<commit_message>
Editor SHALL not use a custom file or folder selector
Window creation popup must not close while chossing a path
new option to select an assert directory in the editor from commande line
</commit_message>
<xml_diff>
--- a/docs/user_guide/MFDStudio_End_To_End_User_Guide.docx
+++ b/docs/user_guide/MFDStudio_End_To_End_User_Guide.docx
@@ -70,7 +70,7 @@
               <w:t xml:space="preserve">Document generated on </w:t>
             </w:r>
             <w:r>
-              <w:t>2026-05-10 12:51</w:t>
+              <w:t>2026-05-19 19:46</w:t>
             </w:r>
             <w:r>
               <w:rPr>
@@ -241,7 +241,7 @@
       <w:pPr>
         <w:pStyle w:val="Titre1"/>
       </w:pPr>
-      <w:bookmarkStart w:id="0" w:name="_Toc229310070"/>
+      <w:bookmarkStart w:id="0" w:name="_Toc230112414"/>
       <w:r>
         <w:t>Table of Contents</w:t>
       </w:r>
@@ -269,7 +269,7 @@
         </w:rPr>
         <w:fldChar w:fldCharType="separate"/>
       </w:r>
-      <w:hyperlink w:anchor="_Toc229310070" w:history="1">
+      <w:hyperlink w:anchor="_Toc230112414" w:history="1">
         <w:r>
           <w:rPr>
             <w:rStyle w:val="Lienhypertexte"/>
@@ -296,7 +296,7 @@
             <w:noProof/>
             <w:webHidden/>
           </w:rPr>
-          <w:instrText xml:space="preserve"> PAGEREF _Toc229310070 \h </w:instrText>
+          <w:instrText xml:space="preserve"> PAGEREF _Toc230112414 \h </w:instrText>
         </w:r>
         <w:r>
           <w:rPr>
@@ -337,7 +337,7 @@
           <w:noProof/>
         </w:rPr>
       </w:pPr>
-      <w:hyperlink w:anchor="_Toc229310071" w:history="1">
+      <w:hyperlink w:anchor="_Toc230112415" w:history="1">
         <w:r>
           <w:rPr>
             <w:rStyle w:val="Lienhypertexte"/>
@@ -365,7 +365,7 @@
             <w:noProof/>
             <w:webHidden/>
           </w:rPr>
-          <w:instrText xml:space="preserve"> PAGEREF _Toc229310071 \h </w:instrText>
+          <w:instrText xml:space="preserve"> PAGEREF _Toc230112415 \h </w:instrText>
         </w:r>
         <w:r>
           <w:rPr>
@@ -406,7 +406,7 @@
           <w:noProof/>
         </w:rPr>
       </w:pPr>
-      <w:hyperlink w:anchor="_Toc229310072" w:history="1">
+      <w:hyperlink w:anchor="_Toc230112416" w:history="1">
         <w:r>
           <w:rPr>
             <w:rStyle w:val="Lienhypertexte"/>
@@ -434,7 +434,7 @@
             <w:noProof/>
             <w:webHidden/>
           </w:rPr>
-          <w:instrText xml:space="preserve"> PAGEREF _Toc229310072 \h </w:instrText>
+          <w:instrText xml:space="preserve"> PAGEREF _Toc230112416 \h </w:instrText>
         </w:r>
         <w:r>
           <w:rPr>
@@ -475,7 +475,7 @@
           <w:noProof/>
         </w:rPr>
       </w:pPr>
-      <w:hyperlink w:anchor="_Toc229310073" w:history="1">
+      <w:hyperlink w:anchor="_Toc230112417" w:history="1">
         <w:r>
           <w:rPr>
             <w:rStyle w:val="Lienhypertexte"/>
@@ -503,7 +503,7 @@
             <w:noProof/>
             <w:webHidden/>
           </w:rPr>
-          <w:instrText xml:space="preserve"> PAGEREF _Toc229310073 \h </w:instrText>
+          <w:instrText xml:space="preserve"> PAGEREF _Toc230112417 \h </w:instrText>
         </w:r>
         <w:r>
           <w:rPr>
@@ -544,7 +544,7 @@
           <w:noProof/>
         </w:rPr>
       </w:pPr>
-      <w:hyperlink w:anchor="_Toc229310074" w:history="1">
+      <w:hyperlink w:anchor="_Toc230112418" w:history="1">
         <w:r>
           <w:rPr>
             <w:rStyle w:val="Lienhypertexte"/>
@@ -572,7 +572,7 @@
             <w:noProof/>
             <w:webHidden/>
           </w:rPr>
-          <w:instrText xml:space="preserve"> PAGEREF _Toc229310074 \h </w:instrText>
+          <w:instrText xml:space="preserve"> PAGEREF _Toc230112418 \h </w:instrText>
         </w:r>
         <w:r>
           <w:rPr>
@@ -613,7 +613,7 @@
           <w:noProof/>
         </w:rPr>
       </w:pPr>
-      <w:hyperlink w:anchor="_Toc229310075" w:history="1">
+      <w:hyperlink w:anchor="_Toc230112419" w:history="1">
         <w:r>
           <w:rPr>
             <w:rStyle w:val="Lienhypertexte"/>
@@ -641,7 +641,7 @@
             <w:noProof/>
             <w:webHidden/>
           </w:rPr>
-          <w:instrText xml:space="preserve"> PAGEREF _Toc229310075 \h </w:instrText>
+          <w:instrText xml:space="preserve"> PAGEREF _Toc230112419 \h </w:instrText>
         </w:r>
         <w:r>
           <w:rPr>
@@ -682,7 +682,7 @@
           <w:noProof/>
         </w:rPr>
       </w:pPr>
-      <w:hyperlink w:anchor="_Toc229310076" w:history="1">
+      <w:hyperlink w:anchor="_Toc230112420" w:history="1">
         <w:r>
           <w:rPr>
             <w:rStyle w:val="Lienhypertexte"/>
@@ -710,7 +710,7 @@
             <w:noProof/>
             <w:webHidden/>
           </w:rPr>
-          <w:instrText xml:space="preserve"> PAGEREF _Toc229310076 \h </w:instrText>
+          <w:instrText xml:space="preserve"> PAGEREF _Toc230112420 \h </w:instrText>
         </w:r>
         <w:r>
           <w:rPr>
@@ -751,7 +751,7 @@
           <w:noProof/>
         </w:rPr>
       </w:pPr>
-      <w:hyperlink w:anchor="_Toc229310077" w:history="1">
+      <w:hyperlink w:anchor="_Toc230112421" w:history="1">
         <w:r>
           <w:rPr>
             <w:rStyle w:val="Lienhypertexte"/>
@@ -779,7 +779,7 @@
             <w:noProof/>
             <w:webHidden/>
           </w:rPr>
-          <w:instrText xml:space="preserve"> PAGEREF _Toc229310077 \h </w:instrText>
+          <w:instrText xml:space="preserve"> PAGEREF _Toc230112421 \h </w:instrText>
         </w:r>
         <w:r>
           <w:rPr>
@@ -820,7 +820,7 @@
           <w:noProof/>
         </w:rPr>
       </w:pPr>
-      <w:hyperlink w:anchor="_Toc229310078" w:history="1">
+      <w:hyperlink w:anchor="_Toc230112422" w:history="1">
         <w:r>
           <w:rPr>
             <w:rStyle w:val="Lienhypertexte"/>
@@ -848,7 +848,7 @@
             <w:noProof/>
             <w:webHidden/>
           </w:rPr>
-          <w:instrText xml:space="preserve"> PAGEREF _Toc229310078 \h </w:instrText>
+          <w:instrText xml:space="preserve"> PAGEREF _Toc230112422 \h </w:instrText>
         </w:r>
         <w:r>
           <w:rPr>
@@ -889,7 +889,7 @@
           <w:noProof/>
         </w:rPr>
       </w:pPr>
-      <w:hyperlink w:anchor="_Toc229310079" w:history="1">
+      <w:hyperlink w:anchor="_Toc230112423" w:history="1">
         <w:r>
           <w:rPr>
             <w:rStyle w:val="Lienhypertexte"/>
@@ -917,7 +917,7 @@
             <w:noProof/>
             <w:webHidden/>
           </w:rPr>
-          <w:instrText xml:space="preserve"> PAGEREF _Toc229310079 \h </w:instrText>
+          <w:instrText xml:space="preserve"> PAGEREF _Toc230112423 \h </w:instrText>
         </w:r>
         <w:r>
           <w:rPr>
@@ -958,7 +958,7 @@
           <w:noProof/>
         </w:rPr>
       </w:pPr>
-      <w:hyperlink w:anchor="_Toc229310080" w:history="1">
+      <w:hyperlink w:anchor="_Toc230112424" w:history="1">
         <w:r>
           <w:rPr>
             <w:rStyle w:val="Lienhypertexte"/>
@@ -986,7 +986,7 @@
             <w:noProof/>
             <w:webHidden/>
           </w:rPr>
-          <w:instrText xml:space="preserve"> PAGEREF _Toc229310080 \h </w:instrText>
+          <w:instrText xml:space="preserve"> PAGEREF _Toc230112424 \h </w:instrText>
         </w:r>
         <w:r>
           <w:rPr>
@@ -1027,7 +1027,7 @@
           <w:noProof/>
         </w:rPr>
       </w:pPr>
-      <w:hyperlink w:anchor="_Toc229310081" w:history="1">
+      <w:hyperlink w:anchor="_Toc230112425" w:history="1">
         <w:r>
           <w:rPr>
             <w:rStyle w:val="Lienhypertexte"/>
@@ -1055,7 +1055,7 @@
             <w:noProof/>
             <w:webHidden/>
           </w:rPr>
-          <w:instrText xml:space="preserve"> PAGEREF _Toc229310081 \h </w:instrText>
+          <w:instrText xml:space="preserve"> PAGEREF _Toc230112425 \h </w:instrText>
         </w:r>
         <w:r>
           <w:rPr>
@@ -1096,7 +1096,7 @@
           <w:noProof/>
         </w:rPr>
       </w:pPr>
-      <w:hyperlink w:anchor="_Toc229310082" w:history="1">
+      <w:hyperlink w:anchor="_Toc230112426" w:history="1">
         <w:r>
           <w:rPr>
             <w:rStyle w:val="Lienhypertexte"/>
@@ -1124,7 +1124,7 @@
             <w:noProof/>
             <w:webHidden/>
           </w:rPr>
-          <w:instrText xml:space="preserve"> PAGEREF _Toc229310082 \h </w:instrText>
+          <w:instrText xml:space="preserve"> PAGEREF _Toc230112426 \h </w:instrText>
         </w:r>
         <w:r>
           <w:rPr>
@@ -1165,7 +1165,7 @@
           <w:noProof/>
         </w:rPr>
       </w:pPr>
-      <w:hyperlink w:anchor="_Toc229310083" w:history="1">
+      <w:hyperlink w:anchor="_Toc230112427" w:history="1">
         <w:r>
           <w:rPr>
             <w:rStyle w:val="Lienhypertexte"/>
@@ -1193,7 +1193,7 @@
             <w:noProof/>
             <w:webHidden/>
           </w:rPr>
-          <w:instrText xml:space="preserve"> PAGEREF _Toc229310083 \h </w:instrText>
+          <w:instrText xml:space="preserve"> PAGEREF _Toc230112427 \h </w:instrText>
         </w:r>
         <w:r>
           <w:rPr>
@@ -1234,7 +1234,7 @@
           <w:noProof/>
         </w:rPr>
       </w:pPr>
-      <w:hyperlink w:anchor="_Toc229310084" w:history="1">
+      <w:hyperlink w:anchor="_Toc230112428" w:history="1">
         <w:r>
           <w:rPr>
             <w:rStyle w:val="Lienhypertexte"/>
@@ -1262,7 +1262,7 @@
             <w:noProof/>
             <w:webHidden/>
           </w:rPr>
-          <w:instrText xml:space="preserve"> PAGEREF _Toc229310084 \h </w:instrText>
+          <w:instrText xml:space="preserve"> PAGEREF _Toc230112428 \h </w:instrText>
         </w:r>
         <w:r>
           <w:rPr>
@@ -1303,7 +1303,7 @@
           <w:noProof/>
         </w:rPr>
       </w:pPr>
-      <w:hyperlink w:anchor="_Toc229310085" w:history="1">
+      <w:hyperlink w:anchor="_Toc230112429" w:history="1">
         <w:r>
           <w:rPr>
             <w:rStyle w:val="Lienhypertexte"/>
@@ -1331,7 +1331,7 @@
             <w:noProof/>
             <w:webHidden/>
           </w:rPr>
-          <w:instrText xml:space="preserve"> PAGEREF _Toc229310085 \h </w:instrText>
+          <w:instrText xml:space="preserve"> PAGEREF _Toc230112429 \h </w:instrText>
         </w:r>
         <w:r>
           <w:rPr>
@@ -1372,7 +1372,7 @@
           <w:noProof/>
         </w:rPr>
       </w:pPr>
-      <w:hyperlink w:anchor="_Toc229310086" w:history="1">
+      <w:hyperlink w:anchor="_Toc230112430" w:history="1">
         <w:r>
           <w:rPr>
             <w:rStyle w:val="Lienhypertexte"/>
@@ -1400,7 +1400,7 @@
             <w:noProof/>
             <w:webHidden/>
           </w:rPr>
-          <w:instrText xml:space="preserve"> PAGEREF _Toc229310086 \h </w:instrText>
+          <w:instrText xml:space="preserve"> PAGEREF _Toc230112430 \h </w:instrText>
         </w:r>
         <w:r>
           <w:rPr>
@@ -1441,7 +1441,7 @@
           <w:noProof/>
         </w:rPr>
       </w:pPr>
-      <w:hyperlink w:anchor="_Toc229310087" w:history="1">
+      <w:hyperlink w:anchor="_Toc230112431" w:history="1">
         <w:r>
           <w:rPr>
             <w:rStyle w:val="Lienhypertexte"/>
@@ -1469,7 +1469,7 @@
             <w:noProof/>
             <w:webHidden/>
           </w:rPr>
-          <w:instrText xml:space="preserve"> PAGEREF _Toc229310087 \h </w:instrText>
+          <w:instrText xml:space="preserve"> PAGEREF _Toc230112431 \h </w:instrText>
         </w:r>
         <w:r>
           <w:rPr>
@@ -1510,7 +1510,7 @@
           <w:noProof/>
         </w:rPr>
       </w:pPr>
-      <w:hyperlink w:anchor="_Toc229310088" w:history="1">
+      <w:hyperlink w:anchor="_Toc230112432" w:history="1">
         <w:r>
           <w:rPr>
             <w:rStyle w:val="Lienhypertexte"/>
@@ -1538,7 +1538,7 @@
             <w:noProof/>
             <w:webHidden/>
           </w:rPr>
-          <w:instrText xml:space="preserve"> PAGEREF _Toc229310088 \h </w:instrText>
+          <w:instrText xml:space="preserve"> PAGEREF _Toc230112432 \h </w:instrText>
         </w:r>
         <w:r>
           <w:rPr>
@@ -1579,7 +1579,7 @@
           <w:noProof/>
         </w:rPr>
       </w:pPr>
-      <w:hyperlink w:anchor="_Toc229310089" w:history="1">
+      <w:hyperlink w:anchor="_Toc230112433" w:history="1">
         <w:r>
           <w:rPr>
             <w:rStyle w:val="Lienhypertexte"/>
@@ -1607,7 +1607,7 @@
             <w:noProof/>
             <w:webHidden/>
           </w:rPr>
-          <w:instrText xml:space="preserve"> PAGEREF _Toc229310089 \h </w:instrText>
+          <w:instrText xml:space="preserve"> PAGEREF _Toc230112433 \h </w:instrText>
         </w:r>
         <w:r>
           <w:rPr>
@@ -1648,7 +1648,7 @@
           <w:noProof/>
         </w:rPr>
       </w:pPr>
-      <w:hyperlink w:anchor="_Toc229310090" w:history="1">
+      <w:hyperlink w:anchor="_Toc230112434" w:history="1">
         <w:r>
           <w:rPr>
             <w:rStyle w:val="Lienhypertexte"/>
@@ -1676,7 +1676,7 @@
             <w:noProof/>
             <w:webHidden/>
           </w:rPr>
-          <w:instrText xml:space="preserve"> PAGEREF _Toc229310090 \h </w:instrText>
+          <w:instrText xml:space="preserve"> PAGEREF _Toc230112434 \h </w:instrText>
         </w:r>
         <w:r>
           <w:rPr>
@@ -1717,7 +1717,7 @@
           <w:noProof/>
         </w:rPr>
       </w:pPr>
-      <w:hyperlink w:anchor="_Toc229310091" w:history="1">
+      <w:hyperlink w:anchor="_Toc230112435" w:history="1">
         <w:r>
           <w:rPr>
             <w:rStyle w:val="Lienhypertexte"/>
@@ -1745,7 +1745,7 @@
             <w:noProof/>
             <w:webHidden/>
           </w:rPr>
-          <w:instrText xml:space="preserve"> PAGEREF _Toc229310091 \h </w:instrText>
+          <w:instrText xml:space="preserve"> PAGEREF _Toc230112435 \h </w:instrText>
         </w:r>
         <w:r>
           <w:rPr>
@@ -1786,7 +1786,7 @@
           <w:noProof/>
         </w:rPr>
       </w:pPr>
-      <w:hyperlink w:anchor="_Toc229310092" w:history="1">
+      <w:hyperlink w:anchor="_Toc230112436" w:history="1">
         <w:r>
           <w:rPr>
             <w:rStyle w:val="Lienhypertexte"/>
@@ -1814,7 +1814,7 @@
             <w:noProof/>
             <w:webHidden/>
           </w:rPr>
-          <w:instrText xml:space="preserve"> PAGEREF _Toc229310092 \h </w:instrText>
+          <w:instrText xml:space="preserve"> PAGEREF _Toc230112436 \h </w:instrText>
         </w:r>
         <w:r>
           <w:rPr>
@@ -1855,7 +1855,7 @@
           <w:noProof/>
         </w:rPr>
       </w:pPr>
-      <w:hyperlink w:anchor="_Toc229310093" w:history="1">
+      <w:hyperlink w:anchor="_Toc230112437" w:history="1">
         <w:r>
           <w:rPr>
             <w:rStyle w:val="Lienhypertexte"/>
@@ -1882,7 +1882,7 @@
             <w:noProof/>
             <w:webHidden/>
           </w:rPr>
-          <w:instrText xml:space="preserve"> PAGEREF _Toc229310093 \h </w:instrText>
+          <w:instrText xml:space="preserve"> PAGEREF _Toc230112437 \h </w:instrText>
         </w:r>
         <w:r>
           <w:rPr>
@@ -1923,7 +1923,7 @@
           <w:noProof/>
         </w:rPr>
       </w:pPr>
-      <w:hyperlink w:anchor="_Toc229310094" w:history="1">
+      <w:hyperlink w:anchor="_Toc230112438" w:history="1">
         <w:r>
           <w:rPr>
             <w:rStyle w:val="Lienhypertexte"/>
@@ -1950,7 +1950,7 @@
             <w:noProof/>
             <w:webHidden/>
           </w:rPr>
-          <w:instrText xml:space="preserve"> PAGEREF _Toc229310094 \h </w:instrText>
+          <w:instrText xml:space="preserve"> PAGEREF _Toc230112438 \h </w:instrText>
         </w:r>
         <w:r>
           <w:rPr>
@@ -1991,7 +1991,7 @@
           <w:noProof/>
         </w:rPr>
       </w:pPr>
-      <w:hyperlink w:anchor="_Toc229310095" w:history="1">
+      <w:hyperlink w:anchor="_Toc230112439" w:history="1">
         <w:r>
           <w:rPr>
             <w:rStyle w:val="Lienhypertexte"/>
@@ -2019,7 +2019,7 @@
             <w:noProof/>
             <w:webHidden/>
           </w:rPr>
-          <w:instrText xml:space="preserve"> PAGEREF _Toc229310095 \h </w:instrText>
+          <w:instrText xml:space="preserve"> PAGEREF _Toc230112439 \h </w:instrText>
         </w:r>
         <w:r>
           <w:rPr>
@@ -2060,7 +2060,7 @@
           <w:noProof/>
         </w:rPr>
       </w:pPr>
-      <w:hyperlink w:anchor="_Toc229310096" w:history="1">
+      <w:hyperlink w:anchor="_Toc230112440" w:history="1">
         <w:r>
           <w:rPr>
             <w:rStyle w:val="Lienhypertexte"/>
@@ -2088,7 +2088,7 @@
             <w:noProof/>
             <w:webHidden/>
           </w:rPr>
-          <w:instrText xml:space="preserve"> PAGEREF _Toc229310096 \h </w:instrText>
+          <w:instrText xml:space="preserve"> PAGEREF _Toc230112440 \h </w:instrText>
         </w:r>
         <w:r>
           <w:rPr>
@@ -2129,7 +2129,7 @@
           <w:noProof/>
         </w:rPr>
       </w:pPr>
-      <w:hyperlink w:anchor="_Toc229310097" w:history="1">
+      <w:hyperlink w:anchor="_Toc230112441" w:history="1">
         <w:r>
           <w:rPr>
             <w:rStyle w:val="Lienhypertexte"/>
@@ -2157,7 +2157,7 @@
             <w:noProof/>
             <w:webHidden/>
           </w:rPr>
-          <w:instrText xml:space="preserve"> PAGEREF _Toc229310097 \h </w:instrText>
+          <w:instrText xml:space="preserve"> PAGEREF _Toc230112441 \h </w:instrText>
         </w:r>
         <w:r>
           <w:rPr>
@@ -2198,7 +2198,7 @@
           <w:noProof/>
         </w:rPr>
       </w:pPr>
-      <w:hyperlink w:anchor="_Toc229310098" w:history="1">
+      <w:hyperlink w:anchor="_Toc230112442" w:history="1">
         <w:r>
           <w:rPr>
             <w:rStyle w:val="Lienhypertexte"/>
@@ -2226,7 +2226,7 @@
             <w:noProof/>
             <w:webHidden/>
           </w:rPr>
-          <w:instrText xml:space="preserve"> PAGEREF _Toc229310098 \h </w:instrText>
+          <w:instrText xml:space="preserve"> PAGEREF _Toc230112442 \h </w:instrText>
         </w:r>
         <w:r>
           <w:rPr>
@@ -2267,7 +2267,7 @@
           <w:noProof/>
         </w:rPr>
       </w:pPr>
-      <w:hyperlink w:anchor="_Toc229310099" w:history="1">
+      <w:hyperlink w:anchor="_Toc230112443" w:history="1">
         <w:r>
           <w:rPr>
             <w:rStyle w:val="Lienhypertexte"/>
@@ -2294,7 +2294,7 @@
             <w:noProof/>
             <w:webHidden/>
           </w:rPr>
-          <w:instrText xml:space="preserve"> PAGEREF _Toc229310099 \h </w:instrText>
+          <w:instrText xml:space="preserve"> PAGEREF _Toc230112443 \h </w:instrText>
         </w:r>
         <w:r>
           <w:rPr>
@@ -2335,7 +2335,7 @@
           <w:noProof/>
         </w:rPr>
       </w:pPr>
-      <w:hyperlink w:anchor="_Toc229310100" w:history="1">
+      <w:hyperlink w:anchor="_Toc230112444" w:history="1">
         <w:r>
           <w:rPr>
             <w:rStyle w:val="Lienhypertexte"/>
@@ -2362,7 +2362,7 @@
             <w:noProof/>
             <w:webHidden/>
           </w:rPr>
-          <w:instrText xml:space="preserve"> PAGEREF _Toc229310100 \h </w:instrText>
+          <w:instrText xml:space="preserve"> PAGEREF _Toc230112444 \h </w:instrText>
         </w:r>
         <w:r>
           <w:rPr>
@@ -2403,7 +2403,7 @@
           <w:noProof/>
         </w:rPr>
       </w:pPr>
-      <w:hyperlink w:anchor="_Toc229310101" w:history="1">
+      <w:hyperlink w:anchor="_Toc230112445" w:history="1">
         <w:r>
           <w:rPr>
             <w:rStyle w:val="Lienhypertexte"/>
@@ -2430,7 +2430,7 @@
             <w:noProof/>
             <w:webHidden/>
           </w:rPr>
-          <w:instrText xml:space="preserve"> PAGEREF _Toc229310101 \h </w:instrText>
+          <w:instrText xml:space="preserve"> PAGEREF _Toc230112445 \h </w:instrText>
         </w:r>
         <w:r>
           <w:rPr>
@@ -2471,7 +2471,7 @@
           <w:noProof/>
         </w:rPr>
       </w:pPr>
-      <w:hyperlink w:anchor="_Toc229310102" w:history="1">
+      <w:hyperlink w:anchor="_Toc230112446" w:history="1">
         <w:r>
           <w:rPr>
             <w:rStyle w:val="Lienhypertexte"/>
@@ -2498,7 +2498,7 @@
             <w:noProof/>
             <w:webHidden/>
           </w:rPr>
-          <w:instrText xml:space="preserve"> PAGEREF _Toc229310102 \h </w:instrText>
+          <w:instrText xml:space="preserve"> PAGEREF _Toc230112446 \h </w:instrText>
         </w:r>
         <w:r>
           <w:rPr>
@@ -2539,7 +2539,7 @@
           <w:noProof/>
         </w:rPr>
       </w:pPr>
-      <w:hyperlink w:anchor="_Toc229310103" w:history="1">
+      <w:hyperlink w:anchor="_Toc230112447" w:history="1">
         <w:r>
           <w:rPr>
             <w:rStyle w:val="Lienhypertexte"/>
@@ -2567,7 +2567,7 @@
             <w:noProof/>
             <w:webHidden/>
           </w:rPr>
-          <w:instrText xml:space="preserve"> PAGEREF _Toc229310103 \h </w:instrText>
+          <w:instrText xml:space="preserve"> PAGEREF _Toc230112447 \h </w:instrText>
         </w:r>
         <w:r>
           <w:rPr>
@@ -2587,7 +2587,7 @@
             <w:noProof/>
             <w:webHidden/>
           </w:rPr>
-          <w:t>21</w:t>
+          <w:t>22</w:t>
         </w:r>
         <w:r>
           <w:rPr>
@@ -2608,7 +2608,7 @@
           <w:noProof/>
         </w:rPr>
       </w:pPr>
-      <w:hyperlink w:anchor="_Toc229310104" w:history="1">
+      <w:hyperlink w:anchor="_Toc230112448" w:history="1">
         <w:r>
           <w:rPr>
             <w:rStyle w:val="Lienhypertexte"/>
@@ -2636,7 +2636,7 @@
             <w:noProof/>
             <w:webHidden/>
           </w:rPr>
-          <w:instrText xml:space="preserve"> PAGEREF _Toc229310104 \h </w:instrText>
+          <w:instrText xml:space="preserve"> PAGEREF _Toc230112448 \h </w:instrText>
         </w:r>
         <w:r>
           <w:rPr>
@@ -2677,7 +2677,7 @@
           <w:noProof/>
         </w:rPr>
       </w:pPr>
-      <w:hyperlink w:anchor="_Toc229310105" w:history="1">
+      <w:hyperlink w:anchor="_Toc230112449" w:history="1">
         <w:r>
           <w:rPr>
             <w:rStyle w:val="Lienhypertexte"/>
@@ -2705,7 +2705,7 @@
             <w:noProof/>
             <w:webHidden/>
           </w:rPr>
-          <w:instrText xml:space="preserve"> PAGEREF _Toc229310105 \h </w:instrText>
+          <w:instrText xml:space="preserve"> PAGEREF _Toc230112449 \h </w:instrText>
         </w:r>
         <w:r>
           <w:rPr>
@@ -2746,7 +2746,7 @@
           <w:noProof/>
         </w:rPr>
       </w:pPr>
-      <w:hyperlink w:anchor="_Toc229310106" w:history="1">
+      <w:hyperlink w:anchor="_Toc230112450" w:history="1">
         <w:r>
           <w:rPr>
             <w:rStyle w:val="Lienhypertexte"/>
@@ -2774,7 +2774,7 @@
             <w:noProof/>
             <w:webHidden/>
           </w:rPr>
-          <w:instrText xml:space="preserve"> PAGEREF _Toc229310106 \h </w:instrText>
+          <w:instrText xml:space="preserve"> PAGEREF _Toc230112450 \h </w:instrText>
         </w:r>
         <w:r>
           <w:rPr>
@@ -2815,7 +2815,7 @@
           <w:noProof/>
         </w:rPr>
       </w:pPr>
-      <w:hyperlink w:anchor="_Toc229310107" w:history="1">
+      <w:hyperlink w:anchor="_Toc230112451" w:history="1">
         <w:r>
           <w:rPr>
             <w:rStyle w:val="Lienhypertexte"/>
@@ -2842,7 +2842,7 @@
             <w:noProof/>
             <w:webHidden/>
           </w:rPr>
-          <w:instrText xml:space="preserve"> PAGEREF _Toc229310107 \h </w:instrText>
+          <w:instrText xml:space="preserve"> PAGEREF _Toc230112451 \h </w:instrText>
         </w:r>
         <w:r>
           <w:rPr>
@@ -2883,7 +2883,7 @@
           <w:noProof/>
         </w:rPr>
       </w:pPr>
-      <w:hyperlink w:anchor="_Toc229310108" w:history="1">
+      <w:hyperlink w:anchor="_Toc230112452" w:history="1">
         <w:r>
           <w:rPr>
             <w:rStyle w:val="Lienhypertexte"/>
@@ -2911,7 +2911,7 @@
             <w:noProof/>
             <w:webHidden/>
           </w:rPr>
-          <w:instrText xml:space="preserve"> PAGEREF _Toc229310108 \h </w:instrText>
+          <w:instrText xml:space="preserve"> PAGEREF _Toc230112452 \h </w:instrText>
         </w:r>
         <w:r>
           <w:rPr>
@@ -2952,7 +2952,7 @@
           <w:noProof/>
         </w:rPr>
       </w:pPr>
-      <w:hyperlink w:anchor="_Toc229310109" w:history="1">
+      <w:hyperlink w:anchor="_Toc230112453" w:history="1">
         <w:r>
           <w:rPr>
             <w:rStyle w:val="Lienhypertexte"/>
@@ -2980,7 +2980,7 @@
             <w:noProof/>
             <w:webHidden/>
           </w:rPr>
-          <w:instrText xml:space="preserve"> PAGEREF _Toc229310109 \h </w:instrText>
+          <w:instrText xml:space="preserve"> PAGEREF _Toc230112453 \h </w:instrText>
         </w:r>
         <w:r>
           <w:rPr>
@@ -3021,7 +3021,7 @@
           <w:noProof/>
         </w:rPr>
       </w:pPr>
-      <w:hyperlink w:anchor="_Toc229310110" w:history="1">
+      <w:hyperlink w:anchor="_Toc230112454" w:history="1">
         <w:r>
           <w:rPr>
             <w:rStyle w:val="Lienhypertexte"/>
@@ -3049,7 +3049,7 @@
             <w:noProof/>
             <w:webHidden/>
           </w:rPr>
-          <w:instrText xml:space="preserve"> PAGEREF _Toc229310110 \h </w:instrText>
+          <w:instrText xml:space="preserve"> PAGEREF _Toc230112454 \h </w:instrText>
         </w:r>
         <w:r>
           <w:rPr>
@@ -3090,7 +3090,7 @@
           <w:noProof/>
         </w:rPr>
       </w:pPr>
-      <w:hyperlink w:anchor="_Toc229310111" w:history="1">
+      <w:hyperlink w:anchor="_Toc230112455" w:history="1">
         <w:r>
           <w:rPr>
             <w:rStyle w:val="Lienhypertexte"/>
@@ -3118,7 +3118,7 @@
             <w:noProof/>
             <w:webHidden/>
           </w:rPr>
-          <w:instrText xml:space="preserve"> PAGEREF _Toc229310111 \h </w:instrText>
+          <w:instrText xml:space="preserve"> PAGEREF _Toc230112455 \h </w:instrText>
         </w:r>
         <w:r>
           <w:rPr>
@@ -3159,7 +3159,7 @@
           <w:noProof/>
         </w:rPr>
       </w:pPr>
-      <w:hyperlink w:anchor="_Toc229310112" w:history="1">
+      <w:hyperlink w:anchor="_Toc230112456" w:history="1">
         <w:r>
           <w:rPr>
             <w:rStyle w:val="Lienhypertexte"/>
@@ -3187,7 +3187,7 @@
             <w:noProof/>
             <w:webHidden/>
           </w:rPr>
-          <w:instrText xml:space="preserve"> PAGEREF _Toc229310112 \h </w:instrText>
+          <w:instrText xml:space="preserve"> PAGEREF _Toc230112456 \h </w:instrText>
         </w:r>
         <w:r>
           <w:rPr>
@@ -3228,7 +3228,7 @@
           <w:noProof/>
         </w:rPr>
       </w:pPr>
-      <w:hyperlink w:anchor="_Toc229310113" w:history="1">
+      <w:hyperlink w:anchor="_Toc230112457" w:history="1">
         <w:r>
           <w:rPr>
             <w:rStyle w:val="Lienhypertexte"/>
@@ -3256,7 +3256,7 @@
             <w:noProof/>
             <w:webHidden/>
           </w:rPr>
-          <w:instrText xml:space="preserve"> PAGEREF _Toc229310113 \h </w:instrText>
+          <w:instrText xml:space="preserve"> PAGEREF _Toc230112457 \h </w:instrText>
         </w:r>
         <w:r>
           <w:rPr>
@@ -3297,7 +3297,7 @@
           <w:noProof/>
         </w:rPr>
       </w:pPr>
-      <w:hyperlink w:anchor="_Toc229310114" w:history="1">
+      <w:hyperlink w:anchor="_Toc230112458" w:history="1">
         <w:r>
           <w:rPr>
             <w:rStyle w:val="Lienhypertexte"/>
@@ -3325,7 +3325,7 @@
             <w:noProof/>
             <w:webHidden/>
           </w:rPr>
-          <w:instrText xml:space="preserve"> PAGEREF _Toc229310114 \h </w:instrText>
+          <w:instrText xml:space="preserve"> PAGEREF _Toc230112458 \h </w:instrText>
         </w:r>
         <w:r>
           <w:rPr>
@@ -3366,7 +3366,7 @@
           <w:noProof/>
         </w:rPr>
       </w:pPr>
-      <w:hyperlink w:anchor="_Toc229310115" w:history="1">
+      <w:hyperlink w:anchor="_Toc230112459" w:history="1">
         <w:r>
           <w:rPr>
             <w:rStyle w:val="Lienhypertexte"/>
@@ -3394,7 +3394,7 @@
             <w:noProof/>
             <w:webHidden/>
           </w:rPr>
-          <w:instrText xml:space="preserve"> PAGEREF _Toc229310115 \h </w:instrText>
+          <w:instrText xml:space="preserve"> PAGEREF _Toc230112459 \h </w:instrText>
         </w:r>
         <w:r>
           <w:rPr>
@@ -3435,7 +3435,7 @@
           <w:noProof/>
         </w:rPr>
       </w:pPr>
-      <w:hyperlink w:anchor="_Toc229310116" w:history="1">
+      <w:hyperlink w:anchor="_Toc230112460" w:history="1">
         <w:r>
           <w:rPr>
             <w:rStyle w:val="Lienhypertexte"/>
@@ -3463,7 +3463,7 @@
             <w:noProof/>
             <w:webHidden/>
           </w:rPr>
-          <w:instrText xml:space="preserve"> PAGEREF _Toc229310116 \h </w:instrText>
+          <w:instrText xml:space="preserve"> PAGEREF _Toc230112460 \h </w:instrText>
         </w:r>
         <w:r>
           <w:rPr>
@@ -3504,7 +3504,7 @@
           <w:noProof/>
         </w:rPr>
       </w:pPr>
-      <w:hyperlink w:anchor="_Toc229310117" w:history="1">
+      <w:hyperlink w:anchor="_Toc230112461" w:history="1">
         <w:r>
           <w:rPr>
             <w:rStyle w:val="Lienhypertexte"/>
@@ -3532,7 +3532,7 @@
             <w:noProof/>
             <w:webHidden/>
           </w:rPr>
-          <w:instrText xml:space="preserve"> PAGEREF _Toc229310117 \h </w:instrText>
+          <w:instrText xml:space="preserve"> PAGEREF _Toc230112461 \h </w:instrText>
         </w:r>
         <w:r>
           <w:rPr>
@@ -3573,7 +3573,7 @@
           <w:noProof/>
         </w:rPr>
       </w:pPr>
-      <w:hyperlink w:anchor="_Toc229310118" w:history="1">
+      <w:hyperlink w:anchor="_Toc230112462" w:history="1">
         <w:r>
           <w:rPr>
             <w:rStyle w:val="Lienhypertexte"/>
@@ -3601,7 +3601,7 @@
             <w:noProof/>
             <w:webHidden/>
           </w:rPr>
-          <w:instrText xml:space="preserve"> PAGEREF _Toc229310118 \h </w:instrText>
+          <w:instrText xml:space="preserve"> PAGEREF _Toc230112462 \h </w:instrText>
         </w:r>
         <w:r>
           <w:rPr>
@@ -3642,7 +3642,7 @@
           <w:noProof/>
         </w:rPr>
       </w:pPr>
-      <w:hyperlink w:anchor="_Toc229310119" w:history="1">
+      <w:hyperlink w:anchor="_Toc230112463" w:history="1">
         <w:r>
           <w:rPr>
             <w:rStyle w:val="Lienhypertexte"/>
@@ -3670,7 +3670,7 @@
             <w:noProof/>
             <w:webHidden/>
           </w:rPr>
-          <w:instrText xml:space="preserve"> PAGEREF _Toc229310119 \h </w:instrText>
+          <w:instrText xml:space="preserve"> PAGEREF _Toc230112463 \h </w:instrText>
         </w:r>
         <w:r>
           <w:rPr>
@@ -3711,7 +3711,7 @@
           <w:noProof/>
         </w:rPr>
       </w:pPr>
-      <w:hyperlink w:anchor="_Toc229310120" w:history="1">
+      <w:hyperlink w:anchor="_Toc230112464" w:history="1">
         <w:r>
           <w:rPr>
             <w:rStyle w:val="Lienhypertexte"/>
@@ -3739,7 +3739,7 @@
             <w:noProof/>
             <w:webHidden/>
           </w:rPr>
-          <w:instrText xml:space="preserve"> PAGEREF _Toc229310120 \h </w:instrText>
+          <w:instrText xml:space="preserve"> PAGEREF _Toc230112464 \h </w:instrText>
         </w:r>
         <w:r>
           <w:rPr>
@@ -3780,7 +3780,7 @@
           <w:noProof/>
         </w:rPr>
       </w:pPr>
-      <w:hyperlink w:anchor="_Toc229310121" w:history="1">
+      <w:hyperlink w:anchor="_Toc230112465" w:history="1">
         <w:r>
           <w:rPr>
             <w:rStyle w:val="Lienhypertexte"/>
@@ -3808,7 +3808,7 @@
             <w:noProof/>
             <w:webHidden/>
           </w:rPr>
-          <w:instrText xml:space="preserve"> PAGEREF _Toc229310121 \h </w:instrText>
+          <w:instrText xml:space="preserve"> PAGEREF _Toc230112465 \h </w:instrText>
         </w:r>
         <w:r>
           <w:rPr>
@@ -3849,7 +3849,7 @@
           <w:noProof/>
         </w:rPr>
       </w:pPr>
-      <w:hyperlink w:anchor="_Toc229310122" w:history="1">
+      <w:hyperlink w:anchor="_Toc230112466" w:history="1">
         <w:r>
           <w:rPr>
             <w:rStyle w:val="Lienhypertexte"/>
@@ -3877,7 +3877,7 @@
             <w:noProof/>
             <w:webHidden/>
           </w:rPr>
-          <w:instrText xml:space="preserve"> PAGEREF _Toc229310122 \h </w:instrText>
+          <w:instrText xml:space="preserve"> PAGEREF _Toc230112466 \h </w:instrText>
         </w:r>
         <w:r>
           <w:rPr>
@@ -3918,7 +3918,7 @@
           <w:noProof/>
         </w:rPr>
       </w:pPr>
-      <w:hyperlink w:anchor="_Toc229310123" w:history="1">
+      <w:hyperlink w:anchor="_Toc230112467" w:history="1">
         <w:r>
           <w:rPr>
             <w:rStyle w:val="Lienhypertexte"/>
@@ -3946,7 +3946,7 @@
             <w:noProof/>
             <w:webHidden/>
           </w:rPr>
-          <w:instrText xml:space="preserve"> PAGEREF _Toc229310123 \h </w:instrText>
+          <w:instrText xml:space="preserve"> PAGEREF _Toc230112467 \h </w:instrText>
         </w:r>
         <w:r>
           <w:rPr>
@@ -3987,7 +3987,7 @@
           <w:noProof/>
         </w:rPr>
       </w:pPr>
-      <w:hyperlink w:anchor="_Toc229310124" w:history="1">
+      <w:hyperlink w:anchor="_Toc230112468" w:history="1">
         <w:r>
           <w:rPr>
             <w:rStyle w:val="Lienhypertexte"/>
@@ -4015,7 +4015,7 @@
             <w:noProof/>
             <w:webHidden/>
           </w:rPr>
-          <w:instrText xml:space="preserve"> PAGEREF _Toc229310124 \h </w:instrText>
+          <w:instrText xml:space="preserve"> PAGEREF _Toc230112468 \h </w:instrText>
         </w:r>
         <w:r>
           <w:rPr>
@@ -4056,7 +4056,7 @@
           <w:noProof/>
         </w:rPr>
       </w:pPr>
-      <w:hyperlink w:anchor="_Toc229310125" w:history="1">
+      <w:hyperlink w:anchor="_Toc230112469" w:history="1">
         <w:r>
           <w:rPr>
             <w:rStyle w:val="Lienhypertexte"/>
@@ -4084,7 +4084,7 @@
             <w:noProof/>
             <w:webHidden/>
           </w:rPr>
-          <w:instrText xml:space="preserve"> PAGEREF _Toc229310125 \h </w:instrText>
+          <w:instrText xml:space="preserve"> PAGEREF _Toc230112469 \h </w:instrText>
         </w:r>
         <w:r>
           <w:rPr>
@@ -4125,7 +4125,7 @@
           <w:noProof/>
         </w:rPr>
       </w:pPr>
-      <w:hyperlink w:anchor="_Toc229310126" w:history="1">
+      <w:hyperlink w:anchor="_Toc230112470" w:history="1">
         <w:r>
           <w:rPr>
             <w:rStyle w:val="Lienhypertexte"/>
@@ -4153,7 +4153,7 @@
             <w:noProof/>
             <w:webHidden/>
           </w:rPr>
-          <w:instrText xml:space="preserve"> PAGEREF _Toc229310126 \h </w:instrText>
+          <w:instrText xml:space="preserve"> PAGEREF _Toc230112470 \h </w:instrText>
         </w:r>
         <w:r>
           <w:rPr>
@@ -4194,7 +4194,7 @@
           <w:noProof/>
         </w:rPr>
       </w:pPr>
-      <w:hyperlink w:anchor="_Toc229310127" w:history="1">
+      <w:hyperlink w:anchor="_Toc230112471" w:history="1">
         <w:r>
           <w:rPr>
             <w:rStyle w:val="Lienhypertexte"/>
@@ -4222,7 +4222,7 @@
             <w:noProof/>
             <w:webHidden/>
           </w:rPr>
-          <w:instrText xml:space="preserve"> PAGEREF _Toc229310127 \h </w:instrText>
+          <w:instrText xml:space="preserve"> PAGEREF _Toc230112471 \h </w:instrText>
         </w:r>
         <w:r>
           <w:rPr>
@@ -4263,7 +4263,7 @@
           <w:noProof/>
         </w:rPr>
       </w:pPr>
-      <w:hyperlink w:anchor="_Toc229310128" w:history="1">
+      <w:hyperlink w:anchor="_Toc230112472" w:history="1">
         <w:r>
           <w:rPr>
             <w:rStyle w:val="Lienhypertexte"/>
@@ -4291,7 +4291,7 @@
             <w:noProof/>
             <w:webHidden/>
           </w:rPr>
-          <w:instrText xml:space="preserve"> PAGEREF _Toc229310128 \h </w:instrText>
+          <w:instrText xml:space="preserve"> PAGEREF _Toc230112472 \h </w:instrText>
         </w:r>
         <w:r>
           <w:rPr>
@@ -4332,7 +4332,7 @@
           <w:noProof/>
         </w:rPr>
       </w:pPr>
-      <w:hyperlink w:anchor="_Toc229310129" w:history="1">
+      <w:hyperlink w:anchor="_Toc230112473" w:history="1">
         <w:r>
           <w:rPr>
             <w:rStyle w:val="Lienhypertexte"/>
@@ -4360,7 +4360,7 @@
             <w:noProof/>
             <w:webHidden/>
           </w:rPr>
-          <w:instrText xml:space="preserve"> PAGEREF _Toc229310129 \h </w:instrText>
+          <w:instrText xml:space="preserve"> PAGEREF _Toc230112473 \h </w:instrText>
         </w:r>
         <w:r>
           <w:rPr>
@@ -4401,7 +4401,7 @@
           <w:noProof/>
         </w:rPr>
       </w:pPr>
-      <w:hyperlink w:anchor="_Toc229310130" w:history="1">
+      <w:hyperlink w:anchor="_Toc230112474" w:history="1">
         <w:r>
           <w:rPr>
             <w:rStyle w:val="Lienhypertexte"/>
@@ -4429,7 +4429,7 @@
             <w:noProof/>
             <w:webHidden/>
           </w:rPr>
-          <w:instrText xml:space="preserve"> PAGEREF _Toc229310130 \h </w:instrText>
+          <w:instrText xml:space="preserve"> PAGEREF _Toc230112474 \h </w:instrText>
         </w:r>
         <w:r>
           <w:rPr>
@@ -4470,7 +4470,7 @@
           <w:noProof/>
         </w:rPr>
       </w:pPr>
-      <w:hyperlink w:anchor="_Toc229310131" w:history="1">
+      <w:hyperlink w:anchor="_Toc230112475" w:history="1">
         <w:r>
           <w:rPr>
             <w:rStyle w:val="Lienhypertexte"/>
@@ -4498,7 +4498,7 @@
             <w:noProof/>
             <w:webHidden/>
           </w:rPr>
-          <w:instrText xml:space="preserve"> PAGEREF _Toc229310131 \h </w:instrText>
+          <w:instrText xml:space="preserve"> PAGEREF _Toc230112475 \h </w:instrText>
         </w:r>
         <w:r>
           <w:rPr>
@@ -4539,7 +4539,7 @@
           <w:noProof/>
         </w:rPr>
       </w:pPr>
-      <w:hyperlink w:anchor="_Toc229310132" w:history="1">
+      <w:hyperlink w:anchor="_Toc230112476" w:history="1">
         <w:r>
           <w:rPr>
             <w:rStyle w:val="Lienhypertexte"/>
@@ -4567,7 +4567,7 @@
             <w:noProof/>
             <w:webHidden/>
           </w:rPr>
-          <w:instrText xml:space="preserve"> PAGEREF _Toc229310132 \h </w:instrText>
+          <w:instrText xml:space="preserve"> PAGEREF _Toc230112476 \h </w:instrText>
         </w:r>
         <w:r>
           <w:rPr>
@@ -4608,7 +4608,7 @@
           <w:noProof/>
         </w:rPr>
       </w:pPr>
-      <w:hyperlink w:anchor="_Toc229310133" w:history="1">
+      <w:hyperlink w:anchor="_Toc230112477" w:history="1">
         <w:r>
           <w:rPr>
             <w:rStyle w:val="Lienhypertexte"/>
@@ -4636,7 +4636,7 @@
             <w:noProof/>
             <w:webHidden/>
           </w:rPr>
-          <w:instrText xml:space="preserve"> PAGEREF _Toc229310133 \h </w:instrText>
+          <w:instrText xml:space="preserve"> PAGEREF _Toc230112477 \h </w:instrText>
         </w:r>
         <w:r>
           <w:rPr>
@@ -4677,7 +4677,7 @@
           <w:noProof/>
         </w:rPr>
       </w:pPr>
-      <w:hyperlink w:anchor="_Toc229310134" w:history="1">
+      <w:hyperlink w:anchor="_Toc230112478" w:history="1">
         <w:r>
           <w:rPr>
             <w:rStyle w:val="Lienhypertexte"/>
@@ -4705,7 +4705,7 @@
             <w:noProof/>
             <w:webHidden/>
           </w:rPr>
-          <w:instrText xml:space="preserve"> PAGEREF _Toc229310134 \h </w:instrText>
+          <w:instrText xml:space="preserve"> PAGEREF _Toc230112478 \h </w:instrText>
         </w:r>
         <w:r>
           <w:rPr>
@@ -4746,7 +4746,7 @@
           <w:noProof/>
         </w:rPr>
       </w:pPr>
-      <w:hyperlink w:anchor="_Toc229310135" w:history="1">
+      <w:hyperlink w:anchor="_Toc230112479" w:history="1">
         <w:r>
           <w:rPr>
             <w:rStyle w:val="Lienhypertexte"/>
@@ -4774,7 +4774,7 @@
             <w:noProof/>
             <w:webHidden/>
           </w:rPr>
-          <w:instrText xml:space="preserve"> PAGEREF _Toc229310135 \h </w:instrText>
+          <w:instrText xml:space="preserve"> PAGEREF _Toc230112479 \h </w:instrText>
         </w:r>
         <w:r>
           <w:rPr>
@@ -4815,7 +4815,7 @@
           <w:noProof/>
         </w:rPr>
       </w:pPr>
-      <w:hyperlink w:anchor="_Toc229310136" w:history="1">
+      <w:hyperlink w:anchor="_Toc230112480" w:history="1">
         <w:r>
           <w:rPr>
             <w:rStyle w:val="Lienhypertexte"/>
@@ -4843,7 +4843,7 @@
             <w:noProof/>
             <w:webHidden/>
           </w:rPr>
-          <w:instrText xml:space="preserve"> PAGEREF _Toc229310136 \h </w:instrText>
+          <w:instrText xml:space="preserve"> PAGEREF _Toc230112480 \h </w:instrText>
         </w:r>
         <w:r>
           <w:rPr>
@@ -4884,7 +4884,7 @@
           <w:noProof/>
         </w:rPr>
       </w:pPr>
-      <w:hyperlink w:anchor="_Toc229310137" w:history="1">
+      <w:hyperlink w:anchor="_Toc230112481" w:history="1">
         <w:r>
           <w:rPr>
             <w:rStyle w:val="Lienhypertexte"/>
@@ -4912,7 +4912,7 @@
             <w:noProof/>
             <w:webHidden/>
           </w:rPr>
-          <w:instrText xml:space="preserve"> PAGEREF _Toc229310137 \h </w:instrText>
+          <w:instrText xml:space="preserve"> PAGEREF _Toc230112481 \h </w:instrText>
         </w:r>
         <w:r>
           <w:rPr>
@@ -4953,7 +4953,7 @@
           <w:noProof/>
         </w:rPr>
       </w:pPr>
-      <w:hyperlink w:anchor="_Toc229310138" w:history="1">
+      <w:hyperlink w:anchor="_Toc230112482" w:history="1">
         <w:r>
           <w:rPr>
             <w:rStyle w:val="Lienhypertexte"/>
@@ -4980,7 +4980,7 @@
             <w:noProof/>
             <w:webHidden/>
           </w:rPr>
-          <w:instrText xml:space="preserve"> PAGEREF _Toc229310138 \h </w:instrText>
+          <w:instrText xml:space="preserve"> PAGEREF _Toc230112482 \h </w:instrText>
         </w:r>
         <w:r>
           <w:rPr>
@@ -5021,7 +5021,7 @@
           <w:noProof/>
         </w:rPr>
       </w:pPr>
-      <w:hyperlink w:anchor="_Toc229310139" w:history="1">
+      <w:hyperlink w:anchor="_Toc230112483" w:history="1">
         <w:r>
           <w:rPr>
             <w:rStyle w:val="Lienhypertexte"/>
@@ -5049,7 +5049,7 @@
             <w:noProof/>
             <w:webHidden/>
           </w:rPr>
-          <w:instrText xml:space="preserve"> PAGEREF _Toc229310139 \h </w:instrText>
+          <w:instrText xml:space="preserve"> PAGEREF _Toc230112483 \h </w:instrText>
         </w:r>
         <w:r>
           <w:rPr>
@@ -5090,7 +5090,7 @@
           <w:noProof/>
         </w:rPr>
       </w:pPr>
-      <w:hyperlink w:anchor="_Toc229310140" w:history="1">
+      <w:hyperlink w:anchor="_Toc230112484" w:history="1">
         <w:r>
           <w:rPr>
             <w:rStyle w:val="Lienhypertexte"/>
@@ -5117,7 +5117,7 @@
             <w:noProof/>
             <w:webHidden/>
           </w:rPr>
-          <w:instrText xml:space="preserve"> PAGEREF _Toc229310140 \h </w:instrText>
+          <w:instrText xml:space="preserve"> PAGEREF _Toc230112484 \h </w:instrText>
         </w:r>
         <w:r>
           <w:rPr>
@@ -5158,7 +5158,7 @@
           <w:noProof/>
         </w:rPr>
       </w:pPr>
-      <w:hyperlink w:anchor="_Toc229310141" w:history="1">
+      <w:hyperlink w:anchor="_Toc230112485" w:history="1">
         <w:r>
           <w:rPr>
             <w:rStyle w:val="Lienhypertexte"/>
@@ -5185,7 +5185,7 @@
             <w:noProof/>
             <w:webHidden/>
           </w:rPr>
-          <w:instrText xml:space="preserve"> PAGEREF _Toc229310141 \h </w:instrText>
+          <w:instrText xml:space="preserve"> PAGEREF _Toc230112485 \h </w:instrText>
         </w:r>
         <w:r>
           <w:rPr>
@@ -5226,7 +5226,7 @@
           <w:noProof/>
         </w:rPr>
       </w:pPr>
-      <w:hyperlink w:anchor="_Toc229310142" w:history="1">
+      <w:hyperlink w:anchor="_Toc230112486" w:history="1">
         <w:r>
           <w:rPr>
             <w:rStyle w:val="Lienhypertexte"/>
@@ -5254,7 +5254,7 @@
             <w:noProof/>
             <w:webHidden/>
           </w:rPr>
-          <w:instrText xml:space="preserve"> PAGEREF _Toc229310142 \h </w:instrText>
+          <w:instrText xml:space="preserve"> PAGEREF _Toc230112486 \h </w:instrText>
         </w:r>
         <w:r>
           <w:rPr>
@@ -5295,7 +5295,7 @@
           <w:noProof/>
         </w:rPr>
       </w:pPr>
-      <w:hyperlink w:anchor="_Toc229310143" w:history="1">
+      <w:hyperlink w:anchor="_Toc230112487" w:history="1">
         <w:r>
           <w:rPr>
             <w:rStyle w:val="Lienhypertexte"/>
@@ -5323,7 +5323,7 @@
             <w:noProof/>
             <w:webHidden/>
           </w:rPr>
-          <w:instrText xml:space="preserve"> PAGEREF _Toc229310143 \h </w:instrText>
+          <w:instrText xml:space="preserve"> PAGEREF _Toc230112487 \h </w:instrText>
         </w:r>
         <w:r>
           <w:rPr>
@@ -5364,7 +5364,7 @@
           <w:noProof/>
         </w:rPr>
       </w:pPr>
-      <w:hyperlink w:anchor="_Toc229310144" w:history="1">
+      <w:hyperlink w:anchor="_Toc230112488" w:history="1">
         <w:r>
           <w:rPr>
             <w:rStyle w:val="Lienhypertexte"/>
@@ -5392,7 +5392,7 @@
             <w:noProof/>
             <w:webHidden/>
           </w:rPr>
-          <w:instrText xml:space="preserve"> PAGEREF _Toc229310144 \h </w:instrText>
+          <w:instrText xml:space="preserve"> PAGEREF _Toc230112488 \h </w:instrText>
         </w:r>
         <w:r>
           <w:rPr>
@@ -5433,7 +5433,7 @@
           <w:noProof/>
         </w:rPr>
       </w:pPr>
-      <w:hyperlink w:anchor="_Toc229310145" w:history="1">
+      <w:hyperlink w:anchor="_Toc230112489" w:history="1">
         <w:r>
           <w:rPr>
             <w:rStyle w:val="Lienhypertexte"/>
@@ -5461,7 +5461,7 @@
             <w:noProof/>
             <w:webHidden/>
           </w:rPr>
-          <w:instrText xml:space="preserve"> PAGEREF _Toc229310145 \h </w:instrText>
+          <w:instrText xml:space="preserve"> PAGEREF _Toc230112489 \h </w:instrText>
         </w:r>
         <w:r>
           <w:rPr>
@@ -5502,7 +5502,7 @@
           <w:noProof/>
         </w:rPr>
       </w:pPr>
-      <w:hyperlink w:anchor="_Toc229310146" w:history="1">
+      <w:hyperlink w:anchor="_Toc230112490" w:history="1">
         <w:r>
           <w:rPr>
             <w:rStyle w:val="Lienhypertexte"/>
@@ -5530,7 +5530,7 @@
             <w:noProof/>
             <w:webHidden/>
           </w:rPr>
-          <w:instrText xml:space="preserve"> PAGEREF _Toc229310146 \h </w:instrText>
+          <w:instrText xml:space="preserve"> PAGEREF _Toc230112490 \h </w:instrText>
         </w:r>
         <w:r>
           <w:rPr>
@@ -5571,7 +5571,7 @@
           <w:noProof/>
         </w:rPr>
       </w:pPr>
-      <w:hyperlink w:anchor="_Toc229310147" w:history="1">
+      <w:hyperlink w:anchor="_Toc230112491" w:history="1">
         <w:r>
           <w:rPr>
             <w:rStyle w:val="Lienhypertexte"/>
@@ -5599,7 +5599,7 @@
             <w:noProof/>
             <w:webHidden/>
           </w:rPr>
-          <w:instrText xml:space="preserve"> PAGEREF _Toc229310147 \h </w:instrText>
+          <w:instrText xml:space="preserve"> PAGEREF _Toc230112491 \h </w:instrText>
         </w:r>
         <w:r>
           <w:rPr>
@@ -5640,7 +5640,7 @@
           <w:noProof/>
         </w:rPr>
       </w:pPr>
-      <w:hyperlink w:anchor="_Toc229310148" w:history="1">
+      <w:hyperlink w:anchor="_Toc230112492" w:history="1">
         <w:r>
           <w:rPr>
             <w:rStyle w:val="Lienhypertexte"/>
@@ -5668,7 +5668,7 @@
             <w:noProof/>
             <w:webHidden/>
           </w:rPr>
-          <w:instrText xml:space="preserve"> PAGEREF _Toc229310148 \h </w:instrText>
+          <w:instrText xml:space="preserve"> PAGEREF _Toc230112492 \h </w:instrText>
         </w:r>
         <w:r>
           <w:rPr>
@@ -5709,7 +5709,7 @@
           <w:noProof/>
         </w:rPr>
       </w:pPr>
-      <w:hyperlink w:anchor="_Toc229310149" w:history="1">
+      <w:hyperlink w:anchor="_Toc230112493" w:history="1">
         <w:r>
           <w:rPr>
             <w:rStyle w:val="Lienhypertexte"/>
@@ -5737,7 +5737,7 @@
             <w:noProof/>
             <w:webHidden/>
           </w:rPr>
-          <w:instrText xml:space="preserve"> PAGEREF _Toc229310149 \h </w:instrText>
+          <w:instrText xml:space="preserve"> PAGEREF _Toc230112493 \h </w:instrText>
         </w:r>
         <w:r>
           <w:rPr>
@@ -5778,7 +5778,7 @@
           <w:noProof/>
         </w:rPr>
       </w:pPr>
-      <w:hyperlink w:anchor="_Toc229310150" w:history="1">
+      <w:hyperlink w:anchor="_Toc230112494" w:history="1">
         <w:r>
           <w:rPr>
             <w:rStyle w:val="Lienhypertexte"/>
@@ -5806,7 +5806,7 @@
             <w:noProof/>
             <w:webHidden/>
           </w:rPr>
-          <w:instrText xml:space="preserve"> PAGEREF _Toc229310150 \h </w:instrText>
+          <w:instrText xml:space="preserve"> PAGEREF _Toc230112494 \h </w:instrText>
         </w:r>
         <w:r>
           <w:rPr>
@@ -5847,7 +5847,7 @@
           <w:noProof/>
         </w:rPr>
       </w:pPr>
-      <w:hyperlink w:anchor="_Toc229310151" w:history="1">
+      <w:hyperlink w:anchor="_Toc230112495" w:history="1">
         <w:r>
           <w:rPr>
             <w:rStyle w:val="Lienhypertexte"/>
@@ -5875,7 +5875,7 @@
             <w:noProof/>
             <w:webHidden/>
           </w:rPr>
-          <w:instrText xml:space="preserve"> PAGEREF _Toc229310151 \h </w:instrText>
+          <w:instrText xml:space="preserve"> PAGEREF _Toc230112495 \h </w:instrText>
         </w:r>
         <w:r>
           <w:rPr>
@@ -5916,7 +5916,7 @@
           <w:noProof/>
         </w:rPr>
       </w:pPr>
-      <w:hyperlink w:anchor="_Toc229310152" w:history="1">
+      <w:hyperlink w:anchor="_Toc230112496" w:history="1">
         <w:r>
           <w:rPr>
             <w:rStyle w:val="Lienhypertexte"/>
@@ -5944,7 +5944,7 @@
             <w:noProof/>
             <w:webHidden/>
           </w:rPr>
-          <w:instrText xml:space="preserve"> PAGEREF _Toc229310152 \h </w:instrText>
+          <w:instrText xml:space="preserve"> PAGEREF _Toc230112496 \h </w:instrText>
         </w:r>
         <w:r>
           <w:rPr>
@@ -5985,7 +5985,7 @@
           <w:noProof/>
         </w:rPr>
       </w:pPr>
-      <w:hyperlink w:anchor="_Toc229310153" w:history="1">
+      <w:hyperlink w:anchor="_Toc230112497" w:history="1">
         <w:r>
           <w:rPr>
             <w:rStyle w:val="Lienhypertexte"/>
@@ -6013,7 +6013,7 @@
             <w:noProof/>
             <w:webHidden/>
           </w:rPr>
-          <w:instrText xml:space="preserve"> PAGEREF _Toc229310153 \h </w:instrText>
+          <w:instrText xml:space="preserve"> PAGEREF _Toc230112497 \h </w:instrText>
         </w:r>
         <w:r>
           <w:rPr>
@@ -6054,7 +6054,7 @@
           <w:noProof/>
         </w:rPr>
       </w:pPr>
-      <w:hyperlink w:anchor="_Toc229310154" w:history="1">
+      <w:hyperlink w:anchor="_Toc230112498" w:history="1">
         <w:r>
           <w:rPr>
             <w:rStyle w:val="Lienhypertexte"/>
@@ -6082,7 +6082,7 @@
             <w:noProof/>
             <w:webHidden/>
           </w:rPr>
-          <w:instrText xml:space="preserve"> PAGEREF _Toc229310154 \h </w:instrText>
+          <w:instrText xml:space="preserve"> PAGEREF _Toc230112498 \h </w:instrText>
         </w:r>
         <w:r>
           <w:rPr>
@@ -6123,7 +6123,7 @@
           <w:noProof/>
         </w:rPr>
       </w:pPr>
-      <w:hyperlink w:anchor="_Toc229310155" w:history="1">
+      <w:hyperlink w:anchor="_Toc230112499" w:history="1">
         <w:r>
           <w:rPr>
             <w:rStyle w:val="Lienhypertexte"/>
@@ -6151,7 +6151,7 @@
             <w:noProof/>
             <w:webHidden/>
           </w:rPr>
-          <w:instrText xml:space="preserve"> PAGEREF _Toc229310155 \h </w:instrText>
+          <w:instrText xml:space="preserve"> PAGEREF _Toc230112499 \h </w:instrText>
         </w:r>
         <w:r>
           <w:rPr>
@@ -6192,7 +6192,7 @@
           <w:noProof/>
         </w:rPr>
       </w:pPr>
-      <w:hyperlink w:anchor="_Toc229310156" w:history="1">
+      <w:hyperlink w:anchor="_Toc230112500" w:history="1">
         <w:r>
           <w:rPr>
             <w:rStyle w:val="Lienhypertexte"/>
@@ -6220,7 +6220,7 @@
             <w:noProof/>
             <w:webHidden/>
           </w:rPr>
-          <w:instrText xml:space="preserve"> PAGEREF _Toc229310156 \h </w:instrText>
+          <w:instrText xml:space="preserve"> PAGEREF _Toc230112500 \h </w:instrText>
         </w:r>
         <w:r>
           <w:rPr>
@@ -6261,7 +6261,7 @@
           <w:noProof/>
         </w:rPr>
       </w:pPr>
-      <w:hyperlink w:anchor="_Toc229310157" w:history="1">
+      <w:hyperlink w:anchor="_Toc230112501" w:history="1">
         <w:r>
           <w:rPr>
             <w:rStyle w:val="Lienhypertexte"/>
@@ -6289,7 +6289,7 @@
             <w:noProof/>
             <w:webHidden/>
           </w:rPr>
-          <w:instrText xml:space="preserve"> PAGEREF _Toc229310157 \h </w:instrText>
+          <w:instrText xml:space="preserve"> PAGEREF _Toc230112501 \h </w:instrText>
         </w:r>
         <w:r>
           <w:rPr>
@@ -6330,7 +6330,7 @@
           <w:noProof/>
         </w:rPr>
       </w:pPr>
-      <w:hyperlink w:anchor="_Toc229310158" w:history="1">
+      <w:hyperlink w:anchor="_Toc230112502" w:history="1">
         <w:r>
           <w:rPr>
             <w:rStyle w:val="Lienhypertexte"/>
@@ -6358,7 +6358,7 @@
             <w:noProof/>
             <w:webHidden/>
           </w:rPr>
-          <w:instrText xml:space="preserve"> PAGEREF _Toc229310158 \h </w:instrText>
+          <w:instrText xml:space="preserve"> PAGEREF _Toc230112502 \h </w:instrText>
         </w:r>
         <w:r>
           <w:rPr>
@@ -6399,7 +6399,7 @@
           <w:noProof/>
         </w:rPr>
       </w:pPr>
-      <w:hyperlink w:anchor="_Toc229310159" w:history="1">
+      <w:hyperlink w:anchor="_Toc230112503" w:history="1">
         <w:r>
           <w:rPr>
             <w:rStyle w:val="Lienhypertexte"/>
@@ -6427,7 +6427,7 @@
             <w:noProof/>
             <w:webHidden/>
           </w:rPr>
-          <w:instrText xml:space="preserve"> PAGEREF _Toc229310159 \h </w:instrText>
+          <w:instrText xml:space="preserve"> PAGEREF _Toc230112503 \h </w:instrText>
         </w:r>
         <w:r>
           <w:rPr>
@@ -6468,7 +6468,7 @@
           <w:noProof/>
         </w:rPr>
       </w:pPr>
-      <w:hyperlink w:anchor="_Toc229310160" w:history="1">
+      <w:hyperlink w:anchor="_Toc230112504" w:history="1">
         <w:r>
           <w:rPr>
             <w:rStyle w:val="Lienhypertexte"/>
@@ -6496,7 +6496,7 @@
             <w:noProof/>
             <w:webHidden/>
           </w:rPr>
-          <w:instrText xml:space="preserve"> PAGEREF _Toc229310160 \h </w:instrText>
+          <w:instrText xml:space="preserve"> PAGEREF _Toc230112504 \h </w:instrText>
         </w:r>
         <w:r>
           <w:rPr>
@@ -6537,7 +6537,7 @@
           <w:noProof/>
         </w:rPr>
       </w:pPr>
-      <w:hyperlink w:anchor="_Toc229310161" w:history="1">
+      <w:hyperlink w:anchor="_Toc230112505" w:history="1">
         <w:r>
           <w:rPr>
             <w:rStyle w:val="Lienhypertexte"/>
@@ -6565,7 +6565,7 @@
             <w:noProof/>
             <w:webHidden/>
           </w:rPr>
-          <w:instrText xml:space="preserve"> PAGEREF _Toc229310161 \h </w:instrText>
+          <w:instrText xml:space="preserve"> PAGEREF _Toc230112505 \h </w:instrText>
         </w:r>
         <w:r>
           <w:rPr>
@@ -6606,7 +6606,7 @@
           <w:noProof/>
         </w:rPr>
       </w:pPr>
-      <w:hyperlink w:anchor="_Toc229310162" w:history="1">
+      <w:hyperlink w:anchor="_Toc230112506" w:history="1">
         <w:r>
           <w:rPr>
             <w:rStyle w:val="Lienhypertexte"/>
@@ -6634,7 +6634,7 @@
             <w:noProof/>
             <w:webHidden/>
           </w:rPr>
-          <w:instrText xml:space="preserve"> PAGEREF _Toc229310162 \h </w:instrText>
+          <w:instrText xml:space="preserve"> PAGEREF _Toc230112506 \h </w:instrText>
         </w:r>
         <w:r>
           <w:rPr>
@@ -6675,7 +6675,7 @@
           <w:noProof/>
         </w:rPr>
       </w:pPr>
-      <w:hyperlink w:anchor="_Toc229310163" w:history="1">
+      <w:hyperlink w:anchor="_Toc230112507" w:history="1">
         <w:r>
           <w:rPr>
             <w:rStyle w:val="Lienhypertexte"/>
@@ -6703,7 +6703,7 @@
             <w:noProof/>
             <w:webHidden/>
           </w:rPr>
-          <w:instrText xml:space="preserve"> PAGEREF _Toc229310163 \h </w:instrText>
+          <w:instrText xml:space="preserve"> PAGEREF _Toc230112507 \h </w:instrText>
         </w:r>
         <w:r>
           <w:rPr>
@@ -6744,7 +6744,7 @@
           <w:noProof/>
         </w:rPr>
       </w:pPr>
-      <w:hyperlink w:anchor="_Toc229310164" w:history="1">
+      <w:hyperlink w:anchor="_Toc230112508" w:history="1">
         <w:r>
           <w:rPr>
             <w:rStyle w:val="Lienhypertexte"/>
@@ -6772,7 +6772,7 @@
             <w:noProof/>
             <w:webHidden/>
           </w:rPr>
-          <w:instrText xml:space="preserve"> PAGEREF _Toc229310164 \h </w:instrText>
+          <w:instrText xml:space="preserve"> PAGEREF _Toc230112508 \h </w:instrText>
         </w:r>
         <w:r>
           <w:rPr>
@@ -6813,7 +6813,7 @@
           <w:noProof/>
         </w:rPr>
       </w:pPr>
-      <w:hyperlink w:anchor="_Toc229310165" w:history="1">
+      <w:hyperlink w:anchor="_Toc230112509" w:history="1">
         <w:r>
           <w:rPr>
             <w:rStyle w:val="Lienhypertexte"/>
@@ -6841,7 +6841,7 @@
             <w:noProof/>
             <w:webHidden/>
           </w:rPr>
-          <w:instrText xml:space="preserve"> PAGEREF _Toc229310165 \h </w:instrText>
+          <w:instrText xml:space="preserve"> PAGEREF _Toc230112509 \h </w:instrText>
         </w:r>
         <w:r>
           <w:rPr>
@@ -6882,7 +6882,7 @@
           <w:noProof/>
         </w:rPr>
       </w:pPr>
-      <w:hyperlink w:anchor="_Toc229310166" w:history="1">
+      <w:hyperlink w:anchor="_Toc230112510" w:history="1">
         <w:r>
           <w:rPr>
             <w:rStyle w:val="Lienhypertexte"/>
@@ -6910,7 +6910,7 @@
             <w:noProof/>
             <w:webHidden/>
           </w:rPr>
-          <w:instrText xml:space="preserve"> PAGEREF _Toc229310166 \h </w:instrText>
+          <w:instrText xml:space="preserve"> PAGEREF _Toc230112510 \h </w:instrText>
         </w:r>
         <w:r>
           <w:rPr>
@@ -6951,7 +6951,7 @@
           <w:noProof/>
         </w:rPr>
       </w:pPr>
-      <w:hyperlink w:anchor="_Toc229310167" w:history="1">
+      <w:hyperlink w:anchor="_Toc230112511" w:history="1">
         <w:r>
           <w:rPr>
             <w:rStyle w:val="Lienhypertexte"/>
@@ -6979,7 +6979,7 @@
             <w:noProof/>
             <w:webHidden/>
           </w:rPr>
-          <w:instrText xml:space="preserve"> PAGEREF _Toc229310167 \h </w:instrText>
+          <w:instrText xml:space="preserve"> PAGEREF _Toc230112511 \h </w:instrText>
         </w:r>
         <w:r>
           <w:rPr>
@@ -7020,7 +7020,7 @@
           <w:noProof/>
         </w:rPr>
       </w:pPr>
-      <w:hyperlink w:anchor="_Toc229310168" w:history="1">
+      <w:hyperlink w:anchor="_Toc230112512" w:history="1">
         <w:r>
           <w:rPr>
             <w:rStyle w:val="Lienhypertexte"/>
@@ -7048,7 +7048,7 @@
             <w:noProof/>
             <w:webHidden/>
           </w:rPr>
-          <w:instrText xml:space="preserve"> PAGEREF _Toc229310168 \h </w:instrText>
+          <w:instrText xml:space="preserve"> PAGEREF _Toc230112512 \h </w:instrText>
         </w:r>
         <w:r>
           <w:rPr>
@@ -7089,7 +7089,7 @@
           <w:noProof/>
         </w:rPr>
       </w:pPr>
-      <w:hyperlink w:anchor="_Toc229310169" w:history="1">
+      <w:hyperlink w:anchor="_Toc230112513" w:history="1">
         <w:r>
           <w:rPr>
             <w:rStyle w:val="Lienhypertexte"/>
@@ -7117,7 +7117,7 @@
             <w:noProof/>
             <w:webHidden/>
           </w:rPr>
-          <w:instrText xml:space="preserve"> PAGEREF _Toc229310169 \h </w:instrText>
+          <w:instrText xml:space="preserve"> PAGEREF _Toc230112513 \h </w:instrText>
         </w:r>
         <w:r>
           <w:rPr>
@@ -7158,7 +7158,7 @@
           <w:noProof/>
         </w:rPr>
       </w:pPr>
-      <w:hyperlink w:anchor="_Toc229310170" w:history="1">
+      <w:hyperlink w:anchor="_Toc230112514" w:history="1">
         <w:r>
           <w:rPr>
             <w:rStyle w:val="Lienhypertexte"/>
@@ -7186,7 +7186,7 @@
             <w:noProof/>
             <w:webHidden/>
           </w:rPr>
-          <w:instrText xml:space="preserve"> PAGEREF _Toc229310170 \h </w:instrText>
+          <w:instrText xml:space="preserve"> PAGEREF _Toc230112514 \h </w:instrText>
         </w:r>
         <w:r>
           <w:rPr>
@@ -7227,7 +7227,7 @@
           <w:noProof/>
         </w:rPr>
       </w:pPr>
-      <w:hyperlink w:anchor="_Toc229310171" w:history="1">
+      <w:hyperlink w:anchor="_Toc230112515" w:history="1">
         <w:r>
           <w:rPr>
             <w:rStyle w:val="Lienhypertexte"/>
@@ -7255,7 +7255,7 @@
             <w:noProof/>
             <w:webHidden/>
           </w:rPr>
-          <w:instrText xml:space="preserve"> PAGEREF _Toc229310171 \h </w:instrText>
+          <w:instrText xml:space="preserve"> PAGEREF _Toc230112515 \h </w:instrText>
         </w:r>
         <w:r>
           <w:rPr>
@@ -7296,7 +7296,7 @@
           <w:noProof/>
         </w:rPr>
       </w:pPr>
-      <w:hyperlink w:anchor="_Toc229310172" w:history="1">
+      <w:hyperlink w:anchor="_Toc230112516" w:history="1">
         <w:r>
           <w:rPr>
             <w:rStyle w:val="Lienhypertexte"/>
@@ -7324,7 +7324,7 @@
             <w:noProof/>
             <w:webHidden/>
           </w:rPr>
-          <w:instrText xml:space="preserve"> PAGEREF _Toc229310172 \h </w:instrText>
+          <w:instrText xml:space="preserve"> PAGEREF _Toc230112516 \h </w:instrText>
         </w:r>
         <w:r>
           <w:rPr>
@@ -7365,7 +7365,7 @@
           <w:noProof/>
         </w:rPr>
       </w:pPr>
-      <w:hyperlink w:anchor="_Toc229310173" w:history="1">
+      <w:hyperlink w:anchor="_Toc230112517" w:history="1">
         <w:r>
           <w:rPr>
             <w:rStyle w:val="Lienhypertexte"/>
@@ -7393,7 +7393,7 @@
             <w:noProof/>
             <w:webHidden/>
           </w:rPr>
-          <w:instrText xml:space="preserve"> PAGEREF _Toc229310173 \h </w:instrText>
+          <w:instrText xml:space="preserve"> PAGEREF _Toc230112517 \h </w:instrText>
         </w:r>
         <w:r>
           <w:rPr>
@@ -7434,7 +7434,7 @@
           <w:noProof/>
         </w:rPr>
       </w:pPr>
-      <w:hyperlink w:anchor="_Toc229310174" w:history="1">
+      <w:hyperlink w:anchor="_Toc230112518" w:history="1">
         <w:r>
           <w:rPr>
             <w:rStyle w:val="Lienhypertexte"/>
@@ -7462,7 +7462,7 @@
             <w:noProof/>
             <w:webHidden/>
           </w:rPr>
-          <w:instrText xml:space="preserve"> PAGEREF _Toc229310174 \h </w:instrText>
+          <w:instrText xml:space="preserve"> PAGEREF _Toc230112518 \h </w:instrText>
         </w:r>
         <w:r>
           <w:rPr>
@@ -7503,7 +7503,7 @@
           <w:noProof/>
         </w:rPr>
       </w:pPr>
-      <w:hyperlink w:anchor="_Toc229310175" w:history="1">
+      <w:hyperlink w:anchor="_Toc230112519" w:history="1">
         <w:r>
           <w:rPr>
             <w:rStyle w:val="Lienhypertexte"/>
@@ -7531,7 +7531,7 @@
             <w:noProof/>
             <w:webHidden/>
           </w:rPr>
-          <w:instrText xml:space="preserve"> PAGEREF _Toc229310175 \h </w:instrText>
+          <w:instrText xml:space="preserve"> PAGEREF _Toc230112519 \h </w:instrText>
         </w:r>
         <w:r>
           <w:rPr>
@@ -7572,7 +7572,7 @@
           <w:noProof/>
         </w:rPr>
       </w:pPr>
-      <w:hyperlink w:anchor="_Toc229310176" w:history="1">
+      <w:hyperlink w:anchor="_Toc230112520" w:history="1">
         <w:r>
           <w:rPr>
             <w:rStyle w:val="Lienhypertexte"/>
@@ -7600,7 +7600,7 @@
             <w:noProof/>
             <w:webHidden/>
           </w:rPr>
-          <w:instrText xml:space="preserve"> PAGEREF _Toc229310176 \h </w:instrText>
+          <w:instrText xml:space="preserve"> PAGEREF _Toc230112520 \h </w:instrText>
         </w:r>
         <w:r>
           <w:rPr>
@@ -7641,7 +7641,7 @@
           <w:noProof/>
         </w:rPr>
       </w:pPr>
-      <w:hyperlink w:anchor="_Toc229310177" w:history="1">
+      <w:hyperlink w:anchor="_Toc230112521" w:history="1">
         <w:r>
           <w:rPr>
             <w:rStyle w:val="Lienhypertexte"/>
@@ -7669,7 +7669,7 @@
             <w:noProof/>
             <w:webHidden/>
           </w:rPr>
-          <w:instrText xml:space="preserve"> PAGEREF _Toc229310177 \h </w:instrText>
+          <w:instrText xml:space="preserve"> PAGEREF _Toc230112521 \h </w:instrText>
         </w:r>
         <w:r>
           <w:rPr>
@@ -7710,7 +7710,7 @@
           <w:noProof/>
         </w:rPr>
       </w:pPr>
-      <w:hyperlink w:anchor="_Toc229310178" w:history="1">
+      <w:hyperlink w:anchor="_Toc230112522" w:history="1">
         <w:r>
           <w:rPr>
             <w:rStyle w:val="Lienhypertexte"/>
@@ -7738,7 +7738,7 @@
             <w:noProof/>
             <w:webHidden/>
           </w:rPr>
-          <w:instrText xml:space="preserve"> PAGEREF _Toc229310178 \h </w:instrText>
+          <w:instrText xml:space="preserve"> PAGEREF _Toc230112522 \h </w:instrText>
         </w:r>
         <w:r>
           <w:rPr>
@@ -7779,7 +7779,7 @@
           <w:noProof/>
         </w:rPr>
       </w:pPr>
-      <w:hyperlink w:anchor="_Toc229310179" w:history="1">
+      <w:hyperlink w:anchor="_Toc230112523" w:history="1">
         <w:r>
           <w:rPr>
             <w:rStyle w:val="Lienhypertexte"/>
@@ -7807,7 +7807,7 @@
             <w:noProof/>
             <w:webHidden/>
           </w:rPr>
-          <w:instrText xml:space="preserve"> PAGEREF _Toc229310179 \h </w:instrText>
+          <w:instrText xml:space="preserve"> PAGEREF _Toc230112523 \h </w:instrText>
         </w:r>
         <w:r>
           <w:rPr>
@@ -7848,7 +7848,7 @@
           <w:noProof/>
         </w:rPr>
       </w:pPr>
-      <w:hyperlink w:anchor="_Toc229310180" w:history="1">
+      <w:hyperlink w:anchor="_Toc230112524" w:history="1">
         <w:r>
           <w:rPr>
             <w:rStyle w:val="Lienhypertexte"/>
@@ -7876,7 +7876,7 @@
             <w:noProof/>
             <w:webHidden/>
           </w:rPr>
-          <w:instrText xml:space="preserve"> PAGEREF _Toc229310180 \h </w:instrText>
+          <w:instrText xml:space="preserve"> PAGEREF _Toc230112524 \h </w:instrText>
         </w:r>
         <w:r>
           <w:rPr>
@@ -7917,7 +7917,7 @@
           <w:noProof/>
         </w:rPr>
       </w:pPr>
-      <w:hyperlink w:anchor="_Toc229310181" w:history="1">
+      <w:hyperlink w:anchor="_Toc230112525" w:history="1">
         <w:r>
           <w:rPr>
             <w:rStyle w:val="Lienhypertexte"/>
@@ -7945,7 +7945,7 @@
             <w:noProof/>
             <w:webHidden/>
           </w:rPr>
-          <w:instrText xml:space="preserve"> PAGEREF _Toc229310181 \h </w:instrText>
+          <w:instrText xml:space="preserve"> PAGEREF _Toc230112525 \h </w:instrText>
         </w:r>
         <w:r>
           <w:rPr>
@@ -8001,7 +8001,7 @@
         </w:pBdr>
         <w:spacing w:before="80" w:after="200"/>
       </w:pPr>
-      <w:bookmarkStart w:id="1" w:name="_Toc229310071"/>
+      <w:bookmarkStart w:id="1" w:name="_Toc230112415"/>
       <w:r>
         <w:rPr>
           <w:rFonts w:ascii="Aptos Display" w:hAnsi="Aptos Display"/>
@@ -8026,7 +8026,7 @@
           <w:noProof/>
         </w:rPr>
         <w:drawing>
-          <wp:inline distT="0" distB="0" distL="0" distR="0" wp14:anchorId="1B481135" wp14:editId="36C8D015">
+          <wp:inline distT="0" distB="0" distL="0" distR="0" wp14:anchorId="2632F0D4" wp14:editId="0B4DC14C">
             <wp:extent cx="5486400" cy="3320928"/>
             <wp:effectExtent l="0" t="0" r="0" b="0"/>
             <wp:docPr id="1" name="Picture 1"/>
@@ -8093,7 +8093,7 @@
           <w:noProof/>
         </w:rPr>
         <w:drawing>
-          <wp:inline distT="0" distB="0" distL="0" distR="0" wp14:anchorId="50E38773" wp14:editId="43D02E1B">
+          <wp:inline distT="0" distB="0" distL="0" distR="0" wp14:anchorId="40FD30A4" wp14:editId="4C3FC79D">
             <wp:extent cx="5486400" cy="3676506"/>
             <wp:effectExtent l="0" t="0" r="0" b="0"/>
             <wp:docPr id="2" name="Picture 2"/>
@@ -8269,7 +8269,7 @@
         <w:pStyle w:val="Titre2"/>
         <w:spacing w:before="460" w:after="220"/>
       </w:pPr>
-      <w:bookmarkStart w:id="2" w:name="_Toc229310072"/>
+      <w:bookmarkStart w:id="2" w:name="_Toc230112416"/>
       <w:r>
         <w:rPr>
           <w:rFonts w:ascii="Aptos Display" w:hAnsi="Aptos Display"/>
@@ -8683,7 +8683,7 @@
         <w:pStyle w:val="Titre2"/>
         <w:spacing w:before="460" w:after="220"/>
       </w:pPr>
-      <w:bookmarkStart w:id="3" w:name="_Toc229310073"/>
+      <w:bookmarkStart w:id="3" w:name="_Toc230112417"/>
       <w:r>
         <w:rPr>
           <w:rFonts w:ascii="Aptos Display" w:hAnsi="Aptos Display"/>
@@ -8722,7 +8722,7 @@
           <w:noProof/>
         </w:rPr>
         <w:drawing>
-          <wp:inline distT="0" distB="0" distL="0" distR="0" wp14:anchorId="248587CB" wp14:editId="31B74340">
+          <wp:inline distT="0" distB="0" distL="0" distR="0" wp14:anchorId="45D9A92D" wp14:editId="4A3C06B4">
             <wp:extent cx="4192474" cy="7498079"/>
             <wp:effectExtent l="0" t="0" r="0" b="0"/>
             <wp:docPr id="3" name="Picture 3"/>
@@ -8790,7 +8790,7 @@
         </w:rPr>
         <w:lastRenderedPageBreak/>
         <w:drawing>
-          <wp:inline distT="0" distB="0" distL="0" distR="0" wp14:anchorId="5E9BB32F" wp14:editId="1635F01D">
+          <wp:inline distT="0" distB="0" distL="0" distR="0" wp14:anchorId="7BD9FBAE" wp14:editId="74994FAC">
             <wp:extent cx="4001844" cy="7498079"/>
             <wp:effectExtent l="0" t="0" r="0" b="0"/>
             <wp:docPr id="4" name="Picture 4"/>
@@ -8969,7 +8969,7 @@
         <w:pStyle w:val="Titre2"/>
         <w:spacing w:before="460" w:after="220"/>
       </w:pPr>
-      <w:bookmarkStart w:id="4" w:name="_Toc229310074"/>
+      <w:bookmarkStart w:id="4" w:name="_Toc230112418"/>
       <w:r>
         <w:rPr>
           <w:rFonts w:ascii="Aptos Display" w:hAnsi="Aptos Display"/>
@@ -9063,7 +9063,7 @@
         <w:pStyle w:val="Titre2"/>
         <w:spacing w:before="460" w:after="220"/>
       </w:pPr>
-      <w:bookmarkStart w:id="5" w:name="_Toc229310075"/>
+      <w:bookmarkStart w:id="5" w:name="_Toc230112419"/>
       <w:r>
         <w:rPr>
           <w:rFonts w:ascii="Aptos Display" w:hAnsi="Aptos Display"/>
@@ -9224,7 +9224,7 @@
         </w:pBdr>
         <w:spacing w:before="80" w:after="200"/>
       </w:pPr>
-      <w:bookmarkStart w:id="6" w:name="_Toc229310076"/>
+      <w:bookmarkStart w:id="6" w:name="_Toc230112420"/>
       <w:r>
         <w:rPr>
           <w:rFonts w:ascii="Aptos Display" w:hAnsi="Aptos Display"/>
@@ -9249,7 +9249,7 @@
           <w:noProof/>
         </w:rPr>
         <w:drawing>
-          <wp:inline distT="0" distB="0" distL="0" distR="0" wp14:anchorId="2E493A70" wp14:editId="4A53B37A">
+          <wp:inline distT="0" distB="0" distL="0" distR="0" wp14:anchorId="3892774A" wp14:editId="65F72AD2">
             <wp:extent cx="3699052" cy="7498079"/>
             <wp:effectExtent l="0" t="0" r="0" b="0"/>
             <wp:docPr id="5" name="Picture 5"/>
@@ -9317,7 +9317,7 @@
         <w:pStyle w:val="Titre2"/>
         <w:spacing w:before="460" w:after="220"/>
       </w:pPr>
-      <w:bookmarkStart w:id="7" w:name="_Toc229310077"/>
+      <w:bookmarkStart w:id="7" w:name="_Toc230112421"/>
       <w:r>
         <w:rPr>
           <w:rFonts w:ascii="Aptos Display" w:hAnsi="Aptos Display"/>
@@ -9356,7 +9356,7 @@
           <w:noProof/>
         </w:rPr>
         <w:drawing>
-          <wp:inline distT="0" distB="0" distL="0" distR="0" wp14:anchorId="08193287" wp14:editId="49B42B66">
+          <wp:inline distT="0" distB="0" distL="0" distR="0" wp14:anchorId="5632AB6E" wp14:editId="70E77F70">
             <wp:extent cx="4852378" cy="7498079"/>
             <wp:effectExtent l="0" t="0" r="0" b="0"/>
             <wp:docPr id="6" name="Picture 6"/>
@@ -9906,7 +9906,7 @@
         <w:pStyle w:val="Titre2"/>
         <w:spacing w:before="460" w:after="220"/>
       </w:pPr>
-      <w:bookmarkStart w:id="8" w:name="_Toc229310078"/>
+      <w:bookmarkStart w:id="8" w:name="_Toc230112422"/>
       <w:r>
         <w:rPr>
           <w:rFonts w:ascii="Aptos Display" w:hAnsi="Aptos Display"/>
@@ -10274,7 +10274,7 @@
         <w:pStyle w:val="Titre2"/>
         <w:spacing w:before="460" w:after="220"/>
       </w:pPr>
-      <w:bookmarkStart w:id="9" w:name="_Toc229310079"/>
+      <w:bookmarkStart w:id="9" w:name="_Toc230112423"/>
       <w:r>
         <w:rPr>
           <w:rFonts w:ascii="Aptos Display" w:hAnsi="Aptos Display"/>
@@ -10453,7 +10453,7 @@
         <w:pStyle w:val="Titre2"/>
         <w:spacing w:before="460" w:after="220"/>
       </w:pPr>
-      <w:bookmarkStart w:id="10" w:name="_Toc229310080"/>
+      <w:bookmarkStart w:id="10" w:name="_Toc230112424"/>
       <w:r>
         <w:rPr>
           <w:rFonts w:ascii="Aptos Display" w:hAnsi="Aptos Display"/>
@@ -10492,7 +10492,7 @@
           <w:noProof/>
         </w:rPr>
         <w:drawing>
-          <wp:inline distT="0" distB="0" distL="0" distR="0" wp14:anchorId="1FF1D767" wp14:editId="1BE13AC0">
+          <wp:inline distT="0" distB="0" distL="0" distR="0" wp14:anchorId="7C10DBC7" wp14:editId="2DCC574E">
             <wp:extent cx="5486400" cy="3363310"/>
             <wp:effectExtent l="0" t="0" r="0" b="0"/>
             <wp:docPr id="7" name="Picture 7"/>
@@ -10659,7 +10659,7 @@
         <w:pStyle w:val="Titre2"/>
         <w:spacing w:before="460" w:after="220"/>
       </w:pPr>
-      <w:bookmarkStart w:id="11" w:name="_Toc229310081"/>
+      <w:bookmarkStart w:id="11" w:name="_Toc230112425"/>
       <w:r>
         <w:rPr>
           <w:rFonts w:ascii="Aptos Display" w:hAnsi="Aptos Display"/>
@@ -10863,7 +10863,7 @@
         <w:pStyle w:val="Titre2"/>
         <w:spacing w:before="460" w:after="220"/>
       </w:pPr>
-      <w:bookmarkStart w:id="12" w:name="_Toc229310082"/>
+      <w:bookmarkStart w:id="12" w:name="_Toc230112426"/>
       <w:r>
         <w:rPr>
           <w:rFonts w:ascii="Aptos Display" w:hAnsi="Aptos Display"/>
@@ -10974,7 +10974,7 @@
         </w:pBdr>
         <w:spacing w:before="80" w:after="200"/>
       </w:pPr>
-      <w:bookmarkStart w:id="13" w:name="_Toc229310083"/>
+      <w:bookmarkStart w:id="13" w:name="_Toc230112427"/>
       <w:r>
         <w:rPr>
           <w:rFonts w:ascii="Aptos Display" w:hAnsi="Aptos Display"/>
@@ -10990,7 +10990,7 @@
         <w:pStyle w:val="Titre2"/>
         <w:spacing w:before="460" w:after="220"/>
       </w:pPr>
-      <w:bookmarkStart w:id="14" w:name="_Toc229310084"/>
+      <w:bookmarkStart w:id="14" w:name="_Toc230112428"/>
       <w:r>
         <w:rPr>
           <w:rFonts w:ascii="Aptos Display" w:hAnsi="Aptos Display"/>
@@ -11073,7 +11073,7 @@
         <w:pStyle w:val="Titre2"/>
         <w:spacing w:before="460" w:after="220"/>
       </w:pPr>
-      <w:bookmarkStart w:id="15" w:name="_Toc229310085"/>
+      <w:bookmarkStart w:id="15" w:name="_Toc230112429"/>
       <w:r>
         <w:rPr>
           <w:rFonts w:ascii="Aptos Display" w:hAnsi="Aptos Display"/>
@@ -11171,7 +11171,7 @@
         <w:pStyle w:val="Titre2"/>
         <w:spacing w:before="460" w:after="220"/>
       </w:pPr>
-      <w:bookmarkStart w:id="16" w:name="_Toc229310086"/>
+      <w:bookmarkStart w:id="16" w:name="_Toc230112430"/>
       <w:r>
         <w:rPr>
           <w:rFonts w:ascii="Aptos Display" w:hAnsi="Aptos Display"/>
@@ -11304,7 +11304,7 @@
         <w:pStyle w:val="Titre2"/>
         <w:spacing w:before="460" w:after="220"/>
       </w:pPr>
-      <w:bookmarkStart w:id="17" w:name="_Toc229310087"/>
+      <w:bookmarkStart w:id="17" w:name="_Toc230112431"/>
       <w:r>
         <w:rPr>
           <w:rFonts w:ascii="Aptos Display" w:hAnsi="Aptos Display"/>
@@ -11895,7 +11895,7 @@
         </w:pBdr>
         <w:spacing w:before="80" w:after="200"/>
       </w:pPr>
-      <w:bookmarkStart w:id="18" w:name="_Toc229310088"/>
+      <w:bookmarkStart w:id="18" w:name="_Toc230112432"/>
       <w:r>
         <w:rPr>
           <w:rFonts w:ascii="Aptos Display" w:hAnsi="Aptos Display"/>
@@ -11920,7 +11920,7 @@
           <w:noProof/>
         </w:rPr>
         <w:drawing>
-          <wp:inline distT="0" distB="0" distL="0" distR="0" wp14:anchorId="2A97914C" wp14:editId="13ADD745">
+          <wp:inline distT="0" distB="0" distL="0" distR="0" wp14:anchorId="133E287A" wp14:editId="52A37B54">
             <wp:extent cx="5486400" cy="3244475"/>
             <wp:effectExtent l="0" t="0" r="0" b="0"/>
             <wp:docPr id="8" name="Picture 8"/>
@@ -11987,7 +11987,7 @@
           <w:noProof/>
         </w:rPr>
         <w:drawing>
-          <wp:inline distT="0" distB="0" distL="0" distR="0" wp14:anchorId="0F28308F" wp14:editId="13DBA429">
+          <wp:inline distT="0" distB="0" distL="0" distR="0" wp14:anchorId="64BF2965" wp14:editId="14A3E667">
             <wp:extent cx="5486400" cy="4057865"/>
             <wp:effectExtent l="0" t="0" r="0" b="0"/>
             <wp:docPr id="9" name="Picture 9"/>
@@ -12067,7 +12067,7 @@
         <w:pStyle w:val="Titre2"/>
         <w:spacing w:before="460" w:after="220"/>
       </w:pPr>
-      <w:bookmarkStart w:id="19" w:name="_Toc229310089"/>
+      <w:bookmarkStart w:id="19" w:name="_Toc230112433"/>
       <w:r>
         <w:rPr>
           <w:rFonts w:ascii="Aptos Display" w:hAnsi="Aptos Display"/>
@@ -12156,6 +12156,39 @@
     </w:p>
     <w:p>
       <w:pPr>
+        <w:pStyle w:val="Listepuces"/>
+        <w:rPr>
+          <w:rFonts w:hint="eastAsia"/>
+        </w:rPr>
+      </w:pPr>
+      <w:r>
+        <w:t xml:space="preserve">optionally pass </w:t>
+      </w:r>
+      <w:r>
+        <w:rPr>
+          <w:rFonts w:ascii="Consolas" w:hAnsi="Consolas"/>
+          <w:color w:val="374151"/>
+          <w:sz w:val="17"/>
+          <w:shd w:val="clear" w:color="auto" w:fill="F5F5F5"/>
+        </w:rPr>
+        <w:t>--asset-directory C:\Path\To\assets</w:t>
+      </w:r>
+      <w:r>
+        <w:t xml:space="preserve"> to use another</w:t>
+      </w:r>
+    </w:p>
+    <w:p>
+      <w:pPr>
+        <w:rPr>
+          <w:rFonts w:hint="eastAsia"/>
+        </w:rPr>
+      </w:pPr>
+      <w:r>
+        <w:t>authored asset root for default window, page, font, and reticle paths</w:t>
+      </w:r>
+    </w:p>
+    <w:p>
+      <w:pPr>
         <w:rPr>
           <w:rFonts w:hint="eastAsia"/>
         </w:rPr>
@@ -12203,7 +12236,7 @@
         <w:pStyle w:val="Titre2"/>
         <w:spacing w:before="460" w:after="220"/>
       </w:pPr>
-      <w:bookmarkStart w:id="20" w:name="_Toc229310090"/>
+      <w:bookmarkStart w:id="20" w:name="_Toc230112434"/>
       <w:r>
         <w:rPr>
           <w:rFonts w:ascii="Aptos Display" w:hAnsi="Aptos Display"/>
@@ -12531,7 +12564,7 @@
         <w:pStyle w:val="Titre2"/>
         <w:spacing w:before="460" w:after="220"/>
       </w:pPr>
-      <w:bookmarkStart w:id="21" w:name="_Toc229310091"/>
+      <w:bookmarkStart w:id="21" w:name="_Toc230112435"/>
       <w:r>
         <w:rPr>
           <w:rFonts w:ascii="Aptos Display" w:hAnsi="Aptos Display"/>
@@ -12946,6 +12979,7 @@
                 <w:b/>
                 <w:sz w:val="19"/>
               </w:rPr>
+              <w:lastRenderedPageBreak/>
               <w:t>Reticle library folder</w:t>
             </w:r>
           </w:p>
@@ -12984,8 +13018,17 @@
         </w:rPr>
       </w:pPr>
       <w:r>
-        <w:lastRenderedPageBreak/>
         <w:t>These fields correspond directly to the root of the JSON window.</w:t>
+      </w:r>
+    </w:p>
+    <w:p>
+      <w:pPr>
+        <w:rPr>
+          <w:rFonts w:hint="eastAsia"/>
+        </w:rPr>
+      </w:pPr>
+      <w:r>
+        <w:t>The creation popup uses native Windows pickers: save-file pickers for new window and page JSON files, an open-file picker for the optional font, and a folder picker for the reticle library. The popup stays open after each picker returns so the draft can be completed in one pass.</w:t>
       </w:r>
     </w:p>
     <w:p>
@@ -12993,7 +13036,7 @@
         <w:pStyle w:val="Titre2"/>
         <w:spacing w:before="460" w:after="220"/>
       </w:pPr>
-      <w:bookmarkStart w:id="22" w:name="_Toc229310092"/>
+      <w:bookmarkStart w:id="22" w:name="_Toc230112436"/>
       <w:r>
         <w:rPr>
           <w:rFonts w:ascii="Aptos Display" w:hAnsi="Aptos Display"/>
@@ -13032,7 +13075,7 @@
         <w:pStyle w:val="Titre3"/>
         <w:spacing w:before="60" w:after="80"/>
       </w:pPr>
-      <w:bookmarkStart w:id="23" w:name="_Toc229310093"/>
+      <w:bookmarkStart w:id="23" w:name="_Toc230112437"/>
       <w:r>
         <w:rPr>
           <w:rFonts w:ascii="Aptos" w:hAnsi="Aptos"/>
@@ -13327,7 +13370,7 @@
         <w:pStyle w:val="Titre3"/>
         <w:spacing w:before="60" w:after="80"/>
       </w:pPr>
-      <w:bookmarkStart w:id="24" w:name="_Toc229310094"/>
+      <w:bookmarkStart w:id="24" w:name="_Toc230112438"/>
       <w:r>
         <w:rPr>
           <w:rFonts w:ascii="Aptos" w:hAnsi="Aptos"/>
@@ -13644,7 +13687,7 @@
         <w:pStyle w:val="Titre2"/>
         <w:spacing w:before="460" w:after="220"/>
       </w:pPr>
-      <w:bookmarkStart w:id="25" w:name="_Toc229310095"/>
+      <w:bookmarkStart w:id="25" w:name="_Toc230112439"/>
       <w:r>
         <w:rPr>
           <w:rFonts w:ascii="Aptos Display" w:hAnsi="Aptos Display"/>
@@ -13938,6 +13981,7 @@
                 <w:b/>
                 <w:sz w:val="19"/>
               </w:rPr>
+              <w:lastRenderedPageBreak/>
               <w:t>First page background</w:t>
             </w:r>
           </w:p>
@@ -13996,13 +14040,12 @@
         <w:pStyle w:val="Titre2"/>
         <w:spacing w:before="460" w:after="220"/>
       </w:pPr>
-      <w:bookmarkStart w:id="26" w:name="_Toc229310096"/>
+      <w:bookmarkStart w:id="26" w:name="_Toc230112440"/>
       <w:r>
         <w:rPr>
           <w:rFonts w:ascii="Aptos Display" w:hAnsi="Aptos Display"/>
           <w:color w:val="1E88E5"/>
         </w:rPr>
-        <w:lastRenderedPageBreak/>
         <w:t>▪</w:t>
       </w:r>
       <w:r>
@@ -14096,7 +14139,7 @@
         <w:pStyle w:val="Titre2"/>
         <w:spacing w:before="460" w:after="220"/>
       </w:pPr>
-      <w:bookmarkStart w:id="27" w:name="_Toc229310097"/>
+      <w:bookmarkStart w:id="27" w:name="_Toc230112441"/>
       <w:r>
         <w:rPr>
           <w:rFonts w:ascii="Aptos Display" w:hAnsi="Aptos Display"/>
@@ -14196,7 +14239,7 @@
         <w:pStyle w:val="Titre2"/>
         <w:spacing w:before="460" w:after="220"/>
       </w:pPr>
-      <w:bookmarkStart w:id="28" w:name="_Toc229310098"/>
+      <w:bookmarkStart w:id="28" w:name="_Toc230112442"/>
       <w:r>
         <w:rPr>
           <w:rFonts w:ascii="Aptos Display" w:hAnsi="Aptos Display"/>
@@ -14225,7 +14268,7 @@
         <w:pStyle w:val="Titre3"/>
         <w:spacing w:before="60" w:after="80"/>
       </w:pPr>
-      <w:bookmarkStart w:id="29" w:name="_Toc229310099"/>
+      <w:bookmarkStart w:id="29" w:name="_Toc230112443"/>
       <w:r>
         <w:rPr>
           <w:rFonts w:ascii="Aptos" w:hAnsi="Aptos"/>
@@ -14263,7 +14306,7 @@
         <w:pStyle w:val="Titre3"/>
         <w:spacing w:before="60" w:after="80"/>
       </w:pPr>
-      <w:bookmarkStart w:id="30" w:name="_Toc229310100"/>
+      <w:bookmarkStart w:id="30" w:name="_Toc230112444"/>
       <w:r>
         <w:rPr>
           <w:rFonts w:ascii="Aptos" w:hAnsi="Aptos"/>
@@ -14345,7 +14388,7 @@
         <w:pStyle w:val="Titre3"/>
         <w:spacing w:before="60" w:after="80"/>
       </w:pPr>
-      <w:bookmarkStart w:id="31" w:name="_Toc229310101"/>
+      <w:bookmarkStart w:id="31" w:name="_Toc230112445"/>
       <w:r>
         <w:rPr>
           <w:rFonts w:ascii="Aptos" w:hAnsi="Aptos"/>
@@ -14453,7 +14496,7 @@
         <w:pStyle w:val="Titre3"/>
         <w:spacing w:before="60" w:after="80"/>
       </w:pPr>
-      <w:bookmarkStart w:id="32" w:name="_Toc229310102"/>
+      <w:bookmarkStart w:id="32" w:name="_Toc230112446"/>
       <w:r>
         <w:rPr>
           <w:rFonts w:ascii="Aptos" w:hAnsi="Aptos"/>
@@ -14491,12 +14534,13 @@
         <w:pStyle w:val="Titre2"/>
         <w:spacing w:before="460" w:after="220"/>
       </w:pPr>
-      <w:bookmarkStart w:id="33" w:name="_Toc229310103"/>
+      <w:bookmarkStart w:id="33" w:name="_Toc230112447"/>
       <w:r>
         <w:rPr>
           <w:rFonts w:ascii="Aptos Display" w:hAnsi="Aptos Display"/>
           <w:color w:val="1E88E5"/>
         </w:rPr>
+        <w:lastRenderedPageBreak/>
         <w:t>▪</w:t>
       </w:r>
       <w:r>
@@ -14559,7 +14603,6 @@
                 <w:color w:val="FFFFFF"/>
                 <w:sz w:val="17"/>
               </w:rPr>
-              <w:lastRenderedPageBreak/>
               <w:t>Canonical field</w:t>
             </w:r>
           </w:p>
@@ -15181,7 +15224,7 @@
         <w:pStyle w:val="Titre2"/>
         <w:spacing w:before="460" w:after="220"/>
       </w:pPr>
-      <w:bookmarkStart w:id="34" w:name="_Toc229310104"/>
+      <w:bookmarkStart w:id="34" w:name="_Toc230112448"/>
       <w:r>
         <w:rPr>
           <w:rFonts w:ascii="Aptos Display" w:hAnsi="Aptos Display"/>
@@ -15800,6 +15843,7 @@
                 <w:b/>
                 <w:sz w:val="19"/>
               </w:rPr>
+              <w:lastRenderedPageBreak/>
               <w:t>ellipse</w:t>
             </w:r>
           </w:p>
@@ -15956,7 +16000,6 @@
                 <w:b/>
                 <w:sz w:val="19"/>
               </w:rPr>
-              <w:lastRenderedPageBreak/>
               <w:t>diamond</w:t>
             </w:r>
           </w:p>
@@ -16571,7 +16614,7 @@
         <w:pStyle w:val="Titre2"/>
         <w:spacing w:before="460" w:after="220"/>
       </w:pPr>
-      <w:bookmarkStart w:id="35" w:name="_Toc229310105"/>
+      <w:bookmarkStart w:id="35" w:name="_Toc230112449"/>
       <w:r>
         <w:rPr>
           <w:rFonts w:ascii="Aptos Display" w:hAnsi="Aptos Display"/>
@@ -16757,7 +16800,7 @@
         <w:pStyle w:val="Titre2"/>
         <w:spacing w:before="460" w:after="220"/>
       </w:pPr>
-      <w:bookmarkStart w:id="36" w:name="_Toc229310106"/>
+      <w:bookmarkStart w:id="36" w:name="_Toc230112450"/>
       <w:r>
         <w:rPr>
           <w:rFonts w:ascii="Aptos Display" w:hAnsi="Aptos Display"/>
@@ -16880,6 +16923,7 @@
                 <w:b/>
                 <w:sz w:val="19"/>
               </w:rPr>
+              <w:lastRenderedPageBreak/>
               <w:t>Layer Inspector</w:t>
             </w:r>
           </w:p>
@@ -16986,7 +17030,6 @@
                 <w:b/>
                 <w:sz w:val="19"/>
               </w:rPr>
-              <w:lastRenderedPageBreak/>
               <w:t>Problems</w:t>
             </w:r>
           </w:p>
@@ -17245,7 +17288,7 @@
         <w:pStyle w:val="Titre3"/>
         <w:spacing w:before="60" w:after="80"/>
       </w:pPr>
-      <w:bookmarkStart w:id="37" w:name="_Toc229310107"/>
+      <w:bookmarkStart w:id="37" w:name="_Toc230112451"/>
       <w:r>
         <w:rPr>
           <w:rFonts w:ascii="Aptos" w:hAnsi="Aptos"/>
@@ -17340,7 +17383,7 @@
         <w:pStyle w:val="Titre2"/>
         <w:spacing w:before="460" w:after="220"/>
       </w:pPr>
-      <w:bookmarkStart w:id="38" w:name="_Toc229310108"/>
+      <w:bookmarkStart w:id="38" w:name="_Toc230112452"/>
       <w:r>
         <w:rPr>
           <w:rFonts w:ascii="Aptos Display" w:hAnsi="Aptos Display"/>
@@ -17454,7 +17497,7 @@
         <w:pStyle w:val="Titre2"/>
         <w:spacing w:before="460" w:after="220"/>
       </w:pPr>
-      <w:bookmarkStart w:id="39" w:name="_Toc229310109"/>
+      <w:bookmarkStart w:id="39" w:name="_Toc230112453"/>
       <w:r>
         <w:rPr>
           <w:rFonts w:ascii="Aptos Display" w:hAnsi="Aptos Display"/>
@@ -17493,7 +17536,7 @@
           <w:noProof/>
         </w:rPr>
         <w:drawing>
-          <wp:inline distT="0" distB="0" distL="0" distR="0" wp14:anchorId="6C3573F0" wp14:editId="59AD9D1F">
+          <wp:inline distT="0" distB="0" distL="0" distR="0" wp14:anchorId="6ECAC7AB" wp14:editId="745AEB8C">
             <wp:extent cx="5486400" cy="3190125"/>
             <wp:effectExtent l="0" t="0" r="0" b="0"/>
             <wp:docPr id="10" name="Picture 10"/>
@@ -17697,7 +17740,7 @@
         <w:pStyle w:val="Titre2"/>
         <w:spacing w:before="460" w:after="220"/>
       </w:pPr>
-      <w:bookmarkStart w:id="40" w:name="_Toc229310110"/>
+      <w:bookmarkStart w:id="40" w:name="_Toc230112454"/>
       <w:r>
         <w:rPr>
           <w:rFonts w:ascii="Aptos Display" w:hAnsi="Aptos Display"/>
@@ -17965,7 +18008,7 @@
         <w:pStyle w:val="Titre2"/>
         <w:spacing w:before="460" w:after="220"/>
       </w:pPr>
-      <w:bookmarkStart w:id="41" w:name="_Toc229310111"/>
+      <w:bookmarkStart w:id="41" w:name="_Toc230112455"/>
       <w:r>
         <w:rPr>
           <w:rFonts w:ascii="Aptos Display" w:hAnsi="Aptos Display"/>
@@ -18003,7 +18046,7 @@
           <w:noProof/>
         </w:rPr>
         <w:drawing>
-          <wp:inline distT="0" distB="0" distL="0" distR="0" wp14:anchorId="74718D7E" wp14:editId="434E15CE">
+          <wp:inline distT="0" distB="0" distL="0" distR="0" wp14:anchorId="5F0B4096" wp14:editId="4DB99588">
             <wp:extent cx="5486400" cy="6696000"/>
             <wp:effectExtent l="0" t="0" r="0" b="0"/>
             <wp:docPr id="11" name="Picture 11"/>
@@ -18221,7 +18264,7 @@
         <w:pStyle w:val="Titre2"/>
         <w:spacing w:before="460" w:after="220"/>
       </w:pPr>
-      <w:bookmarkStart w:id="42" w:name="_Toc229310112"/>
+      <w:bookmarkStart w:id="42" w:name="_Toc230112456"/>
       <w:r>
         <w:rPr>
           <w:rFonts w:ascii="Aptos Display" w:hAnsi="Aptos Display"/>
@@ -18426,7 +18469,7 @@
         <w:pStyle w:val="Titre2"/>
         <w:spacing w:before="460" w:after="220"/>
       </w:pPr>
-      <w:bookmarkStart w:id="43" w:name="_Toc229310113"/>
+      <w:bookmarkStart w:id="43" w:name="_Toc230112457"/>
       <w:r>
         <w:rPr>
           <w:rFonts w:ascii="Aptos Display" w:hAnsi="Aptos Display"/>
@@ -18529,7 +18572,7 @@
         <w:pStyle w:val="Titre2"/>
         <w:spacing w:before="460" w:after="220"/>
       </w:pPr>
-      <w:bookmarkStart w:id="44" w:name="_Toc229310114"/>
+      <w:bookmarkStart w:id="44" w:name="_Toc230112458"/>
       <w:r>
         <w:rPr>
           <w:rFonts w:ascii="Aptos Display" w:hAnsi="Aptos Display"/>
@@ -19015,7 +19058,7 @@
         <w:pStyle w:val="Titre2"/>
         <w:spacing w:before="460" w:after="220"/>
       </w:pPr>
-      <w:bookmarkStart w:id="45" w:name="_Toc229310115"/>
+      <w:bookmarkStart w:id="45" w:name="_Toc230112459"/>
       <w:r>
         <w:rPr>
           <w:rFonts w:ascii="Aptos Display" w:hAnsi="Aptos Display"/>
@@ -19210,7 +19253,7 @@
         </w:pBdr>
         <w:spacing w:before="80" w:after="200"/>
       </w:pPr>
-      <w:bookmarkStart w:id="46" w:name="_Toc229310116"/>
+      <w:bookmarkStart w:id="46" w:name="_Toc230112460"/>
       <w:r>
         <w:rPr>
           <w:rFonts w:ascii="Aptos Display" w:hAnsi="Aptos Display"/>
@@ -19246,7 +19289,7 @@
         <w:pStyle w:val="Titre2"/>
         <w:spacing w:before="460" w:after="220"/>
       </w:pPr>
-      <w:bookmarkStart w:id="47" w:name="_Toc229310117"/>
+      <w:bookmarkStart w:id="47" w:name="_Toc230112461"/>
       <w:r>
         <w:rPr>
           <w:rFonts w:ascii="Aptos Display" w:hAnsi="Aptos Display"/>
@@ -19407,7 +19450,7 @@
         <w:pStyle w:val="Titre2"/>
         <w:spacing w:before="460" w:after="220"/>
       </w:pPr>
-      <w:bookmarkStart w:id="48" w:name="_Toc229310118"/>
+      <w:bookmarkStart w:id="48" w:name="_Toc230112462"/>
       <w:r>
         <w:rPr>
           <w:rFonts w:ascii="Aptos Display" w:hAnsi="Aptos Display"/>
@@ -19572,7 +19615,7 @@
         <w:pStyle w:val="Titre2"/>
         <w:spacing w:before="460" w:after="220"/>
       </w:pPr>
-      <w:bookmarkStart w:id="49" w:name="_Toc229310119"/>
+      <w:bookmarkStart w:id="49" w:name="_Toc230112463"/>
       <w:r>
         <w:rPr>
           <w:rFonts w:ascii="Aptos Display" w:hAnsi="Aptos Display"/>
@@ -20499,7 +20542,7 @@
         <w:pStyle w:val="Titre2"/>
         <w:spacing w:before="460" w:after="220"/>
       </w:pPr>
-      <w:bookmarkStart w:id="50" w:name="_Toc229310120"/>
+      <w:bookmarkStart w:id="50" w:name="_Toc230112464"/>
       <w:r>
         <w:rPr>
           <w:rFonts w:ascii="Aptos Display" w:hAnsi="Aptos Display"/>
@@ -20537,7 +20580,7 @@
           <w:noProof/>
         </w:rPr>
         <w:drawing>
-          <wp:inline distT="0" distB="0" distL="0" distR="0" wp14:anchorId="25A76391" wp14:editId="21A38273">
+          <wp:inline distT="0" distB="0" distL="0" distR="0" wp14:anchorId="63AA507B" wp14:editId="17DE62DE">
             <wp:extent cx="5486400" cy="3005803"/>
             <wp:effectExtent l="0" t="0" r="0" b="0"/>
             <wp:docPr id="12" name="Picture 12"/>
@@ -20720,7 +20763,7 @@
           <w:noProof/>
         </w:rPr>
         <w:drawing>
-          <wp:inline distT="0" distB="0" distL="0" distR="0" wp14:anchorId="18D04847" wp14:editId="09717EBF">
+          <wp:inline distT="0" distB="0" distL="0" distR="0" wp14:anchorId="49838C81" wp14:editId="56B210FF">
             <wp:extent cx="4004012" cy="7498079"/>
             <wp:effectExtent l="0" t="0" r="0" b="0"/>
             <wp:docPr id="13" name="Picture 13"/>
@@ -20778,7 +20821,7 @@
         <w:pStyle w:val="Titre2"/>
         <w:spacing w:before="460" w:after="220"/>
       </w:pPr>
-      <w:bookmarkStart w:id="51" w:name="_Toc229310121"/>
+      <w:bookmarkStart w:id="51" w:name="_Toc230112465"/>
       <w:r>
         <w:rPr>
           <w:rFonts w:ascii="Aptos Display" w:hAnsi="Aptos Display"/>
@@ -21077,7 +21120,7 @@
         <w:pStyle w:val="Titre2"/>
         <w:spacing w:before="460" w:after="220"/>
       </w:pPr>
-      <w:bookmarkStart w:id="52" w:name="_Toc229310122"/>
+      <w:bookmarkStart w:id="52" w:name="_Toc230112466"/>
       <w:r>
         <w:rPr>
           <w:rFonts w:ascii="Aptos Display" w:hAnsi="Aptos Display"/>
@@ -21693,7 +21736,7 @@
         <w:pStyle w:val="Titre2"/>
         <w:spacing w:before="460" w:after="220"/>
       </w:pPr>
-      <w:bookmarkStart w:id="53" w:name="_Toc229310123"/>
+      <w:bookmarkStart w:id="53" w:name="_Toc230112467"/>
       <w:r>
         <w:rPr>
           <w:rFonts w:ascii="Aptos Display" w:hAnsi="Aptos Display"/>
@@ -21828,7 +21871,7 @@
         <w:pStyle w:val="Titre2"/>
         <w:spacing w:before="460" w:after="220"/>
       </w:pPr>
-      <w:bookmarkStart w:id="54" w:name="_Toc229310124"/>
+      <w:bookmarkStart w:id="54" w:name="_Toc230112468"/>
       <w:r>
         <w:rPr>
           <w:rFonts w:ascii="Aptos Display" w:hAnsi="Aptos Display"/>
@@ -21996,7 +22039,7 @@
         <w:pStyle w:val="Titre2"/>
         <w:spacing w:before="460" w:after="220"/>
       </w:pPr>
-      <w:bookmarkStart w:id="55" w:name="_Toc229310125"/>
+      <w:bookmarkStart w:id="55" w:name="_Toc230112469"/>
       <w:r>
         <w:rPr>
           <w:rFonts w:ascii="Aptos Display" w:hAnsi="Aptos Display"/>
@@ -22455,7 +22498,7 @@
         <w:pStyle w:val="Titre2"/>
         <w:spacing w:before="460" w:after="220"/>
       </w:pPr>
-      <w:bookmarkStart w:id="56" w:name="_Toc229310126"/>
+      <w:bookmarkStart w:id="56" w:name="_Toc230112470"/>
       <w:r>
         <w:rPr>
           <w:rFonts w:ascii="Aptos Display" w:hAnsi="Aptos Display"/>
@@ -22746,7 +22789,7 @@
         <w:pStyle w:val="Titre2"/>
         <w:spacing w:before="460" w:after="220"/>
       </w:pPr>
-      <w:bookmarkStart w:id="57" w:name="_Toc229310127"/>
+      <w:bookmarkStart w:id="57" w:name="_Toc230112471"/>
       <w:r>
         <w:rPr>
           <w:rFonts w:ascii="Aptos Display" w:hAnsi="Aptos Display"/>
@@ -22926,7 +22969,7 @@
         <w:pStyle w:val="Titre2"/>
         <w:spacing w:before="460" w:after="220"/>
       </w:pPr>
-      <w:bookmarkStart w:id="58" w:name="_Toc229310128"/>
+      <w:bookmarkStart w:id="58" w:name="_Toc230112472"/>
       <w:r>
         <w:rPr>
           <w:rFonts w:ascii="Aptos Display" w:hAnsi="Aptos Display"/>
@@ -23596,7 +23639,7 @@
         </w:pBdr>
         <w:spacing w:before="80" w:after="200"/>
       </w:pPr>
-      <w:bookmarkStart w:id="59" w:name="_Toc229310129"/>
+      <w:bookmarkStart w:id="59" w:name="_Toc230112473"/>
       <w:r>
         <w:rPr>
           <w:rFonts w:ascii="Aptos Display" w:hAnsi="Aptos Display"/>
@@ -23621,7 +23664,7 @@
           <w:noProof/>
         </w:rPr>
         <w:drawing>
-          <wp:inline distT="0" distB="0" distL="0" distR="0" wp14:anchorId="62182CA4" wp14:editId="547585D0">
+          <wp:inline distT="0" distB="0" distL="0" distR="0" wp14:anchorId="0842E234" wp14:editId="08EC9705">
             <wp:extent cx="5486400" cy="3347633"/>
             <wp:effectExtent l="0" t="0" r="0" b="0"/>
             <wp:docPr id="14" name="Picture 14"/>
@@ -23689,7 +23732,7 @@
         <w:pStyle w:val="Titre2"/>
         <w:spacing w:before="460" w:after="220"/>
       </w:pPr>
-      <w:bookmarkStart w:id="60" w:name="_Toc229310130"/>
+      <w:bookmarkStart w:id="60" w:name="_Toc230112474"/>
       <w:r>
         <w:rPr>
           <w:rFonts w:ascii="Aptos Display" w:hAnsi="Aptos Display"/>
@@ -23727,7 +23770,7 @@
           <w:noProof/>
         </w:rPr>
         <w:drawing>
-          <wp:inline distT="0" distB="0" distL="0" distR="0" wp14:anchorId="3B9B6E87" wp14:editId="54EC1572">
+          <wp:inline distT="0" distB="0" distL="0" distR="0" wp14:anchorId="776A6225" wp14:editId="474422A5">
             <wp:extent cx="5486400" cy="2887578"/>
             <wp:effectExtent l="0" t="0" r="0" b="0"/>
             <wp:docPr id="15" name="Picture 15"/>
@@ -24081,7 +24124,7 @@
         <w:pStyle w:val="Titre2"/>
         <w:spacing w:before="460" w:after="220"/>
       </w:pPr>
-      <w:bookmarkStart w:id="61" w:name="_Toc229310131"/>
+      <w:bookmarkStart w:id="61" w:name="_Toc230112475"/>
       <w:r>
         <w:rPr>
           <w:rFonts w:ascii="Aptos Display" w:hAnsi="Aptos Display"/>
@@ -24367,7 +24410,7 @@
         <w:pStyle w:val="Titre2"/>
         <w:spacing w:before="460" w:after="220"/>
       </w:pPr>
-      <w:bookmarkStart w:id="62" w:name="_Toc229310132"/>
+      <w:bookmarkStart w:id="62" w:name="_Toc230112476"/>
       <w:r>
         <w:rPr>
           <w:rFonts w:ascii="Aptos Display" w:hAnsi="Aptos Display"/>
@@ -24576,7 +24619,7 @@
         <w:pStyle w:val="Titre2"/>
         <w:spacing w:before="460" w:after="220"/>
       </w:pPr>
-      <w:bookmarkStart w:id="63" w:name="_Toc229310133"/>
+      <w:bookmarkStart w:id="63" w:name="_Toc230112477"/>
       <w:r>
         <w:rPr>
           <w:rFonts w:ascii="Aptos Display" w:hAnsi="Aptos Display"/>
@@ -24840,7 +24883,7 @@
         <w:pStyle w:val="Titre2"/>
         <w:spacing w:before="460" w:after="220"/>
       </w:pPr>
-      <w:bookmarkStart w:id="64" w:name="_Toc229310134"/>
+      <w:bookmarkStart w:id="64" w:name="_Toc230112478"/>
       <w:r>
         <w:rPr>
           <w:rFonts w:ascii="Aptos Display" w:hAnsi="Aptos Display"/>
@@ -24879,7 +24922,7 @@
           <w:noProof/>
         </w:rPr>
         <w:drawing>
-          <wp:inline distT="0" distB="0" distL="0" distR="0" wp14:anchorId="7FFF9F89" wp14:editId="0C9844E8">
+          <wp:inline distT="0" distB="0" distL="0" distR="0" wp14:anchorId="1BF201DD" wp14:editId="2E3E40AC">
             <wp:extent cx="5486400" cy="4315364"/>
             <wp:effectExtent l="0" t="0" r="0" b="0"/>
             <wp:docPr id="16" name="Picture 16"/>
@@ -25492,7 +25535,7 @@
         <w:pStyle w:val="Titre2"/>
         <w:spacing w:before="460" w:after="220"/>
       </w:pPr>
-      <w:bookmarkStart w:id="65" w:name="_Toc229310135"/>
+      <w:bookmarkStart w:id="65" w:name="_Toc230112479"/>
       <w:r>
         <w:rPr>
           <w:rFonts w:ascii="Aptos Display" w:hAnsi="Aptos Display"/>
@@ -25640,7 +25683,7 @@
         <w:pStyle w:val="Titre2"/>
         <w:spacing w:before="460" w:after="220"/>
       </w:pPr>
-      <w:bookmarkStart w:id="66" w:name="_Toc229310136"/>
+      <w:bookmarkStart w:id="66" w:name="_Toc230112480"/>
       <w:r>
         <w:rPr>
           <w:rFonts w:ascii="Aptos Display" w:hAnsi="Aptos Display"/>
@@ -25814,7 +25857,7 @@
         <w:pStyle w:val="Titre2"/>
         <w:spacing w:before="460" w:after="220"/>
       </w:pPr>
-      <w:bookmarkStart w:id="67" w:name="_Toc229310137"/>
+      <w:bookmarkStart w:id="67" w:name="_Toc230112481"/>
       <w:r>
         <w:rPr>
           <w:rFonts w:ascii="Aptos Display" w:hAnsi="Aptos Display"/>
@@ -26149,7 +26192,7 @@
         <w:pStyle w:val="Titre3"/>
         <w:spacing w:before="60" w:after="80"/>
       </w:pPr>
-      <w:bookmarkStart w:id="68" w:name="_Toc229310138"/>
+      <w:bookmarkStart w:id="68" w:name="_Toc230112482"/>
       <w:r>
         <w:rPr>
           <w:rFonts w:ascii="Aptos" w:hAnsi="Aptos"/>
@@ -26763,7 +26806,7 @@
         <w:pStyle w:val="Titre2"/>
         <w:spacing w:before="460" w:after="220"/>
       </w:pPr>
-      <w:bookmarkStart w:id="69" w:name="_Toc229310139"/>
+      <w:bookmarkStart w:id="69" w:name="_Toc230112483"/>
       <w:r>
         <w:rPr>
           <w:rFonts w:ascii="Aptos Display" w:hAnsi="Aptos Display"/>
@@ -26899,7 +26942,7 @@
         <w:pStyle w:val="Titre3"/>
         <w:spacing w:before="60" w:after="80"/>
       </w:pPr>
-      <w:bookmarkStart w:id="70" w:name="_Toc229310140"/>
+      <w:bookmarkStart w:id="70" w:name="_Toc230112484"/>
       <w:r>
         <w:rPr>
           <w:rFonts w:ascii="Aptos" w:hAnsi="Aptos"/>
@@ -27459,7 +27502,7 @@
         <w:pStyle w:val="Titre3"/>
         <w:spacing w:before="60" w:after="80"/>
       </w:pPr>
-      <w:bookmarkStart w:id="71" w:name="_Toc229310141"/>
+      <w:bookmarkStart w:id="71" w:name="_Toc230112485"/>
       <w:r>
         <w:rPr>
           <w:rFonts w:ascii="Aptos" w:hAnsi="Aptos"/>
@@ -28368,7 +28411,7 @@
         <w:pStyle w:val="Titre2"/>
         <w:spacing w:before="460" w:after="220"/>
       </w:pPr>
-      <w:bookmarkStart w:id="72" w:name="_Toc229310142"/>
+      <w:bookmarkStart w:id="72" w:name="_Toc230112486"/>
       <w:r>
         <w:rPr>
           <w:rFonts w:ascii="Aptos Display" w:hAnsi="Aptos Display"/>
@@ -28855,7 +28898,7 @@
         <w:pStyle w:val="Titre2"/>
         <w:spacing w:before="460" w:after="220"/>
       </w:pPr>
-      <w:bookmarkStart w:id="73" w:name="_Toc229310143"/>
+      <w:bookmarkStart w:id="73" w:name="_Toc230112487"/>
       <w:r>
         <w:rPr>
           <w:rFonts w:ascii="Aptos Display" w:hAnsi="Aptos Display"/>
@@ -29111,7 +29154,7 @@
         <w:pStyle w:val="Titre2"/>
         <w:spacing w:before="460" w:after="220"/>
       </w:pPr>
-      <w:bookmarkStart w:id="74" w:name="_Toc229310144"/>
+      <w:bookmarkStart w:id="74" w:name="_Toc230112488"/>
       <w:r>
         <w:rPr>
           <w:rFonts w:ascii="Aptos Display" w:hAnsi="Aptos Display"/>
@@ -29622,7 +29665,7 @@
         <w:pStyle w:val="Titre2"/>
         <w:spacing w:before="460" w:after="220"/>
       </w:pPr>
-      <w:bookmarkStart w:id="75" w:name="_Toc229310145"/>
+      <w:bookmarkStart w:id="75" w:name="_Toc230112489"/>
       <w:r>
         <w:rPr>
           <w:rFonts w:ascii="Aptos Display" w:hAnsi="Aptos Display"/>
@@ -29661,7 +29704,7 @@
           <w:noProof/>
         </w:rPr>
         <w:drawing>
-          <wp:inline distT="0" distB="0" distL="0" distR="0" wp14:anchorId="48982EC1" wp14:editId="11467DFB">
+          <wp:inline distT="0" distB="0" distL="0" distR="0" wp14:anchorId="2543C19B" wp14:editId="336716D9">
             <wp:extent cx="5486400" cy="3575221"/>
             <wp:effectExtent l="0" t="0" r="0" b="0"/>
             <wp:docPr id="17" name="Picture 17"/>
@@ -30036,11 +30079,21 @@
           <w:sz w:val="17"/>
           <w:shd w:val="clear" w:color="auto" w:fill="F5F5F5"/>
         </w:rPr>
+        <w:t>IsStrobeCaptured()</w:t>
+      </w:r>
+      <w:r>
+        <w:t xml:space="preserve"> means the runtime confirmed that exact dynamic instance</w:t>
+      </w:r>
+    </w:p>
+    <w:p>
+      <w:pPr>
+        <w:rPr>
+          <w:rFonts w:hint="eastAsia"/>
+        </w:rPr>
+      </w:pPr>
+      <w:r>
         <w:lastRenderedPageBreak/>
-        <w:t>IsStrobeCaptured()</w:t>
-      </w:r>
-      <w:r>
-        <w:t xml:space="preserve"> means the runtime confirmed that exact dynamic instance as the captured target</w:t>
+        <w:t>as the captured target on the currently active page strobe</w:t>
       </w:r>
     </w:p>
     <w:tbl>
@@ -30131,7 +30184,7 @@
         <w:pStyle w:val="Titre2"/>
         <w:spacing w:before="460" w:after="220"/>
       </w:pPr>
-      <w:bookmarkStart w:id="76" w:name="_Toc229310146"/>
+      <w:bookmarkStart w:id="76" w:name="_Toc230112490"/>
       <w:r>
         <w:rPr>
           <w:rFonts w:ascii="Aptos Display" w:hAnsi="Aptos Display"/>
@@ -30214,7 +30267,47 @@
         <w:t>DynamicReticle::IsStrobeCaptured()</w:t>
       </w:r>
       <w:r>
-        <w:t xml:space="preserve"> is false until the strobe feedback identifies that exact runtime reticle</w:t>
+        <w:t xml:space="preserve"> is false until the strobe feedback for</w:t>
+      </w:r>
+    </w:p>
+    <w:p>
+      <w:pPr>
+        <w:rPr>
+          <w:rFonts w:hint="eastAsia"/>
+        </w:rPr>
+      </w:pPr>
+      <w:r>
+        <w:t>the currently active page identifies that exact runtime reticle</w:t>
+      </w:r>
+    </w:p>
+    <w:p>
+      <w:pPr>
+        <w:pStyle w:val="Listepuces"/>
+        <w:rPr>
+          <w:rFonts w:hint="eastAsia"/>
+        </w:rPr>
+      </w:pPr>
+      <w:r>
+        <w:rPr>
+          <w:rFonts w:ascii="Consolas" w:hAnsi="Consolas"/>
+          <w:color w:val="374151"/>
+          <w:sz w:val="17"/>
+          <w:shd w:val="clear" w:color="auto" w:fill="F5F5F5"/>
+        </w:rPr>
+        <w:t>DynamicReticle::IsStrobeCaptured()</w:t>
+      </w:r>
+      <w:r>
+        <w:t xml:space="preserve"> becomes false again when another page</w:t>
+      </w:r>
+    </w:p>
+    <w:p>
+      <w:pPr>
+        <w:rPr>
+          <w:rFonts w:hint="eastAsia"/>
+        </w:rPr>
+      </w:pPr>
+      <w:r>
+        <w:t>becomes active until a fresh strobe snapshot arrives for the new active page</w:t>
       </w:r>
     </w:p>
     <w:p>
@@ -30254,7 +30347,7 @@
         <w:pStyle w:val="Titre2"/>
         <w:spacing w:before="460" w:after="220"/>
       </w:pPr>
-      <w:bookmarkStart w:id="77" w:name="_Toc229310147"/>
+      <w:bookmarkStart w:id="77" w:name="_Toc230112491"/>
       <w:r>
         <w:rPr>
           <w:rFonts w:ascii="Aptos Display" w:hAnsi="Aptos Display"/>
@@ -30436,7 +30529,7 @@
         <w:pStyle w:val="Titre2"/>
         <w:spacing w:before="460" w:after="220"/>
       </w:pPr>
-      <w:bookmarkStart w:id="78" w:name="_Toc229310148"/>
+      <w:bookmarkStart w:id="78" w:name="_Toc230112492"/>
       <w:r>
         <w:rPr>
           <w:rFonts w:ascii="Aptos Display" w:hAnsi="Aptos Display"/>
@@ -30564,6 +30657,14 @@
           <w:shd w:val="clear" w:color="auto" w:fill="F1F5F9"/>
         </w:rPr>
         <w:br/>
+      </w:r>
+      <w:r>
+        <w:rPr>
+          <w:rFonts w:ascii="Consolas" w:hAnsi="Consolas"/>
+          <w:sz w:val="17"/>
+          <w:shd w:val="clear" w:color="auto" w:fill="F1F5F9"/>
+        </w:rPr>
+        <w:lastRenderedPageBreak/>
         <w:t>patch.visible = true;</w:t>
       </w:r>
       <w:r>
@@ -30598,7 +30699,6 @@
           <w:sz w:val="17"/>
           <w:shd w:val="clear" w:color="auto" w:fill="F1F5F9"/>
         </w:rPr>
-        <w:lastRenderedPageBreak/>
         <w:br/>
         <w:t>if (!client.UpsertDynamicReticle("Cockpit", "lead_track", "cockpit_radar_contact", patch))</w:t>
       </w:r>
@@ -30645,7 +30745,7 @@
         <w:pStyle w:val="Titre2"/>
         <w:spacing w:before="460" w:after="220"/>
       </w:pPr>
-      <w:bookmarkStart w:id="79" w:name="_Toc229310149"/>
+      <w:bookmarkStart w:id="79" w:name="_Toc230112493"/>
       <w:r>
         <w:rPr>
           <w:rFonts w:ascii="Aptos Display" w:hAnsi="Aptos Display"/>
@@ -31064,7 +31164,7 @@
         </w:pBdr>
         <w:spacing w:before="80" w:after="200"/>
       </w:pPr>
-      <w:bookmarkStart w:id="80" w:name="_Toc229310150"/>
+      <w:bookmarkStart w:id="80" w:name="_Toc230112494"/>
       <w:r>
         <w:rPr>
           <w:rFonts w:ascii="Aptos Display" w:hAnsi="Aptos Display"/>
@@ -31089,7 +31189,7 @@
           <w:noProof/>
         </w:rPr>
         <w:drawing>
-          <wp:inline distT="0" distB="0" distL="0" distR="0" wp14:anchorId="585BADD2" wp14:editId="50282E80">
+          <wp:inline distT="0" distB="0" distL="0" distR="0" wp14:anchorId="14E45DDF" wp14:editId="17F20217">
             <wp:extent cx="4031889" cy="7498079"/>
             <wp:effectExtent l="0" t="0" r="0" b="0"/>
             <wp:docPr id="18" name="Picture 18"/>
@@ -31253,7 +31353,7 @@
           <w:noProof/>
         </w:rPr>
         <w:drawing>
-          <wp:inline distT="0" distB="0" distL="0" distR="0" wp14:anchorId="308CBCD7" wp14:editId="223563DE">
+          <wp:inline distT="0" distB="0" distL="0" distR="0" wp14:anchorId="3A46EA2C" wp14:editId="4D926E34">
             <wp:extent cx="5152526" cy="7498079"/>
             <wp:effectExtent l="0" t="0" r="0" b="0"/>
             <wp:docPr id="19" name="Picture 19"/>
@@ -31311,7 +31411,7 @@
         <w:pStyle w:val="Titre2"/>
         <w:spacing w:before="460" w:after="220"/>
       </w:pPr>
-      <w:bookmarkStart w:id="81" w:name="_Toc229310151"/>
+      <w:bookmarkStart w:id="81" w:name="_Toc230112495"/>
       <w:r>
         <w:rPr>
           <w:rFonts w:ascii="Aptos Display" w:hAnsi="Aptos Display"/>
@@ -31460,7 +31560,7 @@
         <w:pStyle w:val="Titre2"/>
         <w:spacing w:before="460" w:after="220"/>
       </w:pPr>
-      <w:bookmarkStart w:id="82" w:name="_Toc229310152"/>
+      <w:bookmarkStart w:id="82" w:name="_Toc230112496"/>
       <w:r>
         <w:rPr>
           <w:rFonts w:ascii="Aptos Display" w:hAnsi="Aptos Display"/>
@@ -31599,7 +31699,7 @@
         <w:pStyle w:val="Titre2"/>
         <w:spacing w:before="460" w:after="220"/>
       </w:pPr>
-      <w:bookmarkStart w:id="83" w:name="_Toc229310153"/>
+      <w:bookmarkStart w:id="83" w:name="_Toc230112497"/>
       <w:r>
         <w:rPr>
           <w:rFonts w:ascii="Aptos Display" w:hAnsi="Aptos Display"/>
@@ -32468,7 +32568,7 @@
         <w:pStyle w:val="Titre2"/>
         <w:spacing w:before="460" w:after="220"/>
       </w:pPr>
-      <w:bookmarkStart w:id="84" w:name="_Toc229310154"/>
+      <w:bookmarkStart w:id="84" w:name="_Toc230112498"/>
       <w:r>
         <w:rPr>
           <w:rFonts w:ascii="Aptos Display" w:hAnsi="Aptos Display"/>
@@ -32976,7 +33076,7 @@
         <w:pStyle w:val="Titre2"/>
         <w:spacing w:before="460" w:after="220"/>
       </w:pPr>
-      <w:bookmarkStart w:id="85" w:name="_Toc229310155"/>
+      <w:bookmarkStart w:id="85" w:name="_Toc230112499"/>
       <w:r>
         <w:rPr>
           <w:rFonts w:ascii="Aptos Display" w:hAnsi="Aptos Display"/>
@@ -33467,7 +33567,7 @@
         <w:pStyle w:val="Titre2"/>
         <w:spacing w:before="460" w:after="220"/>
       </w:pPr>
-      <w:bookmarkStart w:id="86" w:name="_Toc229310156"/>
+      <w:bookmarkStart w:id="86" w:name="_Toc230112500"/>
       <w:r>
         <w:rPr>
           <w:rFonts w:ascii="Aptos Display" w:hAnsi="Aptos Display"/>
@@ -33505,7 +33605,7 @@
           <w:noProof/>
         </w:rPr>
         <w:drawing>
-          <wp:inline distT="0" distB="0" distL="0" distR="0" wp14:anchorId="7544F45E" wp14:editId="715FA73E">
+          <wp:inline distT="0" distB="0" distL="0" distR="0" wp14:anchorId="059AA107" wp14:editId="18203EBF">
             <wp:extent cx="5486400" cy="3942488"/>
             <wp:effectExtent l="0" t="0" r="0" b="0"/>
             <wp:docPr id="20" name="Picture 20"/>
@@ -33781,7 +33881,7 @@
         <w:pStyle w:val="Titre2"/>
         <w:spacing w:before="460" w:after="220"/>
       </w:pPr>
-      <w:bookmarkStart w:id="87" w:name="_Toc229310157"/>
+      <w:bookmarkStart w:id="87" w:name="_Toc230112501"/>
       <w:r>
         <w:rPr>
           <w:rFonts w:ascii="Aptos Display" w:hAnsi="Aptos Display"/>
@@ -34403,7 +34503,7 @@
         <w:pStyle w:val="Titre2"/>
         <w:spacing w:before="460" w:after="220"/>
       </w:pPr>
-      <w:bookmarkStart w:id="88" w:name="_Toc229310158"/>
+      <w:bookmarkStart w:id="88" w:name="_Toc230112502"/>
       <w:r>
         <w:rPr>
           <w:rFonts w:ascii="Aptos Display" w:hAnsi="Aptos Display"/>
@@ -34841,7 +34941,7 @@
         <w:pStyle w:val="Titre2"/>
         <w:spacing w:before="460" w:after="220"/>
       </w:pPr>
-      <w:bookmarkStart w:id="89" w:name="_Toc229310159"/>
+      <w:bookmarkStart w:id="89" w:name="_Toc230112503"/>
       <w:r>
         <w:rPr>
           <w:rFonts w:ascii="Aptos Display" w:hAnsi="Aptos Display"/>
@@ -35444,7 +35544,7 @@
         <w:pStyle w:val="Titre2"/>
         <w:spacing w:before="460" w:after="220"/>
       </w:pPr>
-      <w:bookmarkStart w:id="90" w:name="_Toc229310160"/>
+      <w:bookmarkStart w:id="90" w:name="_Toc230112504"/>
       <w:r>
         <w:rPr>
           <w:rFonts w:ascii="Aptos Display" w:hAnsi="Aptos Display"/>
@@ -35569,7 +35669,7 @@
         <w:pStyle w:val="Titre2"/>
         <w:spacing w:before="460" w:after="220"/>
       </w:pPr>
-      <w:bookmarkStart w:id="91" w:name="_Toc229310161"/>
+      <w:bookmarkStart w:id="91" w:name="_Toc230112505"/>
       <w:r>
         <w:rPr>
           <w:rFonts w:ascii="Aptos Display" w:hAnsi="Aptos Display"/>
@@ -35884,7 +35984,7 @@
         <w:pStyle w:val="Titre2"/>
         <w:spacing w:before="460" w:after="220"/>
       </w:pPr>
-      <w:bookmarkStart w:id="92" w:name="_Toc229310162"/>
+      <w:bookmarkStart w:id="92" w:name="_Toc230112506"/>
       <w:r>
         <w:rPr>
           <w:rFonts w:ascii="Aptos Display" w:hAnsi="Aptos Display"/>
@@ -36022,7 +36122,7 @@
         <w:pStyle w:val="Titre2"/>
         <w:spacing w:before="460" w:after="220"/>
       </w:pPr>
-      <w:bookmarkStart w:id="93" w:name="_Toc229310163"/>
+      <w:bookmarkStart w:id="93" w:name="_Toc230112507"/>
       <w:r>
         <w:rPr>
           <w:rFonts w:ascii="Aptos Display" w:hAnsi="Aptos Display"/>
@@ -36162,7 +36262,7 @@
         <w:pStyle w:val="Titre2"/>
         <w:spacing w:before="460" w:after="220"/>
       </w:pPr>
-      <w:bookmarkStart w:id="94" w:name="_Toc229310164"/>
+      <w:bookmarkStart w:id="94" w:name="_Toc230112508"/>
       <w:r>
         <w:rPr>
           <w:rFonts w:ascii="Aptos Display" w:hAnsi="Aptos Display"/>
@@ -36372,7 +36472,7 @@
         </w:pBdr>
         <w:spacing w:before="80" w:after="200"/>
       </w:pPr>
-      <w:bookmarkStart w:id="95" w:name="_Toc229310165"/>
+      <w:bookmarkStart w:id="95" w:name="_Toc230112509"/>
       <w:r>
         <w:rPr>
           <w:rFonts w:ascii="Aptos Display" w:hAnsi="Aptos Display"/>
@@ -36397,7 +36497,7 @@
           <w:noProof/>
         </w:rPr>
         <w:drawing>
-          <wp:inline distT="0" distB="0" distL="0" distR="0" wp14:anchorId="7D9FE158" wp14:editId="7994D57E">
+          <wp:inline distT="0" distB="0" distL="0" distR="0" wp14:anchorId="2813D784" wp14:editId="1C3FAA4A">
             <wp:extent cx="4601762" cy="7498079"/>
             <wp:effectExtent l="0" t="0" r="0" b="0"/>
             <wp:docPr id="21" name="Picture 21"/>
@@ -36499,7 +36599,7 @@
         <w:pStyle w:val="Titre2"/>
         <w:spacing w:before="460" w:after="220"/>
       </w:pPr>
-      <w:bookmarkStart w:id="96" w:name="_Toc229310166"/>
+      <w:bookmarkStart w:id="96" w:name="_Toc230112510"/>
       <w:r>
         <w:rPr>
           <w:rFonts w:ascii="Aptos Display" w:hAnsi="Aptos Display"/>
@@ -36627,7 +36727,7 @@
         <w:pStyle w:val="Titre2"/>
         <w:spacing w:before="460" w:after="220"/>
       </w:pPr>
-      <w:bookmarkStart w:id="97" w:name="_Toc229310167"/>
+      <w:bookmarkStart w:id="97" w:name="_Toc230112511"/>
       <w:r>
         <w:rPr>
           <w:rFonts w:ascii="Aptos Display" w:hAnsi="Aptos Display"/>
@@ -36988,7 +37088,7 @@
         <w:pStyle w:val="Titre2"/>
         <w:spacing w:before="460" w:after="220"/>
       </w:pPr>
-      <w:bookmarkStart w:id="98" w:name="_Toc229310168"/>
+      <w:bookmarkStart w:id="98" w:name="_Toc230112512"/>
       <w:r>
         <w:rPr>
           <w:rFonts w:ascii="Aptos Display" w:hAnsi="Aptos Display"/>
@@ -37120,7 +37220,7 @@
         <w:pStyle w:val="Titre2"/>
         <w:spacing w:before="460" w:after="220"/>
       </w:pPr>
-      <w:bookmarkStart w:id="99" w:name="_Toc229310169"/>
+      <w:bookmarkStart w:id="99" w:name="_Toc230112513"/>
       <w:r>
         <w:rPr>
           <w:rFonts w:ascii="Aptos Display" w:hAnsi="Aptos Display"/>
@@ -37259,7 +37359,7 @@
         <w:pStyle w:val="Titre2"/>
         <w:spacing w:before="460" w:after="220"/>
       </w:pPr>
-      <w:bookmarkStart w:id="100" w:name="_Toc229310170"/>
+      <w:bookmarkStart w:id="100" w:name="_Toc230112514"/>
       <w:r>
         <w:rPr>
           <w:rFonts w:ascii="Aptos Display" w:hAnsi="Aptos Display"/>
@@ -37399,7 +37499,7 @@
         <w:pStyle w:val="Titre2"/>
         <w:spacing w:before="460" w:after="220"/>
       </w:pPr>
-      <w:bookmarkStart w:id="101" w:name="_Toc229310171"/>
+      <w:bookmarkStart w:id="101" w:name="_Toc230112515"/>
       <w:r>
         <w:rPr>
           <w:rFonts w:ascii="Aptos Display" w:hAnsi="Aptos Display"/>
@@ -37533,7 +37633,7 @@
         <w:pStyle w:val="Titre2"/>
         <w:spacing w:before="460" w:after="220"/>
       </w:pPr>
-      <w:bookmarkStart w:id="102" w:name="_Toc229310172"/>
+      <w:bookmarkStart w:id="102" w:name="_Toc230112516"/>
       <w:r>
         <w:rPr>
           <w:rFonts w:ascii="Aptos Display" w:hAnsi="Aptos Display"/>
@@ -37627,7 +37727,7 @@
         <w:pStyle w:val="Titre2"/>
         <w:spacing w:before="460" w:after="220"/>
       </w:pPr>
-      <w:bookmarkStart w:id="103" w:name="_Toc229310173"/>
+      <w:bookmarkStart w:id="103" w:name="_Toc230112517"/>
       <w:r>
         <w:rPr>
           <w:rFonts w:ascii="Aptos Display" w:hAnsi="Aptos Display"/>
@@ -37736,7 +37836,7 @@
         <w:pStyle w:val="Titre2"/>
         <w:spacing w:before="460" w:after="220"/>
       </w:pPr>
-      <w:bookmarkStart w:id="104" w:name="_Toc229310174"/>
+      <w:bookmarkStart w:id="104" w:name="_Toc230112518"/>
       <w:r>
         <w:rPr>
           <w:rFonts w:ascii="Aptos Display" w:hAnsi="Aptos Display"/>
@@ -37849,7 +37949,7 @@
         <w:pStyle w:val="Titre2"/>
         <w:spacing w:before="460" w:after="220"/>
       </w:pPr>
-      <w:bookmarkStart w:id="105" w:name="_Toc229310175"/>
+      <w:bookmarkStart w:id="105" w:name="_Toc230112519"/>
       <w:r>
         <w:rPr>
           <w:rFonts w:ascii="Aptos Display" w:hAnsi="Aptos Display"/>
@@ -37988,7 +38088,7 @@
         </w:pBdr>
         <w:spacing w:before="80" w:after="200"/>
       </w:pPr>
-      <w:bookmarkStart w:id="106" w:name="_Toc229310176"/>
+      <w:bookmarkStart w:id="106" w:name="_Toc230112520"/>
       <w:r>
         <w:rPr>
           <w:rFonts w:ascii="Aptos Display" w:hAnsi="Aptos Display"/>
@@ -38004,7 +38104,7 @@
         <w:pStyle w:val="Titre2"/>
         <w:spacing w:before="460" w:after="220"/>
       </w:pPr>
-      <w:bookmarkStart w:id="107" w:name="_Toc229310177"/>
+      <w:bookmarkStart w:id="107" w:name="_Toc230112521"/>
       <w:r>
         <w:rPr>
           <w:rFonts w:ascii="Aptos Display" w:hAnsi="Aptos Display"/>
@@ -38233,7 +38333,7 @@
         <w:pStyle w:val="Titre2"/>
         <w:spacing w:before="460" w:after="220"/>
       </w:pPr>
-      <w:bookmarkStart w:id="108" w:name="_Toc229310178"/>
+      <w:bookmarkStart w:id="108" w:name="_Toc230112522"/>
       <w:r>
         <w:rPr>
           <w:rFonts w:ascii="Aptos Display" w:hAnsi="Aptos Display"/>
@@ -38361,7 +38461,7 @@
         <w:pStyle w:val="Titre2"/>
         <w:spacing w:before="460" w:after="220"/>
       </w:pPr>
-      <w:bookmarkStart w:id="109" w:name="_Toc229310179"/>
+      <w:bookmarkStart w:id="109" w:name="_Toc230112523"/>
       <w:r>
         <w:rPr>
           <w:rFonts w:ascii="Aptos Display" w:hAnsi="Aptos Display"/>
@@ -38935,7 +39035,7 @@
         <w:pStyle w:val="Titre2"/>
         <w:spacing w:before="460" w:after="220"/>
       </w:pPr>
-      <w:bookmarkStart w:id="110" w:name="_Toc229310180"/>
+      <w:bookmarkStart w:id="110" w:name="_Toc230112524"/>
       <w:r>
         <w:rPr>
           <w:rFonts w:ascii="Aptos Display" w:hAnsi="Aptos Display"/>
@@ -39043,7 +39143,7 @@
         </w:pBdr>
         <w:spacing w:before="80" w:after="200"/>
       </w:pPr>
-      <w:bookmarkStart w:id="111" w:name="_Toc229310181"/>
+      <w:bookmarkStart w:id="111" w:name="_Toc230112525"/>
       <w:r>
         <w:rPr>
           <w:rFonts w:ascii="Aptos Display" w:hAnsi="Aptos Display"/>
@@ -39933,7 +40033,7 @@
               <w:rPr>
                 <w:sz w:val="19"/>
               </w:rPr>
-              <w:t>runtime target captured</w:t>
+              <w:t>runtime target captured on the active page strobe</w:t>
             </w:r>
           </w:p>
         </w:tc>
@@ -40245,31 +40345,31 @@
       </w:rPr>
     </w:lvl>
   </w:abstractNum>
-  <w:num w:numId="1" w16cid:durableId="1984431432">
+  <w:num w:numId="1" w16cid:durableId="1624460090">
     <w:abstractNumId w:val="8"/>
   </w:num>
-  <w:num w:numId="2" w16cid:durableId="330256995">
+  <w:num w:numId="2" w16cid:durableId="228004627">
     <w:abstractNumId w:val="6"/>
   </w:num>
-  <w:num w:numId="3" w16cid:durableId="2000384446">
+  <w:num w:numId="3" w16cid:durableId="1065295530">
     <w:abstractNumId w:val="5"/>
   </w:num>
-  <w:num w:numId="4" w16cid:durableId="1598247528">
+  <w:num w:numId="4" w16cid:durableId="268780640">
     <w:abstractNumId w:val="4"/>
   </w:num>
-  <w:num w:numId="5" w16cid:durableId="1666085732">
+  <w:num w:numId="5" w16cid:durableId="1959944218">
     <w:abstractNumId w:val="7"/>
   </w:num>
-  <w:num w:numId="6" w16cid:durableId="1593398273">
+  <w:num w:numId="6" w16cid:durableId="2018772424">
     <w:abstractNumId w:val="3"/>
   </w:num>
-  <w:num w:numId="7" w16cid:durableId="2053068182">
+  <w:num w:numId="7" w16cid:durableId="734738066">
     <w:abstractNumId w:val="2"/>
   </w:num>
-  <w:num w:numId="8" w16cid:durableId="1585145965">
+  <w:num w:numId="8" w16cid:durableId="1142189383">
     <w:abstractNumId w:val="1"/>
   </w:num>
-  <w:num w:numId="9" w16cid:durableId="1068723699">
+  <w:num w:numId="9" w16cid:durableId="205067787">
     <w:abstractNumId w:val="0"/>
   </w:num>
 </w:numbering>
@@ -51660,7 +51760,7 @@
     <w:autoRedefine/>
     <w:uiPriority w:val="39"/>
     <w:unhideWhenUsed/>
-    <w:rsid w:val="00270D39"/>
+    <w:rsid w:val="00A8474A"/>
     <w:pPr>
       <w:spacing w:after="100"/>
     </w:pPr>
@@ -51672,7 +51772,7 @@
     <w:autoRedefine/>
     <w:uiPriority w:val="39"/>
     <w:unhideWhenUsed/>
-    <w:rsid w:val="00270D39"/>
+    <w:rsid w:val="00A8474A"/>
     <w:pPr>
       <w:spacing w:after="100"/>
       <w:ind w:left="200"/>
@@ -51685,7 +51785,7 @@
     <w:autoRedefine/>
     <w:uiPriority w:val="39"/>
     <w:unhideWhenUsed/>
-    <w:rsid w:val="00270D39"/>
+    <w:rsid w:val="00A8474A"/>
     <w:pPr>
       <w:spacing w:after="100"/>
       <w:ind w:left="400"/>
@@ -51698,7 +51798,7 @@
     <w:autoRedefine/>
     <w:uiPriority w:val="39"/>
     <w:unhideWhenUsed/>
-    <w:rsid w:val="00270D39"/>
+    <w:rsid w:val="00A8474A"/>
     <w:pPr>
       <w:spacing w:after="100" w:line="278" w:lineRule="auto"/>
       <w:ind w:left="720"/>
@@ -51720,7 +51820,7 @@
     <w:autoRedefine/>
     <w:uiPriority w:val="39"/>
     <w:unhideWhenUsed/>
-    <w:rsid w:val="00270D39"/>
+    <w:rsid w:val="00A8474A"/>
     <w:pPr>
       <w:spacing w:after="100" w:line="278" w:lineRule="auto"/>
       <w:ind w:left="960"/>
@@ -51742,7 +51842,7 @@
     <w:autoRedefine/>
     <w:uiPriority w:val="39"/>
     <w:unhideWhenUsed/>
-    <w:rsid w:val="00270D39"/>
+    <w:rsid w:val="00A8474A"/>
     <w:pPr>
       <w:spacing w:after="100" w:line="278" w:lineRule="auto"/>
       <w:ind w:left="1200"/>
@@ -51764,7 +51864,7 @@
     <w:autoRedefine/>
     <w:uiPriority w:val="39"/>
     <w:unhideWhenUsed/>
-    <w:rsid w:val="00270D39"/>
+    <w:rsid w:val="00A8474A"/>
     <w:pPr>
       <w:spacing w:after="100" w:line="278" w:lineRule="auto"/>
       <w:ind w:left="1440"/>
@@ -51786,7 +51886,7 @@
     <w:autoRedefine/>
     <w:uiPriority w:val="39"/>
     <w:unhideWhenUsed/>
-    <w:rsid w:val="00270D39"/>
+    <w:rsid w:val="00A8474A"/>
     <w:pPr>
       <w:spacing w:after="100" w:line="278" w:lineRule="auto"/>
       <w:ind w:left="1680"/>
@@ -51808,7 +51908,7 @@
     <w:autoRedefine/>
     <w:uiPriority w:val="39"/>
     <w:unhideWhenUsed/>
-    <w:rsid w:val="00270D39"/>
+    <w:rsid w:val="00A8474A"/>
     <w:pPr>
       <w:spacing w:after="100" w:line="278" w:lineRule="auto"/>
       <w:ind w:left="1920"/>
@@ -51828,7 +51928,7 @@
     <w:basedOn w:val="Policepardfaut"/>
     <w:uiPriority w:val="99"/>
     <w:unhideWhenUsed/>
-    <w:rsid w:val="00270D39"/>
+    <w:rsid w:val="00A8474A"/>
     <w:rPr>
       <w:color w:val="0000FF" w:themeColor="hyperlink"/>
       <w:u w:val="single"/>
@@ -51840,7 +51940,7 @@
     <w:uiPriority w:val="99"/>
     <w:semiHidden/>
     <w:unhideWhenUsed/>
-    <w:rsid w:val="00270D39"/>
+    <w:rsid w:val="00A8474A"/>
     <w:rPr>
       <w:color w:val="605E5C"/>
       <w:shd w:val="clear" w:color="auto" w:fill="E1DFDD"/>

</xml_diff>

<commit_message>
Do not expose legacy API
</commit_message>
<xml_diff>
--- a/docs/user_guide/MFDStudio_End_To_End_User_Guide.docx
+++ b/docs/user_guide/MFDStudio_End_To_End_User_Guide.docx
@@ -70,7 +70,7 @@
               <w:t xml:space="preserve">Document generated on </w:t>
             </w:r>
             <w:r>
-              <w:t>2026-05-23 19:05</w:t>
+              <w:t>2026-05-23 19:48</w:t>
             </w:r>
             <w:r>
               <w:rPr>
@@ -241,7 +241,7 @@
       <w:pPr>
         <w:pStyle w:val="Titre1"/>
       </w:pPr>
-      <w:bookmarkStart w:id="0" w:name="_Toc230455529"/>
+      <w:bookmarkStart w:id="0" w:name="_Toc230458123"/>
       <w:r>
         <w:t>Table of Contents</w:t>
       </w:r>
@@ -269,7 +269,7 @@
         </w:rPr>
         <w:fldChar w:fldCharType="separate"/>
       </w:r>
-      <w:hyperlink w:anchor="_Toc230455529" w:history="1">
+      <w:hyperlink w:anchor="_Toc230458123" w:history="1">
         <w:r>
           <w:rPr>
             <w:rStyle w:val="Lienhypertexte"/>
@@ -296,7 +296,7 @@
             <w:noProof/>
             <w:webHidden/>
           </w:rPr>
-          <w:instrText xml:space="preserve"> PAGEREF _Toc230455529 \h </w:instrText>
+          <w:instrText xml:space="preserve"> PAGEREF _Toc230458123 \h </w:instrText>
         </w:r>
         <w:r>
           <w:rPr>
@@ -337,7 +337,7 @@
           <w:noProof/>
         </w:rPr>
       </w:pPr>
-      <w:hyperlink w:anchor="_Toc230455530" w:history="1">
+      <w:hyperlink w:anchor="_Toc230458124" w:history="1">
         <w:r>
           <w:rPr>
             <w:rStyle w:val="Lienhypertexte"/>
@@ -365,7 +365,7 @@
             <w:noProof/>
             <w:webHidden/>
           </w:rPr>
-          <w:instrText xml:space="preserve"> PAGEREF _Toc230455530 \h </w:instrText>
+          <w:instrText xml:space="preserve"> PAGEREF _Toc230458124 \h </w:instrText>
         </w:r>
         <w:r>
           <w:rPr>
@@ -406,7 +406,7 @@
           <w:noProof/>
         </w:rPr>
       </w:pPr>
-      <w:hyperlink w:anchor="_Toc230455531" w:history="1">
+      <w:hyperlink w:anchor="_Toc230458125" w:history="1">
         <w:r>
           <w:rPr>
             <w:rStyle w:val="Lienhypertexte"/>
@@ -434,7 +434,7 @@
             <w:noProof/>
             <w:webHidden/>
           </w:rPr>
-          <w:instrText xml:space="preserve"> PAGEREF _Toc230455531 \h </w:instrText>
+          <w:instrText xml:space="preserve"> PAGEREF _Toc230458125 \h </w:instrText>
         </w:r>
         <w:r>
           <w:rPr>
@@ -475,7 +475,7 @@
           <w:noProof/>
         </w:rPr>
       </w:pPr>
-      <w:hyperlink w:anchor="_Toc230455532" w:history="1">
+      <w:hyperlink w:anchor="_Toc230458126" w:history="1">
         <w:r>
           <w:rPr>
             <w:rStyle w:val="Lienhypertexte"/>
@@ -503,7 +503,7 @@
             <w:noProof/>
             <w:webHidden/>
           </w:rPr>
-          <w:instrText xml:space="preserve"> PAGEREF _Toc230455532 \h </w:instrText>
+          <w:instrText xml:space="preserve"> PAGEREF _Toc230458126 \h </w:instrText>
         </w:r>
         <w:r>
           <w:rPr>
@@ -544,7 +544,7 @@
           <w:noProof/>
         </w:rPr>
       </w:pPr>
-      <w:hyperlink w:anchor="_Toc230455533" w:history="1">
+      <w:hyperlink w:anchor="_Toc230458127" w:history="1">
         <w:r>
           <w:rPr>
             <w:rStyle w:val="Lienhypertexte"/>
@@ -572,7 +572,7 @@
             <w:noProof/>
             <w:webHidden/>
           </w:rPr>
-          <w:instrText xml:space="preserve"> PAGEREF _Toc230455533 \h </w:instrText>
+          <w:instrText xml:space="preserve"> PAGEREF _Toc230458127 \h </w:instrText>
         </w:r>
         <w:r>
           <w:rPr>
@@ -613,7 +613,7 @@
           <w:noProof/>
         </w:rPr>
       </w:pPr>
-      <w:hyperlink w:anchor="_Toc230455534" w:history="1">
+      <w:hyperlink w:anchor="_Toc230458128" w:history="1">
         <w:r>
           <w:rPr>
             <w:rStyle w:val="Lienhypertexte"/>
@@ -641,7 +641,7 @@
             <w:noProof/>
             <w:webHidden/>
           </w:rPr>
-          <w:instrText xml:space="preserve"> PAGEREF _Toc230455534 \h </w:instrText>
+          <w:instrText xml:space="preserve"> PAGEREF _Toc230458128 \h </w:instrText>
         </w:r>
         <w:r>
           <w:rPr>
@@ -682,7 +682,7 @@
           <w:noProof/>
         </w:rPr>
       </w:pPr>
-      <w:hyperlink w:anchor="_Toc230455535" w:history="1">
+      <w:hyperlink w:anchor="_Toc230458129" w:history="1">
         <w:r>
           <w:rPr>
             <w:rStyle w:val="Lienhypertexte"/>
@@ -710,7 +710,7 @@
             <w:noProof/>
             <w:webHidden/>
           </w:rPr>
-          <w:instrText xml:space="preserve"> PAGEREF _Toc230455535 \h </w:instrText>
+          <w:instrText xml:space="preserve"> PAGEREF _Toc230458129 \h </w:instrText>
         </w:r>
         <w:r>
           <w:rPr>
@@ -751,7 +751,7 @@
           <w:noProof/>
         </w:rPr>
       </w:pPr>
-      <w:hyperlink w:anchor="_Toc230455536" w:history="1">
+      <w:hyperlink w:anchor="_Toc230458130" w:history="1">
         <w:r>
           <w:rPr>
             <w:rStyle w:val="Lienhypertexte"/>
@@ -779,7 +779,7 @@
             <w:noProof/>
             <w:webHidden/>
           </w:rPr>
-          <w:instrText xml:space="preserve"> PAGEREF _Toc230455536 \h </w:instrText>
+          <w:instrText xml:space="preserve"> PAGEREF _Toc230458130 \h </w:instrText>
         </w:r>
         <w:r>
           <w:rPr>
@@ -820,7 +820,7 @@
           <w:noProof/>
         </w:rPr>
       </w:pPr>
-      <w:hyperlink w:anchor="_Toc230455537" w:history="1">
+      <w:hyperlink w:anchor="_Toc230458131" w:history="1">
         <w:r>
           <w:rPr>
             <w:rStyle w:val="Lienhypertexte"/>
@@ -848,7 +848,7 @@
             <w:noProof/>
             <w:webHidden/>
           </w:rPr>
-          <w:instrText xml:space="preserve"> PAGEREF _Toc230455537 \h </w:instrText>
+          <w:instrText xml:space="preserve"> PAGEREF _Toc230458131 \h </w:instrText>
         </w:r>
         <w:r>
           <w:rPr>
@@ -889,7 +889,7 @@
           <w:noProof/>
         </w:rPr>
       </w:pPr>
-      <w:hyperlink w:anchor="_Toc230455538" w:history="1">
+      <w:hyperlink w:anchor="_Toc230458132" w:history="1">
         <w:r>
           <w:rPr>
             <w:rStyle w:val="Lienhypertexte"/>
@@ -917,7 +917,7 @@
             <w:noProof/>
             <w:webHidden/>
           </w:rPr>
-          <w:instrText xml:space="preserve"> PAGEREF _Toc230455538 \h </w:instrText>
+          <w:instrText xml:space="preserve"> PAGEREF _Toc230458132 \h </w:instrText>
         </w:r>
         <w:r>
           <w:rPr>
@@ -958,7 +958,7 @@
           <w:noProof/>
         </w:rPr>
       </w:pPr>
-      <w:hyperlink w:anchor="_Toc230455539" w:history="1">
+      <w:hyperlink w:anchor="_Toc230458133" w:history="1">
         <w:r>
           <w:rPr>
             <w:rStyle w:val="Lienhypertexte"/>
@@ -986,7 +986,7 @@
             <w:noProof/>
             <w:webHidden/>
           </w:rPr>
-          <w:instrText xml:space="preserve"> PAGEREF _Toc230455539 \h </w:instrText>
+          <w:instrText xml:space="preserve"> PAGEREF _Toc230458133 \h </w:instrText>
         </w:r>
         <w:r>
           <w:rPr>
@@ -1027,7 +1027,7 @@
           <w:noProof/>
         </w:rPr>
       </w:pPr>
-      <w:hyperlink w:anchor="_Toc230455540" w:history="1">
+      <w:hyperlink w:anchor="_Toc230458134" w:history="1">
         <w:r>
           <w:rPr>
             <w:rStyle w:val="Lienhypertexte"/>
@@ -1055,7 +1055,7 @@
             <w:noProof/>
             <w:webHidden/>
           </w:rPr>
-          <w:instrText xml:space="preserve"> PAGEREF _Toc230455540 \h </w:instrText>
+          <w:instrText xml:space="preserve"> PAGEREF _Toc230458134 \h </w:instrText>
         </w:r>
         <w:r>
           <w:rPr>
@@ -1096,7 +1096,7 @@
           <w:noProof/>
         </w:rPr>
       </w:pPr>
-      <w:hyperlink w:anchor="_Toc230455541" w:history="1">
+      <w:hyperlink w:anchor="_Toc230458135" w:history="1">
         <w:r>
           <w:rPr>
             <w:rStyle w:val="Lienhypertexte"/>
@@ -1124,7 +1124,7 @@
             <w:noProof/>
             <w:webHidden/>
           </w:rPr>
-          <w:instrText xml:space="preserve"> PAGEREF _Toc230455541 \h </w:instrText>
+          <w:instrText xml:space="preserve"> PAGEREF _Toc230458135 \h </w:instrText>
         </w:r>
         <w:r>
           <w:rPr>
@@ -1165,7 +1165,7 @@
           <w:noProof/>
         </w:rPr>
       </w:pPr>
-      <w:hyperlink w:anchor="_Toc230455542" w:history="1">
+      <w:hyperlink w:anchor="_Toc230458136" w:history="1">
         <w:r>
           <w:rPr>
             <w:rStyle w:val="Lienhypertexte"/>
@@ -1193,7 +1193,7 @@
             <w:noProof/>
             <w:webHidden/>
           </w:rPr>
-          <w:instrText xml:space="preserve"> PAGEREF _Toc230455542 \h </w:instrText>
+          <w:instrText xml:space="preserve"> PAGEREF _Toc230458136 \h </w:instrText>
         </w:r>
         <w:r>
           <w:rPr>
@@ -1234,7 +1234,7 @@
           <w:noProof/>
         </w:rPr>
       </w:pPr>
-      <w:hyperlink w:anchor="_Toc230455543" w:history="1">
+      <w:hyperlink w:anchor="_Toc230458137" w:history="1">
         <w:r>
           <w:rPr>
             <w:rStyle w:val="Lienhypertexte"/>
@@ -1262,7 +1262,7 @@
             <w:noProof/>
             <w:webHidden/>
           </w:rPr>
-          <w:instrText xml:space="preserve"> PAGEREF _Toc230455543 \h </w:instrText>
+          <w:instrText xml:space="preserve"> PAGEREF _Toc230458137 \h </w:instrText>
         </w:r>
         <w:r>
           <w:rPr>
@@ -1303,7 +1303,7 @@
           <w:noProof/>
         </w:rPr>
       </w:pPr>
-      <w:hyperlink w:anchor="_Toc230455544" w:history="1">
+      <w:hyperlink w:anchor="_Toc230458138" w:history="1">
         <w:r>
           <w:rPr>
             <w:rStyle w:val="Lienhypertexte"/>
@@ -1331,7 +1331,7 @@
             <w:noProof/>
             <w:webHidden/>
           </w:rPr>
-          <w:instrText xml:space="preserve"> PAGEREF _Toc230455544 \h </w:instrText>
+          <w:instrText xml:space="preserve"> PAGEREF _Toc230458138 \h </w:instrText>
         </w:r>
         <w:r>
           <w:rPr>
@@ -1372,7 +1372,7 @@
           <w:noProof/>
         </w:rPr>
       </w:pPr>
-      <w:hyperlink w:anchor="_Toc230455545" w:history="1">
+      <w:hyperlink w:anchor="_Toc230458139" w:history="1">
         <w:r>
           <w:rPr>
             <w:rStyle w:val="Lienhypertexte"/>
@@ -1400,7 +1400,7 @@
             <w:noProof/>
             <w:webHidden/>
           </w:rPr>
-          <w:instrText xml:space="preserve"> PAGEREF _Toc230455545 \h </w:instrText>
+          <w:instrText xml:space="preserve"> PAGEREF _Toc230458139 \h </w:instrText>
         </w:r>
         <w:r>
           <w:rPr>
@@ -1441,7 +1441,7 @@
           <w:noProof/>
         </w:rPr>
       </w:pPr>
-      <w:hyperlink w:anchor="_Toc230455546" w:history="1">
+      <w:hyperlink w:anchor="_Toc230458140" w:history="1">
         <w:r>
           <w:rPr>
             <w:rStyle w:val="Lienhypertexte"/>
@@ -1469,7 +1469,7 @@
             <w:noProof/>
             <w:webHidden/>
           </w:rPr>
-          <w:instrText xml:space="preserve"> PAGEREF _Toc230455546 \h </w:instrText>
+          <w:instrText xml:space="preserve"> PAGEREF _Toc230458140 \h </w:instrText>
         </w:r>
         <w:r>
           <w:rPr>
@@ -1510,7 +1510,7 @@
           <w:noProof/>
         </w:rPr>
       </w:pPr>
-      <w:hyperlink w:anchor="_Toc230455547" w:history="1">
+      <w:hyperlink w:anchor="_Toc230458141" w:history="1">
         <w:r>
           <w:rPr>
             <w:rStyle w:val="Lienhypertexte"/>
@@ -1538,7 +1538,7 @@
             <w:noProof/>
             <w:webHidden/>
           </w:rPr>
-          <w:instrText xml:space="preserve"> PAGEREF _Toc230455547 \h </w:instrText>
+          <w:instrText xml:space="preserve"> PAGEREF _Toc230458141 \h </w:instrText>
         </w:r>
         <w:r>
           <w:rPr>
@@ -1579,7 +1579,7 @@
           <w:noProof/>
         </w:rPr>
       </w:pPr>
-      <w:hyperlink w:anchor="_Toc230455548" w:history="1">
+      <w:hyperlink w:anchor="_Toc230458142" w:history="1">
         <w:r>
           <w:rPr>
             <w:rStyle w:val="Lienhypertexte"/>
@@ -1607,7 +1607,7 @@
             <w:noProof/>
             <w:webHidden/>
           </w:rPr>
-          <w:instrText xml:space="preserve"> PAGEREF _Toc230455548 \h </w:instrText>
+          <w:instrText xml:space="preserve"> PAGEREF _Toc230458142 \h </w:instrText>
         </w:r>
         <w:r>
           <w:rPr>
@@ -1648,7 +1648,7 @@
           <w:noProof/>
         </w:rPr>
       </w:pPr>
-      <w:hyperlink w:anchor="_Toc230455549" w:history="1">
+      <w:hyperlink w:anchor="_Toc230458143" w:history="1">
         <w:r>
           <w:rPr>
             <w:rStyle w:val="Lienhypertexte"/>
@@ -1676,7 +1676,7 @@
             <w:noProof/>
             <w:webHidden/>
           </w:rPr>
-          <w:instrText xml:space="preserve"> PAGEREF _Toc230455549 \h </w:instrText>
+          <w:instrText xml:space="preserve"> PAGEREF _Toc230458143 \h </w:instrText>
         </w:r>
         <w:r>
           <w:rPr>
@@ -1717,7 +1717,7 @@
           <w:noProof/>
         </w:rPr>
       </w:pPr>
-      <w:hyperlink w:anchor="_Toc230455550" w:history="1">
+      <w:hyperlink w:anchor="_Toc230458144" w:history="1">
         <w:r>
           <w:rPr>
             <w:rStyle w:val="Lienhypertexte"/>
@@ -1745,7 +1745,7 @@
             <w:noProof/>
             <w:webHidden/>
           </w:rPr>
-          <w:instrText xml:space="preserve"> PAGEREF _Toc230455550 \h </w:instrText>
+          <w:instrText xml:space="preserve"> PAGEREF _Toc230458144 \h </w:instrText>
         </w:r>
         <w:r>
           <w:rPr>
@@ -1786,7 +1786,7 @@
           <w:noProof/>
         </w:rPr>
       </w:pPr>
-      <w:hyperlink w:anchor="_Toc230455551" w:history="1">
+      <w:hyperlink w:anchor="_Toc230458145" w:history="1">
         <w:r>
           <w:rPr>
             <w:rStyle w:val="Lienhypertexte"/>
@@ -1814,7 +1814,7 @@
             <w:noProof/>
             <w:webHidden/>
           </w:rPr>
-          <w:instrText xml:space="preserve"> PAGEREF _Toc230455551 \h </w:instrText>
+          <w:instrText xml:space="preserve"> PAGEREF _Toc230458145 \h </w:instrText>
         </w:r>
         <w:r>
           <w:rPr>
@@ -1855,7 +1855,7 @@
           <w:noProof/>
         </w:rPr>
       </w:pPr>
-      <w:hyperlink w:anchor="_Toc230455552" w:history="1">
+      <w:hyperlink w:anchor="_Toc230458146" w:history="1">
         <w:r>
           <w:rPr>
             <w:rStyle w:val="Lienhypertexte"/>
@@ -1882,7 +1882,7 @@
             <w:noProof/>
             <w:webHidden/>
           </w:rPr>
-          <w:instrText xml:space="preserve"> PAGEREF _Toc230455552 \h </w:instrText>
+          <w:instrText xml:space="preserve"> PAGEREF _Toc230458146 \h </w:instrText>
         </w:r>
         <w:r>
           <w:rPr>
@@ -1923,7 +1923,7 @@
           <w:noProof/>
         </w:rPr>
       </w:pPr>
-      <w:hyperlink w:anchor="_Toc230455553" w:history="1">
+      <w:hyperlink w:anchor="_Toc230458147" w:history="1">
         <w:r>
           <w:rPr>
             <w:rStyle w:val="Lienhypertexte"/>
@@ -1950,7 +1950,7 @@
             <w:noProof/>
             <w:webHidden/>
           </w:rPr>
-          <w:instrText xml:space="preserve"> PAGEREF _Toc230455553 \h </w:instrText>
+          <w:instrText xml:space="preserve"> PAGEREF _Toc230458147 \h </w:instrText>
         </w:r>
         <w:r>
           <w:rPr>
@@ -1991,7 +1991,7 @@
           <w:noProof/>
         </w:rPr>
       </w:pPr>
-      <w:hyperlink w:anchor="_Toc230455554" w:history="1">
+      <w:hyperlink w:anchor="_Toc230458148" w:history="1">
         <w:r>
           <w:rPr>
             <w:rStyle w:val="Lienhypertexte"/>
@@ -2019,7 +2019,7 @@
             <w:noProof/>
             <w:webHidden/>
           </w:rPr>
-          <w:instrText xml:space="preserve"> PAGEREF _Toc230455554 \h </w:instrText>
+          <w:instrText xml:space="preserve"> PAGEREF _Toc230458148 \h </w:instrText>
         </w:r>
         <w:r>
           <w:rPr>
@@ -2060,7 +2060,7 @@
           <w:noProof/>
         </w:rPr>
       </w:pPr>
-      <w:hyperlink w:anchor="_Toc230455555" w:history="1">
+      <w:hyperlink w:anchor="_Toc230458149" w:history="1">
         <w:r>
           <w:rPr>
             <w:rStyle w:val="Lienhypertexte"/>
@@ -2088,7 +2088,7 @@
             <w:noProof/>
             <w:webHidden/>
           </w:rPr>
-          <w:instrText xml:space="preserve"> PAGEREF _Toc230455555 \h </w:instrText>
+          <w:instrText xml:space="preserve"> PAGEREF _Toc230458149 \h </w:instrText>
         </w:r>
         <w:r>
           <w:rPr>
@@ -2129,7 +2129,7 @@
           <w:noProof/>
         </w:rPr>
       </w:pPr>
-      <w:hyperlink w:anchor="_Toc230455556" w:history="1">
+      <w:hyperlink w:anchor="_Toc230458150" w:history="1">
         <w:r>
           <w:rPr>
             <w:rStyle w:val="Lienhypertexte"/>
@@ -2157,7 +2157,7 @@
             <w:noProof/>
             <w:webHidden/>
           </w:rPr>
-          <w:instrText xml:space="preserve"> PAGEREF _Toc230455556 \h </w:instrText>
+          <w:instrText xml:space="preserve"> PAGEREF _Toc230458150 \h </w:instrText>
         </w:r>
         <w:r>
           <w:rPr>
@@ -2198,7 +2198,7 @@
           <w:noProof/>
         </w:rPr>
       </w:pPr>
-      <w:hyperlink w:anchor="_Toc230455557" w:history="1">
+      <w:hyperlink w:anchor="_Toc230458151" w:history="1">
         <w:r>
           <w:rPr>
             <w:rStyle w:val="Lienhypertexte"/>
@@ -2226,7 +2226,7 @@
             <w:noProof/>
             <w:webHidden/>
           </w:rPr>
-          <w:instrText xml:space="preserve"> PAGEREF _Toc230455557 \h </w:instrText>
+          <w:instrText xml:space="preserve"> PAGEREF _Toc230458151 \h </w:instrText>
         </w:r>
         <w:r>
           <w:rPr>
@@ -2267,7 +2267,7 @@
           <w:noProof/>
         </w:rPr>
       </w:pPr>
-      <w:hyperlink w:anchor="_Toc230455558" w:history="1">
+      <w:hyperlink w:anchor="_Toc230458152" w:history="1">
         <w:r>
           <w:rPr>
             <w:rStyle w:val="Lienhypertexte"/>
@@ -2294,7 +2294,7 @@
             <w:noProof/>
             <w:webHidden/>
           </w:rPr>
-          <w:instrText xml:space="preserve"> PAGEREF _Toc230455558 \h </w:instrText>
+          <w:instrText xml:space="preserve"> PAGEREF _Toc230458152 \h </w:instrText>
         </w:r>
         <w:r>
           <w:rPr>
@@ -2335,7 +2335,7 @@
           <w:noProof/>
         </w:rPr>
       </w:pPr>
-      <w:hyperlink w:anchor="_Toc230455559" w:history="1">
+      <w:hyperlink w:anchor="_Toc230458153" w:history="1">
         <w:r>
           <w:rPr>
             <w:rStyle w:val="Lienhypertexte"/>
@@ -2362,7 +2362,7 @@
             <w:noProof/>
             <w:webHidden/>
           </w:rPr>
-          <w:instrText xml:space="preserve"> PAGEREF _Toc230455559 \h </w:instrText>
+          <w:instrText xml:space="preserve"> PAGEREF _Toc230458153 \h </w:instrText>
         </w:r>
         <w:r>
           <w:rPr>
@@ -2403,7 +2403,7 @@
           <w:noProof/>
         </w:rPr>
       </w:pPr>
-      <w:hyperlink w:anchor="_Toc230455560" w:history="1">
+      <w:hyperlink w:anchor="_Toc230458154" w:history="1">
         <w:r>
           <w:rPr>
             <w:rStyle w:val="Lienhypertexte"/>
@@ -2430,7 +2430,7 @@
             <w:noProof/>
             <w:webHidden/>
           </w:rPr>
-          <w:instrText xml:space="preserve"> PAGEREF _Toc230455560 \h </w:instrText>
+          <w:instrText xml:space="preserve"> PAGEREF _Toc230458154 \h </w:instrText>
         </w:r>
         <w:r>
           <w:rPr>
@@ -2471,7 +2471,7 @@
           <w:noProof/>
         </w:rPr>
       </w:pPr>
-      <w:hyperlink w:anchor="_Toc230455561" w:history="1">
+      <w:hyperlink w:anchor="_Toc230458155" w:history="1">
         <w:r>
           <w:rPr>
             <w:rStyle w:val="Lienhypertexte"/>
@@ -2498,7 +2498,7 @@
             <w:noProof/>
             <w:webHidden/>
           </w:rPr>
-          <w:instrText xml:space="preserve"> PAGEREF _Toc230455561 \h </w:instrText>
+          <w:instrText xml:space="preserve"> PAGEREF _Toc230458155 \h </w:instrText>
         </w:r>
         <w:r>
           <w:rPr>
@@ -2539,7 +2539,7 @@
           <w:noProof/>
         </w:rPr>
       </w:pPr>
-      <w:hyperlink w:anchor="_Toc230455562" w:history="1">
+      <w:hyperlink w:anchor="_Toc230458156" w:history="1">
         <w:r>
           <w:rPr>
             <w:rStyle w:val="Lienhypertexte"/>
@@ -2566,7 +2566,7 @@
             <w:noProof/>
             <w:webHidden/>
           </w:rPr>
-          <w:instrText xml:space="preserve"> PAGEREF _Toc230455562 \h </w:instrText>
+          <w:instrText xml:space="preserve"> PAGEREF _Toc230458156 \h </w:instrText>
         </w:r>
         <w:r>
           <w:rPr>
@@ -2607,7 +2607,7 @@
           <w:noProof/>
         </w:rPr>
       </w:pPr>
-      <w:hyperlink w:anchor="_Toc230455563" w:history="1">
+      <w:hyperlink w:anchor="_Toc230458157" w:history="1">
         <w:r>
           <w:rPr>
             <w:rStyle w:val="Lienhypertexte"/>
@@ -2635,7 +2635,7 @@
             <w:noProof/>
             <w:webHidden/>
           </w:rPr>
-          <w:instrText xml:space="preserve"> PAGEREF _Toc230455563 \h </w:instrText>
+          <w:instrText xml:space="preserve"> PAGEREF _Toc230458157 \h </w:instrText>
         </w:r>
         <w:r>
           <w:rPr>
@@ -2676,7 +2676,7 @@
           <w:noProof/>
         </w:rPr>
       </w:pPr>
-      <w:hyperlink w:anchor="_Toc230455564" w:history="1">
+      <w:hyperlink w:anchor="_Toc230458158" w:history="1">
         <w:r>
           <w:rPr>
             <w:rStyle w:val="Lienhypertexte"/>
@@ -2704,7 +2704,7 @@
             <w:noProof/>
             <w:webHidden/>
           </w:rPr>
-          <w:instrText xml:space="preserve"> PAGEREF _Toc230455564 \h </w:instrText>
+          <w:instrText xml:space="preserve"> PAGEREF _Toc230458158 \h </w:instrText>
         </w:r>
         <w:r>
           <w:rPr>
@@ -2745,7 +2745,7 @@
           <w:noProof/>
         </w:rPr>
       </w:pPr>
-      <w:hyperlink w:anchor="_Toc230455565" w:history="1">
+      <w:hyperlink w:anchor="_Toc230458159" w:history="1">
         <w:r>
           <w:rPr>
             <w:rStyle w:val="Lienhypertexte"/>
@@ -2773,7 +2773,7 @@
             <w:noProof/>
             <w:webHidden/>
           </w:rPr>
-          <w:instrText xml:space="preserve"> PAGEREF _Toc230455565 \h </w:instrText>
+          <w:instrText xml:space="preserve"> PAGEREF _Toc230458159 \h </w:instrText>
         </w:r>
         <w:r>
           <w:rPr>
@@ -2814,7 +2814,7 @@
           <w:noProof/>
         </w:rPr>
       </w:pPr>
-      <w:hyperlink w:anchor="_Toc230455566" w:history="1">
+      <w:hyperlink w:anchor="_Toc230458160" w:history="1">
         <w:r>
           <w:rPr>
             <w:rStyle w:val="Lienhypertexte"/>
@@ -2842,7 +2842,7 @@
             <w:noProof/>
             <w:webHidden/>
           </w:rPr>
-          <w:instrText xml:space="preserve"> PAGEREF _Toc230455566 \h </w:instrText>
+          <w:instrText xml:space="preserve"> PAGEREF _Toc230458160 \h </w:instrText>
         </w:r>
         <w:r>
           <w:rPr>
@@ -2883,7 +2883,7 @@
           <w:noProof/>
         </w:rPr>
       </w:pPr>
-      <w:hyperlink w:anchor="_Toc230455567" w:history="1">
+      <w:hyperlink w:anchor="_Toc230458161" w:history="1">
         <w:r>
           <w:rPr>
             <w:rStyle w:val="Lienhypertexte"/>
@@ -2910,7 +2910,7 @@
             <w:noProof/>
             <w:webHidden/>
           </w:rPr>
-          <w:instrText xml:space="preserve"> PAGEREF _Toc230455567 \h </w:instrText>
+          <w:instrText xml:space="preserve"> PAGEREF _Toc230458161 \h </w:instrText>
         </w:r>
         <w:r>
           <w:rPr>
@@ -2951,7 +2951,7 @@
           <w:noProof/>
         </w:rPr>
       </w:pPr>
-      <w:hyperlink w:anchor="_Toc230455568" w:history="1">
+      <w:hyperlink w:anchor="_Toc230458162" w:history="1">
         <w:r>
           <w:rPr>
             <w:rStyle w:val="Lienhypertexte"/>
@@ -2979,7 +2979,7 @@
             <w:noProof/>
             <w:webHidden/>
           </w:rPr>
-          <w:instrText xml:space="preserve"> PAGEREF _Toc230455568 \h </w:instrText>
+          <w:instrText xml:space="preserve"> PAGEREF _Toc230458162 \h </w:instrText>
         </w:r>
         <w:r>
           <w:rPr>
@@ -3020,7 +3020,7 @@
           <w:noProof/>
         </w:rPr>
       </w:pPr>
-      <w:hyperlink w:anchor="_Toc230455569" w:history="1">
+      <w:hyperlink w:anchor="_Toc230458163" w:history="1">
         <w:r>
           <w:rPr>
             <w:rStyle w:val="Lienhypertexte"/>
@@ -3048,7 +3048,7 @@
             <w:noProof/>
             <w:webHidden/>
           </w:rPr>
-          <w:instrText xml:space="preserve"> PAGEREF _Toc230455569 \h </w:instrText>
+          <w:instrText xml:space="preserve"> PAGEREF _Toc230458163 \h </w:instrText>
         </w:r>
         <w:r>
           <w:rPr>
@@ -3089,7 +3089,7 @@
           <w:noProof/>
         </w:rPr>
       </w:pPr>
-      <w:hyperlink w:anchor="_Toc230455570" w:history="1">
+      <w:hyperlink w:anchor="_Toc230458164" w:history="1">
         <w:r>
           <w:rPr>
             <w:rStyle w:val="Lienhypertexte"/>
@@ -3117,7 +3117,7 @@
             <w:noProof/>
             <w:webHidden/>
           </w:rPr>
-          <w:instrText xml:space="preserve"> PAGEREF _Toc230455570 \h </w:instrText>
+          <w:instrText xml:space="preserve"> PAGEREF _Toc230458164 \h </w:instrText>
         </w:r>
         <w:r>
           <w:rPr>
@@ -3158,7 +3158,7 @@
           <w:noProof/>
         </w:rPr>
       </w:pPr>
-      <w:hyperlink w:anchor="_Toc230455571" w:history="1">
+      <w:hyperlink w:anchor="_Toc230458165" w:history="1">
         <w:r>
           <w:rPr>
             <w:rStyle w:val="Lienhypertexte"/>
@@ -3186,7 +3186,7 @@
             <w:noProof/>
             <w:webHidden/>
           </w:rPr>
-          <w:instrText xml:space="preserve"> PAGEREF _Toc230455571 \h </w:instrText>
+          <w:instrText xml:space="preserve"> PAGEREF _Toc230458165 \h </w:instrText>
         </w:r>
         <w:r>
           <w:rPr>
@@ -3227,7 +3227,7 @@
           <w:noProof/>
         </w:rPr>
       </w:pPr>
-      <w:hyperlink w:anchor="_Toc230455572" w:history="1">
+      <w:hyperlink w:anchor="_Toc230458166" w:history="1">
         <w:r>
           <w:rPr>
             <w:rStyle w:val="Lienhypertexte"/>
@@ -3255,7 +3255,7 @@
             <w:noProof/>
             <w:webHidden/>
           </w:rPr>
-          <w:instrText xml:space="preserve"> PAGEREF _Toc230455572 \h </w:instrText>
+          <w:instrText xml:space="preserve"> PAGEREF _Toc230458166 \h </w:instrText>
         </w:r>
         <w:r>
           <w:rPr>
@@ -3296,7 +3296,7 @@
           <w:noProof/>
         </w:rPr>
       </w:pPr>
-      <w:hyperlink w:anchor="_Toc230455573" w:history="1">
+      <w:hyperlink w:anchor="_Toc230458167" w:history="1">
         <w:r>
           <w:rPr>
             <w:rStyle w:val="Lienhypertexte"/>
@@ -3324,7 +3324,7 @@
             <w:noProof/>
             <w:webHidden/>
           </w:rPr>
-          <w:instrText xml:space="preserve"> PAGEREF _Toc230455573 \h </w:instrText>
+          <w:instrText xml:space="preserve"> PAGEREF _Toc230458167 \h </w:instrText>
         </w:r>
         <w:r>
           <w:rPr>
@@ -3365,7 +3365,7 @@
           <w:noProof/>
         </w:rPr>
       </w:pPr>
-      <w:hyperlink w:anchor="_Toc230455574" w:history="1">
+      <w:hyperlink w:anchor="_Toc230458168" w:history="1">
         <w:r>
           <w:rPr>
             <w:rStyle w:val="Lienhypertexte"/>
@@ -3393,7 +3393,7 @@
             <w:noProof/>
             <w:webHidden/>
           </w:rPr>
-          <w:instrText xml:space="preserve"> PAGEREF _Toc230455574 \h </w:instrText>
+          <w:instrText xml:space="preserve"> PAGEREF _Toc230458168 \h </w:instrText>
         </w:r>
         <w:r>
           <w:rPr>
@@ -3434,7 +3434,7 @@
           <w:noProof/>
         </w:rPr>
       </w:pPr>
-      <w:hyperlink w:anchor="_Toc230455575" w:history="1">
+      <w:hyperlink w:anchor="_Toc230458169" w:history="1">
         <w:r>
           <w:rPr>
             <w:rStyle w:val="Lienhypertexte"/>
@@ -3462,7 +3462,7 @@
             <w:noProof/>
             <w:webHidden/>
           </w:rPr>
-          <w:instrText xml:space="preserve"> PAGEREF _Toc230455575 \h </w:instrText>
+          <w:instrText xml:space="preserve"> PAGEREF _Toc230458169 \h </w:instrText>
         </w:r>
         <w:r>
           <w:rPr>
@@ -3503,7 +3503,7 @@
           <w:noProof/>
         </w:rPr>
       </w:pPr>
-      <w:hyperlink w:anchor="_Toc230455576" w:history="1">
+      <w:hyperlink w:anchor="_Toc230458170" w:history="1">
         <w:r>
           <w:rPr>
             <w:rStyle w:val="Lienhypertexte"/>
@@ -3531,7 +3531,7 @@
             <w:noProof/>
             <w:webHidden/>
           </w:rPr>
-          <w:instrText xml:space="preserve"> PAGEREF _Toc230455576 \h </w:instrText>
+          <w:instrText xml:space="preserve"> PAGEREF _Toc230458170 \h </w:instrText>
         </w:r>
         <w:r>
           <w:rPr>
@@ -3572,7 +3572,7 @@
           <w:noProof/>
         </w:rPr>
       </w:pPr>
-      <w:hyperlink w:anchor="_Toc230455577" w:history="1">
+      <w:hyperlink w:anchor="_Toc230458171" w:history="1">
         <w:r>
           <w:rPr>
             <w:rStyle w:val="Lienhypertexte"/>
@@ -3600,7 +3600,7 @@
             <w:noProof/>
             <w:webHidden/>
           </w:rPr>
-          <w:instrText xml:space="preserve"> PAGEREF _Toc230455577 \h </w:instrText>
+          <w:instrText xml:space="preserve"> PAGEREF _Toc230458171 \h </w:instrText>
         </w:r>
         <w:r>
           <w:rPr>
@@ -3641,7 +3641,7 @@
           <w:noProof/>
         </w:rPr>
       </w:pPr>
-      <w:hyperlink w:anchor="_Toc230455578" w:history="1">
+      <w:hyperlink w:anchor="_Toc230458172" w:history="1">
         <w:r>
           <w:rPr>
             <w:rStyle w:val="Lienhypertexte"/>
@@ -3669,7 +3669,7 @@
             <w:noProof/>
             <w:webHidden/>
           </w:rPr>
-          <w:instrText xml:space="preserve"> PAGEREF _Toc230455578 \h </w:instrText>
+          <w:instrText xml:space="preserve"> PAGEREF _Toc230458172 \h </w:instrText>
         </w:r>
         <w:r>
           <w:rPr>
@@ -3710,7 +3710,7 @@
           <w:noProof/>
         </w:rPr>
       </w:pPr>
-      <w:hyperlink w:anchor="_Toc230455579" w:history="1">
+      <w:hyperlink w:anchor="_Toc230458173" w:history="1">
         <w:r>
           <w:rPr>
             <w:rStyle w:val="Lienhypertexte"/>
@@ -3738,7 +3738,7 @@
             <w:noProof/>
             <w:webHidden/>
           </w:rPr>
-          <w:instrText xml:space="preserve"> PAGEREF _Toc230455579 \h </w:instrText>
+          <w:instrText xml:space="preserve"> PAGEREF _Toc230458173 \h </w:instrText>
         </w:r>
         <w:r>
           <w:rPr>
@@ -3779,7 +3779,7 @@
           <w:noProof/>
         </w:rPr>
       </w:pPr>
-      <w:hyperlink w:anchor="_Toc230455580" w:history="1">
+      <w:hyperlink w:anchor="_Toc230458174" w:history="1">
         <w:r>
           <w:rPr>
             <w:rStyle w:val="Lienhypertexte"/>
@@ -3807,7 +3807,7 @@
             <w:noProof/>
             <w:webHidden/>
           </w:rPr>
-          <w:instrText xml:space="preserve"> PAGEREF _Toc230455580 \h </w:instrText>
+          <w:instrText xml:space="preserve"> PAGEREF _Toc230458174 \h </w:instrText>
         </w:r>
         <w:r>
           <w:rPr>
@@ -3848,7 +3848,7 @@
           <w:noProof/>
         </w:rPr>
       </w:pPr>
-      <w:hyperlink w:anchor="_Toc230455581" w:history="1">
+      <w:hyperlink w:anchor="_Toc230458175" w:history="1">
         <w:r>
           <w:rPr>
             <w:rStyle w:val="Lienhypertexte"/>
@@ -3876,7 +3876,7 @@
             <w:noProof/>
             <w:webHidden/>
           </w:rPr>
-          <w:instrText xml:space="preserve"> PAGEREF _Toc230455581 \h </w:instrText>
+          <w:instrText xml:space="preserve"> PAGEREF _Toc230458175 \h </w:instrText>
         </w:r>
         <w:r>
           <w:rPr>
@@ -3917,7 +3917,7 @@
           <w:noProof/>
         </w:rPr>
       </w:pPr>
-      <w:hyperlink w:anchor="_Toc230455582" w:history="1">
+      <w:hyperlink w:anchor="_Toc230458176" w:history="1">
         <w:r>
           <w:rPr>
             <w:rStyle w:val="Lienhypertexte"/>
@@ -3945,7 +3945,7 @@
             <w:noProof/>
             <w:webHidden/>
           </w:rPr>
-          <w:instrText xml:space="preserve"> PAGEREF _Toc230455582 \h </w:instrText>
+          <w:instrText xml:space="preserve"> PAGEREF _Toc230458176 \h </w:instrText>
         </w:r>
         <w:r>
           <w:rPr>
@@ -3986,7 +3986,7 @@
           <w:noProof/>
         </w:rPr>
       </w:pPr>
-      <w:hyperlink w:anchor="_Toc230455583" w:history="1">
+      <w:hyperlink w:anchor="_Toc230458177" w:history="1">
         <w:r>
           <w:rPr>
             <w:rStyle w:val="Lienhypertexte"/>
@@ -4014,7 +4014,7 @@
             <w:noProof/>
             <w:webHidden/>
           </w:rPr>
-          <w:instrText xml:space="preserve"> PAGEREF _Toc230455583 \h </w:instrText>
+          <w:instrText xml:space="preserve"> PAGEREF _Toc230458177 \h </w:instrText>
         </w:r>
         <w:r>
           <w:rPr>
@@ -4055,7 +4055,7 @@
           <w:noProof/>
         </w:rPr>
       </w:pPr>
-      <w:hyperlink w:anchor="_Toc230455584" w:history="1">
+      <w:hyperlink w:anchor="_Toc230458178" w:history="1">
         <w:r>
           <w:rPr>
             <w:rStyle w:val="Lienhypertexte"/>
@@ -4083,7 +4083,7 @@
             <w:noProof/>
             <w:webHidden/>
           </w:rPr>
-          <w:instrText xml:space="preserve"> PAGEREF _Toc230455584 \h </w:instrText>
+          <w:instrText xml:space="preserve"> PAGEREF _Toc230458178 \h </w:instrText>
         </w:r>
         <w:r>
           <w:rPr>
@@ -4124,7 +4124,7 @@
           <w:noProof/>
         </w:rPr>
       </w:pPr>
-      <w:hyperlink w:anchor="_Toc230455585" w:history="1">
+      <w:hyperlink w:anchor="_Toc230458179" w:history="1">
         <w:r>
           <w:rPr>
             <w:rStyle w:val="Lienhypertexte"/>
@@ -4152,7 +4152,7 @@
             <w:noProof/>
             <w:webHidden/>
           </w:rPr>
-          <w:instrText xml:space="preserve"> PAGEREF _Toc230455585 \h </w:instrText>
+          <w:instrText xml:space="preserve"> PAGEREF _Toc230458179 \h </w:instrText>
         </w:r>
         <w:r>
           <w:rPr>
@@ -4193,7 +4193,7 @@
           <w:noProof/>
         </w:rPr>
       </w:pPr>
-      <w:hyperlink w:anchor="_Toc230455586" w:history="1">
+      <w:hyperlink w:anchor="_Toc230458180" w:history="1">
         <w:r>
           <w:rPr>
             <w:rStyle w:val="Lienhypertexte"/>
@@ -4221,7 +4221,7 @@
             <w:noProof/>
             <w:webHidden/>
           </w:rPr>
-          <w:instrText xml:space="preserve"> PAGEREF _Toc230455586 \h </w:instrText>
+          <w:instrText xml:space="preserve"> PAGEREF _Toc230458180 \h </w:instrText>
         </w:r>
         <w:r>
           <w:rPr>
@@ -4262,7 +4262,7 @@
           <w:noProof/>
         </w:rPr>
       </w:pPr>
-      <w:hyperlink w:anchor="_Toc230455587" w:history="1">
+      <w:hyperlink w:anchor="_Toc230458181" w:history="1">
         <w:r>
           <w:rPr>
             <w:rStyle w:val="Lienhypertexte"/>
@@ -4290,7 +4290,7 @@
             <w:noProof/>
             <w:webHidden/>
           </w:rPr>
-          <w:instrText xml:space="preserve"> PAGEREF _Toc230455587 \h </w:instrText>
+          <w:instrText xml:space="preserve"> PAGEREF _Toc230458181 \h </w:instrText>
         </w:r>
         <w:r>
           <w:rPr>
@@ -4331,7 +4331,7 @@
           <w:noProof/>
         </w:rPr>
       </w:pPr>
-      <w:hyperlink w:anchor="_Toc230455588" w:history="1">
+      <w:hyperlink w:anchor="_Toc230458182" w:history="1">
         <w:r>
           <w:rPr>
             <w:rStyle w:val="Lienhypertexte"/>
@@ -4359,7 +4359,7 @@
             <w:noProof/>
             <w:webHidden/>
           </w:rPr>
-          <w:instrText xml:space="preserve"> PAGEREF _Toc230455588 \h </w:instrText>
+          <w:instrText xml:space="preserve"> PAGEREF _Toc230458182 \h </w:instrText>
         </w:r>
         <w:r>
           <w:rPr>
@@ -4379,7 +4379,7 @@
             <w:noProof/>
             <w:webHidden/>
           </w:rPr>
-          <w:t>36</w:t>
+          <w:t>37</w:t>
         </w:r>
         <w:r>
           <w:rPr>
@@ -4400,7 +4400,7 @@
           <w:noProof/>
         </w:rPr>
       </w:pPr>
-      <w:hyperlink w:anchor="_Toc230455589" w:history="1">
+      <w:hyperlink w:anchor="_Toc230458183" w:history="1">
         <w:r>
           <w:rPr>
             <w:rStyle w:val="Lienhypertexte"/>
@@ -4428,7 +4428,7 @@
             <w:noProof/>
             <w:webHidden/>
           </w:rPr>
-          <w:instrText xml:space="preserve"> PAGEREF _Toc230455589 \h </w:instrText>
+          <w:instrText xml:space="preserve"> PAGEREF _Toc230458183 \h </w:instrText>
         </w:r>
         <w:r>
           <w:rPr>
@@ -4469,7 +4469,7 @@
           <w:noProof/>
         </w:rPr>
       </w:pPr>
-      <w:hyperlink w:anchor="_Toc230455590" w:history="1">
+      <w:hyperlink w:anchor="_Toc230458184" w:history="1">
         <w:r>
           <w:rPr>
             <w:rStyle w:val="Lienhypertexte"/>
@@ -4497,7 +4497,7 @@
             <w:noProof/>
             <w:webHidden/>
           </w:rPr>
-          <w:instrText xml:space="preserve"> PAGEREF _Toc230455590 \h </w:instrText>
+          <w:instrText xml:space="preserve"> PAGEREF _Toc230458184 \h </w:instrText>
         </w:r>
         <w:r>
           <w:rPr>
@@ -4538,7 +4538,7 @@
           <w:noProof/>
         </w:rPr>
       </w:pPr>
-      <w:hyperlink w:anchor="_Toc230455591" w:history="1">
+      <w:hyperlink w:anchor="_Toc230458185" w:history="1">
         <w:r>
           <w:rPr>
             <w:rStyle w:val="Lienhypertexte"/>
@@ -4566,7 +4566,7 @@
             <w:noProof/>
             <w:webHidden/>
           </w:rPr>
-          <w:instrText xml:space="preserve"> PAGEREF _Toc230455591 \h </w:instrText>
+          <w:instrText xml:space="preserve"> PAGEREF _Toc230458185 \h </w:instrText>
         </w:r>
         <w:r>
           <w:rPr>
@@ -4607,7 +4607,7 @@
           <w:noProof/>
         </w:rPr>
       </w:pPr>
-      <w:hyperlink w:anchor="_Toc230455592" w:history="1">
+      <w:hyperlink w:anchor="_Toc230458186" w:history="1">
         <w:r>
           <w:rPr>
             <w:rStyle w:val="Lienhypertexte"/>
@@ -4635,7 +4635,7 @@
             <w:noProof/>
             <w:webHidden/>
           </w:rPr>
-          <w:instrText xml:space="preserve"> PAGEREF _Toc230455592 \h </w:instrText>
+          <w:instrText xml:space="preserve"> PAGEREF _Toc230458186 \h </w:instrText>
         </w:r>
         <w:r>
           <w:rPr>
@@ -4676,7 +4676,7 @@
           <w:noProof/>
         </w:rPr>
       </w:pPr>
-      <w:hyperlink w:anchor="_Toc230455593" w:history="1">
+      <w:hyperlink w:anchor="_Toc230458187" w:history="1">
         <w:r>
           <w:rPr>
             <w:rStyle w:val="Lienhypertexte"/>
@@ -4704,7 +4704,7 @@
             <w:noProof/>
             <w:webHidden/>
           </w:rPr>
-          <w:instrText xml:space="preserve"> PAGEREF _Toc230455593 \h </w:instrText>
+          <w:instrText xml:space="preserve"> PAGEREF _Toc230458187 \h </w:instrText>
         </w:r>
         <w:r>
           <w:rPr>
@@ -4724,7 +4724,7 @@
             <w:noProof/>
             <w:webHidden/>
           </w:rPr>
-          <w:t>39</w:t>
+          <w:t>40</w:t>
         </w:r>
         <w:r>
           <w:rPr>
@@ -4745,7 +4745,7 @@
           <w:noProof/>
         </w:rPr>
       </w:pPr>
-      <w:hyperlink w:anchor="_Toc230455594" w:history="1">
+      <w:hyperlink w:anchor="_Toc230458188" w:history="1">
         <w:r>
           <w:rPr>
             <w:rStyle w:val="Lienhypertexte"/>
@@ -4773,7 +4773,7 @@
             <w:noProof/>
             <w:webHidden/>
           </w:rPr>
-          <w:instrText xml:space="preserve"> PAGEREF _Toc230455594 \h </w:instrText>
+          <w:instrText xml:space="preserve"> PAGEREF _Toc230458188 \h </w:instrText>
         </w:r>
         <w:r>
           <w:rPr>
@@ -4814,7 +4814,7 @@
           <w:noProof/>
         </w:rPr>
       </w:pPr>
-      <w:hyperlink w:anchor="_Toc230455595" w:history="1">
+      <w:hyperlink w:anchor="_Toc230458189" w:history="1">
         <w:r>
           <w:rPr>
             <w:rStyle w:val="Lienhypertexte"/>
@@ -4842,7 +4842,7 @@
             <w:noProof/>
             <w:webHidden/>
           </w:rPr>
-          <w:instrText xml:space="preserve"> PAGEREF _Toc230455595 \h </w:instrText>
+          <w:instrText xml:space="preserve"> PAGEREF _Toc230458189 \h </w:instrText>
         </w:r>
         <w:r>
           <w:rPr>
@@ -4883,7 +4883,7 @@
           <w:noProof/>
         </w:rPr>
       </w:pPr>
-      <w:hyperlink w:anchor="_Toc230455596" w:history="1">
+      <w:hyperlink w:anchor="_Toc230458190" w:history="1">
         <w:r>
           <w:rPr>
             <w:rStyle w:val="Lienhypertexte"/>
@@ -4911,7 +4911,7 @@
             <w:noProof/>
             <w:webHidden/>
           </w:rPr>
-          <w:instrText xml:space="preserve"> PAGEREF _Toc230455596 \h </w:instrText>
+          <w:instrText xml:space="preserve"> PAGEREF _Toc230458190 \h </w:instrText>
         </w:r>
         <w:r>
           <w:rPr>
@@ -4952,7 +4952,7 @@
           <w:noProof/>
         </w:rPr>
       </w:pPr>
-      <w:hyperlink w:anchor="_Toc230455597" w:history="1">
+      <w:hyperlink w:anchor="_Toc230458191" w:history="1">
         <w:r>
           <w:rPr>
             <w:rStyle w:val="Lienhypertexte"/>
@@ -4980,7 +4980,7 @@
             <w:noProof/>
             <w:webHidden/>
           </w:rPr>
-          <w:instrText xml:space="preserve"> PAGEREF _Toc230455597 \h </w:instrText>
+          <w:instrText xml:space="preserve"> PAGEREF _Toc230458191 \h </w:instrText>
         </w:r>
         <w:r>
           <w:rPr>
@@ -5021,7 +5021,7 @@
           <w:noProof/>
         </w:rPr>
       </w:pPr>
-      <w:hyperlink w:anchor="_Toc230455598" w:history="1">
+      <w:hyperlink w:anchor="_Toc230458192" w:history="1">
         <w:r>
           <w:rPr>
             <w:rStyle w:val="Lienhypertexte"/>
@@ -5049,7 +5049,7 @@
             <w:noProof/>
             <w:webHidden/>
           </w:rPr>
-          <w:instrText xml:space="preserve"> PAGEREF _Toc230455598 \h </w:instrText>
+          <w:instrText xml:space="preserve"> PAGEREF _Toc230458192 \h </w:instrText>
         </w:r>
         <w:r>
           <w:rPr>
@@ -5090,7 +5090,7 @@
           <w:noProof/>
         </w:rPr>
       </w:pPr>
-      <w:hyperlink w:anchor="_Toc230455599" w:history="1">
+      <w:hyperlink w:anchor="_Toc230458193" w:history="1">
         <w:r>
           <w:rPr>
             <w:rStyle w:val="Lienhypertexte"/>
@@ -5117,7 +5117,7 @@
             <w:noProof/>
             <w:webHidden/>
           </w:rPr>
-          <w:instrText xml:space="preserve"> PAGEREF _Toc230455599 \h </w:instrText>
+          <w:instrText xml:space="preserve"> PAGEREF _Toc230458193 \h </w:instrText>
         </w:r>
         <w:r>
           <w:rPr>
@@ -5158,7 +5158,7 @@
           <w:noProof/>
         </w:rPr>
       </w:pPr>
-      <w:hyperlink w:anchor="_Toc230455600" w:history="1">
+      <w:hyperlink w:anchor="_Toc230458194" w:history="1">
         <w:r>
           <w:rPr>
             <w:rStyle w:val="Lienhypertexte"/>
@@ -5186,7 +5186,7 @@
             <w:noProof/>
             <w:webHidden/>
           </w:rPr>
-          <w:instrText xml:space="preserve"> PAGEREF _Toc230455600 \h </w:instrText>
+          <w:instrText xml:space="preserve"> PAGEREF _Toc230458194 \h </w:instrText>
         </w:r>
         <w:r>
           <w:rPr>
@@ -5227,7 +5227,7 @@
           <w:noProof/>
         </w:rPr>
       </w:pPr>
-      <w:hyperlink w:anchor="_Toc230455601" w:history="1">
+      <w:hyperlink w:anchor="_Toc230458195" w:history="1">
         <w:r>
           <w:rPr>
             <w:rStyle w:val="Lienhypertexte"/>
@@ -5254,7 +5254,7 @@
             <w:noProof/>
             <w:webHidden/>
           </w:rPr>
-          <w:instrText xml:space="preserve"> PAGEREF _Toc230455601 \h </w:instrText>
+          <w:instrText xml:space="preserve"> PAGEREF _Toc230458195 \h </w:instrText>
         </w:r>
         <w:r>
           <w:rPr>
@@ -5295,7 +5295,7 @@
           <w:noProof/>
         </w:rPr>
       </w:pPr>
-      <w:hyperlink w:anchor="_Toc230455602" w:history="1">
+      <w:hyperlink w:anchor="_Toc230458196" w:history="1">
         <w:r>
           <w:rPr>
             <w:rStyle w:val="Lienhypertexte"/>
@@ -5322,7 +5322,7 @@
             <w:noProof/>
             <w:webHidden/>
           </w:rPr>
-          <w:instrText xml:space="preserve"> PAGEREF _Toc230455602 \h </w:instrText>
+          <w:instrText xml:space="preserve"> PAGEREF _Toc230458196 \h </w:instrText>
         </w:r>
         <w:r>
           <w:rPr>
@@ -5363,7 +5363,7 @@
           <w:noProof/>
         </w:rPr>
       </w:pPr>
-      <w:hyperlink w:anchor="_Toc230455603" w:history="1">
+      <w:hyperlink w:anchor="_Toc230458197" w:history="1">
         <w:r>
           <w:rPr>
             <w:rStyle w:val="Lienhypertexte"/>
@@ -5391,7 +5391,7 @@
             <w:noProof/>
             <w:webHidden/>
           </w:rPr>
-          <w:instrText xml:space="preserve"> PAGEREF _Toc230455603 \h </w:instrText>
+          <w:instrText xml:space="preserve"> PAGEREF _Toc230458197 \h </w:instrText>
         </w:r>
         <w:r>
           <w:rPr>
@@ -5432,7 +5432,7 @@
           <w:noProof/>
         </w:rPr>
       </w:pPr>
-      <w:hyperlink w:anchor="_Toc230455604" w:history="1">
+      <w:hyperlink w:anchor="_Toc230458198" w:history="1">
         <w:r>
           <w:rPr>
             <w:rStyle w:val="Lienhypertexte"/>
@@ -5460,7 +5460,7 @@
             <w:noProof/>
             <w:webHidden/>
           </w:rPr>
-          <w:instrText xml:space="preserve"> PAGEREF _Toc230455604 \h </w:instrText>
+          <w:instrText xml:space="preserve"> PAGEREF _Toc230458198 \h </w:instrText>
         </w:r>
         <w:r>
           <w:rPr>
@@ -5501,7 +5501,7 @@
           <w:noProof/>
         </w:rPr>
       </w:pPr>
-      <w:hyperlink w:anchor="_Toc230455605" w:history="1">
+      <w:hyperlink w:anchor="_Toc230458199" w:history="1">
         <w:r>
           <w:rPr>
             <w:rStyle w:val="Lienhypertexte"/>
@@ -5529,7 +5529,7 @@
             <w:noProof/>
             <w:webHidden/>
           </w:rPr>
-          <w:instrText xml:space="preserve"> PAGEREF _Toc230455605 \h </w:instrText>
+          <w:instrText xml:space="preserve"> PAGEREF _Toc230458199 \h </w:instrText>
         </w:r>
         <w:r>
           <w:rPr>
@@ -5549,7 +5549,7 @@
             <w:noProof/>
             <w:webHidden/>
           </w:rPr>
-          <w:t>46</w:t>
+          <w:t>47</w:t>
         </w:r>
         <w:r>
           <w:rPr>
@@ -5570,7 +5570,7 @@
           <w:noProof/>
         </w:rPr>
       </w:pPr>
-      <w:hyperlink w:anchor="_Toc230455606" w:history="1">
+      <w:hyperlink w:anchor="_Toc230458200" w:history="1">
         <w:r>
           <w:rPr>
             <w:rStyle w:val="Lienhypertexte"/>
@@ -5598,7 +5598,7 @@
             <w:noProof/>
             <w:webHidden/>
           </w:rPr>
-          <w:instrText xml:space="preserve"> PAGEREF _Toc230455606 \h </w:instrText>
+          <w:instrText xml:space="preserve"> PAGEREF _Toc230458200 \h </w:instrText>
         </w:r>
         <w:r>
           <w:rPr>
@@ -5639,7 +5639,7 @@
           <w:noProof/>
         </w:rPr>
       </w:pPr>
-      <w:hyperlink w:anchor="_Toc230455607" w:history="1">
+      <w:hyperlink w:anchor="_Toc230458201" w:history="1">
         <w:r>
           <w:rPr>
             <w:rStyle w:val="Lienhypertexte"/>
@@ -5667,7 +5667,7 @@
             <w:noProof/>
             <w:webHidden/>
           </w:rPr>
-          <w:instrText xml:space="preserve"> PAGEREF _Toc230455607 \h </w:instrText>
+          <w:instrText xml:space="preserve"> PAGEREF _Toc230458201 \h </w:instrText>
         </w:r>
         <w:r>
           <w:rPr>
@@ -5708,7 +5708,7 @@
           <w:noProof/>
         </w:rPr>
       </w:pPr>
-      <w:hyperlink w:anchor="_Toc230455608" w:history="1">
+      <w:hyperlink w:anchor="_Toc230458202" w:history="1">
         <w:r>
           <w:rPr>
             <w:rStyle w:val="Lienhypertexte"/>
@@ -5736,7 +5736,7 @@
             <w:noProof/>
             <w:webHidden/>
           </w:rPr>
-          <w:instrText xml:space="preserve"> PAGEREF _Toc230455608 \h </w:instrText>
+          <w:instrText xml:space="preserve"> PAGEREF _Toc230458202 \h </w:instrText>
         </w:r>
         <w:r>
           <w:rPr>
@@ -5777,7 +5777,7 @@
           <w:noProof/>
         </w:rPr>
       </w:pPr>
-      <w:hyperlink w:anchor="_Toc230455609" w:history="1">
+      <w:hyperlink w:anchor="_Toc230458203" w:history="1">
         <w:r>
           <w:rPr>
             <w:rStyle w:val="Lienhypertexte"/>
@@ -5805,7 +5805,7 @@
             <w:noProof/>
             <w:webHidden/>
           </w:rPr>
-          <w:instrText xml:space="preserve"> PAGEREF _Toc230455609 \h </w:instrText>
+          <w:instrText xml:space="preserve"> PAGEREF _Toc230458203 \h </w:instrText>
         </w:r>
         <w:r>
           <w:rPr>
@@ -5846,7 +5846,7 @@
           <w:noProof/>
         </w:rPr>
       </w:pPr>
-      <w:hyperlink w:anchor="_Toc230455610" w:history="1">
+      <w:hyperlink w:anchor="_Toc230458204" w:history="1">
         <w:r>
           <w:rPr>
             <w:rStyle w:val="Lienhypertexte"/>
@@ -5874,7 +5874,7 @@
             <w:noProof/>
             <w:webHidden/>
           </w:rPr>
-          <w:instrText xml:space="preserve"> PAGEREF _Toc230455610 \h </w:instrText>
+          <w:instrText xml:space="preserve"> PAGEREF _Toc230458204 \h </w:instrText>
         </w:r>
         <w:r>
           <w:rPr>
@@ -5915,7 +5915,7 @@
           <w:noProof/>
         </w:rPr>
       </w:pPr>
-      <w:hyperlink w:anchor="_Toc230455611" w:history="1">
+      <w:hyperlink w:anchor="_Toc230458205" w:history="1">
         <w:r>
           <w:rPr>
             <w:rStyle w:val="Lienhypertexte"/>
@@ -5943,7 +5943,7 @@
             <w:noProof/>
             <w:webHidden/>
           </w:rPr>
-          <w:instrText xml:space="preserve"> PAGEREF _Toc230455611 \h </w:instrText>
+          <w:instrText xml:space="preserve"> PAGEREF _Toc230458205 \h </w:instrText>
         </w:r>
         <w:r>
           <w:rPr>
@@ -5984,7 +5984,7 @@
           <w:noProof/>
         </w:rPr>
       </w:pPr>
-      <w:hyperlink w:anchor="_Toc230455612" w:history="1">
+      <w:hyperlink w:anchor="_Toc230458206" w:history="1">
         <w:r>
           <w:rPr>
             <w:rStyle w:val="Lienhypertexte"/>
@@ -6012,7 +6012,7 @@
             <w:noProof/>
             <w:webHidden/>
           </w:rPr>
-          <w:instrText xml:space="preserve"> PAGEREF _Toc230455612 \h </w:instrText>
+          <w:instrText xml:space="preserve"> PAGEREF _Toc230458206 \h </w:instrText>
         </w:r>
         <w:r>
           <w:rPr>
@@ -6053,7 +6053,7 @@
           <w:noProof/>
         </w:rPr>
       </w:pPr>
-      <w:hyperlink w:anchor="_Toc230455613" w:history="1">
+      <w:hyperlink w:anchor="_Toc230458207" w:history="1">
         <w:r>
           <w:rPr>
             <w:rStyle w:val="Lienhypertexte"/>
@@ -6081,7 +6081,7 @@
             <w:noProof/>
             <w:webHidden/>
           </w:rPr>
-          <w:instrText xml:space="preserve"> PAGEREF _Toc230455613 \h </w:instrText>
+          <w:instrText xml:space="preserve"> PAGEREF _Toc230458207 \h </w:instrText>
         </w:r>
         <w:r>
           <w:rPr>
@@ -6122,7 +6122,7 @@
           <w:noProof/>
         </w:rPr>
       </w:pPr>
-      <w:hyperlink w:anchor="_Toc230455614" w:history="1">
+      <w:hyperlink w:anchor="_Toc230458208" w:history="1">
         <w:r>
           <w:rPr>
             <w:rStyle w:val="Lienhypertexte"/>
@@ -6150,7 +6150,7 @@
             <w:noProof/>
             <w:webHidden/>
           </w:rPr>
-          <w:instrText xml:space="preserve"> PAGEREF _Toc230455614 \h </w:instrText>
+          <w:instrText xml:space="preserve"> PAGEREF _Toc230458208 \h </w:instrText>
         </w:r>
         <w:r>
           <w:rPr>
@@ -6191,7 +6191,7 @@
           <w:noProof/>
         </w:rPr>
       </w:pPr>
-      <w:hyperlink w:anchor="_Toc230455615" w:history="1">
+      <w:hyperlink w:anchor="_Toc230458209" w:history="1">
         <w:r>
           <w:rPr>
             <w:rStyle w:val="Lienhypertexte"/>
@@ -6219,7 +6219,7 @@
             <w:noProof/>
             <w:webHidden/>
           </w:rPr>
-          <w:instrText xml:space="preserve"> PAGEREF _Toc230455615 \h </w:instrText>
+          <w:instrText xml:space="preserve"> PAGEREF _Toc230458209 \h </w:instrText>
         </w:r>
         <w:r>
           <w:rPr>
@@ -6260,7 +6260,7 @@
           <w:noProof/>
         </w:rPr>
       </w:pPr>
-      <w:hyperlink w:anchor="_Toc230455616" w:history="1">
+      <w:hyperlink w:anchor="_Toc230458210" w:history="1">
         <w:r>
           <w:rPr>
             <w:rStyle w:val="Lienhypertexte"/>
@@ -6288,7 +6288,7 @@
             <w:noProof/>
             <w:webHidden/>
           </w:rPr>
-          <w:instrText xml:space="preserve"> PAGEREF _Toc230455616 \h </w:instrText>
+          <w:instrText xml:space="preserve"> PAGEREF _Toc230458210 \h </w:instrText>
         </w:r>
         <w:r>
           <w:rPr>
@@ -6329,7 +6329,7 @@
           <w:noProof/>
         </w:rPr>
       </w:pPr>
-      <w:hyperlink w:anchor="_Toc230455617" w:history="1">
+      <w:hyperlink w:anchor="_Toc230458211" w:history="1">
         <w:r>
           <w:rPr>
             <w:rStyle w:val="Lienhypertexte"/>
@@ -6357,7 +6357,7 @@
             <w:noProof/>
             <w:webHidden/>
           </w:rPr>
-          <w:instrText xml:space="preserve"> PAGEREF _Toc230455617 \h </w:instrText>
+          <w:instrText xml:space="preserve"> PAGEREF _Toc230458211 \h </w:instrText>
         </w:r>
         <w:r>
           <w:rPr>
@@ -6398,7 +6398,7 @@
           <w:noProof/>
         </w:rPr>
       </w:pPr>
-      <w:hyperlink w:anchor="_Toc230455618" w:history="1">
+      <w:hyperlink w:anchor="_Toc230458212" w:history="1">
         <w:r>
           <w:rPr>
             <w:rStyle w:val="Lienhypertexte"/>
@@ -6426,7 +6426,7 @@
             <w:noProof/>
             <w:webHidden/>
           </w:rPr>
-          <w:instrText xml:space="preserve"> PAGEREF _Toc230455618 \h </w:instrText>
+          <w:instrText xml:space="preserve"> PAGEREF _Toc230458212 \h </w:instrText>
         </w:r>
         <w:r>
           <w:rPr>
@@ -6467,7 +6467,7 @@
           <w:noProof/>
         </w:rPr>
       </w:pPr>
-      <w:hyperlink w:anchor="_Toc230455619" w:history="1">
+      <w:hyperlink w:anchor="_Toc230458213" w:history="1">
         <w:r>
           <w:rPr>
             <w:rStyle w:val="Lienhypertexte"/>
@@ -6495,7 +6495,7 @@
             <w:noProof/>
             <w:webHidden/>
           </w:rPr>
-          <w:instrText xml:space="preserve"> PAGEREF _Toc230455619 \h </w:instrText>
+          <w:instrText xml:space="preserve"> PAGEREF _Toc230458213 \h </w:instrText>
         </w:r>
         <w:r>
           <w:rPr>
@@ -6536,7 +6536,7 @@
           <w:noProof/>
         </w:rPr>
       </w:pPr>
-      <w:hyperlink w:anchor="_Toc230455620" w:history="1">
+      <w:hyperlink w:anchor="_Toc230458214" w:history="1">
         <w:r>
           <w:rPr>
             <w:rStyle w:val="Lienhypertexte"/>
@@ -6564,7 +6564,7 @@
             <w:noProof/>
             <w:webHidden/>
           </w:rPr>
-          <w:instrText xml:space="preserve"> PAGEREF _Toc230455620 \h </w:instrText>
+          <w:instrText xml:space="preserve"> PAGEREF _Toc230458214 \h </w:instrText>
         </w:r>
         <w:r>
           <w:rPr>
@@ -6605,7 +6605,7 @@
           <w:noProof/>
         </w:rPr>
       </w:pPr>
-      <w:hyperlink w:anchor="_Toc230455621" w:history="1">
+      <w:hyperlink w:anchor="_Toc230458215" w:history="1">
         <w:r>
           <w:rPr>
             <w:rStyle w:val="Lienhypertexte"/>
@@ -6633,7 +6633,7 @@
             <w:noProof/>
             <w:webHidden/>
           </w:rPr>
-          <w:instrText xml:space="preserve"> PAGEREF _Toc230455621 \h </w:instrText>
+          <w:instrText xml:space="preserve"> PAGEREF _Toc230458215 \h </w:instrText>
         </w:r>
         <w:r>
           <w:rPr>
@@ -6674,7 +6674,7 @@
           <w:noProof/>
         </w:rPr>
       </w:pPr>
-      <w:hyperlink w:anchor="_Toc230455622" w:history="1">
+      <w:hyperlink w:anchor="_Toc230458216" w:history="1">
         <w:r>
           <w:rPr>
             <w:rStyle w:val="Lienhypertexte"/>
@@ -6702,7 +6702,7 @@
             <w:noProof/>
             <w:webHidden/>
           </w:rPr>
-          <w:instrText xml:space="preserve"> PAGEREF _Toc230455622 \h </w:instrText>
+          <w:instrText xml:space="preserve"> PAGEREF _Toc230458216 \h </w:instrText>
         </w:r>
         <w:r>
           <w:rPr>
@@ -6743,7 +6743,7 @@
           <w:noProof/>
         </w:rPr>
       </w:pPr>
-      <w:hyperlink w:anchor="_Toc230455623" w:history="1">
+      <w:hyperlink w:anchor="_Toc230458217" w:history="1">
         <w:r>
           <w:rPr>
             <w:rStyle w:val="Lienhypertexte"/>
@@ -6771,7 +6771,7 @@
             <w:noProof/>
             <w:webHidden/>
           </w:rPr>
-          <w:instrText xml:space="preserve"> PAGEREF _Toc230455623 \h </w:instrText>
+          <w:instrText xml:space="preserve"> PAGEREF _Toc230458217 \h </w:instrText>
         </w:r>
         <w:r>
           <w:rPr>
@@ -6812,7 +6812,7 @@
           <w:noProof/>
         </w:rPr>
       </w:pPr>
-      <w:hyperlink w:anchor="_Toc230455624" w:history="1">
+      <w:hyperlink w:anchor="_Toc230458218" w:history="1">
         <w:r>
           <w:rPr>
             <w:rStyle w:val="Lienhypertexte"/>
@@ -6840,7 +6840,7 @@
             <w:noProof/>
             <w:webHidden/>
           </w:rPr>
-          <w:instrText xml:space="preserve"> PAGEREF _Toc230455624 \h </w:instrText>
+          <w:instrText xml:space="preserve"> PAGEREF _Toc230458218 \h </w:instrText>
         </w:r>
         <w:r>
           <w:rPr>
@@ -6881,7 +6881,7 @@
           <w:noProof/>
         </w:rPr>
       </w:pPr>
-      <w:hyperlink w:anchor="_Toc230455625" w:history="1">
+      <w:hyperlink w:anchor="_Toc230458219" w:history="1">
         <w:r>
           <w:rPr>
             <w:rStyle w:val="Lienhypertexte"/>
@@ -6909,7 +6909,7 @@
             <w:noProof/>
             <w:webHidden/>
           </w:rPr>
-          <w:instrText xml:space="preserve"> PAGEREF _Toc230455625 \h </w:instrText>
+          <w:instrText xml:space="preserve"> PAGEREF _Toc230458219 \h </w:instrText>
         </w:r>
         <w:r>
           <w:rPr>
@@ -6950,7 +6950,7 @@
           <w:noProof/>
         </w:rPr>
       </w:pPr>
-      <w:hyperlink w:anchor="_Toc230455626" w:history="1">
+      <w:hyperlink w:anchor="_Toc230458220" w:history="1">
         <w:r>
           <w:rPr>
             <w:rStyle w:val="Lienhypertexte"/>
@@ -6978,7 +6978,7 @@
             <w:noProof/>
             <w:webHidden/>
           </w:rPr>
-          <w:instrText xml:space="preserve"> PAGEREF _Toc230455626 \h </w:instrText>
+          <w:instrText xml:space="preserve"> PAGEREF _Toc230458220 \h </w:instrText>
         </w:r>
         <w:r>
           <w:rPr>
@@ -7019,7 +7019,7 @@
           <w:noProof/>
         </w:rPr>
       </w:pPr>
-      <w:hyperlink w:anchor="_Toc230455627" w:history="1">
+      <w:hyperlink w:anchor="_Toc230458221" w:history="1">
         <w:r>
           <w:rPr>
             <w:rStyle w:val="Lienhypertexte"/>
@@ -7047,7 +7047,7 @@
             <w:noProof/>
             <w:webHidden/>
           </w:rPr>
-          <w:instrText xml:space="preserve"> PAGEREF _Toc230455627 \h </w:instrText>
+          <w:instrText xml:space="preserve"> PAGEREF _Toc230458221 \h </w:instrText>
         </w:r>
         <w:r>
           <w:rPr>
@@ -7088,7 +7088,7 @@
           <w:noProof/>
         </w:rPr>
       </w:pPr>
-      <w:hyperlink w:anchor="_Toc230455628" w:history="1">
+      <w:hyperlink w:anchor="_Toc230458222" w:history="1">
         <w:r>
           <w:rPr>
             <w:rStyle w:val="Lienhypertexte"/>
@@ -7116,7 +7116,7 @@
             <w:noProof/>
             <w:webHidden/>
           </w:rPr>
-          <w:instrText xml:space="preserve"> PAGEREF _Toc230455628 \h </w:instrText>
+          <w:instrText xml:space="preserve"> PAGEREF _Toc230458222 \h </w:instrText>
         </w:r>
         <w:r>
           <w:rPr>
@@ -7157,7 +7157,7 @@
           <w:noProof/>
         </w:rPr>
       </w:pPr>
-      <w:hyperlink w:anchor="_Toc230455629" w:history="1">
+      <w:hyperlink w:anchor="_Toc230458223" w:history="1">
         <w:r>
           <w:rPr>
             <w:rStyle w:val="Lienhypertexte"/>
@@ -7185,7 +7185,7 @@
             <w:noProof/>
             <w:webHidden/>
           </w:rPr>
-          <w:instrText xml:space="preserve"> PAGEREF _Toc230455629 \h </w:instrText>
+          <w:instrText xml:space="preserve"> PAGEREF _Toc230458223 \h </w:instrText>
         </w:r>
         <w:r>
           <w:rPr>
@@ -7226,7 +7226,7 @@
           <w:noProof/>
         </w:rPr>
       </w:pPr>
-      <w:hyperlink w:anchor="_Toc230455630" w:history="1">
+      <w:hyperlink w:anchor="_Toc230458224" w:history="1">
         <w:r>
           <w:rPr>
             <w:rStyle w:val="Lienhypertexte"/>
@@ -7254,7 +7254,7 @@
             <w:noProof/>
             <w:webHidden/>
           </w:rPr>
-          <w:instrText xml:space="preserve"> PAGEREF _Toc230455630 \h </w:instrText>
+          <w:instrText xml:space="preserve"> PAGEREF _Toc230458224 \h </w:instrText>
         </w:r>
         <w:r>
           <w:rPr>
@@ -7295,7 +7295,7 @@
           <w:noProof/>
         </w:rPr>
       </w:pPr>
-      <w:hyperlink w:anchor="_Toc230455631" w:history="1">
+      <w:hyperlink w:anchor="_Toc230458225" w:history="1">
         <w:r>
           <w:rPr>
             <w:rStyle w:val="Lienhypertexte"/>
@@ -7323,7 +7323,7 @@
             <w:noProof/>
             <w:webHidden/>
           </w:rPr>
-          <w:instrText xml:space="preserve"> PAGEREF _Toc230455631 \h </w:instrText>
+          <w:instrText xml:space="preserve"> PAGEREF _Toc230458225 \h </w:instrText>
         </w:r>
         <w:r>
           <w:rPr>
@@ -7364,7 +7364,7 @@
           <w:noProof/>
         </w:rPr>
       </w:pPr>
-      <w:hyperlink w:anchor="_Toc230455632" w:history="1">
+      <w:hyperlink w:anchor="_Toc230458226" w:history="1">
         <w:r>
           <w:rPr>
             <w:rStyle w:val="Lienhypertexte"/>
@@ -7392,7 +7392,7 @@
             <w:noProof/>
             <w:webHidden/>
           </w:rPr>
-          <w:instrText xml:space="preserve"> PAGEREF _Toc230455632 \h </w:instrText>
+          <w:instrText xml:space="preserve"> PAGEREF _Toc230458226 \h </w:instrText>
         </w:r>
         <w:r>
           <w:rPr>
@@ -7433,7 +7433,7 @@
           <w:noProof/>
         </w:rPr>
       </w:pPr>
-      <w:hyperlink w:anchor="_Toc230455633" w:history="1">
+      <w:hyperlink w:anchor="_Toc230458227" w:history="1">
         <w:r>
           <w:rPr>
             <w:rStyle w:val="Lienhypertexte"/>
@@ -7461,7 +7461,7 @@
             <w:noProof/>
             <w:webHidden/>
           </w:rPr>
-          <w:instrText xml:space="preserve"> PAGEREF _Toc230455633 \h </w:instrText>
+          <w:instrText xml:space="preserve"> PAGEREF _Toc230458227 \h </w:instrText>
         </w:r>
         <w:r>
           <w:rPr>
@@ -7502,7 +7502,7 @@
           <w:noProof/>
         </w:rPr>
       </w:pPr>
-      <w:hyperlink w:anchor="_Toc230455634" w:history="1">
+      <w:hyperlink w:anchor="_Toc230458228" w:history="1">
         <w:r>
           <w:rPr>
             <w:rStyle w:val="Lienhypertexte"/>
@@ -7530,7 +7530,7 @@
             <w:noProof/>
             <w:webHidden/>
           </w:rPr>
-          <w:instrText xml:space="preserve"> PAGEREF _Toc230455634 \h </w:instrText>
+          <w:instrText xml:space="preserve"> PAGEREF _Toc230458228 \h </w:instrText>
         </w:r>
         <w:r>
           <w:rPr>
@@ -7571,7 +7571,7 @@
           <w:noProof/>
         </w:rPr>
       </w:pPr>
-      <w:hyperlink w:anchor="_Toc230455635" w:history="1">
+      <w:hyperlink w:anchor="_Toc230458229" w:history="1">
         <w:r>
           <w:rPr>
             <w:rStyle w:val="Lienhypertexte"/>
@@ -7599,7 +7599,7 @@
             <w:noProof/>
             <w:webHidden/>
           </w:rPr>
-          <w:instrText xml:space="preserve"> PAGEREF _Toc230455635 \h </w:instrText>
+          <w:instrText xml:space="preserve"> PAGEREF _Toc230458229 \h </w:instrText>
         </w:r>
         <w:r>
           <w:rPr>
@@ -7640,7 +7640,7 @@
           <w:noProof/>
         </w:rPr>
       </w:pPr>
-      <w:hyperlink w:anchor="_Toc230455636" w:history="1">
+      <w:hyperlink w:anchor="_Toc230458230" w:history="1">
         <w:r>
           <w:rPr>
             <w:rStyle w:val="Lienhypertexte"/>
@@ -7668,7 +7668,7 @@
             <w:noProof/>
             <w:webHidden/>
           </w:rPr>
-          <w:instrText xml:space="preserve"> PAGEREF _Toc230455636 \h </w:instrText>
+          <w:instrText xml:space="preserve"> PAGEREF _Toc230458230 \h </w:instrText>
         </w:r>
         <w:r>
           <w:rPr>
@@ -7709,7 +7709,7 @@
           <w:noProof/>
         </w:rPr>
       </w:pPr>
-      <w:hyperlink w:anchor="_Toc230455637" w:history="1">
+      <w:hyperlink w:anchor="_Toc230458231" w:history="1">
         <w:r>
           <w:rPr>
             <w:rStyle w:val="Lienhypertexte"/>
@@ -7737,7 +7737,7 @@
             <w:noProof/>
             <w:webHidden/>
           </w:rPr>
-          <w:instrText xml:space="preserve"> PAGEREF _Toc230455637 \h </w:instrText>
+          <w:instrText xml:space="preserve"> PAGEREF _Toc230458231 \h </w:instrText>
         </w:r>
         <w:r>
           <w:rPr>
@@ -7778,7 +7778,7 @@
           <w:noProof/>
         </w:rPr>
       </w:pPr>
-      <w:hyperlink w:anchor="_Toc230455638" w:history="1">
+      <w:hyperlink w:anchor="_Toc230458232" w:history="1">
         <w:r>
           <w:rPr>
             <w:rStyle w:val="Lienhypertexte"/>
@@ -7806,7 +7806,7 @@
             <w:noProof/>
             <w:webHidden/>
           </w:rPr>
-          <w:instrText xml:space="preserve"> PAGEREF _Toc230455638 \h </w:instrText>
+          <w:instrText xml:space="preserve"> PAGEREF _Toc230458232 \h </w:instrText>
         </w:r>
         <w:r>
           <w:rPr>
@@ -7847,7 +7847,7 @@
           <w:noProof/>
         </w:rPr>
       </w:pPr>
-      <w:hyperlink w:anchor="_Toc230455639" w:history="1">
+      <w:hyperlink w:anchor="_Toc230458233" w:history="1">
         <w:r>
           <w:rPr>
             <w:rStyle w:val="Lienhypertexte"/>
@@ -7875,7 +7875,7 @@
             <w:noProof/>
             <w:webHidden/>
           </w:rPr>
-          <w:instrText xml:space="preserve"> PAGEREF _Toc230455639 \h </w:instrText>
+          <w:instrText xml:space="preserve"> PAGEREF _Toc230458233 \h </w:instrText>
         </w:r>
         <w:r>
           <w:rPr>
@@ -7916,7 +7916,7 @@
           <w:noProof/>
         </w:rPr>
       </w:pPr>
-      <w:hyperlink w:anchor="_Toc230455640" w:history="1">
+      <w:hyperlink w:anchor="_Toc230458234" w:history="1">
         <w:r>
           <w:rPr>
             <w:rStyle w:val="Lienhypertexte"/>
@@ -7944,7 +7944,7 @@
             <w:noProof/>
             <w:webHidden/>
           </w:rPr>
-          <w:instrText xml:space="preserve"> PAGEREF _Toc230455640 \h </w:instrText>
+          <w:instrText xml:space="preserve"> PAGEREF _Toc230458234 \h </w:instrText>
         </w:r>
         <w:r>
           <w:rPr>
@@ -7985,7 +7985,7 @@
           <w:noProof/>
         </w:rPr>
       </w:pPr>
-      <w:hyperlink w:anchor="_Toc230455641" w:history="1">
+      <w:hyperlink w:anchor="_Toc230458235" w:history="1">
         <w:r>
           <w:rPr>
             <w:rStyle w:val="Lienhypertexte"/>
@@ -8013,7 +8013,7 @@
             <w:noProof/>
             <w:webHidden/>
           </w:rPr>
-          <w:instrText xml:space="preserve"> PAGEREF _Toc230455641 \h </w:instrText>
+          <w:instrText xml:space="preserve"> PAGEREF _Toc230458235 \h </w:instrText>
         </w:r>
         <w:r>
           <w:rPr>
@@ -8054,7 +8054,7 @@
           <w:noProof/>
         </w:rPr>
       </w:pPr>
-      <w:hyperlink w:anchor="_Toc230455642" w:history="1">
+      <w:hyperlink w:anchor="_Toc230458236" w:history="1">
         <w:r>
           <w:rPr>
             <w:rStyle w:val="Lienhypertexte"/>
@@ -8082,7 +8082,7 @@
             <w:noProof/>
             <w:webHidden/>
           </w:rPr>
-          <w:instrText xml:space="preserve"> PAGEREF _Toc230455642 \h </w:instrText>
+          <w:instrText xml:space="preserve"> PAGEREF _Toc230458236 \h </w:instrText>
         </w:r>
         <w:r>
           <w:rPr>
@@ -8138,7 +8138,7 @@
         </w:pBdr>
         <w:spacing w:before="80" w:after="200"/>
       </w:pPr>
-      <w:bookmarkStart w:id="1" w:name="_Toc230455530"/>
+      <w:bookmarkStart w:id="1" w:name="_Toc230458124"/>
       <w:r>
         <w:rPr>
           <w:rFonts w:ascii="Aptos Display" w:hAnsi="Aptos Display"/>
@@ -8163,7 +8163,7 @@
           <w:noProof/>
         </w:rPr>
         <w:drawing>
-          <wp:inline distT="0" distB="0" distL="0" distR="0" wp14:anchorId="10F692C6" wp14:editId="5E697744">
+          <wp:inline distT="0" distB="0" distL="0" distR="0" wp14:anchorId="1A828551" wp14:editId="1C41268E">
             <wp:extent cx="5486400" cy="3320928"/>
             <wp:effectExtent l="0" t="0" r="0" b="0"/>
             <wp:docPr id="1" name="Picture 1"/>
@@ -8230,7 +8230,7 @@
           <w:noProof/>
         </w:rPr>
         <w:drawing>
-          <wp:inline distT="0" distB="0" distL="0" distR="0" wp14:anchorId="0F115488" wp14:editId="26E49D4E">
+          <wp:inline distT="0" distB="0" distL="0" distR="0" wp14:anchorId="0A70E86C" wp14:editId="2891365D">
             <wp:extent cx="5486400" cy="3676506"/>
             <wp:effectExtent l="0" t="0" r="0" b="0"/>
             <wp:docPr id="2" name="Picture 2"/>
@@ -8406,7 +8406,7 @@
         <w:pStyle w:val="Titre2"/>
         <w:spacing w:before="460" w:after="220"/>
       </w:pPr>
-      <w:bookmarkStart w:id="2" w:name="_Toc230455531"/>
+      <w:bookmarkStart w:id="2" w:name="_Toc230458125"/>
       <w:r>
         <w:rPr>
           <w:rFonts w:ascii="Aptos Display" w:hAnsi="Aptos Display"/>
@@ -8820,7 +8820,7 @@
         <w:pStyle w:val="Titre2"/>
         <w:spacing w:before="460" w:after="220"/>
       </w:pPr>
-      <w:bookmarkStart w:id="3" w:name="_Toc230455532"/>
+      <w:bookmarkStart w:id="3" w:name="_Toc230458126"/>
       <w:r>
         <w:rPr>
           <w:rFonts w:ascii="Aptos Display" w:hAnsi="Aptos Display"/>
@@ -8859,7 +8859,7 @@
           <w:noProof/>
         </w:rPr>
         <w:drawing>
-          <wp:inline distT="0" distB="0" distL="0" distR="0" wp14:anchorId="2B738025" wp14:editId="0907D7DF">
+          <wp:inline distT="0" distB="0" distL="0" distR="0" wp14:anchorId="65DF55AD" wp14:editId="43E6C5C5">
             <wp:extent cx="4192474" cy="7498079"/>
             <wp:effectExtent l="0" t="0" r="0" b="0"/>
             <wp:docPr id="3" name="Picture 3"/>
@@ -8927,7 +8927,7 @@
         </w:rPr>
         <w:lastRenderedPageBreak/>
         <w:drawing>
-          <wp:inline distT="0" distB="0" distL="0" distR="0" wp14:anchorId="0CF143FB" wp14:editId="1EC9AFFB">
+          <wp:inline distT="0" distB="0" distL="0" distR="0" wp14:anchorId="073DF8BA" wp14:editId="6F7BA918">
             <wp:extent cx="4001844" cy="7498079"/>
             <wp:effectExtent l="0" t="0" r="0" b="0"/>
             <wp:docPr id="4" name="Picture 4"/>
@@ -9106,7 +9106,7 @@
         <w:pStyle w:val="Titre2"/>
         <w:spacing w:before="460" w:after="220"/>
       </w:pPr>
-      <w:bookmarkStart w:id="4" w:name="_Toc230455533"/>
+      <w:bookmarkStart w:id="4" w:name="_Toc230458127"/>
       <w:r>
         <w:rPr>
           <w:rFonts w:ascii="Aptos Display" w:hAnsi="Aptos Display"/>
@@ -9200,7 +9200,7 @@
         <w:pStyle w:val="Titre2"/>
         <w:spacing w:before="460" w:after="220"/>
       </w:pPr>
-      <w:bookmarkStart w:id="5" w:name="_Toc230455534"/>
+      <w:bookmarkStart w:id="5" w:name="_Toc230458128"/>
       <w:r>
         <w:rPr>
           <w:rFonts w:ascii="Aptos Display" w:hAnsi="Aptos Display"/>
@@ -9361,7 +9361,7 @@
         </w:pBdr>
         <w:spacing w:before="80" w:after="200"/>
       </w:pPr>
-      <w:bookmarkStart w:id="6" w:name="_Toc230455535"/>
+      <w:bookmarkStart w:id="6" w:name="_Toc230458129"/>
       <w:r>
         <w:rPr>
           <w:rFonts w:ascii="Aptos Display" w:hAnsi="Aptos Display"/>
@@ -9386,7 +9386,7 @@
           <w:noProof/>
         </w:rPr>
         <w:drawing>
-          <wp:inline distT="0" distB="0" distL="0" distR="0" wp14:anchorId="3A70E1B6" wp14:editId="178FDF6E">
+          <wp:inline distT="0" distB="0" distL="0" distR="0" wp14:anchorId="76130064" wp14:editId="5202F423">
             <wp:extent cx="3699052" cy="7498079"/>
             <wp:effectExtent l="0" t="0" r="0" b="0"/>
             <wp:docPr id="5" name="Picture 5"/>
@@ -9454,7 +9454,7 @@
         <w:pStyle w:val="Titre2"/>
         <w:spacing w:before="460" w:after="220"/>
       </w:pPr>
-      <w:bookmarkStart w:id="7" w:name="_Toc230455536"/>
+      <w:bookmarkStart w:id="7" w:name="_Toc230458130"/>
       <w:r>
         <w:rPr>
           <w:rFonts w:ascii="Aptos Display" w:hAnsi="Aptos Display"/>
@@ -9493,7 +9493,7 @@
           <w:noProof/>
         </w:rPr>
         <w:drawing>
-          <wp:inline distT="0" distB="0" distL="0" distR="0" wp14:anchorId="057B5069" wp14:editId="66C890A0">
+          <wp:inline distT="0" distB="0" distL="0" distR="0" wp14:anchorId="565CCDA3" wp14:editId="4149C7C6">
             <wp:extent cx="4852378" cy="7498079"/>
             <wp:effectExtent l="0" t="0" r="0" b="0"/>
             <wp:docPr id="6" name="Picture 6"/>
@@ -10043,7 +10043,7 @@
         <w:pStyle w:val="Titre2"/>
         <w:spacing w:before="460" w:after="220"/>
       </w:pPr>
-      <w:bookmarkStart w:id="8" w:name="_Toc230455537"/>
+      <w:bookmarkStart w:id="8" w:name="_Toc230458131"/>
       <w:r>
         <w:rPr>
           <w:rFonts w:ascii="Aptos Display" w:hAnsi="Aptos Display"/>
@@ -10411,7 +10411,7 @@
         <w:pStyle w:val="Titre2"/>
         <w:spacing w:before="460" w:after="220"/>
       </w:pPr>
-      <w:bookmarkStart w:id="9" w:name="_Toc230455538"/>
+      <w:bookmarkStart w:id="9" w:name="_Toc230458132"/>
       <w:r>
         <w:rPr>
           <w:rFonts w:ascii="Aptos Display" w:hAnsi="Aptos Display"/>
@@ -10590,7 +10590,7 @@
         <w:pStyle w:val="Titre2"/>
         <w:spacing w:before="460" w:after="220"/>
       </w:pPr>
-      <w:bookmarkStart w:id="10" w:name="_Toc230455539"/>
+      <w:bookmarkStart w:id="10" w:name="_Toc230458133"/>
       <w:r>
         <w:rPr>
           <w:rFonts w:ascii="Aptos Display" w:hAnsi="Aptos Display"/>
@@ -10629,7 +10629,7 @@
           <w:noProof/>
         </w:rPr>
         <w:drawing>
-          <wp:inline distT="0" distB="0" distL="0" distR="0" wp14:anchorId="37614B14" wp14:editId="2A8A08E5">
+          <wp:inline distT="0" distB="0" distL="0" distR="0" wp14:anchorId="4681BD70" wp14:editId="7A4D489A">
             <wp:extent cx="5486400" cy="3363310"/>
             <wp:effectExtent l="0" t="0" r="0" b="0"/>
             <wp:docPr id="7" name="Picture 7"/>
@@ -10796,7 +10796,7 @@
         <w:pStyle w:val="Titre2"/>
         <w:spacing w:before="460" w:after="220"/>
       </w:pPr>
-      <w:bookmarkStart w:id="11" w:name="_Toc230455540"/>
+      <w:bookmarkStart w:id="11" w:name="_Toc230458134"/>
       <w:r>
         <w:rPr>
           <w:rFonts w:ascii="Aptos Display" w:hAnsi="Aptos Display"/>
@@ -11009,7 +11009,7 @@
         <w:pStyle w:val="Titre2"/>
         <w:spacing w:before="460" w:after="220"/>
       </w:pPr>
-      <w:bookmarkStart w:id="12" w:name="_Toc230455541"/>
+      <w:bookmarkStart w:id="12" w:name="_Toc230458135"/>
       <w:r>
         <w:rPr>
           <w:rFonts w:ascii="Aptos Display" w:hAnsi="Aptos Display"/>
@@ -11120,7 +11120,7 @@
         </w:pBdr>
         <w:spacing w:before="80" w:after="200"/>
       </w:pPr>
-      <w:bookmarkStart w:id="13" w:name="_Toc230455542"/>
+      <w:bookmarkStart w:id="13" w:name="_Toc230458136"/>
       <w:r>
         <w:rPr>
           <w:rFonts w:ascii="Aptos Display" w:hAnsi="Aptos Display"/>
@@ -11136,7 +11136,7 @@
         <w:pStyle w:val="Titre2"/>
         <w:spacing w:before="460" w:after="220"/>
       </w:pPr>
-      <w:bookmarkStart w:id="14" w:name="_Toc230455543"/>
+      <w:bookmarkStart w:id="14" w:name="_Toc230458137"/>
       <w:r>
         <w:rPr>
           <w:rFonts w:ascii="Aptos Display" w:hAnsi="Aptos Display"/>
@@ -11219,7 +11219,7 @@
         <w:pStyle w:val="Titre2"/>
         <w:spacing w:before="460" w:after="220"/>
       </w:pPr>
-      <w:bookmarkStart w:id="15" w:name="_Toc230455544"/>
+      <w:bookmarkStart w:id="15" w:name="_Toc230458138"/>
       <w:r>
         <w:rPr>
           <w:rFonts w:ascii="Aptos Display" w:hAnsi="Aptos Display"/>
@@ -11317,7 +11317,7 @@
         <w:pStyle w:val="Titre2"/>
         <w:spacing w:before="460" w:after="220"/>
       </w:pPr>
-      <w:bookmarkStart w:id="16" w:name="_Toc230455545"/>
+      <w:bookmarkStart w:id="16" w:name="_Toc230458139"/>
       <w:r>
         <w:rPr>
           <w:rFonts w:ascii="Aptos Display" w:hAnsi="Aptos Display"/>
@@ -11450,7 +11450,7 @@
         <w:pStyle w:val="Titre2"/>
         <w:spacing w:before="460" w:after="220"/>
       </w:pPr>
-      <w:bookmarkStart w:id="17" w:name="_Toc230455546"/>
+      <w:bookmarkStart w:id="17" w:name="_Toc230458140"/>
       <w:r>
         <w:rPr>
           <w:rFonts w:ascii="Aptos Display" w:hAnsi="Aptos Display"/>
@@ -12041,7 +12041,7 @@
         </w:pBdr>
         <w:spacing w:before="80" w:after="200"/>
       </w:pPr>
-      <w:bookmarkStart w:id="18" w:name="_Toc230455547"/>
+      <w:bookmarkStart w:id="18" w:name="_Toc230458141"/>
       <w:r>
         <w:rPr>
           <w:rFonts w:ascii="Aptos Display" w:hAnsi="Aptos Display"/>
@@ -12066,7 +12066,7 @@
           <w:noProof/>
         </w:rPr>
         <w:drawing>
-          <wp:inline distT="0" distB="0" distL="0" distR="0" wp14:anchorId="0C840FBD" wp14:editId="415C7145">
+          <wp:inline distT="0" distB="0" distL="0" distR="0" wp14:anchorId="01E730C3" wp14:editId="1D466336">
             <wp:extent cx="5486400" cy="3244475"/>
             <wp:effectExtent l="0" t="0" r="0" b="0"/>
             <wp:docPr id="8" name="Picture 8"/>
@@ -12133,7 +12133,7 @@
           <w:noProof/>
         </w:rPr>
         <w:drawing>
-          <wp:inline distT="0" distB="0" distL="0" distR="0" wp14:anchorId="127232F8" wp14:editId="421A11D6">
+          <wp:inline distT="0" distB="0" distL="0" distR="0" wp14:anchorId="3058D534" wp14:editId="5AF7FA6A">
             <wp:extent cx="5486400" cy="4057865"/>
             <wp:effectExtent l="0" t="0" r="0" b="0"/>
             <wp:docPr id="9" name="Picture 9"/>
@@ -12213,7 +12213,7 @@
         <w:pStyle w:val="Titre2"/>
         <w:spacing w:before="460" w:after="220"/>
       </w:pPr>
-      <w:bookmarkStart w:id="19" w:name="_Toc230455548"/>
+      <w:bookmarkStart w:id="19" w:name="_Toc230458142"/>
       <w:r>
         <w:rPr>
           <w:rFonts w:ascii="Aptos Display" w:hAnsi="Aptos Display"/>
@@ -12382,7 +12382,7 @@
         <w:pStyle w:val="Titre2"/>
         <w:spacing w:before="460" w:after="220"/>
       </w:pPr>
-      <w:bookmarkStart w:id="20" w:name="_Toc230455549"/>
+      <w:bookmarkStart w:id="20" w:name="_Toc230458143"/>
       <w:r>
         <w:rPr>
           <w:rFonts w:ascii="Aptos Display" w:hAnsi="Aptos Display"/>
@@ -12710,7 +12710,7 @@
         <w:pStyle w:val="Titre2"/>
         <w:spacing w:before="460" w:after="220"/>
       </w:pPr>
-      <w:bookmarkStart w:id="21" w:name="_Toc230455550"/>
+      <w:bookmarkStart w:id="21" w:name="_Toc230458144"/>
       <w:r>
         <w:rPr>
           <w:rFonts w:ascii="Aptos Display" w:hAnsi="Aptos Display"/>
@@ -13182,7 +13182,7 @@
         <w:pStyle w:val="Titre2"/>
         <w:spacing w:before="460" w:after="220"/>
       </w:pPr>
-      <w:bookmarkStart w:id="22" w:name="_Toc230455551"/>
+      <w:bookmarkStart w:id="22" w:name="_Toc230458145"/>
       <w:r>
         <w:rPr>
           <w:rFonts w:ascii="Aptos Display" w:hAnsi="Aptos Display"/>
@@ -13221,7 +13221,7 @@
         <w:pStyle w:val="Titre3"/>
         <w:spacing w:before="60" w:after="80"/>
       </w:pPr>
-      <w:bookmarkStart w:id="23" w:name="_Toc230455552"/>
+      <w:bookmarkStart w:id="23" w:name="_Toc230458146"/>
       <w:r>
         <w:rPr>
           <w:rFonts w:ascii="Aptos" w:hAnsi="Aptos"/>
@@ -13516,7 +13516,7 @@
         <w:pStyle w:val="Titre3"/>
         <w:spacing w:before="60" w:after="80"/>
       </w:pPr>
-      <w:bookmarkStart w:id="24" w:name="_Toc230455553"/>
+      <w:bookmarkStart w:id="24" w:name="_Toc230458147"/>
       <w:r>
         <w:rPr>
           <w:rFonts w:ascii="Aptos" w:hAnsi="Aptos"/>
@@ -13833,7 +13833,7 @@
         <w:pStyle w:val="Titre2"/>
         <w:spacing w:before="460" w:after="220"/>
       </w:pPr>
-      <w:bookmarkStart w:id="25" w:name="_Toc230455554"/>
+      <w:bookmarkStart w:id="25" w:name="_Toc230458148"/>
       <w:r>
         <w:rPr>
           <w:rFonts w:ascii="Aptos Display" w:hAnsi="Aptos Display"/>
@@ -14186,7 +14186,7 @@
         <w:pStyle w:val="Titre2"/>
         <w:spacing w:before="460" w:after="220"/>
       </w:pPr>
-      <w:bookmarkStart w:id="26" w:name="_Toc230455555"/>
+      <w:bookmarkStart w:id="26" w:name="_Toc230458149"/>
       <w:r>
         <w:rPr>
           <w:rFonts w:ascii="Aptos Display" w:hAnsi="Aptos Display"/>
@@ -14285,7 +14285,7 @@
         <w:pStyle w:val="Titre2"/>
         <w:spacing w:before="460" w:after="220"/>
       </w:pPr>
-      <w:bookmarkStart w:id="27" w:name="_Toc230455556"/>
+      <w:bookmarkStart w:id="27" w:name="_Toc230458150"/>
       <w:r>
         <w:rPr>
           <w:rFonts w:ascii="Aptos Display" w:hAnsi="Aptos Display"/>
@@ -14385,7 +14385,7 @@
         <w:pStyle w:val="Titre2"/>
         <w:spacing w:before="460" w:after="220"/>
       </w:pPr>
-      <w:bookmarkStart w:id="28" w:name="_Toc230455557"/>
+      <w:bookmarkStart w:id="28" w:name="_Toc230458151"/>
       <w:r>
         <w:rPr>
           <w:rFonts w:ascii="Aptos Display" w:hAnsi="Aptos Display"/>
@@ -14414,7 +14414,7 @@
         <w:pStyle w:val="Titre3"/>
         <w:spacing w:before="60" w:after="80"/>
       </w:pPr>
-      <w:bookmarkStart w:id="29" w:name="_Toc230455558"/>
+      <w:bookmarkStart w:id="29" w:name="_Toc230458152"/>
       <w:r>
         <w:rPr>
           <w:rFonts w:ascii="Aptos" w:hAnsi="Aptos"/>
@@ -14607,7 +14607,7 @@
         <w:pStyle w:val="Titre3"/>
         <w:spacing w:before="60" w:after="80"/>
       </w:pPr>
-      <w:bookmarkStart w:id="30" w:name="_Toc230455559"/>
+      <w:bookmarkStart w:id="30" w:name="_Toc230458153"/>
       <w:r>
         <w:rPr>
           <w:rFonts w:ascii="Aptos" w:hAnsi="Aptos"/>
@@ -14645,7 +14645,7 @@
         <w:pStyle w:val="Titre3"/>
         <w:spacing w:before="60" w:after="80"/>
       </w:pPr>
-      <w:bookmarkStart w:id="31" w:name="_Toc230455560"/>
+      <w:bookmarkStart w:id="31" w:name="_Toc230458154"/>
       <w:r>
         <w:rPr>
           <w:rFonts w:ascii="Aptos" w:hAnsi="Aptos"/>
@@ -14728,7 +14728,7 @@
         <w:pStyle w:val="Titre3"/>
         <w:spacing w:before="60" w:after="80"/>
       </w:pPr>
-      <w:bookmarkStart w:id="32" w:name="_Toc230455561"/>
+      <w:bookmarkStart w:id="32" w:name="_Toc230458155"/>
       <w:r>
         <w:rPr>
           <w:rFonts w:ascii="Aptos" w:hAnsi="Aptos"/>
@@ -14836,7 +14836,7 @@
         <w:pStyle w:val="Titre3"/>
         <w:spacing w:before="60" w:after="80"/>
       </w:pPr>
-      <w:bookmarkStart w:id="33" w:name="_Toc230455562"/>
+      <w:bookmarkStart w:id="33" w:name="_Toc230458156"/>
       <w:r>
         <w:rPr>
           <w:rFonts w:ascii="Aptos" w:hAnsi="Aptos"/>
@@ -14950,7 +14950,7 @@
         <w:pStyle w:val="Titre2"/>
         <w:spacing w:before="460" w:after="220"/>
       </w:pPr>
-      <w:bookmarkStart w:id="34" w:name="_Toc230455563"/>
+      <w:bookmarkStart w:id="34" w:name="_Toc230458157"/>
       <w:r>
         <w:rPr>
           <w:rFonts w:ascii="Aptos Display" w:hAnsi="Aptos Display"/>
@@ -15746,7 +15746,7 @@
         <w:pStyle w:val="Titre2"/>
         <w:spacing w:before="460" w:after="220"/>
       </w:pPr>
-      <w:bookmarkStart w:id="35" w:name="_Toc230455564"/>
+      <w:bookmarkStart w:id="35" w:name="_Toc230458158"/>
       <w:r>
         <w:rPr>
           <w:rFonts w:ascii="Aptos Display" w:hAnsi="Aptos Display"/>
@@ -17136,7 +17136,7 @@
         <w:pStyle w:val="Titre2"/>
         <w:spacing w:before="460" w:after="220"/>
       </w:pPr>
-      <w:bookmarkStart w:id="36" w:name="_Toc230455565"/>
+      <w:bookmarkStart w:id="36" w:name="_Toc230458159"/>
       <w:r>
         <w:rPr>
           <w:rFonts w:ascii="Aptos Display" w:hAnsi="Aptos Display"/>
@@ -17464,7 +17464,7 @@
         <w:pStyle w:val="Titre2"/>
         <w:spacing w:before="460" w:after="220"/>
       </w:pPr>
-      <w:bookmarkStart w:id="37" w:name="_Toc230455566"/>
+      <w:bookmarkStart w:id="37" w:name="_Toc230458160"/>
       <w:r>
         <w:rPr>
           <w:rFonts w:ascii="Aptos Display" w:hAnsi="Aptos Display"/>
@@ -17952,7 +17952,7 @@
         <w:pStyle w:val="Titre3"/>
         <w:spacing w:before="60" w:after="80"/>
       </w:pPr>
-      <w:bookmarkStart w:id="38" w:name="_Toc230455567"/>
+      <w:bookmarkStart w:id="38" w:name="_Toc230458161"/>
       <w:r>
         <w:rPr>
           <w:rFonts w:ascii="Aptos" w:hAnsi="Aptos"/>
@@ -18047,7 +18047,7 @@
         <w:pStyle w:val="Titre2"/>
         <w:spacing w:before="460" w:after="220"/>
       </w:pPr>
-      <w:bookmarkStart w:id="39" w:name="_Toc230455568"/>
+      <w:bookmarkStart w:id="39" w:name="_Toc230458162"/>
       <w:r>
         <w:rPr>
           <w:rFonts w:ascii="Aptos Display" w:hAnsi="Aptos Display"/>
@@ -18161,7 +18161,7 @@
         <w:pStyle w:val="Titre2"/>
         <w:spacing w:before="460" w:after="220"/>
       </w:pPr>
-      <w:bookmarkStart w:id="40" w:name="_Toc230455569"/>
+      <w:bookmarkStart w:id="40" w:name="_Toc230458163"/>
       <w:r>
         <w:rPr>
           <w:rFonts w:ascii="Aptos Display" w:hAnsi="Aptos Display"/>
@@ -18199,7 +18199,7 @@
           <w:noProof/>
         </w:rPr>
         <w:drawing>
-          <wp:inline distT="0" distB="0" distL="0" distR="0" wp14:anchorId="7D2B0BFD" wp14:editId="7777F386">
+          <wp:inline distT="0" distB="0" distL="0" distR="0" wp14:anchorId="764E9C21" wp14:editId="40C8A635">
             <wp:extent cx="5486400" cy="3190125"/>
             <wp:effectExtent l="0" t="0" r="0" b="0"/>
             <wp:docPr id="10" name="Picture 10"/>
@@ -18404,7 +18404,7 @@
         <w:pStyle w:val="Titre2"/>
         <w:spacing w:before="460" w:after="220"/>
       </w:pPr>
-      <w:bookmarkStart w:id="41" w:name="_Toc230455570"/>
+      <w:bookmarkStart w:id="41" w:name="_Toc230458164"/>
       <w:r>
         <w:rPr>
           <w:rFonts w:ascii="Aptos Display" w:hAnsi="Aptos Display"/>
@@ -18671,7 +18671,7 @@
         <w:pStyle w:val="Titre2"/>
         <w:spacing w:before="460" w:after="220"/>
       </w:pPr>
-      <w:bookmarkStart w:id="42" w:name="_Toc230455571"/>
+      <w:bookmarkStart w:id="42" w:name="_Toc230458165"/>
       <w:r>
         <w:rPr>
           <w:rFonts w:ascii="Aptos Display" w:hAnsi="Aptos Display"/>
@@ -18710,7 +18710,7 @@
           <w:noProof/>
         </w:rPr>
         <w:drawing>
-          <wp:inline distT="0" distB="0" distL="0" distR="0" wp14:anchorId="4FC65D61" wp14:editId="07F93C44">
+          <wp:inline distT="0" distB="0" distL="0" distR="0" wp14:anchorId="6C9D21C8" wp14:editId="6325F063">
             <wp:extent cx="5486400" cy="6696000"/>
             <wp:effectExtent l="0" t="0" r="0" b="0"/>
             <wp:docPr id="11" name="Picture 11"/>
@@ -18928,7 +18928,7 @@
         <w:pStyle w:val="Titre2"/>
         <w:spacing w:before="460" w:after="220"/>
       </w:pPr>
-      <w:bookmarkStart w:id="43" w:name="_Toc230455572"/>
+      <w:bookmarkStart w:id="43" w:name="_Toc230458166"/>
       <w:r>
         <w:rPr>
           <w:rFonts w:ascii="Aptos Display" w:hAnsi="Aptos Display"/>
@@ -19133,7 +19133,7 @@
         <w:pStyle w:val="Titre2"/>
         <w:spacing w:before="460" w:after="220"/>
       </w:pPr>
-      <w:bookmarkStart w:id="44" w:name="_Toc230455573"/>
+      <w:bookmarkStart w:id="44" w:name="_Toc230458167"/>
       <w:r>
         <w:rPr>
           <w:rFonts w:ascii="Aptos Display" w:hAnsi="Aptos Display"/>
@@ -19236,7 +19236,7 @@
         <w:pStyle w:val="Titre2"/>
         <w:spacing w:before="460" w:after="220"/>
       </w:pPr>
-      <w:bookmarkStart w:id="45" w:name="_Toc230455574"/>
+      <w:bookmarkStart w:id="45" w:name="_Toc230458168"/>
       <w:r>
         <w:rPr>
           <w:rFonts w:ascii="Aptos Display" w:hAnsi="Aptos Display"/>
@@ -19722,7 +19722,7 @@
         <w:pStyle w:val="Titre2"/>
         <w:spacing w:before="460" w:after="220"/>
       </w:pPr>
-      <w:bookmarkStart w:id="46" w:name="_Toc230455575"/>
+      <w:bookmarkStart w:id="46" w:name="_Toc230458169"/>
       <w:r>
         <w:rPr>
           <w:rFonts w:ascii="Aptos Display" w:hAnsi="Aptos Display"/>
@@ -19941,7 +19941,7 @@
         </w:pBdr>
         <w:spacing w:before="80" w:after="200"/>
       </w:pPr>
-      <w:bookmarkStart w:id="47" w:name="_Toc230455576"/>
+      <w:bookmarkStart w:id="47" w:name="_Toc230458170"/>
       <w:r>
         <w:rPr>
           <w:rFonts w:ascii="Aptos Display" w:hAnsi="Aptos Display"/>
@@ -19977,7 +19977,7 @@
         <w:pStyle w:val="Titre2"/>
         <w:spacing w:before="460" w:after="220"/>
       </w:pPr>
-      <w:bookmarkStart w:id="48" w:name="_Toc230455577"/>
+      <w:bookmarkStart w:id="48" w:name="_Toc230458171"/>
       <w:r>
         <w:rPr>
           <w:rFonts w:ascii="Aptos Display" w:hAnsi="Aptos Display"/>
@@ -20138,7 +20138,7 @@
         <w:pStyle w:val="Titre2"/>
         <w:spacing w:before="460" w:after="220"/>
       </w:pPr>
-      <w:bookmarkStart w:id="49" w:name="_Toc230455578"/>
+      <w:bookmarkStart w:id="49" w:name="_Toc230458172"/>
       <w:r>
         <w:rPr>
           <w:rFonts w:ascii="Aptos Display" w:hAnsi="Aptos Display"/>
@@ -20296,7 +20296,7 @@
         <w:pStyle w:val="Titre2"/>
         <w:spacing w:before="460" w:after="220"/>
       </w:pPr>
-      <w:bookmarkStart w:id="50" w:name="_Toc230455579"/>
+      <w:bookmarkStart w:id="50" w:name="_Toc230458173"/>
       <w:r>
         <w:rPr>
           <w:rFonts w:ascii="Aptos Display" w:hAnsi="Aptos Display"/>
@@ -21223,7 +21223,7 @@
         <w:pStyle w:val="Titre2"/>
         <w:spacing w:before="460" w:after="220"/>
       </w:pPr>
-      <w:bookmarkStart w:id="51" w:name="_Toc230455580"/>
+      <w:bookmarkStart w:id="51" w:name="_Toc230458174"/>
       <w:r>
         <w:rPr>
           <w:rFonts w:ascii="Aptos Display" w:hAnsi="Aptos Display"/>
@@ -21261,7 +21261,7 @@
           <w:noProof/>
         </w:rPr>
         <w:drawing>
-          <wp:inline distT="0" distB="0" distL="0" distR="0" wp14:anchorId="7F89B100" wp14:editId="605844F5">
+          <wp:inline distT="0" distB="0" distL="0" distR="0" wp14:anchorId="4183F42F" wp14:editId="7E3B9054">
             <wp:extent cx="5486400" cy="3005803"/>
             <wp:effectExtent l="0" t="0" r="0" b="0"/>
             <wp:docPr id="12" name="Picture 12"/>
@@ -21444,7 +21444,7 @@
           <w:noProof/>
         </w:rPr>
         <w:drawing>
-          <wp:inline distT="0" distB="0" distL="0" distR="0" wp14:anchorId="355A63DD" wp14:editId="67B5EE99">
+          <wp:inline distT="0" distB="0" distL="0" distR="0" wp14:anchorId="4E1CDDE0" wp14:editId="4478C1DA">
             <wp:extent cx="4004012" cy="7498079"/>
             <wp:effectExtent l="0" t="0" r="0" b="0"/>
             <wp:docPr id="13" name="Picture 13"/>
@@ -21502,7 +21502,7 @@
         <w:pStyle w:val="Titre2"/>
         <w:spacing w:before="460" w:after="220"/>
       </w:pPr>
-      <w:bookmarkStart w:id="52" w:name="_Toc230455581"/>
+      <w:bookmarkStart w:id="52" w:name="_Toc230458175"/>
       <w:r>
         <w:rPr>
           <w:rFonts w:ascii="Aptos Display" w:hAnsi="Aptos Display"/>
@@ -21794,7 +21794,7 @@
         <w:pStyle w:val="Titre2"/>
         <w:spacing w:before="460" w:after="220"/>
       </w:pPr>
-      <w:bookmarkStart w:id="53" w:name="_Toc230455582"/>
+      <w:bookmarkStart w:id="53" w:name="_Toc230458176"/>
       <w:r>
         <w:rPr>
           <w:rFonts w:ascii="Aptos Display" w:hAnsi="Aptos Display"/>
@@ -22410,7 +22410,7 @@
         <w:pStyle w:val="Titre2"/>
         <w:spacing w:before="460" w:after="220"/>
       </w:pPr>
-      <w:bookmarkStart w:id="54" w:name="_Toc230455583"/>
+      <w:bookmarkStart w:id="54" w:name="_Toc230458177"/>
       <w:r>
         <w:rPr>
           <w:rFonts w:ascii="Aptos Display" w:hAnsi="Aptos Display"/>
@@ -22545,7 +22545,7 @@
         <w:pStyle w:val="Titre2"/>
         <w:spacing w:before="460" w:after="220"/>
       </w:pPr>
-      <w:bookmarkStart w:id="55" w:name="_Toc230455584"/>
+      <w:bookmarkStart w:id="55" w:name="_Toc230458178"/>
       <w:r>
         <w:rPr>
           <w:rFonts w:ascii="Aptos Display" w:hAnsi="Aptos Display"/>
@@ -22705,6 +22705,41 @@
         </w:rPr>
       </w:pPr>
       <w:r>
+        <w:t xml:space="preserve">The generated wrappers intentionally keep the raw label-based support API out of the normal user surface. Application code is expected to stay on generated members such as </w:t>
+      </w:r>
+      <w:r>
+        <w:rPr>
+          <w:rFonts w:ascii="Consolas" w:hAnsi="Consolas"/>
+          <w:color w:val="374151"/>
+          <w:sz w:val="17"/>
+          <w:shd w:val="clear" w:color="auto" w:fill="F5F5F5"/>
+        </w:rPr>
+        <w:lastRenderedPageBreak/>
+        <w:t>ui.Cockpit().adiHeadingBox.HeadingValue()</w:t>
+      </w:r>
+      <w:r>
+        <w:t xml:space="preserve"> or </w:t>
+      </w:r>
+      <w:r>
+        <w:rPr>
+          <w:rFonts w:ascii="Consolas" w:hAnsi="Consolas"/>
+          <w:color w:val="374151"/>
+          <w:sz w:val="17"/>
+          <w:shd w:val="clear" w:color="auto" w:fill="F5F5F5"/>
+        </w:rPr>
+        <w:t>ui.Radar().DynamicRadarTrack().Create()</w:t>
+      </w:r>
+      <w:r>
+        <w:t xml:space="preserve"> instead of calling generic label-driven helpers.</w:t>
+      </w:r>
+    </w:p>
+    <w:p>
+      <w:pPr>
+        <w:rPr>
+          <w:rFonts w:hint="eastAsia"/>
+        </w:rPr>
+      </w:pPr>
+      <w:r>
         <w:t>This is why the generated path should be the default integration path. The business code manipulates typed handles and leaves transport ids, runtime dynamic ids, and patch serialization to the generated layer.</w:t>
       </w:r>
     </w:p>
@@ -22713,13 +22748,12 @@
         <w:pStyle w:val="Titre2"/>
         <w:spacing w:before="460" w:after="220"/>
       </w:pPr>
-      <w:bookmarkStart w:id="56" w:name="_Toc230455585"/>
+      <w:bookmarkStart w:id="56" w:name="_Toc230458179"/>
       <w:r>
         <w:rPr>
           <w:rFonts w:ascii="Aptos Display" w:hAnsi="Aptos Display"/>
           <w:color w:val="6A1B9A"/>
         </w:rPr>
-        <w:lastRenderedPageBreak/>
         <w:t>▪</w:t>
       </w:r>
       <w:r>
@@ -23225,7 +23259,7 @@
         <w:pStyle w:val="Titre2"/>
         <w:spacing w:before="460" w:after="220"/>
       </w:pPr>
-      <w:bookmarkStart w:id="57" w:name="_Toc230455586"/>
+      <w:bookmarkStart w:id="57" w:name="_Toc230458180"/>
       <w:r>
         <w:rPr>
           <w:rFonts w:ascii="Aptos Display" w:hAnsi="Aptos Display"/>
@@ -23447,6 +23481,14 @@
           <w:shd w:val="clear" w:color="auto" w:fill="F1F5F9"/>
         </w:rPr>
         <w:br/>
+      </w:r>
+      <w:r>
+        <w:rPr>
+          <w:rFonts w:ascii="Consolas" w:hAnsi="Consolas"/>
+          <w:sz w:val="17"/>
+          <w:shd w:val="clear" w:color="auto" w:fill="F1F5F9"/>
+        </w:rPr>
+        <w:lastRenderedPageBreak/>
         <w:t xml:space="preserve">    PRIVATE</w:t>
       </w:r>
       <w:r>
@@ -23546,7 +23588,6 @@
         </w:rPr>
       </w:pPr>
       <w:r>
-        <w:lastRenderedPageBreak/>
         <w:t xml:space="preserve">The packaged client SDK is curated accordingly: it ships </w:t>
       </w:r>
       <w:r>
@@ -23620,6 +23661,37 @@
       </w:r>
       <w:r>
         <w:t>, or other host-runtime headers.</w:t>
+      </w:r>
+    </w:p>
+    <w:p>
+      <w:pPr>
+        <w:rPr>
+          <w:rFonts w:hint="eastAsia"/>
+        </w:rPr>
+      </w:pPr>
+      <w:r>
+        <w:rPr>
+          <w:rFonts w:ascii="Consolas" w:hAnsi="Consolas"/>
+          <w:color w:val="374151"/>
+          <w:sz w:val="17"/>
+          <w:shd w:val="clear" w:color="auto" w:fill="F5F5F5"/>
+        </w:rPr>
+        <w:t>ClientSdk.h</w:t>
+      </w:r>
+      <w:r>
+        <w:t xml:space="preserve"> stays focused on standalone helpers. Generated window headers keep including </w:t>
+      </w:r>
+      <w:r>
+        <w:rPr>
+          <w:rFonts w:ascii="Consolas" w:hAnsi="Consolas"/>
+          <w:color w:val="374151"/>
+          <w:sz w:val="17"/>
+          <w:shd w:val="clear" w:color="auto" w:fill="F5F5F5"/>
+        </w:rPr>
+        <w:t>mfd/client/GeneratedUiSupport.h</w:t>
+      </w:r>
+      <w:r>
+        <w:t xml:space="preserve"> directly so the generated surface does not rely on broad transitive includes.</w:t>
       </w:r>
     </w:p>
     <w:p>
@@ -23627,7 +23699,7 @@
         <w:pStyle w:val="Titre2"/>
         <w:spacing w:before="460" w:after="220"/>
       </w:pPr>
-      <w:bookmarkStart w:id="58" w:name="_Toc230455587"/>
+      <w:bookmarkStart w:id="58" w:name="_Toc230458181"/>
       <w:r>
         <w:rPr>
           <w:rFonts w:ascii="Aptos Display" w:hAnsi="Aptos Display"/>
@@ -24020,13 +24092,6 @@
           <w:shd w:val="clear" w:color="auto" w:fill="F1F5F9"/>
         </w:rPr>
         <w:br/>
-      </w:r>
-      <w:r>
-        <w:rPr>
-          <w:rFonts w:ascii="Consolas" w:hAnsi="Consolas"/>
-          <w:sz w:val="17"/>
-          <w:shd w:val="clear" w:color="auto" w:fill="F1F5F9"/>
-        </w:rPr>
         <w:t>cmake --build --preset debug-win32-no-tests --target client_test_package</w:t>
       </w:r>
     </w:p>
@@ -24035,12 +24100,13 @@
         <w:pStyle w:val="Titre2"/>
         <w:spacing w:before="460" w:after="220"/>
       </w:pPr>
-      <w:bookmarkStart w:id="59" w:name="_Toc230455588"/>
+      <w:bookmarkStart w:id="59" w:name="_Toc230458182"/>
       <w:r>
         <w:rPr>
           <w:rFonts w:ascii="Aptos Display" w:hAnsi="Aptos Display"/>
           <w:color w:val="6A1B9A"/>
         </w:rPr>
+        <w:lastRenderedPageBreak/>
         <w:t>▪</w:t>
       </w:r>
       <w:r>
@@ -24163,7 +24229,6 @@
         </w:rPr>
       </w:pPr>
       <w:r>
-        <w:lastRenderedPageBreak/>
         <w:t>Usually does not require regeneration:</w:t>
       </w:r>
     </w:p>
@@ -24215,7 +24280,7 @@
         <w:pStyle w:val="Titre2"/>
         <w:spacing w:before="460" w:after="220"/>
       </w:pPr>
-      <w:bookmarkStart w:id="60" w:name="_Toc230455589"/>
+      <w:bookmarkStart w:id="60" w:name="_Toc230458183"/>
       <w:r>
         <w:rPr>
           <w:rFonts w:ascii="Aptos Display" w:hAnsi="Aptos Display"/>
@@ -24885,7 +24950,7 @@
         </w:pBdr>
         <w:spacing w:before="80" w:after="200"/>
       </w:pPr>
-      <w:bookmarkStart w:id="61" w:name="_Toc230455590"/>
+      <w:bookmarkStart w:id="61" w:name="_Toc230458184"/>
       <w:r>
         <w:rPr>
           <w:rFonts w:ascii="Aptos Display" w:hAnsi="Aptos Display"/>
@@ -24910,7 +24975,7 @@
           <w:noProof/>
         </w:rPr>
         <w:drawing>
-          <wp:inline distT="0" distB="0" distL="0" distR="0" wp14:anchorId="498F5134" wp14:editId="1A2B07C4">
+          <wp:inline distT="0" distB="0" distL="0" distR="0" wp14:anchorId="67B19C1D" wp14:editId="23BEEF29">
             <wp:extent cx="5486400" cy="3347633"/>
             <wp:effectExtent l="0" t="0" r="0" b="0"/>
             <wp:docPr id="14" name="Picture 14"/>
@@ -24978,7 +25043,7 @@
         <w:pStyle w:val="Titre2"/>
         <w:spacing w:before="460" w:after="220"/>
       </w:pPr>
-      <w:bookmarkStart w:id="62" w:name="_Toc230455591"/>
+      <w:bookmarkStart w:id="62" w:name="_Toc230458185"/>
       <w:r>
         <w:rPr>
           <w:rFonts w:ascii="Aptos Display" w:hAnsi="Aptos Display"/>
@@ -25016,7 +25081,7 @@
           <w:noProof/>
         </w:rPr>
         <w:drawing>
-          <wp:inline distT="0" distB="0" distL="0" distR="0" wp14:anchorId="7FD5B5CD" wp14:editId="44AC843D">
+          <wp:inline distT="0" distB="0" distL="0" distR="0" wp14:anchorId="6EE9BD93" wp14:editId="181AADC3">
             <wp:extent cx="5486400" cy="2887578"/>
             <wp:effectExtent l="0" t="0" r="0" b="0"/>
             <wp:docPr id="15" name="Picture 15"/>
@@ -25370,7 +25435,7 @@
         <w:pStyle w:val="Titre2"/>
         <w:spacing w:before="460" w:after="220"/>
       </w:pPr>
-      <w:bookmarkStart w:id="63" w:name="_Toc230455592"/>
+      <w:bookmarkStart w:id="63" w:name="_Toc230458186"/>
       <w:r>
         <w:rPr>
           <w:rFonts w:ascii="Aptos Display" w:hAnsi="Aptos Display"/>
@@ -25648,7 +25713,7 @@
         <w:t>mfd/client/ClientSdk.h</w:t>
       </w:r>
       <w:r>
-        <w:t xml:space="preserve"> is the supported umbrella include for standalone client applications. It keeps generated code and example integrations on the </w:t>
+        <w:t xml:space="preserve"> is the supported umbrella include for standalone client applications. It keeps example integrations on the </w:t>
       </w:r>
       <w:r>
         <w:rPr>
@@ -25660,7 +25725,7 @@
         <w:t>mfd_client_api</w:t>
       </w:r>
       <w:r>
-        <w:t xml:space="preserve"> SDK surface while still exposing the raw transport helpers when they are needed.</w:t>
+        <w:t xml:space="preserve"> SDK surface while still exposing the raw transport helpers when they are needed. The generated window header remains the dedicated entry point for the typed UI surface itself.</w:t>
       </w:r>
     </w:p>
     <w:p>
@@ -25678,12 +25743,13 @@
         <w:pStyle w:val="Titre2"/>
         <w:spacing w:before="460" w:after="220"/>
       </w:pPr>
-      <w:bookmarkStart w:id="64" w:name="_Toc230455593"/>
+      <w:bookmarkStart w:id="64" w:name="_Toc230458187"/>
       <w:r>
         <w:rPr>
           <w:rFonts w:ascii="Aptos Display" w:hAnsi="Aptos Display"/>
           <w:color w:val="6A1B9A"/>
         </w:rPr>
+        <w:lastRenderedPageBreak/>
         <w:t>▪</w:t>
       </w:r>
       <w:r>
@@ -25733,7 +25799,6 @@
           <w:sz w:val="17"/>
           <w:shd w:val="clear" w:color="auto" w:fill="F1F5F9"/>
         </w:rPr>
-        <w:lastRenderedPageBreak/>
         <w:t>// Scenario: create the transport bridge used by the cockpit control loop.</w:t>
       </w:r>
       <w:r>
@@ -25887,7 +25952,7 @@
         <w:pStyle w:val="Titre2"/>
         <w:spacing w:before="460" w:after="220"/>
       </w:pPr>
-      <w:bookmarkStart w:id="65" w:name="_Toc230455594"/>
+      <w:bookmarkStart w:id="65" w:name="_Toc230458188"/>
       <w:r>
         <w:rPr>
           <w:rFonts w:ascii="Aptos Display" w:hAnsi="Aptos Display"/>
@@ -26151,7 +26216,7 @@
         <w:pStyle w:val="Titre2"/>
         <w:spacing w:before="460" w:after="220"/>
       </w:pPr>
-      <w:bookmarkStart w:id="66" w:name="_Toc230455595"/>
+      <w:bookmarkStart w:id="66" w:name="_Toc230458189"/>
       <w:r>
         <w:rPr>
           <w:rFonts w:ascii="Aptos Display" w:hAnsi="Aptos Display"/>
@@ -26190,7 +26255,7 @@
           <w:noProof/>
         </w:rPr>
         <w:drawing>
-          <wp:inline distT="0" distB="0" distL="0" distR="0" wp14:anchorId="295A0149" wp14:editId="7CF02149">
+          <wp:inline distT="0" distB="0" distL="0" distR="0" wp14:anchorId="5288C0F8" wp14:editId="635FCD99">
             <wp:extent cx="5486400" cy="4315364"/>
             <wp:effectExtent l="0" t="0" r="0" b="0"/>
             <wp:docPr id="16" name="Picture 16"/>
@@ -26803,7 +26868,7 @@
         <w:pStyle w:val="Titre2"/>
         <w:spacing w:before="460" w:after="220"/>
       </w:pPr>
-      <w:bookmarkStart w:id="67" w:name="_Toc230455596"/>
+      <w:bookmarkStart w:id="67" w:name="_Toc230458190"/>
       <w:r>
         <w:rPr>
           <w:rFonts w:ascii="Aptos Display" w:hAnsi="Aptos Display"/>
@@ -26951,7 +27016,7 @@
         <w:pStyle w:val="Titre2"/>
         <w:spacing w:before="460" w:after="220"/>
       </w:pPr>
-      <w:bookmarkStart w:id="68" w:name="_Toc230455597"/>
+      <w:bookmarkStart w:id="68" w:name="_Toc230458191"/>
       <w:r>
         <w:rPr>
           <w:rFonts w:ascii="Aptos Display" w:hAnsi="Aptos Display"/>
@@ -27125,7 +27190,7 @@
         <w:pStyle w:val="Titre2"/>
         <w:spacing w:before="460" w:after="220"/>
       </w:pPr>
-      <w:bookmarkStart w:id="69" w:name="_Toc230455598"/>
+      <w:bookmarkStart w:id="69" w:name="_Toc230458192"/>
       <w:r>
         <w:rPr>
           <w:rFonts w:ascii="Aptos Display" w:hAnsi="Aptos Display"/>
@@ -27460,7 +27525,7 @@
         <w:pStyle w:val="Titre3"/>
         <w:spacing w:before="60" w:after="80"/>
       </w:pPr>
-      <w:bookmarkStart w:id="70" w:name="_Toc230455599"/>
+      <w:bookmarkStart w:id="70" w:name="_Toc230458193"/>
       <w:r>
         <w:rPr>
           <w:rFonts w:ascii="Aptos" w:hAnsi="Aptos"/>
@@ -27962,119 +28027,13 @@
           </w:p>
         </w:tc>
       </w:tr>
-      <w:tr>
-        <w:tc>
-          <w:tcPr>
-            <w:tcW w:w="4479" w:type="dxa"/>
-            <w:shd w:val="clear" w:color="auto" w:fill="FFFFFF"/>
-            <w:tcMar>
-              <w:top w:w="80" w:type="dxa"/>
-              <w:left w:w="120" w:type="dxa"/>
-              <w:bottom w:w="80" w:type="dxa"/>
-              <w:right w:w="120" w:type="dxa"/>
-            </w:tcMar>
-          </w:tcPr>
-          <w:p>
-            <w:pPr>
-              <w:rPr>
-                <w:rFonts w:hint="eastAsia"/>
-              </w:rPr>
-            </w:pPr>
-            <w:r>
-              <w:rPr>
-                <w:b/>
-                <w:sz w:val="19"/>
-              </w:rPr>
-              <w:t>SetText(std::string)</w:t>
-            </w:r>
-          </w:p>
-        </w:tc>
-        <w:tc>
-          <w:tcPr>
-            <w:tcW w:w="4479" w:type="dxa"/>
-            <w:shd w:val="clear" w:color="auto" w:fill="FFFFFF"/>
-            <w:tcMar>
-              <w:top w:w="80" w:type="dxa"/>
-              <w:left w:w="120" w:type="dxa"/>
-              <w:bottom w:w="80" w:type="dxa"/>
-              <w:right w:w="120" w:type="dxa"/>
-            </w:tcMar>
-          </w:tcPr>
-          <w:p>
-            <w:pPr>
-              <w:rPr>
-                <w:rFonts w:hint="eastAsia"/>
-              </w:rPr>
-            </w:pPr>
-            <w:r>
-              <w:rPr>
-                <w:sz w:val="19"/>
-              </w:rPr>
-              <w:t>update the first text primitive or generated status primitive</w:t>
-            </w:r>
-          </w:p>
-        </w:tc>
-      </w:tr>
-      <w:tr>
-        <w:tc>
-          <w:tcPr>
-            <w:tcW w:w="4479" w:type="dxa"/>
-            <w:shd w:val="clear" w:color="auto" w:fill="F8FAFF"/>
-            <w:tcMar>
-              <w:top w:w="80" w:type="dxa"/>
-              <w:left w:w="120" w:type="dxa"/>
-              <w:bottom w:w="80" w:type="dxa"/>
-              <w:right w:w="120" w:type="dxa"/>
-            </w:tcMar>
-          </w:tcPr>
-          <w:p>
-            <w:pPr>
-              <w:rPr>
-                <w:rFonts w:hint="eastAsia"/>
-              </w:rPr>
-            </w:pPr>
-            <w:r>
-              <w:rPr>
-                <w:b/>
-                <w:sz w:val="19"/>
-              </w:rPr>
-              <w:t>SetLetterSpacing(float)</w:t>
-            </w:r>
-          </w:p>
-        </w:tc>
-        <w:tc>
-          <w:tcPr>
-            <w:tcW w:w="4479" w:type="dxa"/>
-            <w:shd w:val="clear" w:color="auto" w:fill="F8FAFF"/>
-            <w:tcMar>
-              <w:top w:w="80" w:type="dxa"/>
-              <w:left w:w="120" w:type="dxa"/>
-              <w:bottom w:w="80" w:type="dxa"/>
-              <w:right w:w="120" w:type="dxa"/>
-            </w:tcMar>
-          </w:tcPr>
-          <w:p>
-            <w:pPr>
-              <w:rPr>
-                <w:rFonts w:hint="eastAsia"/>
-              </w:rPr>
-            </w:pPr>
-            <w:r>
-              <w:rPr>
-                <w:sz w:val="19"/>
-              </w:rPr>
-              <w:t>update authored text spacing</w:t>
-            </w:r>
-          </w:p>
-        </w:tc>
-      </w:tr>
     </w:tbl>
     <w:p>
       <w:pPr>
         <w:pStyle w:val="Titre2"/>
         <w:spacing w:before="460" w:after="220"/>
       </w:pPr>
-      <w:bookmarkStart w:id="71" w:name="_Toc230455600"/>
+      <w:bookmarkStart w:id="71" w:name="_Toc230458194"/>
       <w:r>
         <w:rPr>
           <w:rFonts w:ascii="Aptos Display" w:hAnsi="Aptos Display"/>
@@ -28106,6 +28065,100 @@
       </w:pPr>
       <w:r>
         <w:t>Primitive handles are what make the generated API feel like an integration API instead of a string-based patch list. They let the client touch only the authored surface that was explicitly meant to move.</w:t>
+      </w:r>
+    </w:p>
+    <w:p>
+      <w:pPr>
+        <w:rPr>
+          <w:rFonts w:hint="eastAsia"/>
+        </w:rPr>
+      </w:pPr>
+      <w:r>
+        <w:t>Normal generated code should therefore prefer:</w:t>
+      </w:r>
+    </w:p>
+    <w:p>
+      <w:pPr>
+        <w:pStyle w:val="Listepuces"/>
+        <w:rPr>
+          <w:rFonts w:hint="eastAsia"/>
+        </w:rPr>
+      </w:pPr>
+      <w:r>
+        <w:t xml:space="preserve">generated primitive accessors such as </w:t>
+      </w:r>
+      <w:r>
+        <w:rPr>
+          <w:rFonts w:ascii="Consolas" w:hAnsi="Consolas"/>
+          <w:color w:val="374151"/>
+          <w:sz w:val="17"/>
+          <w:shd w:val="clear" w:color="auto" w:fill="F5F5F5"/>
+        </w:rPr>
+        <w:t>HeadingValue()</w:t>
+      </w:r>
+      <w:r>
+        <w:t xml:space="preserve">, </w:t>
+      </w:r>
+      <w:r>
+        <w:rPr>
+          <w:rFonts w:ascii="Consolas" w:hAnsi="Consolas"/>
+          <w:color w:val="374151"/>
+          <w:sz w:val="17"/>
+          <w:shd w:val="clear" w:color="auto" w:fill="F5F5F5"/>
+        </w:rPr>
+        <w:t>TrackLabel()</w:t>
+      </w:r>
+      <w:r>
+        <w:t>, or</w:t>
+      </w:r>
+    </w:p>
+    <w:p>
+      <w:pPr>
+        <w:rPr>
+          <w:rFonts w:hint="eastAsia"/>
+        </w:rPr>
+      </w:pPr>
+      <w:r>
+        <w:rPr>
+          <w:rFonts w:ascii="Consolas" w:hAnsi="Consolas"/>
+          <w:color w:val="374151"/>
+          <w:sz w:val="17"/>
+          <w:shd w:val="clear" w:color="auto" w:fill="F5F5F5"/>
+        </w:rPr>
+        <w:t>FillBar()</w:t>
+      </w:r>
+    </w:p>
+    <w:p>
+      <w:pPr>
+        <w:pStyle w:val="Listepuces"/>
+        <w:rPr>
+          <w:rFonts w:hint="eastAsia"/>
+        </w:rPr>
+      </w:pPr>
+      <w:r>
+        <w:t xml:space="preserve">generated convenience methods such as </w:t>
+      </w:r>
+      <w:r>
+        <w:rPr>
+          <w:rFonts w:ascii="Consolas" w:hAnsi="Consolas"/>
+          <w:color w:val="374151"/>
+          <w:sz w:val="17"/>
+          <w:shd w:val="clear" w:color="auto" w:fill="F5F5F5"/>
+        </w:rPr>
+        <w:t>SetValue(...)</w:t>
+      </w:r>
+      <w:r>
+        <w:t xml:space="preserve"> when the wrapper emits</w:t>
+      </w:r>
+    </w:p>
+    <w:p>
+      <w:pPr>
+        <w:rPr>
+          <w:rFonts w:hint="eastAsia"/>
+        </w:rPr>
+      </w:pPr>
+      <w:r>
+        <w:t>them</w:t>
       </w:r>
     </w:p>
     <w:p>
@@ -28210,7 +28263,7 @@
         <w:pStyle w:val="Titre3"/>
         <w:spacing w:before="60" w:after="80"/>
       </w:pPr>
-      <w:bookmarkStart w:id="72" w:name="_Toc230455601"/>
+      <w:bookmarkStart w:id="72" w:name="_Toc230458195"/>
       <w:r>
         <w:rPr>
           <w:rFonts w:ascii="Aptos" w:hAnsi="Aptos"/>
@@ -28734,6 +28787,7 @@
                 <w:b/>
                 <w:sz w:val="19"/>
               </w:rPr>
+              <w:lastRenderedPageBreak/>
               <w:t>SetLineStyle(LineStyle)</w:t>
             </w:r>
           </w:p>
@@ -28770,14 +28824,13 @@
         <w:pStyle w:val="Titre3"/>
         <w:spacing w:before="60" w:after="80"/>
       </w:pPr>
-      <w:bookmarkStart w:id="73" w:name="_Toc230455602"/>
+      <w:bookmarkStart w:id="73" w:name="_Toc230458196"/>
       <w:r>
         <w:rPr>
           <w:rFonts w:ascii="Aptos" w:hAnsi="Aptos"/>
           <w:color w:val="424242"/>
           <w:sz w:val="18"/>
         </w:rPr>
-        <w:lastRenderedPageBreak/>
         <w:t>Specialized surfaces</w:t>
       </w:r>
       <w:bookmarkEnd w:id="73"/>
@@ -29679,7 +29732,7 @@
         <w:pStyle w:val="Titre2"/>
         <w:spacing w:before="460" w:after="220"/>
       </w:pPr>
-      <w:bookmarkStart w:id="74" w:name="_Toc230455603"/>
+      <w:bookmarkStart w:id="74" w:name="_Toc230458197"/>
       <w:r>
         <w:rPr>
           <w:rFonts w:ascii="Aptos Display" w:hAnsi="Aptos Display"/>
@@ -29788,6 +29841,14 @@
           <w:shd w:val="clear" w:color="auto" w:fill="F1F5F9"/>
         </w:rPr>
         <w:br/>
+      </w:r>
+      <w:r>
+        <w:rPr>
+          <w:rFonts w:ascii="Consolas" w:hAnsi="Consolas"/>
+          <w:sz w:val="17"/>
+          <w:shd w:val="clear" w:color="auto" w:fill="F1F5F9"/>
+        </w:rPr>
+        <w:lastRenderedPageBreak/>
         <w:t>lead.SetVisible(true);</w:t>
       </w:r>
       <w:r>
@@ -29806,14 +29867,6 @@
           <w:shd w:val="clear" w:color="auto" w:fill="F1F5F9"/>
         </w:rPr>
         <w:br/>
-      </w:r>
-      <w:r>
-        <w:rPr>
-          <w:rFonts w:ascii="Consolas" w:hAnsi="Consolas"/>
-          <w:sz w:val="17"/>
-          <w:shd w:val="clear" w:color="auto" w:fill="F1F5F9"/>
-        </w:rPr>
-        <w:lastRenderedPageBreak/>
         <w:t>lead.SetRotationDegrees(-18.0f);</w:t>
       </w:r>
       <w:r>
@@ -30166,7 +30219,7 @@
         <w:pStyle w:val="Titre2"/>
         <w:spacing w:before="460" w:after="220"/>
       </w:pPr>
-      <w:bookmarkStart w:id="75" w:name="_Toc230455604"/>
+      <w:bookmarkStart w:id="75" w:name="_Toc230458198"/>
       <w:r>
         <w:rPr>
           <w:rFonts w:ascii="Aptos Display" w:hAnsi="Aptos Display"/>
@@ -30422,12 +30475,13 @@
         <w:pStyle w:val="Titre2"/>
         <w:spacing w:before="460" w:after="220"/>
       </w:pPr>
-      <w:bookmarkStart w:id="76" w:name="_Toc230455605"/>
+      <w:bookmarkStart w:id="76" w:name="_Toc230458199"/>
       <w:r>
         <w:rPr>
           <w:rFonts w:ascii="Aptos Display" w:hAnsi="Aptos Display"/>
           <w:color w:val="6A1B9A"/>
         </w:rPr>
+        <w:lastRenderedPageBreak/>
         <w:t>▪</w:t>
       </w:r>
       <w:r>
@@ -30475,7 +30529,6 @@
         </w:rPr>
       </w:pPr>
       <w:r>
-        <w:lastRenderedPageBreak/>
         <w:t>Typical fit:</w:t>
       </w:r>
     </w:p>
@@ -30933,7 +30986,7 @@
         <w:pStyle w:val="Titre2"/>
         <w:spacing w:before="460" w:after="220"/>
       </w:pPr>
-      <w:bookmarkStart w:id="77" w:name="_Toc230455606"/>
+      <w:bookmarkStart w:id="77" w:name="_Toc230458200"/>
       <w:r>
         <w:rPr>
           <w:rFonts w:ascii="Aptos Display" w:hAnsi="Aptos Display"/>
@@ -30972,7 +31025,7 @@
           <w:noProof/>
         </w:rPr>
         <w:drawing>
-          <wp:inline distT="0" distB="0" distL="0" distR="0" wp14:anchorId="2339F092" wp14:editId="00CEDF0B">
+          <wp:inline distT="0" distB="0" distL="0" distR="0" wp14:anchorId="6D5F48D0" wp14:editId="7B79326B">
             <wp:extent cx="5486400" cy="3575221"/>
             <wp:effectExtent l="0" t="0" r="0" b="0"/>
             <wp:docPr id="17" name="Picture 17"/>
@@ -31452,7 +31505,7 @@
         <w:pStyle w:val="Titre2"/>
         <w:spacing w:before="460" w:after="220"/>
       </w:pPr>
-      <w:bookmarkStart w:id="78" w:name="_Toc230455607"/>
+      <w:bookmarkStart w:id="78" w:name="_Toc230458201"/>
       <w:r>
         <w:rPr>
           <w:rFonts w:ascii="Aptos Display" w:hAnsi="Aptos Display"/>
@@ -31615,7 +31668,7 @@
         <w:pStyle w:val="Titre2"/>
         <w:spacing w:before="460" w:after="220"/>
       </w:pPr>
-      <w:bookmarkStart w:id="79" w:name="_Toc230455608"/>
+      <w:bookmarkStart w:id="79" w:name="_Toc230458202"/>
       <w:r>
         <w:rPr>
           <w:rFonts w:ascii="Aptos Display" w:hAnsi="Aptos Display"/>
@@ -31797,7 +31850,7 @@
         <w:pStyle w:val="Titre2"/>
         <w:spacing w:before="460" w:after="220"/>
       </w:pPr>
-      <w:bookmarkStart w:id="80" w:name="_Toc230455609"/>
+      <w:bookmarkStart w:id="80" w:name="_Toc230458203"/>
       <w:r>
         <w:rPr>
           <w:rFonts w:ascii="Aptos Display" w:hAnsi="Aptos Display"/>
@@ -32013,7 +32066,7 @@
         <w:pStyle w:val="Titre2"/>
         <w:spacing w:before="460" w:after="220"/>
       </w:pPr>
-      <w:bookmarkStart w:id="81" w:name="_Toc230455610"/>
+      <w:bookmarkStart w:id="81" w:name="_Toc230458204"/>
       <w:r>
         <w:rPr>
           <w:rFonts w:ascii="Aptos Display" w:hAnsi="Aptos Display"/>
@@ -32423,7 +32476,7 @@
         </w:pBdr>
         <w:spacing w:before="80" w:after="200"/>
       </w:pPr>
-      <w:bookmarkStart w:id="82" w:name="_Toc230455611"/>
+      <w:bookmarkStart w:id="82" w:name="_Toc230458205"/>
       <w:r>
         <w:rPr>
           <w:rFonts w:ascii="Aptos Display" w:hAnsi="Aptos Display"/>
@@ -32448,7 +32501,7 @@
           <w:noProof/>
         </w:rPr>
         <w:drawing>
-          <wp:inline distT="0" distB="0" distL="0" distR="0" wp14:anchorId="1B4F5FD9" wp14:editId="4F1CB9CF">
+          <wp:inline distT="0" distB="0" distL="0" distR="0" wp14:anchorId="73903192" wp14:editId="7DCAB43B">
             <wp:extent cx="4031889" cy="7498079"/>
             <wp:effectExtent l="0" t="0" r="0" b="0"/>
             <wp:docPr id="18" name="Picture 18"/>
@@ -32612,7 +32665,7 @@
           <w:noProof/>
         </w:rPr>
         <w:drawing>
-          <wp:inline distT="0" distB="0" distL="0" distR="0" wp14:anchorId="1C112576" wp14:editId="58D6E733">
+          <wp:inline distT="0" distB="0" distL="0" distR="0" wp14:anchorId="647147EC" wp14:editId="68E118C0">
             <wp:extent cx="5152526" cy="7498079"/>
             <wp:effectExtent l="0" t="0" r="0" b="0"/>
             <wp:docPr id="19" name="Picture 19"/>
@@ -32670,7 +32723,7 @@
         <w:pStyle w:val="Titre2"/>
         <w:spacing w:before="460" w:after="220"/>
       </w:pPr>
-      <w:bookmarkStart w:id="83" w:name="_Toc230455612"/>
+      <w:bookmarkStart w:id="83" w:name="_Toc230458206"/>
       <w:r>
         <w:rPr>
           <w:rFonts w:ascii="Aptos Display" w:hAnsi="Aptos Display"/>
@@ -32819,7 +32872,7 @@
         <w:pStyle w:val="Titre2"/>
         <w:spacing w:before="460" w:after="220"/>
       </w:pPr>
-      <w:bookmarkStart w:id="84" w:name="_Toc230455613"/>
+      <w:bookmarkStart w:id="84" w:name="_Toc230458207"/>
       <w:r>
         <w:rPr>
           <w:rFonts w:ascii="Aptos Display" w:hAnsi="Aptos Display"/>
@@ -32958,7 +33011,7 @@
         <w:pStyle w:val="Titre2"/>
         <w:spacing w:before="460" w:after="220"/>
       </w:pPr>
-      <w:bookmarkStart w:id="85" w:name="_Toc230455614"/>
+      <w:bookmarkStart w:id="85" w:name="_Toc230458208"/>
       <w:r>
         <w:rPr>
           <w:rFonts w:ascii="Aptos Display" w:hAnsi="Aptos Display"/>
@@ -33827,7 +33880,7 @@
         <w:pStyle w:val="Titre2"/>
         <w:spacing w:before="460" w:after="220"/>
       </w:pPr>
-      <w:bookmarkStart w:id="86" w:name="_Toc230455615"/>
+      <w:bookmarkStart w:id="86" w:name="_Toc230458209"/>
       <w:r>
         <w:rPr>
           <w:rFonts w:ascii="Aptos Display" w:hAnsi="Aptos Display"/>
@@ -34335,7 +34388,7 @@
         <w:pStyle w:val="Titre2"/>
         <w:spacing w:before="460" w:after="220"/>
       </w:pPr>
-      <w:bookmarkStart w:id="87" w:name="_Toc230455616"/>
+      <w:bookmarkStart w:id="87" w:name="_Toc230458210"/>
       <w:r>
         <w:rPr>
           <w:rFonts w:ascii="Aptos Display" w:hAnsi="Aptos Display"/>
@@ -34826,7 +34879,7 @@
         <w:pStyle w:val="Titre2"/>
         <w:spacing w:before="460" w:after="220"/>
       </w:pPr>
-      <w:bookmarkStart w:id="88" w:name="_Toc230455617"/>
+      <w:bookmarkStart w:id="88" w:name="_Toc230458211"/>
       <w:r>
         <w:rPr>
           <w:rFonts w:ascii="Aptos Display" w:hAnsi="Aptos Display"/>
@@ -34864,7 +34917,7 @@
           <w:noProof/>
         </w:rPr>
         <w:drawing>
-          <wp:inline distT="0" distB="0" distL="0" distR="0" wp14:anchorId="4770665E" wp14:editId="3E1411FE">
+          <wp:inline distT="0" distB="0" distL="0" distR="0" wp14:anchorId="1E7F6CCC" wp14:editId="197D88EE">
             <wp:extent cx="5486400" cy="3942488"/>
             <wp:effectExtent l="0" t="0" r="0" b="0"/>
             <wp:docPr id="20" name="Picture 20"/>
@@ -35140,7 +35193,7 @@
         <w:pStyle w:val="Titre2"/>
         <w:spacing w:before="460" w:after="220"/>
       </w:pPr>
-      <w:bookmarkStart w:id="89" w:name="_Toc230455618"/>
+      <w:bookmarkStart w:id="89" w:name="_Toc230458212"/>
       <w:r>
         <w:rPr>
           <w:rFonts w:ascii="Aptos Display" w:hAnsi="Aptos Display"/>
@@ -35762,7 +35815,7 @@
         <w:pStyle w:val="Titre2"/>
         <w:spacing w:before="460" w:after="220"/>
       </w:pPr>
-      <w:bookmarkStart w:id="90" w:name="_Toc230455619"/>
+      <w:bookmarkStart w:id="90" w:name="_Toc230458213"/>
       <w:r>
         <w:rPr>
           <w:rFonts w:ascii="Aptos Display" w:hAnsi="Aptos Display"/>
@@ -36200,7 +36253,7 @@
         <w:pStyle w:val="Titre2"/>
         <w:spacing w:before="460" w:after="220"/>
       </w:pPr>
-      <w:bookmarkStart w:id="91" w:name="_Toc230455620"/>
+      <w:bookmarkStart w:id="91" w:name="_Toc230458214"/>
       <w:r>
         <w:rPr>
           <w:rFonts w:ascii="Aptos Display" w:hAnsi="Aptos Display"/>
@@ -36803,7 +36856,7 @@
         <w:pStyle w:val="Titre2"/>
         <w:spacing w:before="460" w:after="220"/>
       </w:pPr>
-      <w:bookmarkStart w:id="92" w:name="_Toc230455621"/>
+      <w:bookmarkStart w:id="92" w:name="_Toc230458215"/>
       <w:r>
         <w:rPr>
           <w:rFonts w:ascii="Aptos Display" w:hAnsi="Aptos Display"/>
@@ -36928,7 +36981,7 @@
         <w:pStyle w:val="Titre2"/>
         <w:spacing w:before="460" w:after="220"/>
       </w:pPr>
-      <w:bookmarkStart w:id="93" w:name="_Toc230455622"/>
+      <w:bookmarkStart w:id="93" w:name="_Toc230458216"/>
       <w:r>
         <w:rPr>
           <w:rFonts w:ascii="Aptos Display" w:hAnsi="Aptos Display"/>
@@ -37243,7 +37296,7 @@
         <w:pStyle w:val="Titre2"/>
         <w:spacing w:before="460" w:after="220"/>
       </w:pPr>
-      <w:bookmarkStart w:id="94" w:name="_Toc230455623"/>
+      <w:bookmarkStart w:id="94" w:name="_Toc230458217"/>
       <w:r>
         <w:rPr>
           <w:rFonts w:ascii="Aptos Display" w:hAnsi="Aptos Display"/>
@@ -37381,7 +37434,7 @@
         <w:pStyle w:val="Titre2"/>
         <w:spacing w:before="460" w:after="220"/>
       </w:pPr>
-      <w:bookmarkStart w:id="95" w:name="_Toc230455624"/>
+      <w:bookmarkStart w:id="95" w:name="_Toc230458218"/>
       <w:r>
         <w:rPr>
           <w:rFonts w:ascii="Aptos Display" w:hAnsi="Aptos Display"/>
@@ -37521,7 +37574,7 @@
         <w:pStyle w:val="Titre2"/>
         <w:spacing w:before="460" w:after="220"/>
       </w:pPr>
-      <w:bookmarkStart w:id="96" w:name="_Toc230455625"/>
+      <w:bookmarkStart w:id="96" w:name="_Toc230458219"/>
       <w:r>
         <w:rPr>
           <w:rFonts w:ascii="Aptos Display" w:hAnsi="Aptos Display"/>
@@ -37731,7 +37784,7 @@
         </w:pBdr>
         <w:spacing w:before="80" w:after="200"/>
       </w:pPr>
-      <w:bookmarkStart w:id="97" w:name="_Toc230455626"/>
+      <w:bookmarkStart w:id="97" w:name="_Toc230458220"/>
       <w:r>
         <w:rPr>
           <w:rFonts w:ascii="Aptos Display" w:hAnsi="Aptos Display"/>
@@ -37756,7 +37809,7 @@
           <w:noProof/>
         </w:rPr>
         <w:drawing>
-          <wp:inline distT="0" distB="0" distL="0" distR="0" wp14:anchorId="2303220E" wp14:editId="4A3E3253">
+          <wp:inline distT="0" distB="0" distL="0" distR="0" wp14:anchorId="7FFADC7D" wp14:editId="55E992EE">
             <wp:extent cx="4601762" cy="7498079"/>
             <wp:effectExtent l="0" t="0" r="0" b="0"/>
             <wp:docPr id="21" name="Picture 21"/>
@@ -37858,7 +37911,7 @@
         <w:pStyle w:val="Titre2"/>
         <w:spacing w:before="460" w:after="220"/>
       </w:pPr>
-      <w:bookmarkStart w:id="98" w:name="_Toc230455627"/>
+      <w:bookmarkStart w:id="98" w:name="_Toc230458221"/>
       <w:r>
         <w:rPr>
           <w:rFonts w:ascii="Aptos Display" w:hAnsi="Aptos Display"/>
@@ -37986,7 +38039,7 @@
         <w:pStyle w:val="Titre2"/>
         <w:spacing w:before="460" w:after="220"/>
       </w:pPr>
-      <w:bookmarkStart w:id="99" w:name="_Toc230455628"/>
+      <w:bookmarkStart w:id="99" w:name="_Toc230458222"/>
       <w:r>
         <w:rPr>
           <w:rFonts w:ascii="Aptos Display" w:hAnsi="Aptos Display"/>
@@ -38347,7 +38400,7 @@
         <w:pStyle w:val="Titre2"/>
         <w:spacing w:before="460" w:after="220"/>
       </w:pPr>
-      <w:bookmarkStart w:id="100" w:name="_Toc230455629"/>
+      <w:bookmarkStart w:id="100" w:name="_Toc230458223"/>
       <w:r>
         <w:rPr>
           <w:rFonts w:ascii="Aptos Display" w:hAnsi="Aptos Display"/>
@@ -38479,7 +38532,7 @@
         <w:pStyle w:val="Titre2"/>
         <w:spacing w:before="460" w:after="220"/>
       </w:pPr>
-      <w:bookmarkStart w:id="101" w:name="_Toc230455630"/>
+      <w:bookmarkStart w:id="101" w:name="_Toc230458224"/>
       <w:r>
         <w:rPr>
           <w:rFonts w:ascii="Aptos Display" w:hAnsi="Aptos Display"/>
@@ -38618,7 +38671,7 @@
         <w:pStyle w:val="Titre2"/>
         <w:spacing w:before="460" w:after="220"/>
       </w:pPr>
-      <w:bookmarkStart w:id="102" w:name="_Toc230455631"/>
+      <w:bookmarkStart w:id="102" w:name="_Toc230458225"/>
       <w:r>
         <w:rPr>
           <w:rFonts w:ascii="Aptos Display" w:hAnsi="Aptos Display"/>
@@ -38789,7 +38842,7 @@
         <w:pStyle w:val="Titre2"/>
         <w:spacing w:before="460" w:after="220"/>
       </w:pPr>
-      <w:bookmarkStart w:id="103" w:name="_Toc230455632"/>
+      <w:bookmarkStart w:id="103" w:name="_Toc230458226"/>
       <w:r>
         <w:rPr>
           <w:rFonts w:ascii="Aptos Display" w:hAnsi="Aptos Display"/>
@@ -38923,7 +38976,7 @@
         <w:pStyle w:val="Titre2"/>
         <w:spacing w:before="460" w:after="220"/>
       </w:pPr>
-      <w:bookmarkStart w:id="104" w:name="_Toc230455633"/>
+      <w:bookmarkStart w:id="104" w:name="_Toc230458227"/>
       <w:r>
         <w:rPr>
           <w:rFonts w:ascii="Aptos Display" w:hAnsi="Aptos Display"/>
@@ -39017,7 +39070,7 @@
         <w:pStyle w:val="Titre2"/>
         <w:spacing w:before="460" w:after="220"/>
       </w:pPr>
-      <w:bookmarkStart w:id="105" w:name="_Toc230455634"/>
+      <w:bookmarkStart w:id="105" w:name="_Toc230458228"/>
       <w:r>
         <w:rPr>
           <w:rFonts w:ascii="Aptos Display" w:hAnsi="Aptos Display"/>
@@ -39126,7 +39179,7 @@
         <w:pStyle w:val="Titre2"/>
         <w:spacing w:before="460" w:after="220"/>
       </w:pPr>
-      <w:bookmarkStart w:id="106" w:name="_Toc230455635"/>
+      <w:bookmarkStart w:id="106" w:name="_Toc230458229"/>
       <w:r>
         <w:rPr>
           <w:rFonts w:ascii="Aptos Display" w:hAnsi="Aptos Display"/>
@@ -39239,7 +39292,7 @@
         <w:pStyle w:val="Titre2"/>
         <w:spacing w:before="460" w:after="220"/>
       </w:pPr>
-      <w:bookmarkStart w:id="107" w:name="_Toc230455636"/>
+      <w:bookmarkStart w:id="107" w:name="_Toc230458230"/>
       <w:r>
         <w:rPr>
           <w:rFonts w:ascii="Aptos Display" w:hAnsi="Aptos Display"/>
@@ -39378,7 +39431,7 @@
         </w:pBdr>
         <w:spacing w:before="80" w:after="200"/>
       </w:pPr>
-      <w:bookmarkStart w:id="108" w:name="_Toc230455637"/>
+      <w:bookmarkStart w:id="108" w:name="_Toc230458231"/>
       <w:r>
         <w:rPr>
           <w:rFonts w:ascii="Aptos Display" w:hAnsi="Aptos Display"/>
@@ -39394,7 +39447,7 @@
         <w:pStyle w:val="Titre2"/>
         <w:spacing w:before="460" w:after="220"/>
       </w:pPr>
-      <w:bookmarkStart w:id="109" w:name="_Toc230455638"/>
+      <w:bookmarkStart w:id="109" w:name="_Toc230458232"/>
       <w:r>
         <w:rPr>
           <w:rFonts w:ascii="Aptos Display" w:hAnsi="Aptos Display"/>
@@ -39623,7 +39676,7 @@
         <w:pStyle w:val="Titre2"/>
         <w:spacing w:before="460" w:after="220"/>
       </w:pPr>
-      <w:bookmarkStart w:id="110" w:name="_Toc230455639"/>
+      <w:bookmarkStart w:id="110" w:name="_Toc230458233"/>
       <w:r>
         <w:rPr>
           <w:rFonts w:ascii="Aptos Display" w:hAnsi="Aptos Display"/>
@@ -39751,7 +39804,7 @@
         <w:pStyle w:val="Titre2"/>
         <w:spacing w:before="460" w:after="220"/>
       </w:pPr>
-      <w:bookmarkStart w:id="111" w:name="_Toc230455640"/>
+      <w:bookmarkStart w:id="111" w:name="_Toc230458234"/>
       <w:r>
         <w:rPr>
           <w:rFonts w:ascii="Aptos Display" w:hAnsi="Aptos Display"/>
@@ -40101,7 +40154,7 @@
               <w:rPr>
                 <w:sz w:val="19"/>
               </w:rPr>
-              <w:t>umbrella client SDK header for standalone applications and examples</w:t>
+              <w:t>umbrella standalone SDK header for loader, transport, feedback, and publisher helpers</w:t>
             </w:r>
           </w:p>
         </w:tc>
@@ -40321,7 +40374,7 @@
               <w:rPr>
                 <w:sz w:val="19"/>
               </w:rPr>
-              <w:t>generated-handle runtime behavior and feedback helpers</w:t>
+              <w:t>generated-runtime support header used by GeneratedUiSupport.h; not the normal user include for window-specific code</w:t>
             </w:r>
           </w:p>
         </w:tc>
@@ -40614,6 +40667,7 @@
                 <w:b/>
                 <w:sz w:val="19"/>
               </w:rPr>
+              <w:lastRenderedPageBreak/>
               <w:t>_Deliveries/packages_windows/MFDStudioClientApi/build/native/cmake/MFDStudioClientApiConfig.cmake</w:t>
             </w:r>
           </w:p>
@@ -40639,14 +40693,7 @@
               <w:rPr>
                 <w:sz w:val="19"/>
               </w:rPr>
-              <w:t xml:space="preserve">packaged development SDK entry point exported for external CMake </w:t>
-            </w:r>
-            <w:r>
-              <w:rPr>
-                <w:sz w:val="19"/>
-              </w:rPr>
-              <w:lastRenderedPageBreak/>
-              <w:t>clients</w:t>
+              <w:t>packaged development SDK entry point exported for external CMake clients</w:t>
             </w:r>
           </w:p>
         </w:tc>
@@ -40674,7 +40721,6 @@
                 <w:b/>
                 <w:sz w:val="19"/>
               </w:rPr>
-              <w:lastRenderedPageBreak/>
               <w:t>_Deliveries/packages_bin_windows/MFDStudioClientApi.Install/_Exec/&lt;toolset&gt;/&lt;platform&gt;/&lt;config&gt;/mfd_client_api.dll</w:t>
             </w:r>
           </w:p>
@@ -40711,7 +40757,7 @@
         <w:pStyle w:val="Titre2"/>
         <w:spacing w:before="460" w:after="220"/>
       </w:pPr>
-      <w:bookmarkStart w:id="112" w:name="_Toc230455641"/>
+      <w:bookmarkStart w:id="112" w:name="_Toc230458235"/>
       <w:r>
         <w:rPr>
           <w:rFonts w:ascii="Aptos Display" w:hAnsi="Aptos Display"/>
@@ -40819,7 +40865,7 @@
         </w:pBdr>
         <w:spacing w:before="80" w:after="200"/>
       </w:pPr>
-      <w:bookmarkStart w:id="113" w:name="_Toc230455642"/>
+      <w:bookmarkStart w:id="113" w:name="_Toc230458236"/>
       <w:r>
         <w:rPr>
           <w:rFonts w:ascii="Aptos Display" w:hAnsi="Aptos Display"/>
@@ -42021,31 +42067,31 @@
       </w:rPr>
     </w:lvl>
   </w:abstractNum>
-  <w:num w:numId="1" w16cid:durableId="1045566894">
+  <w:num w:numId="1" w16cid:durableId="721364437">
     <w:abstractNumId w:val="8"/>
   </w:num>
-  <w:num w:numId="2" w16cid:durableId="1594509270">
+  <w:num w:numId="2" w16cid:durableId="572088948">
     <w:abstractNumId w:val="6"/>
   </w:num>
-  <w:num w:numId="3" w16cid:durableId="859515751">
+  <w:num w:numId="3" w16cid:durableId="1494182826">
     <w:abstractNumId w:val="5"/>
   </w:num>
-  <w:num w:numId="4" w16cid:durableId="353386468">
+  <w:num w:numId="4" w16cid:durableId="1921911023">
     <w:abstractNumId w:val="4"/>
   </w:num>
-  <w:num w:numId="5" w16cid:durableId="233130082">
+  <w:num w:numId="5" w16cid:durableId="83651660">
     <w:abstractNumId w:val="7"/>
   </w:num>
-  <w:num w:numId="6" w16cid:durableId="1721321073">
+  <w:num w:numId="6" w16cid:durableId="132647432">
     <w:abstractNumId w:val="3"/>
   </w:num>
-  <w:num w:numId="7" w16cid:durableId="1351419647">
+  <w:num w:numId="7" w16cid:durableId="428085780">
     <w:abstractNumId w:val="2"/>
   </w:num>
-  <w:num w:numId="8" w16cid:durableId="1603806838">
+  <w:num w:numId="8" w16cid:durableId="2135168926">
     <w:abstractNumId w:val="1"/>
   </w:num>
-  <w:num w:numId="9" w16cid:durableId="1848323833">
+  <w:num w:numId="9" w16cid:durableId="1979604509">
     <w:abstractNumId w:val="0"/>
   </w:num>
 </w:numbering>
@@ -53436,7 +53482,7 @@
     <w:autoRedefine/>
     <w:uiPriority w:val="39"/>
     <w:unhideWhenUsed/>
-    <w:rsid w:val="00B67414"/>
+    <w:rsid w:val="00A77B67"/>
     <w:pPr>
       <w:spacing w:after="100"/>
     </w:pPr>
@@ -53448,7 +53494,7 @@
     <w:autoRedefine/>
     <w:uiPriority w:val="39"/>
     <w:unhideWhenUsed/>
-    <w:rsid w:val="00B67414"/>
+    <w:rsid w:val="00A77B67"/>
     <w:pPr>
       <w:spacing w:after="100"/>
       <w:ind w:left="200"/>
@@ -53461,7 +53507,7 @@
     <w:autoRedefine/>
     <w:uiPriority w:val="39"/>
     <w:unhideWhenUsed/>
-    <w:rsid w:val="00B67414"/>
+    <w:rsid w:val="00A77B67"/>
     <w:pPr>
       <w:spacing w:after="100"/>
       <w:ind w:left="400"/>
@@ -53474,7 +53520,7 @@
     <w:autoRedefine/>
     <w:uiPriority w:val="39"/>
     <w:unhideWhenUsed/>
-    <w:rsid w:val="00B67414"/>
+    <w:rsid w:val="00A77B67"/>
     <w:pPr>
       <w:spacing w:after="100" w:line="278" w:lineRule="auto"/>
       <w:ind w:left="720"/>
@@ -53496,7 +53542,7 @@
     <w:autoRedefine/>
     <w:uiPriority w:val="39"/>
     <w:unhideWhenUsed/>
-    <w:rsid w:val="00B67414"/>
+    <w:rsid w:val="00A77B67"/>
     <w:pPr>
       <w:spacing w:after="100" w:line="278" w:lineRule="auto"/>
       <w:ind w:left="960"/>
@@ -53518,7 +53564,7 @@
     <w:autoRedefine/>
     <w:uiPriority w:val="39"/>
     <w:unhideWhenUsed/>
-    <w:rsid w:val="00B67414"/>
+    <w:rsid w:val="00A77B67"/>
     <w:pPr>
       <w:spacing w:after="100" w:line="278" w:lineRule="auto"/>
       <w:ind w:left="1200"/>
@@ -53540,7 +53586,7 @@
     <w:autoRedefine/>
     <w:uiPriority w:val="39"/>
     <w:unhideWhenUsed/>
-    <w:rsid w:val="00B67414"/>
+    <w:rsid w:val="00A77B67"/>
     <w:pPr>
       <w:spacing w:after="100" w:line="278" w:lineRule="auto"/>
       <w:ind w:left="1440"/>
@@ -53562,7 +53608,7 @@
     <w:autoRedefine/>
     <w:uiPriority w:val="39"/>
     <w:unhideWhenUsed/>
-    <w:rsid w:val="00B67414"/>
+    <w:rsid w:val="00A77B67"/>
     <w:pPr>
       <w:spacing w:after="100" w:line="278" w:lineRule="auto"/>
       <w:ind w:left="1680"/>
@@ -53584,7 +53630,7 @@
     <w:autoRedefine/>
     <w:uiPriority w:val="39"/>
     <w:unhideWhenUsed/>
-    <w:rsid w:val="00B67414"/>
+    <w:rsid w:val="00A77B67"/>
     <w:pPr>
       <w:spacing w:after="100" w:line="278" w:lineRule="auto"/>
       <w:ind w:left="1920"/>
@@ -53604,7 +53650,7 @@
     <w:basedOn w:val="Policepardfaut"/>
     <w:uiPriority w:val="99"/>
     <w:unhideWhenUsed/>
-    <w:rsid w:val="00B67414"/>
+    <w:rsid w:val="00A77B67"/>
     <w:rPr>
       <w:color w:val="0000FF" w:themeColor="hyperlink"/>
       <w:u w:val="single"/>
@@ -53616,7 +53662,7 @@
     <w:uiPriority w:val="99"/>
     <w:semiHidden/>
     <w:unhideWhenUsed/>
-    <w:rsid w:val="00B67414"/>
+    <w:rsid w:val="00A77B67"/>
     <w:rPr>
       <w:color w:val="605E5C"/>
       <w:shd w:val="clear" w:color="auto" w:fill="E1DFDD"/>

</xml_diff>

<commit_message>
Using icon instead of text button to get a better look&feel
</commit_message>
<xml_diff>
--- a/docs/user_guide/MFDStudio_End_To_End_User_Guide.docx
+++ b/docs/user_guide/MFDStudio_End_To_End_User_Guide.docx
@@ -211,7 +211,7 @@
       <w:pPr>
         <w:pStyle w:val="Titre1"/>
       </w:pPr>
-      <w:bookmarkStart w:id="0" w:name="_Toc232620262"/>
+      <w:bookmarkStart w:id="0" w:name="_Toc232748212"/>
       <w:r>
         <w:t>Table of Contents</w:t>
       </w:r>
@@ -243,7 +243,7 @@
       <w:r>
         <w:fldChar w:fldCharType="separate"/>
       </w:r>
-      <w:hyperlink w:anchor="_Toc232620262" w:history="1">
+      <w:hyperlink w:anchor="_Toc232748212" w:history="1">
         <w:r>
           <w:rPr>
             <w:rStyle w:val="Lienhypertexte"/>
@@ -270,7 +270,7 @@
             <w:noProof/>
             <w:webHidden/>
           </w:rPr>
-          <w:instrText xml:space="preserve"> PAGEREF _Toc232620262 \h </w:instrText>
+          <w:instrText xml:space="preserve"> PAGEREF _Toc232748212 \h </w:instrText>
         </w:r>
         <w:r>
           <w:rPr>
@@ -318,7 +318,7 @@
           <w14:ligatures w14:val="standardContextual"/>
         </w:rPr>
       </w:pPr>
-      <w:hyperlink w:anchor="_Toc232620263" w:history="1">
+      <w:hyperlink w:anchor="_Toc232748213" w:history="1">
         <w:r>
           <w:rPr>
             <w:rStyle w:val="Lienhypertexte"/>
@@ -346,7 +346,7 @@
             <w:noProof/>
             <w:webHidden/>
           </w:rPr>
-          <w:instrText xml:space="preserve"> PAGEREF _Toc232620263 \h </w:instrText>
+          <w:instrText xml:space="preserve"> PAGEREF _Toc232748213 \h </w:instrText>
         </w:r>
         <w:r>
           <w:rPr>
@@ -394,7 +394,7 @@
           <w14:ligatures w14:val="standardContextual"/>
         </w:rPr>
       </w:pPr>
-      <w:hyperlink w:anchor="_Toc232620264" w:history="1">
+      <w:hyperlink w:anchor="_Toc232748214" w:history="1">
         <w:r>
           <w:rPr>
             <w:rStyle w:val="Lienhypertexte"/>
@@ -422,7 +422,7 @@
             <w:noProof/>
             <w:webHidden/>
           </w:rPr>
-          <w:instrText xml:space="preserve"> PAGEREF _Toc232620264 \h </w:instrText>
+          <w:instrText xml:space="preserve"> PAGEREF _Toc232748214 \h </w:instrText>
         </w:r>
         <w:r>
           <w:rPr>
@@ -470,7 +470,7 @@
           <w14:ligatures w14:val="standardContextual"/>
         </w:rPr>
       </w:pPr>
-      <w:hyperlink w:anchor="_Toc232620265" w:history="1">
+      <w:hyperlink w:anchor="_Toc232748215" w:history="1">
         <w:r>
           <w:rPr>
             <w:rStyle w:val="Lienhypertexte"/>
@@ -498,7 +498,7 @@
             <w:noProof/>
             <w:webHidden/>
           </w:rPr>
-          <w:instrText xml:space="preserve"> PAGEREF _Toc232620265 \h </w:instrText>
+          <w:instrText xml:space="preserve"> PAGEREF _Toc232748215 \h </w:instrText>
         </w:r>
         <w:r>
           <w:rPr>
@@ -546,7 +546,7 @@
           <w14:ligatures w14:val="standardContextual"/>
         </w:rPr>
       </w:pPr>
-      <w:hyperlink w:anchor="_Toc232620266" w:history="1">
+      <w:hyperlink w:anchor="_Toc232748216" w:history="1">
         <w:r>
           <w:rPr>
             <w:rStyle w:val="Lienhypertexte"/>
@@ -574,7 +574,7 @@
             <w:noProof/>
             <w:webHidden/>
           </w:rPr>
-          <w:instrText xml:space="preserve"> PAGEREF _Toc232620266 \h </w:instrText>
+          <w:instrText xml:space="preserve"> PAGEREF _Toc232748216 \h </w:instrText>
         </w:r>
         <w:r>
           <w:rPr>
@@ -622,7 +622,7 @@
           <w14:ligatures w14:val="standardContextual"/>
         </w:rPr>
       </w:pPr>
-      <w:hyperlink w:anchor="_Toc232620267" w:history="1">
+      <w:hyperlink w:anchor="_Toc232748217" w:history="1">
         <w:r>
           <w:rPr>
             <w:rStyle w:val="Lienhypertexte"/>
@@ -650,7 +650,7 @@
             <w:noProof/>
             <w:webHidden/>
           </w:rPr>
-          <w:instrText xml:space="preserve"> PAGEREF _Toc232620267 \h </w:instrText>
+          <w:instrText xml:space="preserve"> PAGEREF _Toc232748217 \h </w:instrText>
         </w:r>
         <w:r>
           <w:rPr>
@@ -698,7 +698,7 @@
           <w14:ligatures w14:val="standardContextual"/>
         </w:rPr>
       </w:pPr>
-      <w:hyperlink w:anchor="_Toc232620268" w:history="1">
+      <w:hyperlink w:anchor="_Toc232748218" w:history="1">
         <w:r>
           <w:rPr>
             <w:rStyle w:val="Lienhypertexte"/>
@@ -726,7 +726,7 @@
             <w:noProof/>
             <w:webHidden/>
           </w:rPr>
-          <w:instrText xml:space="preserve"> PAGEREF _Toc232620268 \h </w:instrText>
+          <w:instrText xml:space="preserve"> PAGEREF _Toc232748218 \h </w:instrText>
         </w:r>
         <w:r>
           <w:rPr>
@@ -774,7 +774,7 @@
           <w14:ligatures w14:val="standardContextual"/>
         </w:rPr>
       </w:pPr>
-      <w:hyperlink w:anchor="_Toc232620269" w:history="1">
+      <w:hyperlink w:anchor="_Toc232748219" w:history="1">
         <w:r>
           <w:rPr>
             <w:rStyle w:val="Lienhypertexte"/>
@@ -802,7 +802,7 @@
             <w:noProof/>
             <w:webHidden/>
           </w:rPr>
-          <w:instrText xml:space="preserve"> PAGEREF _Toc232620269 \h </w:instrText>
+          <w:instrText xml:space="preserve"> PAGEREF _Toc232748219 \h </w:instrText>
         </w:r>
         <w:r>
           <w:rPr>
@@ -850,7 +850,7 @@
           <w14:ligatures w14:val="standardContextual"/>
         </w:rPr>
       </w:pPr>
-      <w:hyperlink w:anchor="_Toc232620270" w:history="1">
+      <w:hyperlink w:anchor="_Toc232748220" w:history="1">
         <w:r>
           <w:rPr>
             <w:rStyle w:val="Lienhypertexte"/>
@@ -878,7 +878,7 @@
             <w:noProof/>
             <w:webHidden/>
           </w:rPr>
-          <w:instrText xml:space="preserve"> PAGEREF _Toc232620270 \h </w:instrText>
+          <w:instrText xml:space="preserve"> PAGEREF _Toc232748220 \h </w:instrText>
         </w:r>
         <w:r>
           <w:rPr>
@@ -926,7 +926,7 @@
           <w14:ligatures w14:val="standardContextual"/>
         </w:rPr>
       </w:pPr>
-      <w:hyperlink w:anchor="_Toc232620271" w:history="1">
+      <w:hyperlink w:anchor="_Toc232748221" w:history="1">
         <w:r>
           <w:rPr>
             <w:rStyle w:val="Lienhypertexte"/>
@@ -954,7 +954,7 @@
             <w:noProof/>
             <w:webHidden/>
           </w:rPr>
-          <w:instrText xml:space="preserve"> PAGEREF _Toc232620271 \h </w:instrText>
+          <w:instrText xml:space="preserve"> PAGEREF _Toc232748221 \h </w:instrText>
         </w:r>
         <w:r>
           <w:rPr>
@@ -1002,7 +1002,7 @@
           <w14:ligatures w14:val="standardContextual"/>
         </w:rPr>
       </w:pPr>
-      <w:hyperlink w:anchor="_Toc232620272" w:history="1">
+      <w:hyperlink w:anchor="_Toc232748222" w:history="1">
         <w:r>
           <w:rPr>
             <w:rStyle w:val="Lienhypertexte"/>
@@ -1030,7 +1030,7 @@
             <w:noProof/>
             <w:webHidden/>
           </w:rPr>
-          <w:instrText xml:space="preserve"> PAGEREF _Toc232620272 \h </w:instrText>
+          <w:instrText xml:space="preserve"> PAGEREF _Toc232748222 \h </w:instrText>
         </w:r>
         <w:r>
           <w:rPr>
@@ -1078,7 +1078,7 @@
           <w14:ligatures w14:val="standardContextual"/>
         </w:rPr>
       </w:pPr>
-      <w:hyperlink w:anchor="_Toc232620273" w:history="1">
+      <w:hyperlink w:anchor="_Toc232748223" w:history="1">
         <w:r>
           <w:rPr>
             <w:rStyle w:val="Lienhypertexte"/>
@@ -1106,7 +1106,7 @@
             <w:noProof/>
             <w:webHidden/>
           </w:rPr>
-          <w:instrText xml:space="preserve"> PAGEREF _Toc232620273 \h </w:instrText>
+          <w:instrText xml:space="preserve"> PAGEREF _Toc232748223 \h </w:instrText>
         </w:r>
         <w:r>
           <w:rPr>
@@ -1154,7 +1154,7 @@
           <w14:ligatures w14:val="standardContextual"/>
         </w:rPr>
       </w:pPr>
-      <w:hyperlink w:anchor="_Toc232620274" w:history="1">
+      <w:hyperlink w:anchor="_Toc232748224" w:history="1">
         <w:r>
           <w:rPr>
             <w:rStyle w:val="Lienhypertexte"/>
@@ -1182,7 +1182,7 @@
             <w:noProof/>
             <w:webHidden/>
           </w:rPr>
-          <w:instrText xml:space="preserve"> PAGEREF _Toc232620274 \h </w:instrText>
+          <w:instrText xml:space="preserve"> PAGEREF _Toc232748224 \h </w:instrText>
         </w:r>
         <w:r>
           <w:rPr>
@@ -1230,7 +1230,7 @@
           <w14:ligatures w14:val="standardContextual"/>
         </w:rPr>
       </w:pPr>
-      <w:hyperlink w:anchor="_Toc232620275" w:history="1">
+      <w:hyperlink w:anchor="_Toc232748225" w:history="1">
         <w:r>
           <w:rPr>
             <w:rStyle w:val="Lienhypertexte"/>
@@ -1258,7 +1258,7 @@
             <w:noProof/>
             <w:webHidden/>
           </w:rPr>
-          <w:instrText xml:space="preserve"> PAGEREF _Toc232620275 \h </w:instrText>
+          <w:instrText xml:space="preserve"> PAGEREF _Toc232748225 \h </w:instrText>
         </w:r>
         <w:r>
           <w:rPr>
@@ -1306,7 +1306,7 @@
           <w14:ligatures w14:val="standardContextual"/>
         </w:rPr>
       </w:pPr>
-      <w:hyperlink w:anchor="_Toc232620276" w:history="1">
+      <w:hyperlink w:anchor="_Toc232748226" w:history="1">
         <w:r>
           <w:rPr>
             <w:rStyle w:val="Lienhypertexte"/>
@@ -1334,7 +1334,7 @@
             <w:noProof/>
             <w:webHidden/>
           </w:rPr>
-          <w:instrText xml:space="preserve"> PAGEREF _Toc232620276 \h </w:instrText>
+          <w:instrText xml:space="preserve"> PAGEREF _Toc232748226 \h </w:instrText>
         </w:r>
         <w:r>
           <w:rPr>
@@ -1382,7 +1382,7 @@
           <w14:ligatures w14:val="standardContextual"/>
         </w:rPr>
       </w:pPr>
-      <w:hyperlink w:anchor="_Toc232620277" w:history="1">
+      <w:hyperlink w:anchor="_Toc232748227" w:history="1">
         <w:r>
           <w:rPr>
             <w:rStyle w:val="Lienhypertexte"/>
@@ -1410,7 +1410,7 @@
             <w:noProof/>
             <w:webHidden/>
           </w:rPr>
-          <w:instrText xml:space="preserve"> PAGEREF _Toc232620277 \h </w:instrText>
+          <w:instrText xml:space="preserve"> PAGEREF _Toc232748227 \h </w:instrText>
         </w:r>
         <w:r>
           <w:rPr>
@@ -1458,7 +1458,7 @@
           <w14:ligatures w14:val="standardContextual"/>
         </w:rPr>
       </w:pPr>
-      <w:hyperlink w:anchor="_Toc232620278" w:history="1">
+      <w:hyperlink w:anchor="_Toc232748228" w:history="1">
         <w:r>
           <w:rPr>
             <w:rStyle w:val="Lienhypertexte"/>
@@ -1486,7 +1486,7 @@
             <w:noProof/>
             <w:webHidden/>
           </w:rPr>
-          <w:instrText xml:space="preserve"> PAGEREF _Toc232620278 \h </w:instrText>
+          <w:instrText xml:space="preserve"> PAGEREF _Toc232748228 \h </w:instrText>
         </w:r>
         <w:r>
           <w:rPr>
@@ -1534,7 +1534,7 @@
           <w14:ligatures w14:val="standardContextual"/>
         </w:rPr>
       </w:pPr>
-      <w:hyperlink w:anchor="_Toc232620279" w:history="1">
+      <w:hyperlink w:anchor="_Toc232748229" w:history="1">
         <w:r>
           <w:rPr>
             <w:rStyle w:val="Lienhypertexte"/>
@@ -1562,7 +1562,7 @@
             <w:noProof/>
             <w:webHidden/>
           </w:rPr>
-          <w:instrText xml:space="preserve"> PAGEREF _Toc232620279 \h </w:instrText>
+          <w:instrText xml:space="preserve"> PAGEREF _Toc232748229 \h </w:instrText>
         </w:r>
         <w:r>
           <w:rPr>
@@ -1610,7 +1610,7 @@
           <w14:ligatures w14:val="standardContextual"/>
         </w:rPr>
       </w:pPr>
-      <w:hyperlink w:anchor="_Toc232620280" w:history="1">
+      <w:hyperlink w:anchor="_Toc232748230" w:history="1">
         <w:r>
           <w:rPr>
             <w:rStyle w:val="Lienhypertexte"/>
@@ -1638,7 +1638,7 @@
             <w:noProof/>
             <w:webHidden/>
           </w:rPr>
-          <w:instrText xml:space="preserve"> PAGEREF _Toc232620280 \h </w:instrText>
+          <w:instrText xml:space="preserve"> PAGEREF _Toc232748230 \h </w:instrText>
         </w:r>
         <w:r>
           <w:rPr>
@@ -1686,7 +1686,7 @@
           <w14:ligatures w14:val="standardContextual"/>
         </w:rPr>
       </w:pPr>
-      <w:hyperlink w:anchor="_Toc232620281" w:history="1">
+      <w:hyperlink w:anchor="_Toc232748231" w:history="1">
         <w:r>
           <w:rPr>
             <w:rStyle w:val="Lienhypertexte"/>
@@ -1714,7 +1714,7 @@
             <w:noProof/>
             <w:webHidden/>
           </w:rPr>
-          <w:instrText xml:space="preserve"> PAGEREF _Toc232620281 \h </w:instrText>
+          <w:instrText xml:space="preserve"> PAGEREF _Toc232748231 \h </w:instrText>
         </w:r>
         <w:r>
           <w:rPr>
@@ -1762,7 +1762,7 @@
           <w14:ligatures w14:val="standardContextual"/>
         </w:rPr>
       </w:pPr>
-      <w:hyperlink w:anchor="_Toc232620282" w:history="1">
+      <w:hyperlink w:anchor="_Toc232748232" w:history="1">
         <w:r>
           <w:rPr>
             <w:rStyle w:val="Lienhypertexte"/>
@@ -1790,7 +1790,7 @@
             <w:noProof/>
             <w:webHidden/>
           </w:rPr>
-          <w:instrText xml:space="preserve"> PAGEREF _Toc232620282 \h </w:instrText>
+          <w:instrText xml:space="preserve"> PAGEREF _Toc232748232 \h </w:instrText>
         </w:r>
         <w:r>
           <w:rPr>
@@ -1838,7 +1838,7 @@
           <w14:ligatures w14:val="standardContextual"/>
         </w:rPr>
       </w:pPr>
-      <w:hyperlink w:anchor="_Toc232620283" w:history="1">
+      <w:hyperlink w:anchor="_Toc232748233" w:history="1">
         <w:r>
           <w:rPr>
             <w:rStyle w:val="Lienhypertexte"/>
@@ -1866,7 +1866,7 @@
             <w:noProof/>
             <w:webHidden/>
           </w:rPr>
-          <w:instrText xml:space="preserve"> PAGEREF _Toc232620283 \h </w:instrText>
+          <w:instrText xml:space="preserve"> PAGEREF _Toc232748233 \h </w:instrText>
         </w:r>
         <w:r>
           <w:rPr>
@@ -1914,7 +1914,7 @@
           <w14:ligatures w14:val="standardContextual"/>
         </w:rPr>
       </w:pPr>
-      <w:hyperlink w:anchor="_Toc232620284" w:history="1">
+      <w:hyperlink w:anchor="_Toc232748234" w:history="1">
         <w:r>
           <w:rPr>
             <w:rStyle w:val="Lienhypertexte"/>
@@ -1942,7 +1942,7 @@
             <w:noProof/>
             <w:webHidden/>
           </w:rPr>
-          <w:instrText xml:space="preserve"> PAGEREF _Toc232620284 \h </w:instrText>
+          <w:instrText xml:space="preserve"> PAGEREF _Toc232748234 \h </w:instrText>
         </w:r>
         <w:r>
           <w:rPr>
@@ -1990,7 +1990,7 @@
           <w14:ligatures w14:val="standardContextual"/>
         </w:rPr>
       </w:pPr>
-      <w:hyperlink w:anchor="_Toc232620285" w:history="1">
+      <w:hyperlink w:anchor="_Toc232748235" w:history="1">
         <w:r>
           <w:rPr>
             <w:rStyle w:val="Lienhypertexte"/>
@@ -2017,7 +2017,7 @@
             <w:noProof/>
             <w:webHidden/>
           </w:rPr>
-          <w:instrText xml:space="preserve"> PAGEREF _Toc232620285 \h </w:instrText>
+          <w:instrText xml:space="preserve"> PAGEREF _Toc232748235 \h </w:instrText>
         </w:r>
         <w:r>
           <w:rPr>
@@ -2065,7 +2065,7 @@
           <w14:ligatures w14:val="standardContextual"/>
         </w:rPr>
       </w:pPr>
-      <w:hyperlink w:anchor="_Toc232620286" w:history="1">
+      <w:hyperlink w:anchor="_Toc232748236" w:history="1">
         <w:r>
           <w:rPr>
             <w:rStyle w:val="Lienhypertexte"/>
@@ -2092,7 +2092,7 @@
             <w:noProof/>
             <w:webHidden/>
           </w:rPr>
-          <w:instrText xml:space="preserve"> PAGEREF _Toc232620286 \h </w:instrText>
+          <w:instrText xml:space="preserve"> PAGEREF _Toc232748236 \h </w:instrText>
         </w:r>
         <w:r>
           <w:rPr>
@@ -2140,7 +2140,7 @@
           <w14:ligatures w14:val="standardContextual"/>
         </w:rPr>
       </w:pPr>
-      <w:hyperlink w:anchor="_Toc232620287" w:history="1">
+      <w:hyperlink w:anchor="_Toc232748237" w:history="1">
         <w:r>
           <w:rPr>
             <w:rStyle w:val="Lienhypertexte"/>
@@ -2168,7 +2168,7 @@
             <w:noProof/>
             <w:webHidden/>
           </w:rPr>
-          <w:instrText xml:space="preserve"> PAGEREF _Toc232620287 \h </w:instrText>
+          <w:instrText xml:space="preserve"> PAGEREF _Toc232748237 \h </w:instrText>
         </w:r>
         <w:r>
           <w:rPr>
@@ -2216,7 +2216,7 @@
           <w14:ligatures w14:val="standardContextual"/>
         </w:rPr>
       </w:pPr>
-      <w:hyperlink w:anchor="_Toc232620288" w:history="1">
+      <w:hyperlink w:anchor="_Toc232748238" w:history="1">
         <w:r>
           <w:rPr>
             <w:rStyle w:val="Lienhypertexte"/>
@@ -2244,7 +2244,7 @@
             <w:noProof/>
             <w:webHidden/>
           </w:rPr>
-          <w:instrText xml:space="preserve"> PAGEREF _Toc232620288 \h </w:instrText>
+          <w:instrText xml:space="preserve"> PAGEREF _Toc232748238 \h </w:instrText>
         </w:r>
         <w:r>
           <w:rPr>
@@ -2292,7 +2292,7 @@
           <w14:ligatures w14:val="standardContextual"/>
         </w:rPr>
       </w:pPr>
-      <w:hyperlink w:anchor="_Toc232620289" w:history="1">
+      <w:hyperlink w:anchor="_Toc232748239" w:history="1">
         <w:r>
           <w:rPr>
             <w:rStyle w:val="Lienhypertexte"/>
@@ -2320,7 +2320,7 @@
             <w:noProof/>
             <w:webHidden/>
           </w:rPr>
-          <w:instrText xml:space="preserve"> PAGEREF _Toc232620289 \h </w:instrText>
+          <w:instrText xml:space="preserve"> PAGEREF _Toc232748239 \h </w:instrText>
         </w:r>
         <w:r>
           <w:rPr>
@@ -2368,7 +2368,7 @@
           <w14:ligatures w14:val="standardContextual"/>
         </w:rPr>
       </w:pPr>
-      <w:hyperlink w:anchor="_Toc232620290" w:history="1">
+      <w:hyperlink w:anchor="_Toc232748240" w:history="1">
         <w:r>
           <w:rPr>
             <w:rStyle w:val="Lienhypertexte"/>
@@ -2396,7 +2396,7 @@
             <w:noProof/>
             <w:webHidden/>
           </w:rPr>
-          <w:instrText xml:space="preserve"> PAGEREF _Toc232620290 \h </w:instrText>
+          <w:instrText xml:space="preserve"> PAGEREF _Toc232748240 \h </w:instrText>
         </w:r>
         <w:r>
           <w:rPr>
@@ -2444,7 +2444,7 @@
           <w14:ligatures w14:val="standardContextual"/>
         </w:rPr>
       </w:pPr>
-      <w:hyperlink w:anchor="_Toc232620291" w:history="1">
+      <w:hyperlink w:anchor="_Toc232748241" w:history="1">
         <w:r>
           <w:rPr>
             <w:rStyle w:val="Lienhypertexte"/>
@@ -2471,7 +2471,7 @@
             <w:noProof/>
             <w:webHidden/>
           </w:rPr>
-          <w:instrText xml:space="preserve"> PAGEREF _Toc232620291 \h </w:instrText>
+          <w:instrText xml:space="preserve"> PAGEREF _Toc232748241 \h </w:instrText>
         </w:r>
         <w:r>
           <w:rPr>
@@ -2519,7 +2519,7 @@
           <w14:ligatures w14:val="standardContextual"/>
         </w:rPr>
       </w:pPr>
-      <w:hyperlink w:anchor="_Toc232620292" w:history="1">
+      <w:hyperlink w:anchor="_Toc232748242" w:history="1">
         <w:r>
           <w:rPr>
             <w:rStyle w:val="Lienhypertexte"/>
@@ -2546,7 +2546,7 @@
             <w:noProof/>
             <w:webHidden/>
           </w:rPr>
-          <w:instrText xml:space="preserve"> PAGEREF _Toc232620292 \h </w:instrText>
+          <w:instrText xml:space="preserve"> PAGEREF _Toc232748242 \h </w:instrText>
         </w:r>
         <w:r>
           <w:rPr>
@@ -2594,7 +2594,7 @@
           <w14:ligatures w14:val="standardContextual"/>
         </w:rPr>
       </w:pPr>
-      <w:hyperlink w:anchor="_Toc232620293" w:history="1">
+      <w:hyperlink w:anchor="_Toc232748243" w:history="1">
         <w:r>
           <w:rPr>
             <w:rStyle w:val="Lienhypertexte"/>
@@ -2621,7 +2621,7 @@
             <w:noProof/>
             <w:webHidden/>
           </w:rPr>
-          <w:instrText xml:space="preserve"> PAGEREF _Toc232620293 \h </w:instrText>
+          <w:instrText xml:space="preserve"> PAGEREF _Toc232748243 \h </w:instrText>
         </w:r>
         <w:r>
           <w:rPr>
@@ -2669,7 +2669,7 @@
           <w14:ligatures w14:val="standardContextual"/>
         </w:rPr>
       </w:pPr>
-      <w:hyperlink w:anchor="_Toc232620294" w:history="1">
+      <w:hyperlink w:anchor="_Toc232748244" w:history="1">
         <w:r>
           <w:rPr>
             <w:rStyle w:val="Lienhypertexte"/>
@@ -2696,7 +2696,7 @@
             <w:noProof/>
             <w:webHidden/>
           </w:rPr>
-          <w:instrText xml:space="preserve"> PAGEREF _Toc232620294 \h </w:instrText>
+          <w:instrText xml:space="preserve"> PAGEREF _Toc232748244 \h </w:instrText>
         </w:r>
         <w:r>
           <w:rPr>
@@ -2744,7 +2744,7 @@
           <w14:ligatures w14:val="standardContextual"/>
         </w:rPr>
       </w:pPr>
-      <w:hyperlink w:anchor="_Toc232620295" w:history="1">
+      <w:hyperlink w:anchor="_Toc232748245" w:history="1">
         <w:r>
           <w:rPr>
             <w:rStyle w:val="Lienhypertexte"/>
@@ -2771,7 +2771,7 @@
             <w:noProof/>
             <w:webHidden/>
           </w:rPr>
-          <w:instrText xml:space="preserve"> PAGEREF _Toc232620295 \h </w:instrText>
+          <w:instrText xml:space="preserve"> PAGEREF _Toc232748245 \h </w:instrText>
         </w:r>
         <w:r>
           <w:rPr>
@@ -2819,7 +2819,7 @@
           <w14:ligatures w14:val="standardContextual"/>
         </w:rPr>
       </w:pPr>
-      <w:hyperlink w:anchor="_Toc232620296" w:history="1">
+      <w:hyperlink w:anchor="_Toc232748246" w:history="1">
         <w:r>
           <w:rPr>
             <w:rStyle w:val="Lienhypertexte"/>
@@ -2847,7 +2847,7 @@
             <w:noProof/>
             <w:webHidden/>
           </w:rPr>
-          <w:instrText xml:space="preserve"> PAGEREF _Toc232620296 \h </w:instrText>
+          <w:instrText xml:space="preserve"> PAGEREF _Toc232748246 \h </w:instrText>
         </w:r>
         <w:r>
           <w:rPr>
@@ -2895,7 +2895,7 @@
           <w14:ligatures w14:val="standardContextual"/>
         </w:rPr>
       </w:pPr>
-      <w:hyperlink w:anchor="_Toc232620297" w:history="1">
+      <w:hyperlink w:anchor="_Toc232748247" w:history="1">
         <w:r>
           <w:rPr>
             <w:rStyle w:val="Lienhypertexte"/>
@@ -2923,7 +2923,7 @@
             <w:noProof/>
             <w:webHidden/>
           </w:rPr>
-          <w:instrText xml:space="preserve"> PAGEREF _Toc232620297 \h </w:instrText>
+          <w:instrText xml:space="preserve"> PAGEREF _Toc232748247 \h </w:instrText>
         </w:r>
         <w:r>
           <w:rPr>
@@ -2971,7 +2971,7 @@
           <w14:ligatures w14:val="standardContextual"/>
         </w:rPr>
       </w:pPr>
-      <w:hyperlink w:anchor="_Toc232620298" w:history="1">
+      <w:hyperlink w:anchor="_Toc232748248" w:history="1">
         <w:r>
           <w:rPr>
             <w:rStyle w:val="Lienhypertexte"/>
@@ -2999,7 +2999,7 @@
             <w:noProof/>
             <w:webHidden/>
           </w:rPr>
-          <w:instrText xml:space="preserve"> PAGEREF _Toc232620298 \h </w:instrText>
+          <w:instrText xml:space="preserve"> PAGEREF _Toc232748248 \h </w:instrText>
         </w:r>
         <w:r>
           <w:rPr>
@@ -3047,7 +3047,7 @@
           <w14:ligatures w14:val="standardContextual"/>
         </w:rPr>
       </w:pPr>
-      <w:hyperlink w:anchor="_Toc232620299" w:history="1">
+      <w:hyperlink w:anchor="_Toc232748249" w:history="1">
         <w:r>
           <w:rPr>
             <w:rStyle w:val="Lienhypertexte"/>
@@ -3075,7 +3075,7 @@
             <w:noProof/>
             <w:webHidden/>
           </w:rPr>
-          <w:instrText xml:space="preserve"> PAGEREF _Toc232620299 \h </w:instrText>
+          <w:instrText xml:space="preserve"> PAGEREF _Toc232748249 \h </w:instrText>
         </w:r>
         <w:r>
           <w:rPr>
@@ -3123,7 +3123,7 @@
           <w14:ligatures w14:val="standardContextual"/>
         </w:rPr>
       </w:pPr>
-      <w:hyperlink w:anchor="_Toc232620300" w:history="1">
+      <w:hyperlink w:anchor="_Toc232748250" w:history="1">
         <w:r>
           <w:rPr>
             <w:rStyle w:val="Lienhypertexte"/>
@@ -3150,7 +3150,7 @@
             <w:noProof/>
             <w:webHidden/>
           </w:rPr>
-          <w:instrText xml:space="preserve"> PAGEREF _Toc232620300 \h </w:instrText>
+          <w:instrText xml:space="preserve"> PAGEREF _Toc232748250 \h </w:instrText>
         </w:r>
         <w:r>
           <w:rPr>
@@ -3198,7 +3198,7 @@
           <w14:ligatures w14:val="standardContextual"/>
         </w:rPr>
       </w:pPr>
-      <w:hyperlink w:anchor="_Toc232620301" w:history="1">
+      <w:hyperlink w:anchor="_Toc232748251" w:history="1">
         <w:r>
           <w:rPr>
             <w:rStyle w:val="Lienhypertexte"/>
@@ -3226,7 +3226,7 @@
             <w:noProof/>
             <w:webHidden/>
           </w:rPr>
-          <w:instrText xml:space="preserve"> PAGEREF _Toc232620301 \h </w:instrText>
+          <w:instrText xml:space="preserve"> PAGEREF _Toc232748251 \h </w:instrText>
         </w:r>
         <w:r>
           <w:rPr>
@@ -3274,7 +3274,7 @@
           <w14:ligatures w14:val="standardContextual"/>
         </w:rPr>
       </w:pPr>
-      <w:hyperlink w:anchor="_Toc232620302" w:history="1">
+      <w:hyperlink w:anchor="_Toc232748252" w:history="1">
         <w:r>
           <w:rPr>
             <w:rStyle w:val="Lienhypertexte"/>
@@ -3302,7 +3302,7 @@
             <w:noProof/>
             <w:webHidden/>
           </w:rPr>
-          <w:instrText xml:space="preserve"> PAGEREF _Toc232620302 \h </w:instrText>
+          <w:instrText xml:space="preserve"> PAGEREF _Toc232748252 \h </w:instrText>
         </w:r>
         <w:r>
           <w:rPr>
@@ -3350,7 +3350,7 @@
           <w14:ligatures w14:val="standardContextual"/>
         </w:rPr>
       </w:pPr>
-      <w:hyperlink w:anchor="_Toc232620303" w:history="1">
+      <w:hyperlink w:anchor="_Toc232748253" w:history="1">
         <w:r>
           <w:rPr>
             <w:rStyle w:val="Lienhypertexte"/>
@@ -3378,7 +3378,7 @@
             <w:noProof/>
             <w:webHidden/>
           </w:rPr>
-          <w:instrText xml:space="preserve"> PAGEREF _Toc232620303 \h </w:instrText>
+          <w:instrText xml:space="preserve"> PAGEREF _Toc232748253 \h </w:instrText>
         </w:r>
         <w:r>
           <w:rPr>
@@ -3426,7 +3426,7 @@
           <w14:ligatures w14:val="standardContextual"/>
         </w:rPr>
       </w:pPr>
-      <w:hyperlink w:anchor="_Toc232620304" w:history="1">
+      <w:hyperlink w:anchor="_Toc232748254" w:history="1">
         <w:r>
           <w:rPr>
             <w:rStyle w:val="Lienhypertexte"/>
@@ -3454,7 +3454,7 @@
             <w:noProof/>
             <w:webHidden/>
           </w:rPr>
-          <w:instrText xml:space="preserve"> PAGEREF _Toc232620304 \h </w:instrText>
+          <w:instrText xml:space="preserve"> PAGEREF _Toc232748254 \h </w:instrText>
         </w:r>
         <w:r>
           <w:rPr>
@@ -3502,7 +3502,7 @@
           <w14:ligatures w14:val="standardContextual"/>
         </w:rPr>
       </w:pPr>
-      <w:hyperlink w:anchor="_Toc232620305" w:history="1">
+      <w:hyperlink w:anchor="_Toc232748255" w:history="1">
         <w:r>
           <w:rPr>
             <w:rStyle w:val="Lienhypertexte"/>
@@ -3530,7 +3530,7 @@
             <w:noProof/>
             <w:webHidden/>
           </w:rPr>
-          <w:instrText xml:space="preserve"> PAGEREF _Toc232620305 \h </w:instrText>
+          <w:instrText xml:space="preserve"> PAGEREF _Toc232748255 \h </w:instrText>
         </w:r>
         <w:r>
           <w:rPr>
@@ -3578,7 +3578,7 @@
           <w14:ligatures w14:val="standardContextual"/>
         </w:rPr>
       </w:pPr>
-      <w:hyperlink w:anchor="_Toc232620306" w:history="1">
+      <w:hyperlink w:anchor="_Toc232748256" w:history="1">
         <w:r>
           <w:rPr>
             <w:rStyle w:val="Lienhypertexte"/>
@@ -3606,7 +3606,7 @@
             <w:noProof/>
             <w:webHidden/>
           </w:rPr>
-          <w:instrText xml:space="preserve"> PAGEREF _Toc232620306 \h </w:instrText>
+          <w:instrText xml:space="preserve"> PAGEREF _Toc232748256 \h </w:instrText>
         </w:r>
         <w:r>
           <w:rPr>
@@ -3654,7 +3654,7 @@
           <w14:ligatures w14:val="standardContextual"/>
         </w:rPr>
       </w:pPr>
-      <w:hyperlink w:anchor="_Toc232620307" w:history="1">
+      <w:hyperlink w:anchor="_Toc232748257" w:history="1">
         <w:r>
           <w:rPr>
             <w:rStyle w:val="Lienhypertexte"/>
@@ -3682,7 +3682,7 @@
             <w:noProof/>
             <w:webHidden/>
           </w:rPr>
-          <w:instrText xml:space="preserve"> PAGEREF _Toc232620307 \h </w:instrText>
+          <w:instrText xml:space="preserve"> PAGEREF _Toc232748257 \h </w:instrText>
         </w:r>
         <w:r>
           <w:rPr>
@@ -3730,7 +3730,7 @@
           <w14:ligatures w14:val="standardContextual"/>
         </w:rPr>
       </w:pPr>
-      <w:hyperlink w:anchor="_Toc232620308" w:history="1">
+      <w:hyperlink w:anchor="_Toc232748258" w:history="1">
         <w:r>
           <w:rPr>
             <w:rStyle w:val="Lienhypertexte"/>
@@ -3758,7 +3758,7 @@
             <w:noProof/>
             <w:webHidden/>
           </w:rPr>
-          <w:instrText xml:space="preserve"> PAGEREF _Toc232620308 \h </w:instrText>
+          <w:instrText xml:space="preserve"> PAGEREF _Toc232748258 \h </w:instrText>
         </w:r>
         <w:r>
           <w:rPr>
@@ -3806,7 +3806,7 @@
           <w14:ligatures w14:val="standardContextual"/>
         </w:rPr>
       </w:pPr>
-      <w:hyperlink w:anchor="_Toc232620309" w:history="1">
+      <w:hyperlink w:anchor="_Toc232748259" w:history="1">
         <w:r>
           <w:rPr>
             <w:rStyle w:val="Lienhypertexte"/>
@@ -3834,7 +3834,7 @@
             <w:noProof/>
             <w:webHidden/>
           </w:rPr>
-          <w:instrText xml:space="preserve"> PAGEREF _Toc232620309 \h </w:instrText>
+          <w:instrText xml:space="preserve"> PAGEREF _Toc232748259 \h </w:instrText>
         </w:r>
         <w:r>
           <w:rPr>
@@ -3882,7 +3882,7 @@
           <w14:ligatures w14:val="standardContextual"/>
         </w:rPr>
       </w:pPr>
-      <w:hyperlink w:anchor="_Toc232620310" w:history="1">
+      <w:hyperlink w:anchor="_Toc232748260" w:history="1">
         <w:r>
           <w:rPr>
             <w:rStyle w:val="Lienhypertexte"/>
@@ -3910,7 +3910,7 @@
             <w:noProof/>
             <w:webHidden/>
           </w:rPr>
-          <w:instrText xml:space="preserve"> PAGEREF _Toc232620310 \h </w:instrText>
+          <w:instrText xml:space="preserve"> PAGEREF _Toc232748260 \h </w:instrText>
         </w:r>
         <w:r>
           <w:rPr>
@@ -3958,7 +3958,7 @@
           <w14:ligatures w14:val="standardContextual"/>
         </w:rPr>
       </w:pPr>
-      <w:hyperlink w:anchor="_Toc232620311" w:history="1">
+      <w:hyperlink w:anchor="_Toc232748261" w:history="1">
         <w:r>
           <w:rPr>
             <w:rStyle w:val="Lienhypertexte"/>
@@ -3986,7 +3986,7 @@
             <w:noProof/>
             <w:webHidden/>
           </w:rPr>
-          <w:instrText xml:space="preserve"> PAGEREF _Toc232620311 \h </w:instrText>
+          <w:instrText xml:space="preserve"> PAGEREF _Toc232748261 \h </w:instrText>
         </w:r>
         <w:r>
           <w:rPr>
@@ -4034,7 +4034,7 @@
           <w14:ligatures w14:val="standardContextual"/>
         </w:rPr>
       </w:pPr>
-      <w:hyperlink w:anchor="_Toc232620312" w:history="1">
+      <w:hyperlink w:anchor="_Toc232748262" w:history="1">
         <w:r>
           <w:rPr>
             <w:rStyle w:val="Lienhypertexte"/>
@@ -4062,7 +4062,7 @@
             <w:noProof/>
             <w:webHidden/>
           </w:rPr>
-          <w:instrText xml:space="preserve"> PAGEREF _Toc232620312 \h </w:instrText>
+          <w:instrText xml:space="preserve"> PAGEREF _Toc232748262 \h </w:instrText>
         </w:r>
         <w:r>
           <w:rPr>
@@ -4110,7 +4110,7 @@
           <w14:ligatures w14:val="standardContextual"/>
         </w:rPr>
       </w:pPr>
-      <w:hyperlink w:anchor="_Toc232620313" w:history="1">
+      <w:hyperlink w:anchor="_Toc232748263" w:history="1">
         <w:r>
           <w:rPr>
             <w:rStyle w:val="Lienhypertexte"/>
@@ -4138,7 +4138,7 @@
             <w:noProof/>
             <w:webHidden/>
           </w:rPr>
-          <w:instrText xml:space="preserve"> PAGEREF _Toc232620313 \h </w:instrText>
+          <w:instrText xml:space="preserve"> PAGEREF _Toc232748263 \h </w:instrText>
         </w:r>
         <w:r>
           <w:rPr>
@@ -4186,7 +4186,7 @@
           <w14:ligatures w14:val="standardContextual"/>
         </w:rPr>
       </w:pPr>
-      <w:hyperlink w:anchor="_Toc232620314" w:history="1">
+      <w:hyperlink w:anchor="_Toc232748264" w:history="1">
         <w:r>
           <w:rPr>
             <w:rStyle w:val="Lienhypertexte"/>
@@ -4214,7 +4214,7 @@
             <w:noProof/>
             <w:webHidden/>
           </w:rPr>
-          <w:instrText xml:space="preserve"> PAGEREF _Toc232620314 \h </w:instrText>
+          <w:instrText xml:space="preserve"> PAGEREF _Toc232748264 \h </w:instrText>
         </w:r>
         <w:r>
           <w:rPr>
@@ -4262,7 +4262,7 @@
           <w14:ligatures w14:val="standardContextual"/>
         </w:rPr>
       </w:pPr>
-      <w:hyperlink w:anchor="_Toc232620315" w:history="1">
+      <w:hyperlink w:anchor="_Toc232748265" w:history="1">
         <w:r>
           <w:rPr>
             <w:rStyle w:val="Lienhypertexte"/>
@@ -4290,7 +4290,7 @@
             <w:noProof/>
             <w:webHidden/>
           </w:rPr>
-          <w:instrText xml:space="preserve"> PAGEREF _Toc232620315 \h </w:instrText>
+          <w:instrText xml:space="preserve"> PAGEREF _Toc232748265 \h </w:instrText>
         </w:r>
         <w:r>
           <w:rPr>
@@ -4338,7 +4338,7 @@
           <w14:ligatures w14:val="standardContextual"/>
         </w:rPr>
       </w:pPr>
-      <w:hyperlink w:anchor="_Toc232620316" w:history="1">
+      <w:hyperlink w:anchor="_Toc232748266" w:history="1">
         <w:r>
           <w:rPr>
             <w:rStyle w:val="Lienhypertexte"/>
@@ -4366,7 +4366,7 @@
             <w:noProof/>
             <w:webHidden/>
           </w:rPr>
-          <w:instrText xml:space="preserve"> PAGEREF _Toc232620316 \h </w:instrText>
+          <w:instrText xml:space="preserve"> PAGEREF _Toc232748266 \h </w:instrText>
         </w:r>
         <w:r>
           <w:rPr>
@@ -4414,7 +4414,7 @@
           <w14:ligatures w14:val="standardContextual"/>
         </w:rPr>
       </w:pPr>
-      <w:hyperlink w:anchor="_Toc232620317" w:history="1">
+      <w:hyperlink w:anchor="_Toc232748267" w:history="1">
         <w:r>
           <w:rPr>
             <w:rStyle w:val="Lienhypertexte"/>
@@ -4442,7 +4442,7 @@
             <w:noProof/>
             <w:webHidden/>
           </w:rPr>
-          <w:instrText xml:space="preserve"> PAGEREF _Toc232620317 \h </w:instrText>
+          <w:instrText xml:space="preserve"> PAGEREF _Toc232748267 \h </w:instrText>
         </w:r>
         <w:r>
           <w:rPr>
@@ -4490,7 +4490,7 @@
           <w14:ligatures w14:val="standardContextual"/>
         </w:rPr>
       </w:pPr>
-      <w:hyperlink w:anchor="_Toc232620318" w:history="1">
+      <w:hyperlink w:anchor="_Toc232748268" w:history="1">
         <w:r>
           <w:rPr>
             <w:rStyle w:val="Lienhypertexte"/>
@@ -4518,7 +4518,7 @@
             <w:noProof/>
             <w:webHidden/>
           </w:rPr>
-          <w:instrText xml:space="preserve"> PAGEREF _Toc232620318 \h </w:instrText>
+          <w:instrText xml:space="preserve"> PAGEREF _Toc232748268 \h </w:instrText>
         </w:r>
         <w:r>
           <w:rPr>
@@ -4566,7 +4566,7 @@
           <w14:ligatures w14:val="standardContextual"/>
         </w:rPr>
       </w:pPr>
-      <w:hyperlink w:anchor="_Toc232620319" w:history="1">
+      <w:hyperlink w:anchor="_Toc232748269" w:history="1">
         <w:r>
           <w:rPr>
             <w:rStyle w:val="Lienhypertexte"/>
@@ -4594,7 +4594,7 @@
             <w:noProof/>
             <w:webHidden/>
           </w:rPr>
-          <w:instrText xml:space="preserve"> PAGEREF _Toc232620319 \h </w:instrText>
+          <w:instrText xml:space="preserve"> PAGEREF _Toc232748269 \h </w:instrText>
         </w:r>
         <w:r>
           <w:rPr>
@@ -4642,7 +4642,7 @@
           <w14:ligatures w14:val="standardContextual"/>
         </w:rPr>
       </w:pPr>
-      <w:hyperlink w:anchor="_Toc232620320" w:history="1">
+      <w:hyperlink w:anchor="_Toc232748270" w:history="1">
         <w:r>
           <w:rPr>
             <w:rStyle w:val="Lienhypertexte"/>
@@ -4670,7 +4670,7 @@
             <w:noProof/>
             <w:webHidden/>
           </w:rPr>
-          <w:instrText xml:space="preserve"> PAGEREF _Toc232620320 \h </w:instrText>
+          <w:instrText xml:space="preserve"> PAGEREF _Toc232748270 \h </w:instrText>
         </w:r>
         <w:r>
           <w:rPr>
@@ -4718,7 +4718,7 @@
           <w14:ligatures w14:val="standardContextual"/>
         </w:rPr>
       </w:pPr>
-      <w:hyperlink w:anchor="_Toc232620321" w:history="1">
+      <w:hyperlink w:anchor="_Toc232748271" w:history="1">
         <w:r>
           <w:rPr>
             <w:rStyle w:val="Lienhypertexte"/>
@@ -4746,7 +4746,7 @@
             <w:noProof/>
             <w:webHidden/>
           </w:rPr>
-          <w:instrText xml:space="preserve"> PAGEREF _Toc232620321 \h </w:instrText>
+          <w:instrText xml:space="preserve"> PAGEREF _Toc232748271 \h </w:instrText>
         </w:r>
         <w:r>
           <w:rPr>
@@ -4794,7 +4794,7 @@
           <w14:ligatures w14:val="standardContextual"/>
         </w:rPr>
       </w:pPr>
-      <w:hyperlink w:anchor="_Toc232620322" w:history="1">
+      <w:hyperlink w:anchor="_Toc232748272" w:history="1">
         <w:r>
           <w:rPr>
             <w:rStyle w:val="Lienhypertexte"/>
@@ -4822,7 +4822,7 @@
             <w:noProof/>
             <w:webHidden/>
           </w:rPr>
-          <w:instrText xml:space="preserve"> PAGEREF _Toc232620322 \h </w:instrText>
+          <w:instrText xml:space="preserve"> PAGEREF _Toc232748272 \h </w:instrText>
         </w:r>
         <w:r>
           <w:rPr>
@@ -4870,7 +4870,7 @@
           <w14:ligatures w14:val="standardContextual"/>
         </w:rPr>
       </w:pPr>
-      <w:hyperlink w:anchor="_Toc232620323" w:history="1">
+      <w:hyperlink w:anchor="_Toc232748273" w:history="1">
         <w:r>
           <w:rPr>
             <w:rStyle w:val="Lienhypertexte"/>
@@ -4898,7 +4898,7 @@
             <w:noProof/>
             <w:webHidden/>
           </w:rPr>
-          <w:instrText xml:space="preserve"> PAGEREF _Toc232620323 \h </w:instrText>
+          <w:instrText xml:space="preserve"> PAGEREF _Toc232748273 \h </w:instrText>
         </w:r>
         <w:r>
           <w:rPr>
@@ -4946,7 +4946,7 @@
           <w14:ligatures w14:val="standardContextual"/>
         </w:rPr>
       </w:pPr>
-      <w:hyperlink w:anchor="_Toc232620324" w:history="1">
+      <w:hyperlink w:anchor="_Toc232748274" w:history="1">
         <w:r>
           <w:rPr>
             <w:rStyle w:val="Lienhypertexte"/>
@@ -4974,7 +4974,7 @@
             <w:noProof/>
             <w:webHidden/>
           </w:rPr>
-          <w:instrText xml:space="preserve"> PAGEREF _Toc232620324 \h </w:instrText>
+          <w:instrText xml:space="preserve"> PAGEREF _Toc232748274 \h </w:instrText>
         </w:r>
         <w:r>
           <w:rPr>
@@ -5022,7 +5022,7 @@
           <w14:ligatures w14:val="standardContextual"/>
         </w:rPr>
       </w:pPr>
-      <w:hyperlink w:anchor="_Toc232620325" w:history="1">
+      <w:hyperlink w:anchor="_Toc232748275" w:history="1">
         <w:r>
           <w:rPr>
             <w:rStyle w:val="Lienhypertexte"/>
@@ -5050,7 +5050,7 @@
             <w:noProof/>
             <w:webHidden/>
           </w:rPr>
-          <w:instrText xml:space="preserve"> PAGEREF _Toc232620325 \h </w:instrText>
+          <w:instrText xml:space="preserve"> PAGEREF _Toc232748275 \h </w:instrText>
         </w:r>
         <w:r>
           <w:rPr>
@@ -5098,7 +5098,7 @@
           <w14:ligatures w14:val="standardContextual"/>
         </w:rPr>
       </w:pPr>
-      <w:hyperlink w:anchor="_Toc232620326" w:history="1">
+      <w:hyperlink w:anchor="_Toc232748276" w:history="1">
         <w:r>
           <w:rPr>
             <w:rStyle w:val="Lienhypertexte"/>
@@ -5126,7 +5126,7 @@
             <w:noProof/>
             <w:webHidden/>
           </w:rPr>
-          <w:instrText xml:space="preserve"> PAGEREF _Toc232620326 \h </w:instrText>
+          <w:instrText xml:space="preserve"> PAGEREF _Toc232748276 \h </w:instrText>
         </w:r>
         <w:r>
           <w:rPr>
@@ -5174,7 +5174,7 @@
           <w14:ligatures w14:val="standardContextual"/>
         </w:rPr>
       </w:pPr>
-      <w:hyperlink w:anchor="_Toc232620327" w:history="1">
+      <w:hyperlink w:anchor="_Toc232748277" w:history="1">
         <w:r>
           <w:rPr>
             <w:rStyle w:val="Lienhypertexte"/>
@@ -5202,7 +5202,7 @@
             <w:noProof/>
             <w:webHidden/>
           </w:rPr>
-          <w:instrText xml:space="preserve"> PAGEREF _Toc232620327 \h </w:instrText>
+          <w:instrText xml:space="preserve"> PAGEREF _Toc232748277 \h </w:instrText>
         </w:r>
         <w:r>
           <w:rPr>
@@ -5250,7 +5250,7 @@
           <w14:ligatures w14:val="standardContextual"/>
         </w:rPr>
       </w:pPr>
-      <w:hyperlink w:anchor="_Toc232620328" w:history="1">
+      <w:hyperlink w:anchor="_Toc232748278" w:history="1">
         <w:r>
           <w:rPr>
             <w:rStyle w:val="Lienhypertexte"/>
@@ -5278,7 +5278,7 @@
             <w:noProof/>
             <w:webHidden/>
           </w:rPr>
-          <w:instrText xml:space="preserve"> PAGEREF _Toc232620328 \h </w:instrText>
+          <w:instrText xml:space="preserve"> PAGEREF _Toc232748278 \h </w:instrText>
         </w:r>
         <w:r>
           <w:rPr>
@@ -5326,7 +5326,7 @@
           <w14:ligatures w14:val="standardContextual"/>
         </w:rPr>
       </w:pPr>
-      <w:hyperlink w:anchor="_Toc232620329" w:history="1">
+      <w:hyperlink w:anchor="_Toc232748279" w:history="1">
         <w:r>
           <w:rPr>
             <w:rStyle w:val="Lienhypertexte"/>
@@ -5353,7 +5353,7 @@
             <w:noProof/>
             <w:webHidden/>
           </w:rPr>
-          <w:instrText xml:space="preserve"> PAGEREF _Toc232620329 \h </w:instrText>
+          <w:instrText xml:space="preserve"> PAGEREF _Toc232748279 \h </w:instrText>
         </w:r>
         <w:r>
           <w:rPr>
@@ -5401,7 +5401,7 @@
           <w14:ligatures w14:val="standardContextual"/>
         </w:rPr>
       </w:pPr>
-      <w:hyperlink w:anchor="_Toc232620330" w:history="1">
+      <w:hyperlink w:anchor="_Toc232748280" w:history="1">
         <w:r>
           <w:rPr>
             <w:rStyle w:val="Lienhypertexte"/>
@@ -5429,7 +5429,7 @@
             <w:noProof/>
             <w:webHidden/>
           </w:rPr>
-          <w:instrText xml:space="preserve"> PAGEREF _Toc232620330 \h </w:instrText>
+          <w:instrText xml:space="preserve"> PAGEREF _Toc232748280 \h </w:instrText>
         </w:r>
         <w:r>
           <w:rPr>
@@ -5477,7 +5477,7 @@
           <w14:ligatures w14:val="standardContextual"/>
         </w:rPr>
       </w:pPr>
-      <w:hyperlink w:anchor="_Toc232620331" w:history="1">
+      <w:hyperlink w:anchor="_Toc232748281" w:history="1">
         <w:r>
           <w:rPr>
             <w:rStyle w:val="Lienhypertexte"/>
@@ -5505,7 +5505,7 @@
             <w:noProof/>
             <w:webHidden/>
           </w:rPr>
-          <w:instrText xml:space="preserve"> PAGEREF _Toc232620331 \h </w:instrText>
+          <w:instrText xml:space="preserve"> PAGEREF _Toc232748281 \h </w:instrText>
         </w:r>
         <w:r>
           <w:rPr>
@@ -5553,7 +5553,7 @@
           <w14:ligatures w14:val="standardContextual"/>
         </w:rPr>
       </w:pPr>
-      <w:hyperlink w:anchor="_Toc232620332" w:history="1">
+      <w:hyperlink w:anchor="_Toc232748282" w:history="1">
         <w:r>
           <w:rPr>
             <w:rStyle w:val="Lienhypertexte"/>
@@ -5581,7 +5581,7 @@
             <w:noProof/>
             <w:webHidden/>
           </w:rPr>
-          <w:instrText xml:space="preserve"> PAGEREF _Toc232620332 \h </w:instrText>
+          <w:instrText xml:space="preserve"> PAGEREF _Toc232748282 \h </w:instrText>
         </w:r>
         <w:r>
           <w:rPr>
@@ -5629,7 +5629,7 @@
           <w14:ligatures w14:val="standardContextual"/>
         </w:rPr>
       </w:pPr>
-      <w:hyperlink w:anchor="_Toc232620333" w:history="1">
+      <w:hyperlink w:anchor="_Toc232748283" w:history="1">
         <w:r>
           <w:rPr>
             <w:rStyle w:val="Lienhypertexte"/>
@@ -5656,7 +5656,7 @@
             <w:noProof/>
             <w:webHidden/>
           </w:rPr>
-          <w:instrText xml:space="preserve"> PAGEREF _Toc232620333 \h </w:instrText>
+          <w:instrText xml:space="preserve"> PAGEREF _Toc232748283 \h </w:instrText>
         </w:r>
         <w:r>
           <w:rPr>
@@ -5704,7 +5704,7 @@
           <w14:ligatures w14:val="standardContextual"/>
         </w:rPr>
       </w:pPr>
-      <w:hyperlink w:anchor="_Toc232620334" w:history="1">
+      <w:hyperlink w:anchor="_Toc232748284" w:history="1">
         <w:r>
           <w:rPr>
             <w:rStyle w:val="Lienhypertexte"/>
@@ -5732,7 +5732,7 @@
             <w:noProof/>
             <w:webHidden/>
           </w:rPr>
-          <w:instrText xml:space="preserve"> PAGEREF _Toc232620334 \h </w:instrText>
+          <w:instrText xml:space="preserve"> PAGEREF _Toc232748284 \h </w:instrText>
         </w:r>
         <w:r>
           <w:rPr>
@@ -5780,7 +5780,7 @@
           <w14:ligatures w14:val="standardContextual"/>
         </w:rPr>
       </w:pPr>
-      <w:hyperlink w:anchor="_Toc232620335" w:history="1">
+      <w:hyperlink w:anchor="_Toc232748285" w:history="1">
         <w:r>
           <w:rPr>
             <w:rStyle w:val="Lienhypertexte"/>
@@ -5807,7 +5807,7 @@
             <w:noProof/>
             <w:webHidden/>
           </w:rPr>
-          <w:instrText xml:space="preserve"> PAGEREF _Toc232620335 \h </w:instrText>
+          <w:instrText xml:space="preserve"> PAGEREF _Toc232748285 \h </w:instrText>
         </w:r>
         <w:r>
           <w:rPr>
@@ -5855,7 +5855,7 @@
           <w14:ligatures w14:val="standardContextual"/>
         </w:rPr>
       </w:pPr>
-      <w:hyperlink w:anchor="_Toc232620336" w:history="1">
+      <w:hyperlink w:anchor="_Toc232748286" w:history="1">
         <w:r>
           <w:rPr>
             <w:rStyle w:val="Lienhypertexte"/>
@@ -5882,7 +5882,7 @@
             <w:noProof/>
             <w:webHidden/>
           </w:rPr>
-          <w:instrText xml:space="preserve"> PAGEREF _Toc232620336 \h </w:instrText>
+          <w:instrText xml:space="preserve"> PAGEREF _Toc232748286 \h </w:instrText>
         </w:r>
         <w:r>
           <w:rPr>
@@ -5930,7 +5930,7 @@
           <w14:ligatures w14:val="standardContextual"/>
         </w:rPr>
       </w:pPr>
-      <w:hyperlink w:anchor="_Toc232620337" w:history="1">
+      <w:hyperlink w:anchor="_Toc232748287" w:history="1">
         <w:r>
           <w:rPr>
             <w:rStyle w:val="Lienhypertexte"/>
@@ -5957,7 +5957,7 @@
             <w:noProof/>
             <w:webHidden/>
           </w:rPr>
-          <w:instrText xml:space="preserve"> PAGEREF _Toc232620337 \h </w:instrText>
+          <w:instrText xml:space="preserve"> PAGEREF _Toc232748287 \h </w:instrText>
         </w:r>
         <w:r>
           <w:rPr>
@@ -6005,7 +6005,7 @@
           <w14:ligatures w14:val="standardContextual"/>
         </w:rPr>
       </w:pPr>
-      <w:hyperlink w:anchor="_Toc232620338" w:history="1">
+      <w:hyperlink w:anchor="_Toc232748288" w:history="1">
         <w:r>
           <w:rPr>
             <w:rStyle w:val="Lienhypertexte"/>
@@ -6033,7 +6033,7 @@
             <w:noProof/>
             <w:webHidden/>
           </w:rPr>
-          <w:instrText xml:space="preserve"> PAGEREF _Toc232620338 \h </w:instrText>
+          <w:instrText xml:space="preserve"> PAGEREF _Toc232748288 \h </w:instrText>
         </w:r>
         <w:r>
           <w:rPr>
@@ -6081,7 +6081,7 @@
           <w14:ligatures w14:val="standardContextual"/>
         </w:rPr>
       </w:pPr>
-      <w:hyperlink w:anchor="_Toc232620339" w:history="1">
+      <w:hyperlink w:anchor="_Toc232748289" w:history="1">
         <w:r>
           <w:rPr>
             <w:rStyle w:val="Lienhypertexte"/>
@@ -6109,7 +6109,7 @@
             <w:noProof/>
             <w:webHidden/>
           </w:rPr>
-          <w:instrText xml:space="preserve"> PAGEREF _Toc232620339 \h </w:instrText>
+          <w:instrText xml:space="preserve"> PAGEREF _Toc232748289 \h </w:instrText>
         </w:r>
         <w:r>
           <w:rPr>
@@ -6157,7 +6157,7 @@
           <w14:ligatures w14:val="standardContextual"/>
         </w:rPr>
       </w:pPr>
-      <w:hyperlink w:anchor="_Toc232620340" w:history="1">
+      <w:hyperlink w:anchor="_Toc232748290" w:history="1">
         <w:r>
           <w:rPr>
             <w:rStyle w:val="Lienhypertexte"/>
@@ -6185,7 +6185,7 @@
             <w:noProof/>
             <w:webHidden/>
           </w:rPr>
-          <w:instrText xml:space="preserve"> PAGEREF _Toc232620340 \h </w:instrText>
+          <w:instrText xml:space="preserve"> PAGEREF _Toc232748290 \h </w:instrText>
         </w:r>
         <w:r>
           <w:rPr>
@@ -6233,7 +6233,7 @@
           <w14:ligatures w14:val="standardContextual"/>
         </w:rPr>
       </w:pPr>
-      <w:hyperlink w:anchor="_Toc232620341" w:history="1">
+      <w:hyperlink w:anchor="_Toc232748291" w:history="1">
         <w:r>
           <w:rPr>
             <w:rStyle w:val="Lienhypertexte"/>
@@ -6261,7 +6261,7 @@
             <w:noProof/>
             <w:webHidden/>
           </w:rPr>
-          <w:instrText xml:space="preserve"> PAGEREF _Toc232620341 \h </w:instrText>
+          <w:instrText xml:space="preserve"> PAGEREF _Toc232748291 \h </w:instrText>
         </w:r>
         <w:r>
           <w:rPr>
@@ -6309,7 +6309,7 @@
           <w14:ligatures w14:val="standardContextual"/>
         </w:rPr>
       </w:pPr>
-      <w:hyperlink w:anchor="_Toc232620342" w:history="1">
+      <w:hyperlink w:anchor="_Toc232748292" w:history="1">
         <w:r>
           <w:rPr>
             <w:rStyle w:val="Lienhypertexte"/>
@@ -6337,7 +6337,7 @@
             <w:noProof/>
             <w:webHidden/>
           </w:rPr>
-          <w:instrText xml:space="preserve"> PAGEREF _Toc232620342 \h </w:instrText>
+          <w:instrText xml:space="preserve"> PAGEREF _Toc232748292 \h </w:instrText>
         </w:r>
         <w:r>
           <w:rPr>
@@ -6385,7 +6385,7 @@
           <w14:ligatures w14:val="standardContextual"/>
         </w:rPr>
       </w:pPr>
-      <w:hyperlink w:anchor="_Toc232620343" w:history="1">
+      <w:hyperlink w:anchor="_Toc232748293" w:history="1">
         <w:r>
           <w:rPr>
             <w:rStyle w:val="Lienhypertexte"/>
@@ -6413,7 +6413,7 @@
             <w:noProof/>
             <w:webHidden/>
           </w:rPr>
-          <w:instrText xml:space="preserve"> PAGEREF _Toc232620343 \h </w:instrText>
+          <w:instrText xml:space="preserve"> PAGEREF _Toc232748293 \h </w:instrText>
         </w:r>
         <w:r>
           <w:rPr>
@@ -6461,7 +6461,7 @@
           <w14:ligatures w14:val="standardContextual"/>
         </w:rPr>
       </w:pPr>
-      <w:hyperlink w:anchor="_Toc232620344" w:history="1">
+      <w:hyperlink w:anchor="_Toc232748294" w:history="1">
         <w:r>
           <w:rPr>
             <w:rStyle w:val="Lienhypertexte"/>
@@ -6489,7 +6489,7 @@
             <w:noProof/>
             <w:webHidden/>
           </w:rPr>
-          <w:instrText xml:space="preserve"> PAGEREF _Toc232620344 \h </w:instrText>
+          <w:instrText xml:space="preserve"> PAGEREF _Toc232748294 \h </w:instrText>
         </w:r>
         <w:r>
           <w:rPr>
@@ -6537,7 +6537,7 @@
           <w14:ligatures w14:val="standardContextual"/>
         </w:rPr>
       </w:pPr>
-      <w:hyperlink w:anchor="_Toc232620345" w:history="1">
+      <w:hyperlink w:anchor="_Toc232748295" w:history="1">
         <w:r>
           <w:rPr>
             <w:rStyle w:val="Lienhypertexte"/>
@@ -6565,7 +6565,7 @@
             <w:noProof/>
             <w:webHidden/>
           </w:rPr>
-          <w:instrText xml:space="preserve"> PAGEREF _Toc232620345 \h </w:instrText>
+          <w:instrText xml:space="preserve"> PAGEREF _Toc232748295 \h </w:instrText>
         </w:r>
         <w:r>
           <w:rPr>
@@ -6613,7 +6613,7 @@
           <w14:ligatures w14:val="standardContextual"/>
         </w:rPr>
       </w:pPr>
-      <w:hyperlink w:anchor="_Toc232620346" w:history="1">
+      <w:hyperlink w:anchor="_Toc232748296" w:history="1">
         <w:r>
           <w:rPr>
             <w:rStyle w:val="Lienhypertexte"/>
@@ -6640,7 +6640,7 @@
             <w:noProof/>
             <w:webHidden/>
           </w:rPr>
-          <w:instrText xml:space="preserve"> PAGEREF _Toc232620346 \h </w:instrText>
+          <w:instrText xml:space="preserve"> PAGEREF _Toc232748296 \h </w:instrText>
         </w:r>
         <w:r>
           <w:rPr>
@@ -6688,7 +6688,7 @@
           <w14:ligatures w14:val="standardContextual"/>
         </w:rPr>
       </w:pPr>
-      <w:hyperlink w:anchor="_Toc232620347" w:history="1">
+      <w:hyperlink w:anchor="_Toc232748297" w:history="1">
         <w:r>
           <w:rPr>
             <w:rStyle w:val="Lienhypertexte"/>
@@ -6715,7 +6715,7 @@
             <w:noProof/>
             <w:webHidden/>
           </w:rPr>
-          <w:instrText xml:space="preserve"> PAGEREF _Toc232620347 \h </w:instrText>
+          <w:instrText xml:space="preserve"> PAGEREF _Toc232748297 \h </w:instrText>
         </w:r>
         <w:r>
           <w:rPr>
@@ -6763,7 +6763,7 @@
           <w14:ligatures w14:val="standardContextual"/>
         </w:rPr>
       </w:pPr>
-      <w:hyperlink w:anchor="_Toc232620348" w:history="1">
+      <w:hyperlink w:anchor="_Toc232748298" w:history="1">
         <w:r>
           <w:rPr>
             <w:rStyle w:val="Lienhypertexte"/>
@@ -6790,7 +6790,7 @@
             <w:noProof/>
             <w:webHidden/>
           </w:rPr>
-          <w:instrText xml:space="preserve"> PAGEREF _Toc232620348 \h </w:instrText>
+          <w:instrText xml:space="preserve"> PAGEREF _Toc232748298 \h </w:instrText>
         </w:r>
         <w:r>
           <w:rPr>
@@ -6838,7 +6838,7 @@
           <w14:ligatures w14:val="standardContextual"/>
         </w:rPr>
       </w:pPr>
-      <w:hyperlink w:anchor="_Toc232620349" w:history="1">
+      <w:hyperlink w:anchor="_Toc232748299" w:history="1">
         <w:r>
           <w:rPr>
             <w:rStyle w:val="Lienhypertexte"/>
@@ -6865,7 +6865,7 @@
             <w:noProof/>
             <w:webHidden/>
           </w:rPr>
-          <w:instrText xml:space="preserve"> PAGEREF _Toc232620349 \h </w:instrText>
+          <w:instrText xml:space="preserve"> PAGEREF _Toc232748299 \h </w:instrText>
         </w:r>
         <w:r>
           <w:rPr>
@@ -6913,7 +6913,7 @@
           <w14:ligatures w14:val="standardContextual"/>
         </w:rPr>
       </w:pPr>
-      <w:hyperlink w:anchor="_Toc232620350" w:history="1">
+      <w:hyperlink w:anchor="_Toc232748300" w:history="1">
         <w:r>
           <w:rPr>
             <w:rStyle w:val="Lienhypertexte"/>
@@ -6940,7 +6940,7 @@
             <w:noProof/>
             <w:webHidden/>
           </w:rPr>
-          <w:instrText xml:space="preserve"> PAGEREF _Toc232620350 \h </w:instrText>
+          <w:instrText xml:space="preserve"> PAGEREF _Toc232748300 \h </w:instrText>
         </w:r>
         <w:r>
           <w:rPr>
@@ -6988,7 +6988,7 @@
           <w14:ligatures w14:val="standardContextual"/>
         </w:rPr>
       </w:pPr>
-      <w:hyperlink w:anchor="_Toc232620351" w:history="1">
+      <w:hyperlink w:anchor="_Toc232748301" w:history="1">
         <w:r>
           <w:rPr>
             <w:rStyle w:val="Lienhypertexte"/>
@@ -7016,7 +7016,7 @@
             <w:noProof/>
             <w:webHidden/>
           </w:rPr>
-          <w:instrText xml:space="preserve"> PAGEREF _Toc232620351 \h </w:instrText>
+          <w:instrText xml:space="preserve"> PAGEREF _Toc232748301 \h </w:instrText>
         </w:r>
         <w:r>
           <w:rPr>
@@ -7064,7 +7064,7 @@
           <w14:ligatures w14:val="standardContextual"/>
         </w:rPr>
       </w:pPr>
-      <w:hyperlink w:anchor="_Toc232620352" w:history="1">
+      <w:hyperlink w:anchor="_Toc232748302" w:history="1">
         <w:r>
           <w:rPr>
             <w:rStyle w:val="Lienhypertexte"/>
@@ -7092,7 +7092,7 @@
             <w:noProof/>
             <w:webHidden/>
           </w:rPr>
-          <w:instrText xml:space="preserve"> PAGEREF _Toc232620352 \h </w:instrText>
+          <w:instrText xml:space="preserve"> PAGEREF _Toc232748302 \h </w:instrText>
         </w:r>
         <w:r>
           <w:rPr>
@@ -7140,7 +7140,7 @@
           <w14:ligatures w14:val="standardContextual"/>
         </w:rPr>
       </w:pPr>
-      <w:hyperlink w:anchor="_Toc232620353" w:history="1">
+      <w:hyperlink w:anchor="_Toc232748303" w:history="1">
         <w:r>
           <w:rPr>
             <w:rStyle w:val="Lienhypertexte"/>
@@ -7167,7 +7167,7 @@
             <w:noProof/>
             <w:webHidden/>
           </w:rPr>
-          <w:instrText xml:space="preserve"> PAGEREF _Toc232620353 \h </w:instrText>
+          <w:instrText xml:space="preserve"> PAGEREF _Toc232748303 \h </w:instrText>
         </w:r>
         <w:r>
           <w:rPr>
@@ -7215,7 +7215,7 @@
           <w14:ligatures w14:val="standardContextual"/>
         </w:rPr>
       </w:pPr>
-      <w:hyperlink w:anchor="_Toc232620354" w:history="1">
+      <w:hyperlink w:anchor="_Toc232748304" w:history="1">
         <w:r>
           <w:rPr>
             <w:rStyle w:val="Lienhypertexte"/>
@@ -7242,7 +7242,7 @@
             <w:noProof/>
             <w:webHidden/>
           </w:rPr>
-          <w:instrText xml:space="preserve"> PAGEREF _Toc232620354 \h </w:instrText>
+          <w:instrText xml:space="preserve"> PAGEREF _Toc232748304 \h </w:instrText>
         </w:r>
         <w:r>
           <w:rPr>
@@ -7290,7 +7290,7 @@
           <w14:ligatures w14:val="standardContextual"/>
         </w:rPr>
       </w:pPr>
-      <w:hyperlink w:anchor="_Toc232620355" w:history="1">
+      <w:hyperlink w:anchor="_Toc232748305" w:history="1">
         <w:r>
           <w:rPr>
             <w:rStyle w:val="Lienhypertexte"/>
@@ -7317,7 +7317,7 @@
             <w:noProof/>
             <w:webHidden/>
           </w:rPr>
-          <w:instrText xml:space="preserve"> PAGEREF _Toc232620355 \h </w:instrText>
+          <w:instrText xml:space="preserve"> PAGEREF _Toc232748305 \h </w:instrText>
         </w:r>
         <w:r>
           <w:rPr>
@@ -7365,7 +7365,7 @@
           <w14:ligatures w14:val="standardContextual"/>
         </w:rPr>
       </w:pPr>
-      <w:hyperlink w:anchor="_Toc232620356" w:history="1">
+      <w:hyperlink w:anchor="_Toc232748306" w:history="1">
         <w:r>
           <w:rPr>
             <w:rStyle w:val="Lienhypertexte"/>
@@ -7392,7 +7392,7 @@
             <w:noProof/>
             <w:webHidden/>
           </w:rPr>
-          <w:instrText xml:space="preserve"> PAGEREF _Toc232620356 \h </w:instrText>
+          <w:instrText xml:space="preserve"> PAGEREF _Toc232748306 \h </w:instrText>
         </w:r>
         <w:r>
           <w:rPr>
@@ -7440,7 +7440,7 @@
           <w14:ligatures w14:val="standardContextual"/>
         </w:rPr>
       </w:pPr>
-      <w:hyperlink w:anchor="_Toc232620357" w:history="1">
+      <w:hyperlink w:anchor="_Toc232748307" w:history="1">
         <w:r>
           <w:rPr>
             <w:rStyle w:val="Lienhypertexte"/>
@@ -7467,7 +7467,7 @@
             <w:noProof/>
             <w:webHidden/>
           </w:rPr>
-          <w:instrText xml:space="preserve"> PAGEREF _Toc232620357 \h </w:instrText>
+          <w:instrText xml:space="preserve"> PAGEREF _Toc232748307 \h </w:instrText>
         </w:r>
         <w:r>
           <w:rPr>
@@ -7515,7 +7515,7 @@
           <w14:ligatures w14:val="standardContextual"/>
         </w:rPr>
       </w:pPr>
-      <w:hyperlink w:anchor="_Toc232620358" w:history="1">
+      <w:hyperlink w:anchor="_Toc232748308" w:history="1">
         <w:r>
           <w:rPr>
             <w:rStyle w:val="Lienhypertexte"/>
@@ -7543,7 +7543,7 @@
             <w:noProof/>
             <w:webHidden/>
           </w:rPr>
-          <w:instrText xml:space="preserve"> PAGEREF _Toc232620358 \h </w:instrText>
+          <w:instrText xml:space="preserve"> PAGEREF _Toc232748308 \h </w:instrText>
         </w:r>
         <w:r>
           <w:rPr>
@@ -7591,7 +7591,7 @@
           <w14:ligatures w14:val="standardContextual"/>
         </w:rPr>
       </w:pPr>
-      <w:hyperlink w:anchor="_Toc232620359" w:history="1">
+      <w:hyperlink w:anchor="_Toc232748309" w:history="1">
         <w:r>
           <w:rPr>
             <w:rStyle w:val="Lienhypertexte"/>
@@ -7619,7 +7619,7 @@
             <w:noProof/>
             <w:webHidden/>
           </w:rPr>
-          <w:instrText xml:space="preserve"> PAGEREF _Toc232620359 \h </w:instrText>
+          <w:instrText xml:space="preserve"> PAGEREF _Toc232748309 \h </w:instrText>
         </w:r>
         <w:r>
           <w:rPr>
@@ -7667,7 +7667,7 @@
           <w14:ligatures w14:val="standardContextual"/>
         </w:rPr>
       </w:pPr>
-      <w:hyperlink w:anchor="_Toc232620360" w:history="1">
+      <w:hyperlink w:anchor="_Toc232748310" w:history="1">
         <w:r>
           <w:rPr>
             <w:rStyle w:val="Lienhypertexte"/>
@@ -7695,7 +7695,7 @@
             <w:noProof/>
             <w:webHidden/>
           </w:rPr>
-          <w:instrText xml:space="preserve"> PAGEREF _Toc232620360 \h </w:instrText>
+          <w:instrText xml:space="preserve"> PAGEREF _Toc232748310 \h </w:instrText>
         </w:r>
         <w:r>
           <w:rPr>
@@ -7743,7 +7743,7 @@
           <w14:ligatures w14:val="standardContextual"/>
         </w:rPr>
       </w:pPr>
-      <w:hyperlink w:anchor="_Toc232620361" w:history="1">
+      <w:hyperlink w:anchor="_Toc232748311" w:history="1">
         <w:r>
           <w:rPr>
             <w:rStyle w:val="Lienhypertexte"/>
@@ -7771,7 +7771,7 @@
             <w:noProof/>
             <w:webHidden/>
           </w:rPr>
-          <w:instrText xml:space="preserve"> PAGEREF _Toc232620361 \h </w:instrText>
+          <w:instrText xml:space="preserve"> PAGEREF _Toc232748311 \h </w:instrText>
         </w:r>
         <w:r>
           <w:rPr>
@@ -7819,7 +7819,7 @@
           <w14:ligatures w14:val="standardContextual"/>
         </w:rPr>
       </w:pPr>
-      <w:hyperlink w:anchor="_Toc232620362" w:history="1">
+      <w:hyperlink w:anchor="_Toc232748312" w:history="1">
         <w:r>
           <w:rPr>
             <w:rStyle w:val="Lienhypertexte"/>
@@ -7847,7 +7847,7 @@
             <w:noProof/>
             <w:webHidden/>
           </w:rPr>
-          <w:instrText xml:space="preserve"> PAGEREF _Toc232620362 \h </w:instrText>
+          <w:instrText xml:space="preserve"> PAGEREF _Toc232748312 \h </w:instrText>
         </w:r>
         <w:r>
           <w:rPr>
@@ -7895,7 +7895,7 @@
           <w14:ligatures w14:val="standardContextual"/>
         </w:rPr>
       </w:pPr>
-      <w:hyperlink w:anchor="_Toc232620363" w:history="1">
+      <w:hyperlink w:anchor="_Toc232748313" w:history="1">
         <w:r>
           <w:rPr>
             <w:rStyle w:val="Lienhypertexte"/>
@@ -7923,7 +7923,7 @@
             <w:noProof/>
             <w:webHidden/>
           </w:rPr>
-          <w:instrText xml:space="preserve"> PAGEREF _Toc232620363 \h </w:instrText>
+          <w:instrText xml:space="preserve"> PAGEREF _Toc232748313 \h </w:instrText>
         </w:r>
         <w:r>
           <w:rPr>
@@ -7971,7 +7971,7 @@
           <w14:ligatures w14:val="standardContextual"/>
         </w:rPr>
       </w:pPr>
-      <w:hyperlink w:anchor="_Toc232620364" w:history="1">
+      <w:hyperlink w:anchor="_Toc232748314" w:history="1">
         <w:r>
           <w:rPr>
             <w:rStyle w:val="Lienhypertexte"/>
@@ -7999,7 +7999,7 @@
             <w:noProof/>
             <w:webHidden/>
           </w:rPr>
-          <w:instrText xml:space="preserve"> PAGEREF _Toc232620364 \h </w:instrText>
+          <w:instrText xml:space="preserve"> PAGEREF _Toc232748314 \h </w:instrText>
         </w:r>
         <w:r>
           <w:rPr>
@@ -8047,7 +8047,7 @@
           <w14:ligatures w14:val="standardContextual"/>
         </w:rPr>
       </w:pPr>
-      <w:hyperlink w:anchor="_Toc232620365" w:history="1">
+      <w:hyperlink w:anchor="_Toc232748315" w:history="1">
         <w:r>
           <w:rPr>
             <w:rStyle w:val="Lienhypertexte"/>
@@ -8075,7 +8075,7 @@
             <w:noProof/>
             <w:webHidden/>
           </w:rPr>
-          <w:instrText xml:space="preserve"> PAGEREF _Toc232620365 \h </w:instrText>
+          <w:instrText xml:space="preserve"> PAGEREF _Toc232748315 \h </w:instrText>
         </w:r>
         <w:r>
           <w:rPr>
@@ -8123,7 +8123,7 @@
           <w14:ligatures w14:val="standardContextual"/>
         </w:rPr>
       </w:pPr>
-      <w:hyperlink w:anchor="_Toc232620366" w:history="1">
+      <w:hyperlink w:anchor="_Toc232748316" w:history="1">
         <w:r>
           <w:rPr>
             <w:rStyle w:val="Lienhypertexte"/>
@@ -8151,7 +8151,7 @@
             <w:noProof/>
             <w:webHidden/>
           </w:rPr>
-          <w:instrText xml:space="preserve"> PAGEREF _Toc232620366 \h </w:instrText>
+          <w:instrText xml:space="preserve"> PAGEREF _Toc232748316 \h </w:instrText>
         </w:r>
         <w:r>
           <w:rPr>
@@ -8199,7 +8199,7 @@
           <w14:ligatures w14:val="standardContextual"/>
         </w:rPr>
       </w:pPr>
-      <w:hyperlink w:anchor="_Toc232620367" w:history="1">
+      <w:hyperlink w:anchor="_Toc232748317" w:history="1">
         <w:r>
           <w:rPr>
             <w:rStyle w:val="Lienhypertexte"/>
@@ -8227,7 +8227,7 @@
             <w:noProof/>
             <w:webHidden/>
           </w:rPr>
-          <w:instrText xml:space="preserve"> PAGEREF _Toc232620367 \h </w:instrText>
+          <w:instrText xml:space="preserve"> PAGEREF _Toc232748317 \h </w:instrText>
         </w:r>
         <w:r>
           <w:rPr>
@@ -8275,7 +8275,7 @@
           <w14:ligatures w14:val="standardContextual"/>
         </w:rPr>
       </w:pPr>
-      <w:hyperlink w:anchor="_Toc232620368" w:history="1">
+      <w:hyperlink w:anchor="_Toc232748318" w:history="1">
         <w:r>
           <w:rPr>
             <w:rStyle w:val="Lienhypertexte"/>
@@ -8303,7 +8303,7 @@
             <w:noProof/>
             <w:webHidden/>
           </w:rPr>
-          <w:instrText xml:space="preserve"> PAGEREF _Toc232620368 \h </w:instrText>
+          <w:instrText xml:space="preserve"> PAGEREF _Toc232748318 \h </w:instrText>
         </w:r>
         <w:r>
           <w:rPr>
@@ -8351,7 +8351,7 @@
           <w14:ligatures w14:val="standardContextual"/>
         </w:rPr>
       </w:pPr>
-      <w:hyperlink w:anchor="_Toc232620369" w:history="1">
+      <w:hyperlink w:anchor="_Toc232748319" w:history="1">
         <w:r>
           <w:rPr>
             <w:rStyle w:val="Lienhypertexte"/>
@@ -8379,7 +8379,7 @@
             <w:noProof/>
             <w:webHidden/>
           </w:rPr>
-          <w:instrText xml:space="preserve"> PAGEREF _Toc232620369 \h </w:instrText>
+          <w:instrText xml:space="preserve"> PAGEREF _Toc232748319 \h </w:instrText>
         </w:r>
         <w:r>
           <w:rPr>
@@ -8427,7 +8427,7 @@
           <w14:ligatures w14:val="standardContextual"/>
         </w:rPr>
       </w:pPr>
-      <w:hyperlink w:anchor="_Toc232620370" w:history="1">
+      <w:hyperlink w:anchor="_Toc232748320" w:history="1">
         <w:r>
           <w:rPr>
             <w:rStyle w:val="Lienhypertexte"/>
@@ -8455,7 +8455,7 @@
             <w:noProof/>
             <w:webHidden/>
           </w:rPr>
-          <w:instrText xml:space="preserve"> PAGEREF _Toc232620370 \h </w:instrText>
+          <w:instrText xml:space="preserve"> PAGEREF _Toc232748320 \h </w:instrText>
         </w:r>
         <w:r>
           <w:rPr>
@@ -8503,7 +8503,7 @@
           <w14:ligatures w14:val="standardContextual"/>
         </w:rPr>
       </w:pPr>
-      <w:hyperlink w:anchor="_Toc232620371" w:history="1">
+      <w:hyperlink w:anchor="_Toc232748321" w:history="1">
         <w:r>
           <w:rPr>
             <w:rStyle w:val="Lienhypertexte"/>
@@ -8531,7 +8531,7 @@
             <w:noProof/>
             <w:webHidden/>
           </w:rPr>
-          <w:instrText xml:space="preserve"> PAGEREF _Toc232620371 \h </w:instrText>
+          <w:instrText xml:space="preserve"> PAGEREF _Toc232748321 \h </w:instrText>
         </w:r>
         <w:r>
           <w:rPr>
@@ -8579,7 +8579,7 @@
           <w14:ligatures w14:val="standardContextual"/>
         </w:rPr>
       </w:pPr>
-      <w:hyperlink w:anchor="_Toc232620372" w:history="1">
+      <w:hyperlink w:anchor="_Toc232748322" w:history="1">
         <w:r>
           <w:rPr>
             <w:rStyle w:val="Lienhypertexte"/>
@@ -8607,7 +8607,7 @@
             <w:noProof/>
             <w:webHidden/>
           </w:rPr>
-          <w:instrText xml:space="preserve"> PAGEREF _Toc232620372 \h </w:instrText>
+          <w:instrText xml:space="preserve"> PAGEREF _Toc232748322 \h </w:instrText>
         </w:r>
         <w:r>
           <w:rPr>
@@ -8655,7 +8655,7 @@
           <w14:ligatures w14:val="standardContextual"/>
         </w:rPr>
       </w:pPr>
-      <w:hyperlink w:anchor="_Toc232620373" w:history="1">
+      <w:hyperlink w:anchor="_Toc232748323" w:history="1">
         <w:r>
           <w:rPr>
             <w:rStyle w:val="Lienhypertexte"/>
@@ -8683,7 +8683,7 @@
             <w:noProof/>
             <w:webHidden/>
           </w:rPr>
-          <w:instrText xml:space="preserve"> PAGEREF _Toc232620373 \h </w:instrText>
+          <w:instrText xml:space="preserve"> PAGEREF _Toc232748323 \h </w:instrText>
         </w:r>
         <w:r>
           <w:rPr>
@@ -8731,7 +8731,7 @@
           <w14:ligatures w14:val="standardContextual"/>
         </w:rPr>
       </w:pPr>
-      <w:hyperlink w:anchor="_Toc232620374" w:history="1">
+      <w:hyperlink w:anchor="_Toc232748324" w:history="1">
         <w:r>
           <w:rPr>
             <w:rStyle w:val="Lienhypertexte"/>
@@ -8759,7 +8759,7 @@
             <w:noProof/>
             <w:webHidden/>
           </w:rPr>
-          <w:instrText xml:space="preserve"> PAGEREF _Toc232620374 \h </w:instrText>
+          <w:instrText xml:space="preserve"> PAGEREF _Toc232748324 \h </w:instrText>
         </w:r>
         <w:r>
           <w:rPr>
@@ -8807,7 +8807,7 @@
           <w14:ligatures w14:val="standardContextual"/>
         </w:rPr>
       </w:pPr>
-      <w:hyperlink w:anchor="_Toc232620375" w:history="1">
+      <w:hyperlink w:anchor="_Toc232748325" w:history="1">
         <w:r>
           <w:rPr>
             <w:rStyle w:val="Lienhypertexte"/>
@@ -8835,7 +8835,7 @@
             <w:noProof/>
             <w:webHidden/>
           </w:rPr>
-          <w:instrText xml:space="preserve"> PAGEREF _Toc232620375 \h </w:instrText>
+          <w:instrText xml:space="preserve"> PAGEREF _Toc232748325 \h </w:instrText>
         </w:r>
         <w:r>
           <w:rPr>
@@ -8883,7 +8883,7 @@
           <w14:ligatures w14:val="standardContextual"/>
         </w:rPr>
       </w:pPr>
-      <w:hyperlink w:anchor="_Toc232620376" w:history="1">
+      <w:hyperlink w:anchor="_Toc232748326" w:history="1">
         <w:r>
           <w:rPr>
             <w:rStyle w:val="Lienhypertexte"/>
@@ -8911,7 +8911,7 @@
             <w:noProof/>
             <w:webHidden/>
           </w:rPr>
-          <w:instrText xml:space="preserve"> PAGEREF _Toc232620376 \h </w:instrText>
+          <w:instrText xml:space="preserve"> PAGEREF _Toc232748326 \h </w:instrText>
         </w:r>
         <w:r>
           <w:rPr>
@@ -8959,7 +8959,7 @@
           <w14:ligatures w14:val="standardContextual"/>
         </w:rPr>
       </w:pPr>
-      <w:hyperlink w:anchor="_Toc232620377" w:history="1">
+      <w:hyperlink w:anchor="_Toc232748327" w:history="1">
         <w:r>
           <w:rPr>
             <w:rStyle w:val="Lienhypertexte"/>
@@ -8987,7 +8987,7 @@
             <w:noProof/>
             <w:webHidden/>
           </w:rPr>
-          <w:instrText xml:space="preserve"> PAGEREF _Toc232620377 \h </w:instrText>
+          <w:instrText xml:space="preserve"> PAGEREF _Toc232748327 \h </w:instrText>
         </w:r>
         <w:r>
           <w:rPr>
@@ -9035,7 +9035,7 @@
           <w14:ligatures w14:val="standardContextual"/>
         </w:rPr>
       </w:pPr>
-      <w:hyperlink w:anchor="_Toc232620378" w:history="1">
+      <w:hyperlink w:anchor="_Toc232748328" w:history="1">
         <w:r>
           <w:rPr>
             <w:rStyle w:val="Lienhypertexte"/>
@@ -9063,7 +9063,7 @@
             <w:noProof/>
             <w:webHidden/>
           </w:rPr>
-          <w:instrText xml:space="preserve"> PAGEREF _Toc232620378 \h </w:instrText>
+          <w:instrText xml:space="preserve"> PAGEREF _Toc232748328 \h </w:instrText>
         </w:r>
         <w:r>
           <w:rPr>
@@ -9111,7 +9111,7 @@
           <w14:ligatures w14:val="standardContextual"/>
         </w:rPr>
       </w:pPr>
-      <w:hyperlink w:anchor="_Toc232620379" w:history="1">
+      <w:hyperlink w:anchor="_Toc232748329" w:history="1">
         <w:r>
           <w:rPr>
             <w:rStyle w:val="Lienhypertexte"/>
@@ -9139,7 +9139,7 @@
             <w:noProof/>
             <w:webHidden/>
           </w:rPr>
-          <w:instrText xml:space="preserve"> PAGEREF _Toc232620379 \h </w:instrText>
+          <w:instrText xml:space="preserve"> PAGEREF _Toc232748329 \h </w:instrText>
         </w:r>
         <w:r>
           <w:rPr>
@@ -9187,7 +9187,7 @@
           <w14:ligatures w14:val="standardContextual"/>
         </w:rPr>
       </w:pPr>
-      <w:hyperlink w:anchor="_Toc232620380" w:history="1">
+      <w:hyperlink w:anchor="_Toc232748330" w:history="1">
         <w:r>
           <w:rPr>
             <w:rStyle w:val="Lienhypertexte"/>
@@ -9215,7 +9215,7 @@
             <w:noProof/>
             <w:webHidden/>
           </w:rPr>
-          <w:instrText xml:space="preserve"> PAGEREF _Toc232620380 \h </w:instrText>
+          <w:instrText xml:space="preserve"> PAGEREF _Toc232748330 \h </w:instrText>
         </w:r>
         <w:r>
           <w:rPr>
@@ -9263,7 +9263,7 @@
           <w14:ligatures w14:val="standardContextual"/>
         </w:rPr>
       </w:pPr>
-      <w:hyperlink w:anchor="_Toc232620381" w:history="1">
+      <w:hyperlink w:anchor="_Toc232748331" w:history="1">
         <w:r>
           <w:rPr>
             <w:rStyle w:val="Lienhypertexte"/>
@@ -9291,7 +9291,7 @@
             <w:noProof/>
             <w:webHidden/>
           </w:rPr>
-          <w:instrText xml:space="preserve"> PAGEREF _Toc232620381 \h </w:instrText>
+          <w:instrText xml:space="preserve"> PAGEREF _Toc232748331 \h </w:instrText>
         </w:r>
         <w:r>
           <w:rPr>
@@ -9339,7 +9339,7 @@
           <w14:ligatures w14:val="standardContextual"/>
         </w:rPr>
       </w:pPr>
-      <w:hyperlink w:anchor="_Toc232620382" w:history="1">
+      <w:hyperlink w:anchor="_Toc232748332" w:history="1">
         <w:r>
           <w:rPr>
             <w:rStyle w:val="Lienhypertexte"/>
@@ -9367,7 +9367,7 @@
             <w:noProof/>
             <w:webHidden/>
           </w:rPr>
-          <w:instrText xml:space="preserve"> PAGEREF _Toc232620382 \h </w:instrText>
+          <w:instrText xml:space="preserve"> PAGEREF _Toc232748332 \h </w:instrText>
         </w:r>
         <w:r>
           <w:rPr>
@@ -9415,7 +9415,7 @@
           <w14:ligatures w14:val="standardContextual"/>
         </w:rPr>
       </w:pPr>
-      <w:hyperlink w:anchor="_Toc232620383" w:history="1">
+      <w:hyperlink w:anchor="_Toc232748333" w:history="1">
         <w:r>
           <w:rPr>
             <w:rStyle w:val="Lienhypertexte"/>
@@ -9443,7 +9443,7 @@
             <w:noProof/>
             <w:webHidden/>
           </w:rPr>
-          <w:instrText xml:space="preserve"> PAGEREF _Toc232620383 \h </w:instrText>
+          <w:instrText xml:space="preserve"> PAGEREF _Toc232748333 \h </w:instrText>
         </w:r>
         <w:r>
           <w:rPr>
@@ -9491,7 +9491,7 @@
           <w14:ligatures w14:val="standardContextual"/>
         </w:rPr>
       </w:pPr>
-      <w:hyperlink w:anchor="_Toc232620384" w:history="1">
+      <w:hyperlink w:anchor="_Toc232748334" w:history="1">
         <w:r>
           <w:rPr>
             <w:rStyle w:val="Lienhypertexte"/>
@@ -9519,7 +9519,7 @@
             <w:noProof/>
             <w:webHidden/>
           </w:rPr>
-          <w:instrText xml:space="preserve"> PAGEREF _Toc232620384 \h </w:instrText>
+          <w:instrText xml:space="preserve"> PAGEREF _Toc232748334 \h </w:instrText>
         </w:r>
         <w:r>
           <w:rPr>
@@ -9567,7 +9567,7 @@
           <w14:ligatures w14:val="standardContextual"/>
         </w:rPr>
       </w:pPr>
-      <w:hyperlink w:anchor="_Toc232620385" w:history="1">
+      <w:hyperlink w:anchor="_Toc232748335" w:history="1">
         <w:r>
           <w:rPr>
             <w:rStyle w:val="Lienhypertexte"/>
@@ -9595,7 +9595,7 @@
             <w:noProof/>
             <w:webHidden/>
           </w:rPr>
-          <w:instrText xml:space="preserve"> PAGEREF _Toc232620385 \h </w:instrText>
+          <w:instrText xml:space="preserve"> PAGEREF _Toc232748335 \h </w:instrText>
         </w:r>
         <w:r>
           <w:rPr>
@@ -9643,7 +9643,7 @@
           <w14:ligatures w14:val="standardContextual"/>
         </w:rPr>
       </w:pPr>
-      <w:hyperlink w:anchor="_Toc232620386" w:history="1">
+      <w:hyperlink w:anchor="_Toc232748336" w:history="1">
         <w:r>
           <w:rPr>
             <w:rStyle w:val="Lienhypertexte"/>
@@ -9671,7 +9671,7 @@
             <w:noProof/>
             <w:webHidden/>
           </w:rPr>
-          <w:instrText xml:space="preserve"> PAGEREF _Toc232620386 \h </w:instrText>
+          <w:instrText xml:space="preserve"> PAGEREF _Toc232748336 \h </w:instrText>
         </w:r>
         <w:r>
           <w:rPr>
@@ -9719,7 +9719,7 @@
           <w14:ligatures w14:val="standardContextual"/>
         </w:rPr>
       </w:pPr>
-      <w:hyperlink w:anchor="_Toc232620387" w:history="1">
+      <w:hyperlink w:anchor="_Toc232748337" w:history="1">
         <w:r>
           <w:rPr>
             <w:rStyle w:val="Lienhypertexte"/>
@@ -9747,7 +9747,7 @@
             <w:noProof/>
             <w:webHidden/>
           </w:rPr>
-          <w:instrText xml:space="preserve"> PAGEREF _Toc232620387 \h </w:instrText>
+          <w:instrText xml:space="preserve"> PAGEREF _Toc232748337 \h </w:instrText>
         </w:r>
         <w:r>
           <w:rPr>
@@ -9795,7 +9795,7 @@
           <w14:ligatures w14:val="standardContextual"/>
         </w:rPr>
       </w:pPr>
-      <w:hyperlink w:anchor="_Toc232620388" w:history="1">
+      <w:hyperlink w:anchor="_Toc232748338" w:history="1">
         <w:r>
           <w:rPr>
             <w:rStyle w:val="Lienhypertexte"/>
@@ -9823,7 +9823,7 @@
             <w:noProof/>
             <w:webHidden/>
           </w:rPr>
-          <w:instrText xml:space="preserve"> PAGEREF _Toc232620388 \h </w:instrText>
+          <w:instrText xml:space="preserve"> PAGEREF _Toc232748338 \h </w:instrText>
         </w:r>
         <w:r>
           <w:rPr>
@@ -9871,7 +9871,7 @@
           <w14:ligatures w14:val="standardContextual"/>
         </w:rPr>
       </w:pPr>
-      <w:hyperlink w:anchor="_Toc232620389" w:history="1">
+      <w:hyperlink w:anchor="_Toc232748339" w:history="1">
         <w:r>
           <w:rPr>
             <w:rStyle w:val="Lienhypertexte"/>
@@ -9899,7 +9899,7 @@
             <w:noProof/>
             <w:webHidden/>
           </w:rPr>
-          <w:instrText xml:space="preserve"> PAGEREF _Toc232620389 \h </w:instrText>
+          <w:instrText xml:space="preserve"> PAGEREF _Toc232748339 \h </w:instrText>
         </w:r>
         <w:r>
           <w:rPr>
@@ -9950,7 +9950,7 @@
         </w:pBdr>
         <w:spacing w:before="80" w:after="200"/>
       </w:pPr>
-      <w:bookmarkStart w:id="1" w:name="_Toc232620263"/>
+      <w:bookmarkStart w:id="1" w:name="_Toc232748213"/>
       <w:r>
         <w:rPr>
           <w:rFonts w:ascii="Aptos Display" w:hAnsi="Aptos Display"/>
@@ -10181,7 +10181,7 @@
         <w:pStyle w:val="Titre2"/>
         <w:spacing w:before="460" w:after="220"/>
       </w:pPr>
-      <w:bookmarkStart w:id="2" w:name="_Toc232620264"/>
+      <w:bookmarkStart w:id="2" w:name="_Toc232748214"/>
       <w:r>
         <w:rPr>
           <w:rFonts w:ascii="Aptos Display" w:hAnsi="Aptos Display"/>
@@ -10561,7 +10561,7 @@
         <w:pStyle w:val="Titre2"/>
         <w:spacing w:before="460" w:after="220"/>
       </w:pPr>
-      <w:bookmarkStart w:id="3" w:name="_Toc232620265"/>
+      <w:bookmarkStart w:id="3" w:name="_Toc232748215"/>
       <w:r>
         <w:rPr>
           <w:rFonts w:ascii="Aptos Display" w:hAnsi="Aptos Display"/>
@@ -10843,7 +10843,7 @@
         <w:pStyle w:val="Titre2"/>
         <w:spacing w:before="460" w:after="220"/>
       </w:pPr>
-      <w:bookmarkStart w:id="4" w:name="_Toc232620266"/>
+      <w:bookmarkStart w:id="4" w:name="_Toc232748216"/>
       <w:r>
         <w:rPr>
           <w:rFonts w:ascii="Aptos Display" w:hAnsi="Aptos Display"/>
@@ -10918,7 +10918,7 @@
         <w:pStyle w:val="Titre2"/>
         <w:spacing w:before="460" w:after="220"/>
       </w:pPr>
-      <w:bookmarkStart w:id="5" w:name="_Toc232620267"/>
+      <w:bookmarkStart w:id="5" w:name="_Toc232748217"/>
       <w:r>
         <w:rPr>
           <w:rFonts w:ascii="Aptos Display" w:hAnsi="Aptos Display"/>
@@ -11041,7 +11041,7 @@
         </w:pBdr>
         <w:spacing w:before="80" w:after="200"/>
       </w:pPr>
-      <w:bookmarkStart w:id="6" w:name="_Toc232620268"/>
+      <w:bookmarkStart w:id="6" w:name="_Toc232748218"/>
       <w:r>
         <w:rPr>
           <w:rFonts w:ascii="Aptos Display" w:hAnsi="Aptos Display"/>
@@ -11123,7 +11123,7 @@
         <w:pStyle w:val="Titre2"/>
         <w:spacing w:before="460" w:after="220"/>
       </w:pPr>
-      <w:bookmarkStart w:id="7" w:name="_Toc232620269"/>
+      <w:bookmarkStart w:id="7" w:name="_Toc232748219"/>
       <w:r>
         <w:rPr>
           <w:rFonts w:ascii="Aptos Display" w:hAnsi="Aptos Display"/>
@@ -11652,7 +11652,7 @@
         <w:pStyle w:val="Titre2"/>
         <w:spacing w:before="460" w:after="220"/>
       </w:pPr>
-      <w:bookmarkStart w:id="8" w:name="_Toc232620270"/>
+      <w:bookmarkStart w:id="8" w:name="_Toc232748220"/>
       <w:r>
         <w:rPr>
           <w:rFonts w:ascii="Aptos Display" w:hAnsi="Aptos Display"/>
@@ -11948,7 +11948,7 @@
         <w:pStyle w:val="Titre2"/>
         <w:spacing w:before="460" w:after="220"/>
       </w:pPr>
-      <w:bookmarkStart w:id="9" w:name="_Toc232620271"/>
+      <w:bookmarkStart w:id="9" w:name="_Toc232748221"/>
       <w:r>
         <w:rPr>
           <w:rFonts w:ascii="Aptos Display" w:hAnsi="Aptos Display"/>
@@ -12150,7 +12150,7 @@
         <w:pStyle w:val="Titre2"/>
         <w:spacing w:before="460" w:after="220"/>
       </w:pPr>
-      <w:bookmarkStart w:id="10" w:name="_Toc232620272"/>
+      <w:bookmarkStart w:id="10" w:name="_Toc232748222"/>
       <w:r>
         <w:rPr>
           <w:rFonts w:ascii="Aptos Display" w:hAnsi="Aptos Display"/>
@@ -12311,7 +12311,7 @@
         <w:pStyle w:val="Titre2"/>
         <w:spacing w:before="460" w:after="220"/>
       </w:pPr>
-      <w:bookmarkStart w:id="11" w:name="_Toc232620273"/>
+      <w:bookmarkStart w:id="11" w:name="_Toc232748223"/>
       <w:r>
         <w:rPr>
           <w:rFonts w:ascii="Aptos Display" w:hAnsi="Aptos Display"/>
@@ -12487,7 +12487,7 @@
         <w:pStyle w:val="Titre2"/>
         <w:spacing w:before="460" w:after="220"/>
       </w:pPr>
-      <w:bookmarkStart w:id="12" w:name="_Toc232620274"/>
+      <w:bookmarkStart w:id="12" w:name="_Toc232748224"/>
       <w:r>
         <w:rPr>
           <w:rFonts w:ascii="Aptos Display" w:hAnsi="Aptos Display"/>
@@ -12602,7 +12602,7 @@
         </w:pBdr>
         <w:spacing w:before="80" w:after="200"/>
       </w:pPr>
-      <w:bookmarkStart w:id="13" w:name="_Toc232620275"/>
+      <w:bookmarkStart w:id="13" w:name="_Toc232748225"/>
       <w:r>
         <w:rPr>
           <w:rFonts w:ascii="Aptos Display" w:hAnsi="Aptos Display"/>
@@ -12618,7 +12618,7 @@
         <w:pStyle w:val="Titre2"/>
         <w:spacing w:before="460" w:after="220"/>
       </w:pPr>
-      <w:bookmarkStart w:id="14" w:name="_Toc232620276"/>
+      <w:bookmarkStart w:id="14" w:name="_Toc232748226"/>
       <w:r>
         <w:rPr>
           <w:rFonts w:ascii="Aptos Display" w:hAnsi="Aptos Display"/>
@@ -12677,7 +12677,7 @@
         <w:pStyle w:val="Titre2"/>
         <w:spacing w:before="460" w:after="220"/>
       </w:pPr>
-      <w:bookmarkStart w:id="15" w:name="_Toc232620277"/>
+      <w:bookmarkStart w:id="15" w:name="_Toc232748227"/>
       <w:r>
         <w:rPr>
           <w:rFonts w:ascii="Aptos Display" w:hAnsi="Aptos Display"/>
@@ -12750,7 +12750,7 @@
         <w:pStyle w:val="Titre2"/>
         <w:spacing w:before="460" w:after="220"/>
       </w:pPr>
-      <w:bookmarkStart w:id="16" w:name="_Toc232620278"/>
+      <w:bookmarkStart w:id="16" w:name="_Toc232748228"/>
       <w:r>
         <w:rPr>
           <w:rFonts w:ascii="Aptos Display" w:hAnsi="Aptos Display"/>
@@ -12880,7 +12880,7 @@
         <w:pStyle w:val="Titre2"/>
         <w:spacing w:before="460" w:after="220"/>
       </w:pPr>
-      <w:bookmarkStart w:id="17" w:name="_Toc232620279"/>
+      <w:bookmarkStart w:id="17" w:name="_Toc232748229"/>
       <w:r>
         <w:rPr>
           <w:rFonts w:ascii="Aptos Display" w:hAnsi="Aptos Display"/>
@@ -13370,7 +13370,7 @@
         </w:pBdr>
         <w:spacing w:before="80" w:after="200"/>
       </w:pPr>
-      <w:bookmarkStart w:id="18" w:name="_Toc232620280"/>
+      <w:bookmarkStart w:id="18" w:name="_Toc232748230"/>
       <w:r>
         <w:rPr>
           <w:rFonts w:ascii="Aptos Display" w:hAnsi="Aptos Display"/>
@@ -13525,7 +13525,7 @@
         <w:pStyle w:val="Titre2"/>
         <w:spacing w:before="460" w:after="220"/>
       </w:pPr>
-      <w:bookmarkStart w:id="19" w:name="_Toc232620281"/>
+      <w:bookmarkStart w:id="19" w:name="_Toc232748231"/>
       <w:r>
         <w:rPr>
           <w:rFonts w:ascii="Aptos Display" w:hAnsi="Aptos Display"/>
@@ -13657,7 +13657,7 @@
         <w:pStyle w:val="Titre2"/>
         <w:spacing w:before="460" w:after="220"/>
       </w:pPr>
-      <w:bookmarkStart w:id="20" w:name="_Toc232620282"/>
+      <w:bookmarkStart w:id="20" w:name="_Toc232748232"/>
       <w:r>
         <w:rPr>
           <w:rFonts w:ascii="Aptos Display" w:hAnsi="Aptos Display"/>
@@ -13918,7 +13918,7 @@
         <w:pStyle w:val="Titre2"/>
         <w:spacing w:before="460" w:after="220"/>
       </w:pPr>
-      <w:bookmarkStart w:id="21" w:name="_Toc232620283"/>
+      <w:bookmarkStart w:id="21" w:name="_Toc232748233"/>
       <w:r>
         <w:rPr>
           <w:rFonts w:ascii="Aptos Display" w:hAnsi="Aptos Display"/>
@@ -14290,7 +14290,7 @@
         <w:pStyle w:val="Titre2"/>
         <w:spacing w:before="460" w:after="220"/>
       </w:pPr>
-      <w:bookmarkStart w:id="22" w:name="_Toc232620284"/>
+      <w:bookmarkStart w:id="22" w:name="_Toc232748234"/>
       <w:r>
         <w:rPr>
           <w:rFonts w:ascii="Aptos Display" w:hAnsi="Aptos Display"/>
@@ -14317,7 +14317,7 @@
         <w:pStyle w:val="Titre3"/>
         <w:spacing w:before="60" w:after="80"/>
       </w:pPr>
-      <w:bookmarkStart w:id="23" w:name="_Toc232620285"/>
+      <w:bookmarkStart w:id="23" w:name="_Toc232748235"/>
       <w:r>
         <w:rPr>
           <w:rFonts w:ascii="Aptos" w:hAnsi="Aptos"/>
@@ -14562,7 +14562,7 @@
         <w:pStyle w:val="Titre3"/>
         <w:spacing w:before="60" w:after="80"/>
       </w:pPr>
-      <w:bookmarkStart w:id="24" w:name="_Toc232620286"/>
+      <w:bookmarkStart w:id="24" w:name="_Toc232748236"/>
       <w:r>
         <w:rPr>
           <w:rFonts w:ascii="Aptos" w:hAnsi="Aptos"/>
@@ -14824,7 +14824,7 @@
         <w:pStyle w:val="Titre2"/>
         <w:spacing w:before="460" w:after="220"/>
       </w:pPr>
-      <w:bookmarkStart w:id="25" w:name="_Toc232620287"/>
+      <w:bookmarkStart w:id="25" w:name="_Toc232748237"/>
       <w:r>
         <w:rPr>
           <w:rFonts w:ascii="Aptos Display" w:hAnsi="Aptos Display"/>
@@ -15110,7 +15110,7 @@
         <w:pStyle w:val="Titre2"/>
         <w:spacing w:before="460" w:after="220"/>
       </w:pPr>
-      <w:bookmarkStart w:id="26" w:name="_Toc232620288"/>
+      <w:bookmarkStart w:id="26" w:name="_Toc232748238"/>
       <w:r>
         <w:rPr>
           <w:rFonts w:ascii="Aptos Display" w:hAnsi="Aptos Display"/>
@@ -15180,7 +15180,7 @@
         <w:pStyle w:val="Titre2"/>
         <w:spacing w:before="460" w:after="220"/>
       </w:pPr>
-      <w:bookmarkStart w:id="27" w:name="_Toc232620289"/>
+      <w:bookmarkStart w:id="27" w:name="_Toc232748239"/>
       <w:r>
         <w:rPr>
           <w:rFonts w:ascii="Aptos Display" w:hAnsi="Aptos Display"/>
@@ -15254,7 +15254,7 @@
         <w:pStyle w:val="Titre2"/>
         <w:spacing w:before="460" w:after="220"/>
       </w:pPr>
-      <w:bookmarkStart w:id="28" w:name="_Toc232620290"/>
+      <w:bookmarkStart w:id="28" w:name="_Toc232748240"/>
       <w:r>
         <w:rPr>
           <w:rFonts w:ascii="Aptos Display" w:hAnsi="Aptos Display"/>
@@ -15276,7 +15276,7 @@
         <w:pStyle w:val="Titre3"/>
         <w:spacing w:before="60" w:after="80"/>
       </w:pPr>
-      <w:bookmarkStart w:id="29" w:name="_Toc232620291"/>
+      <w:bookmarkStart w:id="29" w:name="_Toc232748241"/>
       <w:r>
         <w:rPr>
           <w:rFonts w:ascii="Aptos" w:hAnsi="Aptos"/>
@@ -15436,7 +15436,7 @@
         <w:pStyle w:val="Titre3"/>
         <w:spacing w:before="60" w:after="80"/>
       </w:pPr>
-      <w:bookmarkStart w:id="30" w:name="_Toc232620292"/>
+      <w:bookmarkStart w:id="30" w:name="_Toc232748242"/>
       <w:r>
         <w:rPr>
           <w:rFonts w:ascii="Aptos" w:hAnsi="Aptos"/>
@@ -15469,7 +15469,7 @@
         <w:pStyle w:val="Titre3"/>
         <w:spacing w:before="60" w:after="80"/>
       </w:pPr>
-      <w:bookmarkStart w:id="31" w:name="_Toc232620293"/>
+      <w:bookmarkStart w:id="31" w:name="_Toc232748243"/>
       <w:r>
         <w:rPr>
           <w:rFonts w:ascii="Aptos" w:hAnsi="Aptos"/>
@@ -15536,7 +15536,7 @@
         <w:pStyle w:val="Titre3"/>
         <w:spacing w:before="60" w:after="80"/>
       </w:pPr>
-      <w:bookmarkStart w:id="32" w:name="_Toc232620294"/>
+      <w:bookmarkStart w:id="32" w:name="_Toc232748244"/>
       <w:r>
         <w:rPr>
           <w:rFonts w:ascii="Aptos" w:hAnsi="Aptos"/>
@@ -15625,7 +15625,7 @@
         <w:pStyle w:val="Titre3"/>
         <w:spacing w:before="60" w:after="80"/>
       </w:pPr>
-      <w:bookmarkStart w:id="33" w:name="_Toc232620295"/>
+      <w:bookmarkStart w:id="33" w:name="_Toc232748245"/>
       <w:r>
         <w:rPr>
           <w:rFonts w:ascii="Aptos" w:hAnsi="Aptos"/>
@@ -15728,7 +15728,7 @@
         <w:pStyle w:val="Titre2"/>
         <w:spacing w:before="460" w:after="220"/>
       </w:pPr>
-      <w:bookmarkStart w:id="34" w:name="_Toc232620296"/>
+      <w:bookmarkStart w:id="34" w:name="_Toc232748246"/>
       <w:r>
         <w:rPr>
           <w:rFonts w:ascii="Aptos Display" w:hAnsi="Aptos Display"/>
@@ -16372,7 +16372,7 @@
         <w:pStyle w:val="Titre2"/>
         <w:spacing w:before="460" w:after="220"/>
       </w:pPr>
-      <w:bookmarkStart w:id="35" w:name="_Toc232620297"/>
+      <w:bookmarkStart w:id="35" w:name="_Toc232748247"/>
       <w:r>
         <w:rPr>
           <w:rFonts w:ascii="Aptos Display" w:hAnsi="Aptos Display"/>
@@ -17730,7 +17730,7 @@
         <w:pStyle w:val="Titre2"/>
         <w:spacing w:before="460" w:after="220"/>
       </w:pPr>
-      <w:bookmarkStart w:id="36" w:name="_Toc232620298"/>
+      <w:bookmarkStart w:id="36" w:name="_Toc232748248"/>
       <w:r>
         <w:rPr>
           <w:rFonts w:ascii="Aptos Display" w:hAnsi="Aptos Display"/>
@@ -17997,7 +17997,7 @@
         <w:pStyle w:val="Titre2"/>
         <w:spacing w:before="460" w:after="220"/>
       </w:pPr>
-      <w:bookmarkStart w:id="37" w:name="_Toc232620299"/>
+      <w:bookmarkStart w:id="37" w:name="_Toc232748249"/>
       <w:r>
         <w:rPr>
           <w:rFonts w:ascii="Aptos Display" w:hAnsi="Aptos Display"/>
@@ -18388,7 +18388,7 @@
         <w:pStyle w:val="Titre3"/>
         <w:spacing w:before="60" w:after="80"/>
       </w:pPr>
-      <w:bookmarkStart w:id="38" w:name="_Toc232620300"/>
+      <w:bookmarkStart w:id="38" w:name="_Toc232748250"/>
       <w:r>
         <w:rPr>
           <w:rFonts w:ascii="Aptos" w:hAnsi="Aptos"/>
@@ -18469,7 +18469,7 @@
         <w:pStyle w:val="Titre2"/>
         <w:spacing w:before="460" w:after="220"/>
       </w:pPr>
-      <w:bookmarkStart w:id="39" w:name="_Toc232620301"/>
+      <w:bookmarkStart w:id="39" w:name="_Toc232748251"/>
       <w:r>
         <w:rPr>
           <w:rFonts w:ascii="Aptos Display" w:hAnsi="Aptos Display"/>
@@ -18554,7 +18554,7 @@
         <w:pStyle w:val="Titre2"/>
         <w:spacing w:before="460" w:after="220"/>
       </w:pPr>
-      <w:bookmarkStart w:id="40" w:name="_Toc232620302"/>
+      <w:bookmarkStart w:id="40" w:name="_Toc232748252"/>
       <w:r>
         <w:rPr>
           <w:rFonts w:ascii="Aptos Display" w:hAnsi="Aptos Display"/>
@@ -18739,7 +18739,7 @@
         <w:pStyle w:val="Titre2"/>
         <w:spacing w:before="460" w:after="220"/>
       </w:pPr>
-      <w:bookmarkStart w:id="41" w:name="_Toc232620303"/>
+      <w:bookmarkStart w:id="41" w:name="_Toc232748253"/>
       <w:r>
         <w:rPr>
           <w:rFonts w:ascii="Aptos Display" w:hAnsi="Aptos Display"/>
@@ -18951,7 +18951,7 @@
         <w:pStyle w:val="Titre2"/>
         <w:spacing w:before="460" w:after="220"/>
       </w:pPr>
-      <w:bookmarkStart w:id="42" w:name="_Toc232620304"/>
+      <w:bookmarkStart w:id="42" w:name="_Toc232748254"/>
       <w:r>
         <w:rPr>
           <w:rFonts w:ascii="Aptos Display" w:hAnsi="Aptos Display"/>
@@ -19160,7 +19160,7 @@
         <w:pStyle w:val="Titre2"/>
         <w:spacing w:before="460" w:after="220"/>
       </w:pPr>
-      <w:bookmarkStart w:id="43" w:name="_Toc232620305"/>
+      <w:bookmarkStart w:id="43" w:name="_Toc232748255"/>
       <w:r>
         <w:rPr>
           <w:rFonts w:ascii="Aptos Display" w:hAnsi="Aptos Display"/>
@@ -19321,7 +19321,7 @@
         <w:pStyle w:val="Titre2"/>
         <w:spacing w:before="460" w:after="220"/>
       </w:pPr>
-      <w:bookmarkStart w:id="44" w:name="_Toc232620306"/>
+      <w:bookmarkStart w:id="44" w:name="_Toc232748256"/>
       <w:r>
         <w:rPr>
           <w:rFonts w:ascii="Aptos Display" w:hAnsi="Aptos Display"/>
@@ -19397,7 +19397,7 @@
         <w:pStyle w:val="Titre2"/>
         <w:spacing w:before="460" w:after="220"/>
       </w:pPr>
-      <w:bookmarkStart w:id="45" w:name="_Toc232620307"/>
+      <w:bookmarkStart w:id="45" w:name="_Toc232748257"/>
       <w:r>
         <w:rPr>
           <w:rFonts w:ascii="Aptos Display" w:hAnsi="Aptos Display"/>
@@ -19777,7 +19777,7 @@
         <w:pStyle w:val="Titre2"/>
         <w:spacing w:before="460" w:after="220"/>
       </w:pPr>
-      <w:bookmarkStart w:id="46" w:name="_Toc232620308"/>
+      <w:bookmarkStart w:id="46" w:name="_Toc232748258"/>
       <w:r>
         <w:rPr>
           <w:rFonts w:ascii="Aptos Display" w:hAnsi="Aptos Display"/>
@@ -19962,7 +19962,7 @@
         </w:pBdr>
         <w:spacing w:before="80" w:after="200"/>
       </w:pPr>
-      <w:bookmarkStart w:id="47" w:name="_Toc232620309"/>
+      <w:bookmarkStart w:id="47" w:name="_Toc232748259"/>
       <w:r>
         <w:rPr>
           <w:rFonts w:ascii="Aptos Display" w:hAnsi="Aptos Display"/>
@@ -19988,7 +19988,7 @@
         <w:pStyle w:val="Titre2"/>
         <w:spacing w:before="460" w:after="220"/>
       </w:pPr>
-      <w:bookmarkStart w:id="48" w:name="_Toc232620310"/>
+      <w:bookmarkStart w:id="48" w:name="_Toc232748260"/>
       <w:r>
         <w:rPr>
           <w:rFonts w:ascii="Aptos Display" w:hAnsi="Aptos Display"/>
@@ -20109,7 +20109,7 @@
         <w:pStyle w:val="Titre2"/>
         <w:spacing w:before="460" w:after="220"/>
       </w:pPr>
-      <w:bookmarkStart w:id="49" w:name="_Toc232620311"/>
+      <w:bookmarkStart w:id="49" w:name="_Toc232748261"/>
       <w:r>
         <w:rPr>
           <w:rFonts w:ascii="Aptos Display" w:hAnsi="Aptos Display"/>
@@ -20244,7 +20244,7 @@
         <w:pStyle w:val="Titre2"/>
         <w:spacing w:before="460" w:after="220"/>
       </w:pPr>
-      <w:bookmarkStart w:id="50" w:name="_Toc232620312"/>
+      <w:bookmarkStart w:id="50" w:name="_Toc232748262"/>
       <w:r>
         <w:rPr>
           <w:rFonts w:ascii="Aptos Display" w:hAnsi="Aptos Display"/>
@@ -20994,7 +20994,7 @@
         <w:pStyle w:val="Titre2"/>
         <w:spacing w:before="460" w:after="220"/>
       </w:pPr>
-      <w:bookmarkStart w:id="51" w:name="_Toc232620313"/>
+      <w:bookmarkStart w:id="51" w:name="_Toc232748263"/>
       <w:r>
         <w:rPr>
           <w:rFonts w:ascii="Aptos Display" w:hAnsi="Aptos Display"/>
@@ -21224,7 +21224,7 @@
         <w:pStyle w:val="Titre2"/>
         <w:spacing w:before="460" w:after="220"/>
       </w:pPr>
-      <w:bookmarkStart w:id="52" w:name="_Toc232620314"/>
+      <w:bookmarkStart w:id="52" w:name="_Toc232748264"/>
       <w:r>
         <w:rPr>
           <w:rFonts w:ascii="Aptos Display" w:hAnsi="Aptos Display"/>
@@ -21460,7 +21460,7 @@
         <w:pStyle w:val="Titre2"/>
         <w:spacing w:before="460" w:after="220"/>
       </w:pPr>
-      <w:bookmarkStart w:id="53" w:name="_Toc232620315"/>
+      <w:bookmarkStart w:id="53" w:name="_Toc232748265"/>
       <w:r>
         <w:rPr>
           <w:rFonts w:ascii="Aptos Display" w:hAnsi="Aptos Display"/>
@@ -21957,7 +21957,7 @@
         <w:pStyle w:val="Titre2"/>
         <w:spacing w:before="460" w:after="220"/>
       </w:pPr>
-      <w:bookmarkStart w:id="54" w:name="_Toc232620316"/>
+      <w:bookmarkStart w:id="54" w:name="_Toc232748266"/>
       <w:r>
         <w:rPr>
           <w:rFonts w:ascii="Aptos Display" w:hAnsi="Aptos Display"/>
@@ -22047,7 +22047,7 @@
         <w:pStyle w:val="Titre2"/>
         <w:spacing w:before="460" w:after="220"/>
       </w:pPr>
-      <w:bookmarkStart w:id="55" w:name="_Toc232620317"/>
+      <w:bookmarkStart w:id="55" w:name="_Toc232748267"/>
       <w:r>
         <w:rPr>
           <w:rFonts w:ascii="Aptos Display" w:hAnsi="Aptos Display"/>
@@ -22215,7 +22215,7 @@
         <w:pStyle w:val="Titre2"/>
         <w:spacing w:before="460" w:after="220"/>
       </w:pPr>
-      <w:bookmarkStart w:id="56" w:name="_Toc232620318"/>
+      <w:bookmarkStart w:id="56" w:name="_Toc232748268"/>
       <w:r>
         <w:rPr>
           <w:rFonts w:ascii="Aptos Display" w:hAnsi="Aptos Display"/>
@@ -22629,7 +22629,7 @@
         <w:pStyle w:val="Titre2"/>
         <w:spacing w:before="460" w:after="220"/>
       </w:pPr>
-      <w:bookmarkStart w:id="57" w:name="_Toc232620319"/>
+      <w:bookmarkStart w:id="57" w:name="_Toc232748269"/>
       <w:r>
         <w:rPr>
           <w:rFonts w:ascii="Aptos Display" w:hAnsi="Aptos Display"/>
@@ -23028,7 +23028,7 @@
         <w:pStyle w:val="Titre2"/>
         <w:spacing w:before="460" w:after="220"/>
       </w:pPr>
-      <w:bookmarkStart w:id="58" w:name="_Toc232620320"/>
+      <w:bookmarkStart w:id="58" w:name="_Toc232748270"/>
       <w:r>
         <w:rPr>
           <w:rFonts w:ascii="Aptos Display" w:hAnsi="Aptos Display"/>
@@ -23373,7 +23373,7 @@
         <w:pStyle w:val="Titre2"/>
         <w:spacing w:before="460" w:after="220"/>
       </w:pPr>
-      <w:bookmarkStart w:id="59" w:name="_Toc232620321"/>
+      <w:bookmarkStart w:id="59" w:name="_Toc232748271"/>
       <w:r>
         <w:rPr>
           <w:rFonts w:ascii="Aptos Display" w:hAnsi="Aptos Display"/>
@@ -23496,7 +23496,7 @@
         <w:pStyle w:val="Titre2"/>
         <w:spacing w:before="460" w:after="220"/>
       </w:pPr>
-      <w:bookmarkStart w:id="60" w:name="_Toc232620322"/>
+      <w:bookmarkStart w:id="60" w:name="_Toc232748272"/>
       <w:r>
         <w:rPr>
           <w:rFonts w:ascii="Aptos Display" w:hAnsi="Aptos Display"/>
@@ -24040,7 +24040,7 @@
         </w:pBdr>
         <w:spacing w:before="80" w:after="200"/>
       </w:pPr>
-      <w:bookmarkStart w:id="61" w:name="_Toc232620323"/>
+      <w:bookmarkStart w:id="61" w:name="_Toc232748273"/>
       <w:r>
         <w:rPr>
           <w:rFonts w:ascii="Aptos Display" w:hAnsi="Aptos Display"/>
@@ -24122,7 +24122,7 @@
         <w:pStyle w:val="Titre2"/>
         <w:spacing w:before="460" w:after="220"/>
       </w:pPr>
-      <w:bookmarkStart w:id="62" w:name="_Toc232620324"/>
+      <w:bookmarkStart w:id="62" w:name="_Toc232748274"/>
       <w:r>
         <w:rPr>
           <w:rFonts w:ascii="Aptos Display" w:hAnsi="Aptos Display"/>
@@ -24459,7 +24459,7 @@
         <w:pStyle w:val="Titre2"/>
         <w:spacing w:before="460" w:after="220"/>
       </w:pPr>
-      <w:bookmarkStart w:id="63" w:name="_Toc232620325"/>
+      <w:bookmarkStart w:id="63" w:name="_Toc232748275"/>
       <w:r>
         <w:rPr>
           <w:rFonts w:ascii="Aptos Display" w:hAnsi="Aptos Display"/>
@@ -24764,7 +24764,7 @@
         <w:pStyle w:val="Titre2"/>
         <w:spacing w:before="460" w:after="220"/>
       </w:pPr>
-      <w:bookmarkStart w:id="64" w:name="_Toc232620326"/>
+      <w:bookmarkStart w:id="64" w:name="_Toc232748276"/>
       <w:r>
         <w:rPr>
           <w:rFonts w:ascii="Aptos Display" w:hAnsi="Aptos Display"/>
@@ -24940,7 +24940,7 @@
         <w:pStyle w:val="Titre2"/>
         <w:spacing w:before="460" w:after="220"/>
       </w:pPr>
-      <w:bookmarkStart w:id="65" w:name="_Toc232620327"/>
+      <w:bookmarkStart w:id="65" w:name="_Toc232748277"/>
       <w:r>
         <w:rPr>
           <w:rFonts w:ascii="Aptos Display" w:hAnsi="Aptos Display"/>
@@ -25167,7 +25167,7 @@
         <w:pStyle w:val="Titre2"/>
         <w:spacing w:before="460" w:after="220"/>
       </w:pPr>
-      <w:bookmarkStart w:id="66" w:name="_Toc232620328"/>
+      <w:bookmarkStart w:id="66" w:name="_Toc232748278"/>
       <w:r>
         <w:rPr>
           <w:rFonts w:ascii="Aptos Display" w:hAnsi="Aptos Display"/>
@@ -25736,7 +25736,7 @@
         <w:pStyle w:val="Titre3"/>
         <w:spacing w:before="60" w:after="80"/>
       </w:pPr>
-      <w:bookmarkStart w:id="67" w:name="_Toc232620329"/>
+      <w:bookmarkStart w:id="67" w:name="_Toc232748279"/>
       <w:r>
         <w:rPr>
           <w:rFonts w:ascii="Aptos" w:hAnsi="Aptos"/>
@@ -26039,7 +26039,7 @@
         <w:pStyle w:val="Titre2"/>
         <w:spacing w:before="460" w:after="220"/>
       </w:pPr>
-      <w:bookmarkStart w:id="68" w:name="_Toc232620330"/>
+      <w:bookmarkStart w:id="68" w:name="_Toc232748280"/>
       <w:r>
         <w:rPr>
           <w:rFonts w:ascii="Aptos Display" w:hAnsi="Aptos Display"/>
@@ -26153,7 +26153,7 @@
         <w:pStyle w:val="Titre2"/>
         <w:spacing w:before="460" w:after="220"/>
       </w:pPr>
-      <w:bookmarkStart w:id="69" w:name="_Toc232620331"/>
+      <w:bookmarkStart w:id="69" w:name="_Toc232748281"/>
       <w:r>
         <w:rPr>
           <w:rFonts w:ascii="Aptos Display" w:hAnsi="Aptos Display"/>
@@ -26296,7 +26296,7 @@
         <w:pStyle w:val="Titre2"/>
         <w:spacing w:before="460" w:after="220"/>
       </w:pPr>
-      <w:bookmarkStart w:id="70" w:name="_Toc232620332"/>
+      <w:bookmarkStart w:id="70" w:name="_Toc232748282"/>
       <w:r>
         <w:rPr>
           <w:rFonts w:ascii="Aptos Display" w:hAnsi="Aptos Display"/>
@@ -26602,7 +26602,7 @@
         <w:pStyle w:val="Titre3"/>
         <w:spacing w:before="60" w:after="80"/>
       </w:pPr>
-      <w:bookmarkStart w:id="71" w:name="_Toc232620333"/>
+      <w:bookmarkStart w:id="71" w:name="_Toc232748283"/>
       <w:r>
         <w:rPr>
           <w:rFonts w:ascii="Aptos" w:hAnsi="Aptos"/>
@@ -27019,7 +27019,7 @@
         <w:pStyle w:val="Titre2"/>
         <w:spacing w:before="460" w:after="220"/>
       </w:pPr>
-      <w:bookmarkStart w:id="72" w:name="_Toc232620334"/>
+      <w:bookmarkStart w:id="72" w:name="_Toc232748284"/>
       <w:r>
         <w:rPr>
           <w:rFonts w:ascii="Aptos Display" w:hAnsi="Aptos Display"/>
@@ -27211,7 +27211,7 @@
         <w:pStyle w:val="Titre3"/>
         <w:spacing w:before="60" w:after="80"/>
       </w:pPr>
-      <w:bookmarkStart w:id="73" w:name="_Toc232620335"/>
+      <w:bookmarkStart w:id="73" w:name="_Toc232748285"/>
       <w:r>
         <w:rPr>
           <w:rFonts w:ascii="Aptos" w:hAnsi="Aptos"/>
@@ -27585,7 +27585,7 @@
         <w:pStyle w:val="Titre3"/>
         <w:spacing w:before="60" w:after="80"/>
       </w:pPr>
-      <w:bookmarkStart w:id="74" w:name="_Toc232620336"/>
+      <w:bookmarkStart w:id="74" w:name="_Toc232748286"/>
       <w:r>
         <w:rPr>
           <w:rFonts w:ascii="Aptos" w:hAnsi="Aptos"/>
@@ -27934,7 +27934,7 @@
         <w:pStyle w:val="Titre3"/>
         <w:spacing w:before="60" w:after="80"/>
       </w:pPr>
-      <w:bookmarkStart w:id="75" w:name="_Toc232620337"/>
+      <w:bookmarkStart w:id="75" w:name="_Toc232748287"/>
       <w:r>
         <w:rPr>
           <w:rFonts w:ascii="Aptos" w:hAnsi="Aptos"/>
@@ -28741,7 +28741,7 @@
         <w:pStyle w:val="Titre2"/>
         <w:spacing w:before="460" w:after="220"/>
       </w:pPr>
-      <w:bookmarkStart w:id="76" w:name="_Toc232620338"/>
+      <w:bookmarkStart w:id="76" w:name="_Toc232748288"/>
       <w:r>
         <w:rPr>
           <w:rFonts w:ascii="Aptos Display" w:hAnsi="Aptos Display"/>
@@ -29163,7 +29163,7 @@
         <w:pStyle w:val="Titre2"/>
         <w:spacing w:before="460" w:after="220"/>
       </w:pPr>
-      <w:bookmarkStart w:id="77" w:name="_Toc232620339"/>
+      <w:bookmarkStart w:id="77" w:name="_Toc232748289"/>
       <w:r>
         <w:rPr>
           <w:rFonts w:ascii="Aptos Display" w:hAnsi="Aptos Display"/>
@@ -29419,7 +29419,7 @@
         <w:pStyle w:val="Titre2"/>
         <w:spacing w:before="460" w:after="220"/>
       </w:pPr>
-      <w:bookmarkStart w:id="78" w:name="_Toc232620340"/>
+      <w:bookmarkStart w:id="78" w:name="_Toc232748290"/>
       <w:r>
         <w:rPr>
           <w:rFonts w:ascii="Aptos Display" w:hAnsi="Aptos Display"/>
@@ -29870,7 +29870,7 @@
         <w:pStyle w:val="Titre2"/>
         <w:spacing w:before="460" w:after="220"/>
       </w:pPr>
-      <w:bookmarkStart w:id="79" w:name="_Toc232620341"/>
+      <w:bookmarkStart w:id="79" w:name="_Toc232748291"/>
       <w:r>
         <w:rPr>
           <w:rFonts w:ascii="Aptos Display" w:hAnsi="Aptos Display"/>
@@ -30357,7 +30357,7 @@
         <w:pStyle w:val="Titre2"/>
         <w:spacing w:before="460" w:after="220"/>
       </w:pPr>
-      <w:bookmarkStart w:id="80" w:name="_Toc232620342"/>
+      <w:bookmarkStart w:id="80" w:name="_Toc232748292"/>
       <w:r>
         <w:rPr>
           <w:rFonts w:ascii="Aptos Display" w:hAnsi="Aptos Display"/>
@@ -30500,7 +30500,7 @@
         <w:pStyle w:val="Titre2"/>
         <w:spacing w:before="460" w:after="220"/>
       </w:pPr>
-      <w:bookmarkStart w:id="81" w:name="_Toc232620343"/>
+      <w:bookmarkStart w:id="81" w:name="_Toc232748293"/>
       <w:r>
         <w:rPr>
           <w:rFonts w:ascii="Aptos Display" w:hAnsi="Aptos Display"/>
@@ -30642,7 +30642,7 @@
         <w:pStyle w:val="Titre2"/>
         <w:spacing w:before="460" w:after="220"/>
       </w:pPr>
-      <w:bookmarkStart w:id="82" w:name="_Toc232620344"/>
+      <w:bookmarkStart w:id="82" w:name="_Toc232748294"/>
       <w:r>
         <w:rPr>
           <w:rFonts w:ascii="Aptos Display" w:hAnsi="Aptos Display"/>
@@ -30819,7 +30819,7 @@
         <w:pStyle w:val="Titre2"/>
         <w:spacing w:before="460" w:after="220"/>
       </w:pPr>
-      <w:bookmarkStart w:id="83" w:name="_Toc232620345"/>
+      <w:bookmarkStart w:id="83" w:name="_Toc232748295"/>
       <w:r>
         <w:rPr>
           <w:rFonts w:ascii="Aptos Display" w:hAnsi="Aptos Display"/>
@@ -31342,7 +31342,7 @@
         <w:pStyle w:val="Titre3"/>
         <w:spacing w:before="60" w:after="80"/>
       </w:pPr>
-      <w:bookmarkStart w:id="84" w:name="_Toc232620346"/>
+      <w:bookmarkStart w:id="84" w:name="_Toc232748296"/>
       <w:r>
         <w:rPr>
           <w:rFonts w:ascii="Aptos" w:hAnsi="Aptos"/>
@@ -32069,7 +32069,7 @@
         <w:pStyle w:val="Titre3"/>
         <w:spacing w:before="60" w:after="80"/>
       </w:pPr>
-      <w:bookmarkStart w:id="85" w:name="_Toc232620347"/>
+      <w:bookmarkStart w:id="85" w:name="_Toc232748297"/>
       <w:r>
         <w:rPr>
           <w:rFonts w:ascii="Aptos" w:hAnsi="Aptos"/>
@@ -32542,7 +32542,7 @@
         <w:pStyle w:val="Titre3"/>
         <w:spacing w:before="60" w:after="80"/>
       </w:pPr>
-      <w:bookmarkStart w:id="86" w:name="_Toc232620348"/>
+      <w:bookmarkStart w:id="86" w:name="_Toc232748298"/>
       <w:r>
         <w:rPr>
           <w:rFonts w:ascii="Aptos" w:hAnsi="Aptos"/>
@@ -33202,7 +33202,7 @@
         <w:pStyle w:val="Titre3"/>
         <w:spacing w:before="60" w:after="80"/>
       </w:pPr>
-      <w:bookmarkStart w:id="87" w:name="_Toc232620349"/>
+      <w:bookmarkStart w:id="87" w:name="_Toc232748299"/>
       <w:r>
         <w:rPr>
           <w:rFonts w:ascii="Aptos" w:hAnsi="Aptos"/>
@@ -33387,7 +33387,7 @@
         <w:pStyle w:val="Titre3"/>
         <w:spacing w:before="60" w:after="80"/>
       </w:pPr>
-      <w:bookmarkStart w:id="88" w:name="_Toc232620350"/>
+      <w:bookmarkStart w:id="88" w:name="_Toc232748300"/>
       <w:r>
         <w:rPr>
           <w:rFonts w:ascii="Aptos" w:hAnsi="Aptos"/>
@@ -33454,7 +33454,7 @@
         <w:pStyle w:val="Titre2"/>
         <w:spacing w:before="460" w:after="220"/>
       </w:pPr>
-      <w:bookmarkStart w:id="89" w:name="_Toc232620351"/>
+      <w:bookmarkStart w:id="89" w:name="_Toc232748301"/>
       <w:r>
         <w:rPr>
           <w:rFonts w:ascii="Aptos Display" w:hAnsi="Aptos Display"/>
@@ -33841,7 +33841,7 @@
         <w:pageBreakBefore/>
         <w:spacing w:before="460" w:after="220"/>
       </w:pPr>
-      <w:bookmarkStart w:id="90" w:name="_Toc232620352"/>
+      <w:bookmarkStart w:id="90" w:name="_Toc232748302"/>
       <w:r>
         <w:rPr>
           <w:rFonts w:ascii="Aptos Display" w:hAnsi="Aptos Display"/>
@@ -34002,7 +34002,7 @@
         <w:pStyle w:val="Titre3"/>
         <w:spacing w:before="60" w:after="80"/>
       </w:pPr>
-      <w:bookmarkStart w:id="91" w:name="_Toc232620353"/>
+      <w:bookmarkStart w:id="91" w:name="_Toc232748303"/>
       <w:r>
         <w:rPr>
           <w:rFonts w:ascii="Aptos" w:hAnsi="Aptos"/>
@@ -34077,7 +34077,7 @@
         <w:pStyle w:val="Titre3"/>
         <w:spacing w:before="60" w:after="80"/>
       </w:pPr>
-      <w:bookmarkStart w:id="92" w:name="_Toc232620354"/>
+      <w:bookmarkStart w:id="92" w:name="_Toc232748304"/>
       <w:r>
         <w:rPr>
           <w:rFonts w:ascii="Aptos" w:hAnsi="Aptos"/>
@@ -34214,7 +34214,7 @@
         <w:pStyle w:val="Titre3"/>
         <w:spacing w:before="60" w:after="80"/>
       </w:pPr>
-      <w:bookmarkStart w:id="93" w:name="_Toc232620355"/>
+      <w:bookmarkStart w:id="93" w:name="_Toc232748305"/>
       <w:r>
         <w:rPr>
           <w:rFonts w:ascii="Aptos" w:hAnsi="Aptos"/>
@@ -34264,7 +34264,7 @@
         <w:pStyle w:val="Titre3"/>
         <w:spacing w:before="60" w:after="80"/>
       </w:pPr>
-      <w:bookmarkStart w:id="94" w:name="_Toc232620356"/>
+      <w:bookmarkStart w:id="94" w:name="_Toc232748306"/>
       <w:r>
         <w:rPr>
           <w:rFonts w:ascii="Aptos" w:hAnsi="Aptos"/>
@@ -34539,7 +34539,7 @@
         <w:pStyle w:val="Titre3"/>
         <w:spacing w:before="60" w:after="80"/>
       </w:pPr>
-      <w:bookmarkStart w:id="95" w:name="_Toc232620357"/>
+      <w:bookmarkStart w:id="95" w:name="_Toc232748307"/>
       <w:r>
         <w:rPr>
           <w:rFonts w:ascii="Aptos" w:hAnsi="Aptos"/>
@@ -34708,7 +34708,7 @@
         </w:pBdr>
         <w:spacing w:before="80" w:after="200"/>
       </w:pPr>
-      <w:bookmarkStart w:id="96" w:name="_Toc232620358"/>
+      <w:bookmarkStart w:id="96" w:name="_Toc232748308"/>
       <w:r>
         <w:rPr>
           <w:rFonts w:ascii="Aptos Display" w:hAnsi="Aptos Display"/>
@@ -34918,7 +34918,7 @@
         <w:pStyle w:val="Titre2"/>
         <w:spacing w:before="460" w:after="220"/>
       </w:pPr>
-      <w:bookmarkStart w:id="97" w:name="_Toc232620359"/>
+      <w:bookmarkStart w:id="97" w:name="_Toc232748309"/>
       <w:r>
         <w:rPr>
           <w:rFonts w:ascii="Aptos Display" w:hAnsi="Aptos Display"/>
@@ -35024,7 +35024,7 @@
         <w:pStyle w:val="Titre2"/>
         <w:spacing w:before="460" w:after="220"/>
       </w:pPr>
-      <w:bookmarkStart w:id="98" w:name="_Toc232620360"/>
+      <w:bookmarkStart w:id="98" w:name="_Toc232748310"/>
       <w:r>
         <w:rPr>
           <w:rFonts w:ascii="Aptos Display" w:hAnsi="Aptos Display"/>
@@ -35129,7 +35129,7 @@
         <w:pStyle w:val="Titre2"/>
         <w:spacing w:before="460" w:after="220"/>
       </w:pPr>
-      <w:bookmarkStart w:id="99" w:name="_Toc232620361"/>
+      <w:bookmarkStart w:id="99" w:name="_Toc232748311"/>
       <w:r>
         <w:rPr>
           <w:rFonts w:ascii="Aptos Display" w:hAnsi="Aptos Display"/>
@@ -35891,7 +35891,7 @@
         <w:pStyle w:val="Titre2"/>
         <w:spacing w:before="460" w:after="220"/>
       </w:pPr>
-      <w:bookmarkStart w:id="100" w:name="_Toc232620362"/>
+      <w:bookmarkStart w:id="100" w:name="_Toc232748312"/>
       <w:r>
         <w:rPr>
           <w:rFonts w:ascii="Aptos Display" w:hAnsi="Aptos Display"/>
@@ -36347,7 +36347,7 @@
         <w:pStyle w:val="Titre2"/>
         <w:spacing w:before="460" w:after="220"/>
       </w:pPr>
-      <w:bookmarkStart w:id="101" w:name="_Toc232620363"/>
+      <w:bookmarkStart w:id="101" w:name="_Toc232748313"/>
       <w:r>
         <w:rPr>
           <w:rFonts w:ascii="Aptos Display" w:hAnsi="Aptos Display"/>
@@ -36848,7 +36848,7 @@
         <w:pStyle w:val="Titre2"/>
         <w:spacing w:before="460" w:after="220"/>
       </w:pPr>
-      <w:bookmarkStart w:id="102" w:name="_Toc232620364"/>
+      <w:bookmarkStart w:id="102" w:name="_Toc232748314"/>
       <w:r>
         <w:rPr>
           <w:rFonts w:ascii="Aptos Display" w:hAnsi="Aptos Display"/>
@@ -37118,7 +37118,7 @@
         <w:pStyle w:val="Titre2"/>
         <w:spacing w:before="460" w:after="220"/>
       </w:pPr>
-      <w:bookmarkStart w:id="103" w:name="_Toc232620365"/>
+      <w:bookmarkStart w:id="103" w:name="_Toc232748315"/>
       <w:r>
         <w:rPr>
           <w:rFonts w:ascii="Aptos Display" w:hAnsi="Aptos Display"/>
@@ -37716,7 +37716,7 @@
         <w:pStyle w:val="Titre2"/>
         <w:spacing w:before="460" w:after="220"/>
       </w:pPr>
-      <w:bookmarkStart w:id="104" w:name="_Toc232620366"/>
+      <w:bookmarkStart w:id="104" w:name="_Toc232748316"/>
       <w:r>
         <w:rPr>
           <w:rFonts w:ascii="Aptos Display" w:hAnsi="Aptos Display"/>
@@ -38133,7 +38133,7 @@
         <w:pStyle w:val="Titre2"/>
         <w:spacing w:before="460" w:after="220"/>
       </w:pPr>
-      <w:bookmarkStart w:id="105" w:name="_Toc232620367"/>
+      <w:bookmarkStart w:id="105" w:name="_Toc232748317"/>
       <w:r>
         <w:rPr>
           <w:rFonts w:ascii="Aptos Display" w:hAnsi="Aptos Display"/>
@@ -38686,7 +38686,7 @@
         <w:pStyle w:val="Titre2"/>
         <w:spacing w:before="460" w:after="220"/>
       </w:pPr>
-      <w:bookmarkStart w:id="106" w:name="_Toc232620368"/>
+      <w:bookmarkStart w:id="106" w:name="_Toc232748318"/>
       <w:r>
         <w:rPr>
           <w:rFonts w:ascii="Aptos Display" w:hAnsi="Aptos Display"/>
@@ -38779,7 +38779,7 @@
         <w:pStyle w:val="Titre2"/>
         <w:spacing w:before="460" w:after="220"/>
       </w:pPr>
-      <w:bookmarkStart w:id="107" w:name="_Toc232620369"/>
+      <w:bookmarkStart w:id="107" w:name="_Toc232748319"/>
       <w:r>
         <w:rPr>
           <w:rFonts w:ascii="Aptos Display" w:hAnsi="Aptos Display"/>
@@ -39052,7 +39052,7 @@
         <w:pStyle w:val="Titre2"/>
         <w:spacing w:before="460" w:after="220"/>
       </w:pPr>
-      <w:bookmarkStart w:id="108" w:name="_Toc232620370"/>
+      <w:bookmarkStart w:id="108" w:name="_Toc232748320"/>
       <w:r>
         <w:rPr>
           <w:rFonts w:ascii="Aptos Display" w:hAnsi="Aptos Display"/>
@@ -39157,7 +39157,7 @@
         <w:pStyle w:val="Titre2"/>
         <w:spacing w:before="460" w:after="220"/>
       </w:pPr>
-      <w:bookmarkStart w:id="109" w:name="_Toc232620371"/>
+      <w:bookmarkStart w:id="109" w:name="_Toc232748321"/>
       <w:r>
         <w:rPr>
           <w:rFonts w:ascii="Aptos Display" w:hAnsi="Aptos Display"/>
@@ -39266,7 +39266,7 @@
         <w:pStyle w:val="Titre2"/>
         <w:spacing w:before="460" w:after="220"/>
       </w:pPr>
-      <w:bookmarkStart w:id="110" w:name="_Toc232620372"/>
+      <w:bookmarkStart w:id="110" w:name="_Toc232748322"/>
       <w:r>
         <w:rPr>
           <w:rFonts w:ascii="Aptos Display" w:hAnsi="Aptos Display"/>
@@ -39463,7 +39463,7 @@
         </w:pBdr>
         <w:spacing w:before="80" w:after="200"/>
       </w:pPr>
-      <w:bookmarkStart w:id="111" w:name="_Toc232620373"/>
+      <w:bookmarkStart w:id="111" w:name="_Toc232748323"/>
       <w:r>
         <w:rPr>
           <w:rFonts w:ascii="Aptos Display" w:hAnsi="Aptos Display"/>
@@ -39573,7 +39573,7 @@
         <w:pStyle w:val="Titre2"/>
         <w:spacing w:before="460" w:after="220"/>
       </w:pPr>
-      <w:bookmarkStart w:id="112" w:name="_Toc232620374"/>
+      <w:bookmarkStart w:id="112" w:name="_Toc232748324"/>
       <w:r>
         <w:rPr>
           <w:rFonts w:ascii="Aptos Display" w:hAnsi="Aptos Display"/>
@@ -39667,7 +39667,7 @@
         <w:pStyle w:val="Titre2"/>
         <w:spacing w:before="460" w:after="220"/>
       </w:pPr>
-      <w:bookmarkStart w:id="113" w:name="_Toc232620375"/>
+      <w:bookmarkStart w:id="113" w:name="_Toc232748325"/>
       <w:r>
         <w:rPr>
           <w:rFonts w:ascii="Aptos Display" w:hAnsi="Aptos Display"/>
@@ -39961,7 +39961,7 @@
         <w:pStyle w:val="Titre2"/>
         <w:spacing w:before="460" w:after="220"/>
       </w:pPr>
-      <w:bookmarkStart w:id="114" w:name="_Toc232620376"/>
+      <w:bookmarkStart w:id="114" w:name="_Toc232748326"/>
       <w:r>
         <w:rPr>
           <w:rFonts w:ascii="Aptos Display" w:hAnsi="Aptos Display"/>
@@ -40064,7 +40064,7 @@
         <w:pStyle w:val="Titre2"/>
         <w:spacing w:before="460" w:after="220"/>
       </w:pPr>
-      <w:bookmarkStart w:id="115" w:name="_Toc232620377"/>
+      <w:bookmarkStart w:id="115" w:name="_Toc232748327"/>
       <w:r>
         <w:rPr>
           <w:rFonts w:ascii="Aptos Display" w:hAnsi="Aptos Display"/>
@@ -40165,7 +40165,7 @@
         <w:pStyle w:val="Titre2"/>
         <w:spacing w:before="460" w:after="220"/>
       </w:pPr>
-      <w:bookmarkStart w:id="116" w:name="_Toc232620378"/>
+      <w:bookmarkStart w:id="116" w:name="_Toc232748328"/>
       <w:r>
         <w:rPr>
           <w:rFonts w:ascii="Aptos Display" w:hAnsi="Aptos Display"/>
@@ -40308,7 +40308,7 @@
         <w:pStyle w:val="Titre2"/>
         <w:spacing w:before="460" w:after="220"/>
       </w:pPr>
-      <w:bookmarkStart w:id="117" w:name="_Toc232620379"/>
+      <w:bookmarkStart w:id="117" w:name="_Toc232748329"/>
       <w:r>
         <w:rPr>
           <w:rFonts w:ascii="Aptos Display" w:hAnsi="Aptos Display"/>
@@ -40418,7 +40418,7 @@
         <w:pStyle w:val="Titre2"/>
         <w:spacing w:before="460" w:after="220"/>
       </w:pPr>
-      <w:bookmarkStart w:id="118" w:name="_Toc232620380"/>
+      <w:bookmarkStart w:id="118" w:name="_Toc232748330"/>
       <w:r>
         <w:rPr>
           <w:rFonts w:ascii="Aptos Display" w:hAnsi="Aptos Display"/>
@@ -40486,7 +40486,7 @@
         <w:pStyle w:val="Titre2"/>
         <w:spacing w:before="460" w:after="220"/>
       </w:pPr>
-      <w:bookmarkStart w:id="119" w:name="_Toc232620381"/>
+      <w:bookmarkStart w:id="119" w:name="_Toc232748331"/>
       <w:r>
         <w:rPr>
           <w:rFonts w:ascii="Aptos Display" w:hAnsi="Aptos Display"/>
@@ -40577,7 +40577,7 @@
         <w:pStyle w:val="Titre2"/>
         <w:spacing w:before="460" w:after="220"/>
       </w:pPr>
-      <w:bookmarkStart w:id="120" w:name="_Toc232620382"/>
+      <w:bookmarkStart w:id="120" w:name="_Toc232748332"/>
       <w:r>
         <w:rPr>
           <w:rFonts w:ascii="Aptos Display" w:hAnsi="Aptos Display"/>
@@ -40663,7 +40663,7 @@
         <w:pStyle w:val="Titre2"/>
         <w:spacing w:before="460" w:after="220"/>
       </w:pPr>
-      <w:bookmarkStart w:id="121" w:name="_Toc232620383"/>
+      <w:bookmarkStart w:id="121" w:name="_Toc232748333"/>
       <w:r>
         <w:rPr>
           <w:rFonts w:ascii="Aptos Display" w:hAnsi="Aptos Display"/>
@@ -40772,7 +40772,7 @@
         </w:pBdr>
         <w:spacing w:before="80" w:after="200"/>
       </w:pPr>
-      <w:bookmarkStart w:id="122" w:name="_Toc232620384"/>
+      <w:bookmarkStart w:id="122" w:name="_Toc232748334"/>
       <w:r>
         <w:rPr>
           <w:rFonts w:ascii="Aptos Display" w:hAnsi="Aptos Display"/>
@@ -40788,7 +40788,7 @@
         <w:pStyle w:val="Titre2"/>
         <w:spacing w:before="460" w:after="220"/>
       </w:pPr>
-      <w:bookmarkStart w:id="123" w:name="_Toc232620385"/>
+      <w:bookmarkStart w:id="123" w:name="_Toc232748335"/>
       <w:r>
         <w:rPr>
           <w:rFonts w:ascii="Aptos Display" w:hAnsi="Aptos Display"/>
@@ -41004,7 +41004,7 @@
         <w:pStyle w:val="Titre2"/>
         <w:spacing w:before="460" w:after="220"/>
       </w:pPr>
-      <w:bookmarkStart w:id="124" w:name="_Toc232620386"/>
+      <w:bookmarkStart w:id="124" w:name="_Toc232748336"/>
       <w:r>
         <w:rPr>
           <w:rFonts w:ascii="Aptos Display" w:hAnsi="Aptos Display"/>
@@ -41139,7 +41139,7 @@
         <w:pStyle w:val="Titre2"/>
         <w:spacing w:before="460" w:after="220"/>
       </w:pPr>
-      <w:bookmarkStart w:id="125" w:name="_Toc232620387"/>
+      <w:bookmarkStart w:id="125" w:name="_Toc232748337"/>
       <w:r>
         <w:rPr>
           <w:rFonts w:ascii="Aptos Display" w:hAnsi="Aptos Display"/>
@@ -42087,7 +42087,7 @@
         <w:pStyle w:val="Titre2"/>
         <w:spacing w:before="460" w:after="220"/>
       </w:pPr>
-      <w:bookmarkStart w:id="126" w:name="_Toc232620388"/>
+      <w:bookmarkStart w:id="126" w:name="_Toc232748338"/>
       <w:r>
         <w:rPr>
           <w:rFonts w:ascii="Aptos Display" w:hAnsi="Aptos Display"/>
@@ -42195,7 +42195,7 @@
         </w:pBdr>
         <w:spacing w:before="80" w:after="200"/>
       </w:pPr>
-      <w:bookmarkStart w:id="127" w:name="_Toc232620389"/>
+      <w:bookmarkStart w:id="127" w:name="_Toc232748339"/>
       <w:r>
         <w:rPr>
           <w:rFonts w:ascii="Aptos Display" w:hAnsi="Aptos Display"/>

</xml_diff>